<commit_message>
feat(exam): tambahkan pengaturan aktif/nonaktif bobot jawaban dan set mode 1 jawaban benar
</commit_message>
<xml_diff>
--- a/Bank_Soal_30_CT_Informatika_SMAN_1_Batu.docx
+++ b/Bank_Soal_30_CT_Informatika_SMAN_1_Batu.docx
@@ -253,55 +253,55 @@
           <w:sz w:val="20"/>
           <w:szCs w:val="20"/>
         </w:rPr>
+        <w:t xml:space="preserve">Keterampilan mengoperasikan berbagai aplikasi komersial perkantoran dan multimedia untuk meningkatkan kecepatan mengetik.</w:t>
+      </w:r>
+    </w:p>
+    <w:p>
+      <w:pPr>
+        <w:spacing w:after="80"/>
+        <w:ind w:left="400"/>
+      </w:pPr>
+      <w:r>
+        <w:rPr>
+          <w:rFonts w:ascii="Arial" w:cs="Arial" w:eastAsia="Arial" w:hAnsi="Arial"/>
+          <w:b/>
+          <w:bCs/>
+          <w:sz w:val="20"/>
+          <w:szCs w:val="20"/>
+        </w:rPr>
+        <w:t xml:space="preserve">B. </w:t>
+      </w:r>
+      <w:r>
+        <w:rPr>
+          <w:rFonts w:ascii="Arial" w:cs="Arial" w:eastAsia="Arial" w:hAnsi="Arial"/>
+          <w:sz w:val="20"/>
+          <w:szCs w:val="20"/>
+        </w:rPr>
+        <w:t xml:space="preserve">Sebuah kerangka kerja berpikir pemecahan masalah (problem solving) yang menyusun representasi solusi secara logis agar dapat dieksekusi oleh agen pemroses informasi, baik manusia maupun komputer.</w:t>
+      </w:r>
+    </w:p>
+    <w:p>
+      <w:pPr>
+        <w:spacing w:after="80"/>
+        <w:ind w:left="400"/>
+      </w:pPr>
+      <w:r>
+        <w:rPr>
+          <w:rFonts w:ascii="Arial" w:cs="Arial" w:eastAsia="Arial" w:hAnsi="Arial"/>
+          <w:b/>
+          <w:bCs/>
+          <w:sz w:val="20"/>
+          <w:szCs w:val="20"/>
+        </w:rPr>
+        <w:t xml:space="preserve">C. </w:t>
+      </w:r>
+      <w:r>
+        <w:rPr>
+          <w:rFonts w:ascii="Arial" w:cs="Arial" w:eastAsia="Arial" w:hAnsi="Arial"/>
+          <w:sz w:val="20"/>
+          <w:szCs w:val="20"/>
+        </w:rPr>
         <w:t xml:space="preserve">Keahlian teknis tingkat lanjut untuk menghafal sintaks bahasa pemrograman dan merakit perangkat keras komputer secara mekanis.</w:t>
-      </w:r>
-    </w:p>
-    <w:p>
-      <w:pPr>
-        <w:spacing w:after="80"/>
-        <w:ind w:left="400"/>
-      </w:pPr>
-      <w:r>
-        <w:rPr>
-          <w:rFonts w:ascii="Arial" w:cs="Arial" w:eastAsia="Arial" w:hAnsi="Arial"/>
-          <w:b/>
-          <w:bCs/>
-          <w:sz w:val="20"/>
-          <w:szCs w:val="20"/>
-        </w:rPr>
-        <w:t xml:space="preserve">B. </w:t>
-      </w:r>
-      <w:r>
-        <w:rPr>
-          <w:rFonts w:ascii="Arial" w:cs="Arial" w:eastAsia="Arial" w:hAnsi="Arial"/>
-          <w:sz w:val="20"/>
-          <w:szCs w:val="20"/>
-        </w:rPr>
-        <w:t xml:space="preserve">Keterampilan mengoperasikan berbagai aplikasi komersial perkantoran dan multimedia untuk meningkatkan kecepatan mengetik.</w:t>
-      </w:r>
-    </w:p>
-    <w:p>
-      <w:pPr>
-        <w:spacing w:after="80"/>
-        <w:ind w:left="400"/>
-      </w:pPr>
-      <w:r>
-        <w:rPr>
-          <w:rFonts w:ascii="Arial" w:cs="Arial" w:eastAsia="Arial" w:hAnsi="Arial"/>
-          <w:b/>
-          <w:bCs/>
-          <w:sz w:val="20"/>
-          <w:szCs w:val="20"/>
-        </w:rPr>
-        <w:t xml:space="preserve">C. </w:t>
-      </w:r>
-      <w:r>
-        <w:rPr>
-          <w:rFonts w:ascii="Arial" w:cs="Arial" w:eastAsia="Arial" w:hAnsi="Arial"/>
-          <w:sz w:val="20"/>
-          <w:szCs w:val="20"/>
-        </w:rPr>
-        <w:t xml:space="preserve">Sebuah kerangka kerja berpikir pemecahan masalah (problem solving) yang menyusun representasi solusi secara logis agar dapat dieksekusi oleh agen pemroses informasi, baik manusia maupun komputer.</w:t>
       </w:r>
     </w:p>
     <w:p>
@@ -697,79 +697,79 @@
           <w:sz w:val="20"/>
           <w:szCs w:val="20"/>
         </w:rPr>
+        <w:t xml:space="preserve">Mengelompokkan data industri di bantaran sungai semata-mata berdasarkan warna cat pagar dan tahun berdirinya bangunan pabrik.</w:t>
+      </w:r>
+    </w:p>
+    <w:p>
+      <w:pPr>
+        <w:spacing w:after="80"/>
+        <w:ind w:left="400"/>
+      </w:pPr>
+      <w:r>
+        <w:rPr>
+          <w:rFonts w:ascii="Arial" w:cs="Arial" w:eastAsia="Arial" w:hAnsi="Arial"/>
+          <w:b/>
+          <w:bCs/>
+          <w:sz w:val="20"/>
+          <w:szCs w:val="20"/>
+        </w:rPr>
+        <w:t xml:space="preserve">B. </w:t>
+      </w:r>
+      <w:r>
+        <w:rPr>
+          <w:rFonts w:ascii="Arial" w:cs="Arial" w:eastAsia="Arial" w:hAnsi="Arial"/>
+          <w:sz w:val="20"/>
+          <w:szCs w:val="20"/>
+        </w:rPr>
+        <w:t xml:space="preserve">Menginstruksikan satu orang ahli untuk menyelesaikan seluruh penyelidikan krisis hulu-hilir sendirian secara bersamaan.</w:t>
+      </w:r>
+    </w:p>
+    <w:p>
+      <w:pPr>
+        <w:spacing w:after="80"/>
+        <w:ind w:left="400"/>
+      </w:pPr>
+      <w:r>
+        <w:rPr>
+          <w:rFonts w:ascii="Arial" w:cs="Arial" w:eastAsia="Arial" w:hAnsi="Arial"/>
+          <w:b/>
+          <w:bCs/>
+          <w:sz w:val="20"/>
+          <w:szCs w:val="20"/>
+        </w:rPr>
+        <w:t xml:space="preserve">C. </w:t>
+      </w:r>
+      <w:r>
+        <w:rPr>
+          <w:rFonts w:ascii="Arial" w:cs="Arial" w:eastAsia="Arial" w:hAnsi="Arial"/>
+          <w:sz w:val="20"/>
+          <w:szCs w:val="20"/>
+        </w:rPr>
+        <w:t xml:space="preserve">Memecah penanganan krisis banjir lumpur beracun kota ke dalam tiga fokus investigasi spesifik: hidrologi/cuaca, evaluasi tata guna lahan hulu, dan uji kimia limbah sedimen.</w:t>
+      </w:r>
+    </w:p>
+    <w:p>
+      <w:pPr>
+        <w:spacing w:after="80"/>
+        <w:ind w:left="400"/>
+      </w:pPr>
+      <w:r>
+        <w:rPr>
+          <w:rFonts w:ascii="Arial" w:cs="Arial" w:eastAsia="Arial" w:hAnsi="Arial"/>
+          <w:b/>
+          <w:bCs/>
+          <w:sz w:val="20"/>
+          <w:szCs w:val="20"/>
+        </w:rPr>
+        <w:t xml:space="preserve">D. </w:t>
+      </w:r>
+      <w:r>
+        <w:rPr>
+          <w:rFonts w:ascii="Arial" w:cs="Arial" w:eastAsia="Arial" w:hAnsi="Arial"/>
+          <w:sz w:val="20"/>
+          <w:szCs w:val="20"/>
+        </w:rPr>
         <w:t xml:space="preserve">Membagi bantuan sembako kepada seluruh warga secara merata tanpa memeriksa apakah mereka terdampak langsung oleh banjir atau tidak.</w:t>
-      </w:r>
-    </w:p>
-    <w:p>
-      <w:pPr>
-        <w:spacing w:after="80"/>
-        <w:ind w:left="400"/>
-      </w:pPr>
-      <w:r>
-        <w:rPr>
-          <w:rFonts w:ascii="Arial" w:cs="Arial" w:eastAsia="Arial" w:hAnsi="Arial"/>
-          <w:b/>
-          <w:bCs/>
-          <w:sz w:val="20"/>
-          <w:szCs w:val="20"/>
-        </w:rPr>
-        <w:t xml:space="preserve">B. </w:t>
-      </w:r>
-      <w:r>
-        <w:rPr>
-          <w:rFonts w:ascii="Arial" w:cs="Arial" w:eastAsia="Arial" w:hAnsi="Arial"/>
-          <w:sz w:val="20"/>
-          <w:szCs w:val="20"/>
-        </w:rPr>
-        <w:t xml:space="preserve">Mengelompokkan data industri di bantaran sungai semata-mata berdasarkan warna cat pagar dan tahun berdirinya bangunan pabrik.</w:t>
-      </w:r>
-    </w:p>
-    <w:p>
-      <w:pPr>
-        <w:spacing w:after="80"/>
-        <w:ind w:left="400"/>
-      </w:pPr>
-      <w:r>
-        <w:rPr>
-          <w:rFonts w:ascii="Arial" w:cs="Arial" w:eastAsia="Arial" w:hAnsi="Arial"/>
-          <w:b/>
-          <w:bCs/>
-          <w:sz w:val="20"/>
-          <w:szCs w:val="20"/>
-        </w:rPr>
-        <w:t xml:space="preserve">C. </w:t>
-      </w:r>
-      <w:r>
-        <w:rPr>
-          <w:rFonts w:ascii="Arial" w:cs="Arial" w:eastAsia="Arial" w:hAnsi="Arial"/>
-          <w:sz w:val="20"/>
-          <w:szCs w:val="20"/>
-        </w:rPr>
-        <w:t xml:space="preserve">Menginstruksikan satu orang ahli untuk menyelesaikan seluruh penyelidikan krisis hulu-hilir sendirian secara bersamaan.</w:t>
-      </w:r>
-    </w:p>
-    <w:p>
-      <w:pPr>
-        <w:spacing w:after="80"/>
-        <w:ind w:left="400"/>
-      </w:pPr>
-      <w:r>
-        <w:rPr>
-          <w:rFonts w:ascii="Arial" w:cs="Arial" w:eastAsia="Arial" w:hAnsi="Arial"/>
-          <w:b/>
-          <w:bCs/>
-          <w:sz w:val="20"/>
-          <w:szCs w:val="20"/>
-        </w:rPr>
-        <w:t xml:space="preserve">D. </w:t>
-      </w:r>
-      <w:r>
-        <w:rPr>
-          <w:rFonts w:ascii="Arial" w:cs="Arial" w:eastAsia="Arial" w:hAnsi="Arial"/>
-          <w:sz w:val="20"/>
-          <w:szCs w:val="20"/>
-        </w:rPr>
-        <w:t xml:space="preserve">Memecah penanganan krisis banjir lumpur beracun kota ke dalam tiga fokus investigasi spesifik: hidrologi/cuaca, evaluasi tata guna lahan hulu, dan uji kimia limbah sedimen.</w:t>
       </w:r>
     </w:p>
     <w:p>
@@ -919,31 +919,31 @@
           <w:sz w:val="20"/>
           <w:szCs w:val="20"/>
         </w:rPr>
+        <w:t xml:space="preserve">Pengenalan Pola (Pattern Recognition); memungkinkan penggunaan model solusi masa lalu untuk mempercepat diagnosis akurat dan penentuan uji laboratorium kritis.</w:t>
+      </w:r>
+    </w:p>
+    <w:p>
+      <w:pPr>
+        <w:spacing w:after="80"/>
+        <w:ind w:left="400"/>
+      </w:pPr>
+      <w:r>
+        <w:rPr>
+          <w:rFonts w:ascii="Arial" w:cs="Arial" w:eastAsia="Arial" w:hAnsi="Arial"/>
+          <w:b/>
+          <w:bCs/>
+          <w:sz w:val="20"/>
+          <w:szCs w:val="20"/>
+        </w:rPr>
+        <w:t xml:space="preserve">B. </w:t>
+      </w:r>
+      <w:r>
+        <w:rPr>
+          <w:rFonts w:ascii="Arial" w:cs="Arial" w:eastAsia="Arial" w:hAnsi="Arial"/>
+          <w:sz w:val="20"/>
+          <w:szCs w:val="20"/>
+        </w:rPr>
         <w:t xml:space="preserve">Dekomposisi; dokter membagi tubuh pasien ke dalam organ-organ terpisah sebelum mendengarkan keluhan demam pasien.</w:t>
-      </w:r>
-    </w:p>
-    <w:p>
-      <w:pPr>
-        <w:spacing w:after="80"/>
-        <w:ind w:left="400"/>
-      </w:pPr>
-      <w:r>
-        <w:rPr>
-          <w:rFonts w:ascii="Arial" w:cs="Arial" w:eastAsia="Arial" w:hAnsi="Arial"/>
-          <w:b/>
-          <w:bCs/>
-          <w:sz w:val="20"/>
-          <w:szCs w:val="20"/>
-        </w:rPr>
-        <w:t xml:space="preserve">B. </w:t>
-      </w:r>
-      <w:r>
-        <w:rPr>
-          <w:rFonts w:ascii="Arial" w:cs="Arial" w:eastAsia="Arial" w:hAnsi="Arial"/>
-          <w:sz w:val="20"/>
-          <w:szCs w:val="20"/>
-        </w:rPr>
-        <w:t xml:space="preserve">Pengenalan Pola (Pattern Recognition); memungkinkan penggunaan model solusi masa lalu untuk mempercepat diagnosis akurat dan penentuan uji laboratorium kritis.</w:t>
       </w:r>
     </w:p>
     <w:p>
@@ -1141,103 +1141,103 @@
           <w:sz w:val="20"/>
           <w:szCs w:val="20"/>
         </w:rPr>
+        <w:t xml:space="preserve">Jalur kereta bawah tanah tidak terikat dengan hukum gravitasi dan tata ruang permukaan bumi sehingga gedung diabaikan.</w:t>
+      </w:r>
+    </w:p>
+    <w:p>
+      <w:pPr>
+        <w:spacing w:after="80"/>
+        <w:ind w:left="400"/>
+      </w:pPr>
+      <w:r>
+        <w:rPr>
+          <w:rFonts w:ascii="Arial" w:cs="Arial" w:eastAsia="Arial" w:hAnsi="Arial"/>
+          <w:b/>
+          <w:bCs/>
+          <w:sz w:val="20"/>
+          <w:szCs w:val="20"/>
+        </w:rPr>
+        <w:t xml:space="preserve">B. </w:t>
+      </w:r>
+      <w:r>
+        <w:rPr>
+          <w:rFonts w:ascii="Arial" w:cs="Arial" w:eastAsia="Arial" w:hAnsi="Arial"/>
+          <w:sz w:val="20"/>
+          <w:szCs w:val="20"/>
+        </w:rPr>
+        <w:t xml:space="preserve">Peta sengaja dibuat membingungkan agar masyarakat lebih memilih menggunakan kendaraan pribadi di jalan raya.</w:t>
+      </w:r>
+    </w:p>
+    <w:p>
+      <w:pPr>
+        <w:spacing w:after="80"/>
+        <w:ind w:left="400"/>
+      </w:pPr>
+      <w:r>
+        <w:rPr>
+          <w:rFonts w:ascii="Arial" w:cs="Arial" w:eastAsia="Arial" w:hAnsi="Arial"/>
+          <w:b/>
+          <w:bCs/>
+          <w:sz w:val="20"/>
+          <w:szCs w:val="20"/>
+        </w:rPr>
+        <w:t xml:space="preserve">C. </w:t>
+      </w:r>
+      <w:r>
+        <w:rPr>
+          <w:rFonts w:ascii="Arial" w:cs="Arial" w:eastAsia="Arial" w:hAnsi="Arial"/>
+          <w:sz w:val="20"/>
+          <w:szCs w:val="20"/>
+        </w:rPr>
+        <w:t xml:space="preserve">Agar ukuran file gambar digital pada aplikasi ponsel pintar menjadi sekecil mungkin tanpa memedulikan kenyamanan pengguna.</w:t>
+      </w:r>
+    </w:p>
+    <w:p>
+      <w:pPr>
+        <w:spacing w:after="80"/>
+        <w:ind w:left="400"/>
+      </w:pPr>
+      <w:r>
+        <w:rPr>
+          <w:rFonts w:ascii="Arial" w:cs="Arial" w:eastAsia="Arial" w:hAnsi="Arial"/>
+          <w:b/>
+          <w:bCs/>
+          <w:sz w:val="20"/>
+          <w:szCs w:val="20"/>
+        </w:rPr>
+        <w:t xml:space="preserve">D. </w:t>
+      </w:r>
+      <w:r>
+        <w:rPr>
+          <w:rFonts w:ascii="Arial" w:cs="Arial" w:eastAsia="Arial" w:hAnsi="Arial"/>
+          <w:sz w:val="20"/>
+          <w:szCs w:val="20"/>
+        </w:rPr>
+        <w:t xml:space="preserve">Menyaring dan mempertahankan informasi esensial yang diperlukan penumpang (rute, stasiun, transit) sembari mengeliminasi detail fisik yang tidak relevan (noise visual).</w:t>
+      </w:r>
+    </w:p>
+    <w:p>
+      <w:pPr>
+        <w:spacing w:after="80"/>
+        <w:ind w:left="400"/>
+      </w:pPr>
+      <w:r>
+        <w:rPr>
+          <w:rFonts w:ascii="Arial" w:cs="Arial" w:eastAsia="Arial" w:hAnsi="Arial"/>
+          <w:b/>
+          <w:bCs/>
+          <w:sz w:val="20"/>
+          <w:szCs w:val="20"/>
+        </w:rPr>
+        <w:t xml:space="preserve">E. </w:t>
+      </w:r>
+      <w:r>
+        <w:rPr>
+          <w:rFonts w:ascii="Arial" w:cs="Arial" w:eastAsia="Arial" w:hAnsi="Arial"/>
+          <w:sz w:val="20"/>
+          <w:szCs w:val="20"/>
+        </w:rPr>
         <w:t xml:space="preserve">Perancang peta kekurangan waktu dan anggaran untuk menggambar gedung dan pohon di sekitar stasiun secara realistis.</w:t>
-      </w:r>
-    </w:p>
-    <w:p>
-      <w:pPr>
-        <w:spacing w:after="80"/>
-        <w:ind w:left="400"/>
-      </w:pPr>
-      <w:r>
-        <w:rPr>
-          <w:rFonts w:ascii="Arial" w:cs="Arial" w:eastAsia="Arial" w:hAnsi="Arial"/>
-          <w:b/>
-          <w:bCs/>
-          <w:sz w:val="20"/>
-          <w:szCs w:val="20"/>
-        </w:rPr>
-        <w:t xml:space="preserve">B. </w:t>
-      </w:r>
-      <w:r>
-        <w:rPr>
-          <w:rFonts w:ascii="Arial" w:cs="Arial" w:eastAsia="Arial" w:hAnsi="Arial"/>
-          <w:sz w:val="20"/>
-          <w:szCs w:val="20"/>
-        </w:rPr>
-        <w:t xml:space="preserve">Jalur kereta bawah tanah tidak terikat dengan hukum gravitasi dan tata ruang permukaan bumi sehingga gedung diabaikan.</w:t>
-      </w:r>
-    </w:p>
-    <w:p>
-      <w:pPr>
-        <w:spacing w:after="80"/>
-        <w:ind w:left="400"/>
-      </w:pPr>
-      <w:r>
-        <w:rPr>
-          <w:rFonts w:ascii="Arial" w:cs="Arial" w:eastAsia="Arial" w:hAnsi="Arial"/>
-          <w:b/>
-          <w:bCs/>
-          <w:sz w:val="20"/>
-          <w:szCs w:val="20"/>
-        </w:rPr>
-        <w:t xml:space="preserve">C. </w:t>
-      </w:r>
-      <w:r>
-        <w:rPr>
-          <w:rFonts w:ascii="Arial" w:cs="Arial" w:eastAsia="Arial" w:hAnsi="Arial"/>
-          <w:sz w:val="20"/>
-          <w:szCs w:val="20"/>
-        </w:rPr>
-        <w:t xml:space="preserve">Peta sengaja dibuat membingungkan agar masyarakat lebih memilih menggunakan kendaraan pribadi di jalan raya.</w:t>
-      </w:r>
-    </w:p>
-    <w:p>
-      <w:pPr>
-        <w:spacing w:after="80"/>
-        <w:ind w:left="400"/>
-      </w:pPr>
-      <w:r>
-        <w:rPr>
-          <w:rFonts w:ascii="Arial" w:cs="Arial" w:eastAsia="Arial" w:hAnsi="Arial"/>
-          <w:b/>
-          <w:bCs/>
-          <w:sz w:val="20"/>
-          <w:szCs w:val="20"/>
-        </w:rPr>
-        <w:t xml:space="preserve">D. </w:t>
-      </w:r>
-      <w:r>
-        <w:rPr>
-          <w:rFonts w:ascii="Arial" w:cs="Arial" w:eastAsia="Arial" w:hAnsi="Arial"/>
-          <w:sz w:val="20"/>
-          <w:szCs w:val="20"/>
-        </w:rPr>
-        <w:t xml:space="preserve">Agar ukuran file gambar digital pada aplikasi ponsel pintar menjadi sekecil mungkin tanpa memedulikan kenyamanan pengguna.</w:t>
-      </w:r>
-    </w:p>
-    <w:p>
-      <w:pPr>
-        <w:spacing w:after="80"/>
-        <w:ind w:left="400"/>
-      </w:pPr>
-      <w:r>
-        <w:rPr>
-          <w:rFonts w:ascii="Arial" w:cs="Arial" w:eastAsia="Arial" w:hAnsi="Arial"/>
-          <w:b/>
-          <w:bCs/>
-          <w:sz w:val="20"/>
-          <w:szCs w:val="20"/>
-        </w:rPr>
-        <w:t xml:space="preserve">E. </w:t>
-      </w:r>
-      <w:r>
-        <w:rPr>
-          <w:rFonts w:ascii="Arial" w:cs="Arial" w:eastAsia="Arial" w:hAnsi="Arial"/>
-          <w:sz w:val="20"/>
-          <w:szCs w:val="20"/>
-        </w:rPr>
-        <w:t xml:space="preserve">Menyaring dan mempertahankan informasi esensial yang diperlukan penumpang (rute, stasiun, transit) sembari mengeliminasi detail fisik yang tidak relevan (noise visual).</w:t>
       </w:r>
     </w:p>
     <w:p>
@@ -1585,55 +1585,55 @@
           <w:sz w:val="20"/>
           <w:szCs w:val="20"/>
         </w:rPr>
+        <w:t xml:space="preserve">Karena warga pengungsi di hilir sungai menolak menerima bantuan logistik sebelum pabrik-pabrik ditutup secara paksa.</w:t>
+      </w:r>
+    </w:p>
+    <w:p>
+      <w:pPr>
+        <w:spacing w:after="80"/>
+        <w:ind w:left="400"/>
+      </w:pPr>
+      <w:r>
+        <w:rPr>
+          <w:rFonts w:ascii="Arial" w:cs="Arial" w:eastAsia="Arial" w:hAnsi="Arial"/>
+          <w:b/>
+          <w:bCs/>
+          <w:sz w:val="20"/>
+          <w:szCs w:val="20"/>
+        </w:rPr>
+        <w:t xml:space="preserve">B. </w:t>
+      </w:r>
+      <w:r>
+        <w:rPr>
+          <w:rFonts w:ascii="Arial" w:cs="Arial" w:eastAsia="Arial" w:hAnsi="Arial"/>
+          <w:sz w:val="20"/>
+          <w:szCs w:val="20"/>
+        </w:rPr>
+        <w:t xml:space="preserve">Karena solusi reaktif hanya meredakan gejala permukaan (symptomatic) tanpa menyentuh analisis kausalitas sistemik yang menjadi akar utama bencana.</w:t>
+      </w:r>
+    </w:p>
+    <w:p>
+      <w:pPr>
+        <w:spacing w:after="80"/>
+        <w:ind w:left="400"/>
+      </w:pPr>
+      <w:r>
+        <w:rPr>
+          <w:rFonts w:ascii="Arial" w:cs="Arial" w:eastAsia="Arial" w:hAnsi="Arial"/>
+          <w:b/>
+          <w:bCs/>
+          <w:sz w:val="20"/>
+          <w:szCs w:val="20"/>
+        </w:rPr>
+        <w:t xml:space="preserve">C. </w:t>
+      </w:r>
+      <w:r>
+        <w:rPr>
+          <w:rFonts w:ascii="Arial" w:cs="Arial" w:eastAsia="Arial" w:hAnsi="Arial"/>
+          <w:sz w:val="20"/>
+          <w:szCs w:val="20"/>
+        </w:rPr>
         <w:t xml:space="preserve">Karena Dr. Aris menilai anggaran belanja sembako daerah terlalu murah sehingga tidak mengangkat gengsi penelitian tim satgas.</w:t>
-      </w:r>
-    </w:p>
-    <w:p>
-      <w:pPr>
-        <w:spacing w:after="80"/>
-        <w:ind w:left="400"/>
-      </w:pPr>
-      <w:r>
-        <w:rPr>
-          <w:rFonts w:ascii="Arial" w:cs="Arial" w:eastAsia="Arial" w:hAnsi="Arial"/>
-          <w:b/>
-          <w:bCs/>
-          <w:sz w:val="20"/>
-          <w:szCs w:val="20"/>
-        </w:rPr>
-        <w:t xml:space="preserve">B. </w:t>
-      </w:r>
-      <w:r>
-        <w:rPr>
-          <w:rFonts w:ascii="Arial" w:cs="Arial" w:eastAsia="Arial" w:hAnsi="Arial"/>
-          <w:sz w:val="20"/>
-          <w:szCs w:val="20"/>
-        </w:rPr>
-        <w:t xml:space="preserve">Karena warga pengungsi di hilir sungai menolak menerima bantuan logistik sebelum pabrik-pabrik ditutup secara paksa.</w:t>
-      </w:r>
-    </w:p>
-    <w:p>
-      <w:pPr>
-        <w:spacing w:after="80"/>
-        <w:ind w:left="400"/>
-      </w:pPr>
-      <w:r>
-        <w:rPr>
-          <w:rFonts w:ascii="Arial" w:cs="Arial" w:eastAsia="Arial" w:hAnsi="Arial"/>
-          <w:b/>
-          <w:bCs/>
-          <w:sz w:val="20"/>
-          <w:szCs w:val="20"/>
-        </w:rPr>
-        <w:t xml:space="preserve">C. </w:t>
-      </w:r>
-      <w:r>
-        <w:rPr>
-          <w:rFonts w:ascii="Arial" w:cs="Arial" w:eastAsia="Arial" w:hAnsi="Arial"/>
-          <w:sz w:val="20"/>
-          <w:szCs w:val="20"/>
-        </w:rPr>
-        <w:t xml:space="preserve">Karena solusi reaktif hanya meredakan gejala permukaan (symptomatic) tanpa menyentuh analisis kausalitas sistemik yang menjadi akar utama bencana.</w:t>
       </w:r>
     </w:p>
     <w:p>
@@ -1807,31 +1807,31 @@
           <w:sz w:val="20"/>
           <w:szCs w:val="20"/>
         </w:rPr>
+        <w:t xml:space="preserve">Memungkinkan investigasi mendalam dan pengumpulan bukti saintifik berjalan secara paralel pada tiga determinan kritis: atmosferik, bentang lahan, dan polutan kimia.</w:t>
+      </w:r>
+    </w:p>
+    <w:p>
+      <w:pPr>
+        <w:spacing w:after="80"/>
+        <w:ind w:left="400"/>
+      </w:pPr>
+      <w:r>
+        <w:rPr>
+          <w:rFonts w:ascii="Arial" w:cs="Arial" w:eastAsia="Arial" w:hAnsi="Arial"/>
+          <w:b/>
+          <w:bCs/>
+          <w:sz w:val="20"/>
+          <w:szCs w:val="20"/>
+        </w:rPr>
+        <w:t xml:space="preserve">B. </w:t>
+      </w:r>
+      <w:r>
+        <w:rPr>
+          <w:rFonts w:ascii="Arial" w:cs="Arial" w:eastAsia="Arial" w:hAnsi="Arial"/>
+          <w:sz w:val="20"/>
+          <w:szCs w:val="20"/>
+        </w:rPr>
         <w:t xml:space="preserve">Menghilangkan kebutuhan rapat koordinasi karena ketiga tim dilarang saling bertukar data hingga bencana tahun berikutnya tiba.</w:t>
-      </w:r>
-    </w:p>
-    <w:p>
-      <w:pPr>
-        <w:spacing w:after="80"/>
-        <w:ind w:left="400"/>
-      </w:pPr>
-      <w:r>
-        <w:rPr>
-          <w:rFonts w:ascii="Arial" w:cs="Arial" w:eastAsia="Arial" w:hAnsi="Arial"/>
-          <w:b/>
-          <w:bCs/>
-          <w:sz w:val="20"/>
-          <w:szCs w:val="20"/>
-        </w:rPr>
-        <w:t xml:space="preserve">B. </w:t>
-      </w:r>
-      <w:r>
-        <w:rPr>
-          <w:rFonts w:ascii="Arial" w:cs="Arial" w:eastAsia="Arial" w:hAnsi="Arial"/>
-          <w:sz w:val="20"/>
-          <w:szCs w:val="20"/>
-        </w:rPr>
-        <w:t xml:space="preserve">Memungkinkan investigasi mendalam dan pengumpulan bukti saintifik berjalan secara paralel pada tiga determinan kritis: atmosferik, bentang lahan, dan polutan kimia.</w:t>
       </w:r>
     </w:p>
     <w:p>
@@ -2029,79 +2029,79 @@
           <w:sz w:val="20"/>
           <w:szCs w:val="20"/>
         </w:rPr>
+        <w:t xml:space="preserve">Membuktikan bahwa prediksi banjir dapat dilakukan tanpa memerlukan data kuantitatif curah hujan dari BMKG.</w:t>
+      </w:r>
+    </w:p>
+    <w:p>
+      <w:pPr>
+        <w:spacing w:after="80"/>
+        <w:ind w:left="400"/>
+      </w:pPr>
+      <w:r>
+        <w:rPr>
+          <w:rFonts w:ascii="Arial" w:cs="Arial" w:eastAsia="Arial" w:hAnsi="Arial"/>
+          <w:b/>
+          <w:bCs/>
+          <w:sz w:val="20"/>
+          <w:szCs w:val="20"/>
+        </w:rPr>
+        <w:t xml:space="preserve">B. </w:t>
+      </w:r>
+      <w:r>
+        <w:rPr>
+          <w:rFonts w:ascii="Arial" w:cs="Arial" w:eastAsia="Arial" w:hAnsi="Arial"/>
+          <w:sz w:val="20"/>
+          <w:szCs w:val="20"/>
+        </w:rPr>
+        <w:t xml:space="preserve">Mengabaikan faktor pasang air laut rob karena air laut berada di hilir dan tidak memengaruhi aliran air tawar sungai.</w:t>
+      </w:r>
+    </w:p>
+    <w:p>
+      <w:pPr>
+        <w:spacing w:after="80"/>
+        <w:ind w:left="400"/>
+      </w:pPr>
+      <w:r>
+        <w:rPr>
+          <w:rFonts w:ascii="Arial" w:cs="Arial" w:eastAsia="Arial" w:hAnsi="Arial"/>
+          <w:b/>
+          <w:bCs/>
+          <w:sz w:val="20"/>
+          <w:szCs w:val="20"/>
+        </w:rPr>
+        <w:t xml:space="preserve">C. </w:t>
+      </w:r>
+      <w:r>
+        <w:rPr>
+          <w:rFonts w:ascii="Arial" w:cs="Arial" w:eastAsia="Arial" w:hAnsi="Arial"/>
+          <w:sz w:val="20"/>
+          <w:szCs w:val="20"/>
+        </w:rPr>
+        <w:t xml:space="preserve">Menemukan keteraturan hubungan berulang dari rekaman data historis jangka panjang yang berfungsi sebagai kondisi batas pemicu (trigger boundary) bencana.</w:t>
+      </w:r>
+    </w:p>
+    <w:p>
+      <w:pPr>
+        <w:spacing w:after="80"/>
+        <w:ind w:left="400"/>
+      </w:pPr>
+      <w:r>
+        <w:rPr>
+          <w:rFonts w:ascii="Arial" w:cs="Arial" w:eastAsia="Arial" w:hAnsi="Arial"/>
+          <w:b/>
+          <w:bCs/>
+          <w:sz w:val="20"/>
+          <w:szCs w:val="20"/>
+        </w:rPr>
+        <w:t xml:space="preserve">D. </w:t>
+      </w:r>
+      <w:r>
+        <w:rPr>
+          <w:rFonts w:ascii="Arial" w:cs="Arial" w:eastAsia="Arial" w:hAnsi="Arial"/>
+          <w:sz w:val="20"/>
+          <w:szCs w:val="20"/>
+        </w:rPr>
         <w:t xml:space="preserve">Merupakan kebetulan statistik yang tidak memiliki korelasi fisika atmosfer dengan meluapnya air sungai Ciliwung.</w:t>
-      </w:r>
-    </w:p>
-    <w:p>
-      <w:pPr>
-        <w:spacing w:after="80"/>
-        <w:ind w:left="400"/>
-      </w:pPr>
-      <w:r>
-        <w:rPr>
-          <w:rFonts w:ascii="Arial" w:cs="Arial" w:eastAsia="Arial" w:hAnsi="Arial"/>
-          <w:b/>
-          <w:bCs/>
-          <w:sz w:val="20"/>
-          <w:szCs w:val="20"/>
-        </w:rPr>
-        <w:t xml:space="preserve">B. </w:t>
-      </w:r>
-      <w:r>
-        <w:rPr>
-          <w:rFonts w:ascii="Arial" w:cs="Arial" w:eastAsia="Arial" w:hAnsi="Arial"/>
-          <w:sz w:val="20"/>
-          <w:szCs w:val="20"/>
-        </w:rPr>
-        <w:t xml:space="preserve">Membuktikan bahwa prediksi banjir dapat dilakukan tanpa memerlukan data kuantitatif curah hujan dari BMKG.</w:t>
-      </w:r>
-    </w:p>
-    <w:p>
-      <w:pPr>
-        <w:spacing w:after="80"/>
-        <w:ind w:left="400"/>
-      </w:pPr>
-      <w:r>
-        <w:rPr>
-          <w:rFonts w:ascii="Arial" w:cs="Arial" w:eastAsia="Arial" w:hAnsi="Arial"/>
-          <w:b/>
-          <w:bCs/>
-          <w:sz w:val="20"/>
-          <w:szCs w:val="20"/>
-        </w:rPr>
-        <w:t xml:space="preserve">C. </w:t>
-      </w:r>
-      <w:r>
-        <w:rPr>
-          <w:rFonts w:ascii="Arial" w:cs="Arial" w:eastAsia="Arial" w:hAnsi="Arial"/>
-          <w:sz w:val="20"/>
-          <w:szCs w:val="20"/>
-        </w:rPr>
-        <w:t xml:space="preserve">Mengabaikan faktor pasang air laut rob karena air laut berada di hilir dan tidak memengaruhi aliran air tawar sungai.</w:t>
-      </w:r>
-    </w:p>
-    <w:p>
-      <w:pPr>
-        <w:spacing w:after="80"/>
-        <w:ind w:left="400"/>
-      </w:pPr>
-      <w:r>
-        <w:rPr>
-          <w:rFonts w:ascii="Arial" w:cs="Arial" w:eastAsia="Arial" w:hAnsi="Arial"/>
-          <w:b/>
-          <w:bCs/>
-          <w:sz w:val="20"/>
-          <w:szCs w:val="20"/>
-        </w:rPr>
-        <w:t xml:space="preserve">D. </w:t>
-      </w:r>
-      <w:r>
-        <w:rPr>
-          <w:rFonts w:ascii="Arial" w:cs="Arial" w:eastAsia="Arial" w:hAnsi="Arial"/>
-          <w:sz w:val="20"/>
-          <w:szCs w:val="20"/>
-        </w:rPr>
-        <w:t xml:space="preserve">Menemukan keteraturan hubungan berulang dari rekaman data historis jangka panjang yang berfungsi sebagai kondisi batas pemicu (trigger boundary) bencana.</w:t>
       </w:r>
     </w:p>
     <w:p>
@@ -2251,103 +2251,103 @@
           <w:sz w:val="20"/>
           <w:szCs w:val="20"/>
         </w:rPr>
+        <w:t xml:space="preserve">Warna seragam pekerja dan tahun berdiri pabrik merupakan rahasia negara yang dilindungi undang-undang intelijen bisnis.</w:t>
+      </w:r>
+    </w:p>
+    <w:p>
+      <w:pPr>
+        <w:spacing w:after="80"/>
+        <w:ind w:left="400"/>
+      </w:pPr>
+      <w:r>
+        <w:rPr>
+          <w:rFonts w:ascii="Arial" w:cs="Arial" w:eastAsia="Arial" w:hAnsi="Arial"/>
+          <w:b/>
+          <w:bCs/>
+          <w:sz w:val="20"/>
+          <w:szCs w:val="20"/>
+        </w:rPr>
+        <w:t xml:space="preserve">B. </w:t>
+      </w:r>
+      <w:r>
+        <w:rPr>
+          <w:rFonts w:ascii="Arial" w:cs="Arial" w:eastAsia="Arial" w:hAnsi="Arial"/>
+          <w:sz w:val="20"/>
+          <w:szCs w:val="20"/>
+        </w:rPr>
+        <w:t xml:space="preserve">Dr. Aris meyakini bahwa pabrik kayu dan makanan tidak menggunakan air sungai untuk membuang limbah domestik.</w:t>
+      </w:r>
+    </w:p>
+    <w:p>
+      <w:pPr>
+        <w:spacing w:after="80"/>
+        <w:ind w:left="400"/>
+      </w:pPr>
+      <w:r>
+        <w:rPr>
+          <w:rFonts w:ascii="Arial" w:cs="Arial" w:eastAsia="Arial" w:hAnsi="Arial"/>
+          <w:b/>
+          <w:bCs/>
+          <w:sz w:val="20"/>
+          <w:szCs w:val="20"/>
+        </w:rPr>
+        <w:t xml:space="preserve">C. </w:t>
+      </w:r>
+      <w:r>
+        <w:rPr>
+          <w:rFonts w:ascii="Arial" w:cs="Arial" w:eastAsia="Arial" w:hAnsi="Arial"/>
+          <w:sz w:val="20"/>
+          <w:szCs w:val="20"/>
+        </w:rPr>
+        <w:t xml:space="preserve">Pabrik aki baterai dan tekstil berada di bawah naungan kementerian yang berbeda dengan pabrik makanan.</w:t>
+      </w:r>
+    </w:p>
+    <w:p>
+      <w:pPr>
+        <w:spacing w:after="80"/>
+        <w:ind w:left="400"/>
+      </w:pPr>
+      <w:r>
+        <w:rPr>
+          <w:rFonts w:ascii="Arial" w:cs="Arial" w:eastAsia="Arial" w:hAnsi="Arial"/>
+          <w:b/>
+          <w:bCs/>
+          <w:sz w:val="20"/>
+          <w:szCs w:val="20"/>
+        </w:rPr>
+        <w:t xml:space="preserve">D. </w:t>
+      </w:r>
+      <w:r>
+        <w:rPr>
+          <w:rFonts w:ascii="Arial" w:cs="Arial" w:eastAsia="Arial" w:hAnsi="Arial"/>
+          <w:sz w:val="20"/>
+          <w:szCs w:val="20"/>
+        </w:rPr>
+        <w:t xml:space="preserve">Menyaring variabel yang tidak relevan (noise) agar fokus tim tercurah pada penghasil potensial kromium dan timbal, sehingga menghemat waktu dan sumber daya krusial.</w:t>
+      </w:r>
+    </w:p>
+    <w:p>
+      <w:pPr>
+        <w:spacing w:after="80"/>
+        <w:ind w:left="400"/>
+      </w:pPr>
+      <w:r>
+        <w:rPr>
+          <w:rFonts w:ascii="Arial" w:cs="Arial" w:eastAsia="Arial" w:hAnsi="Arial"/>
+          <w:b/>
+          <w:bCs/>
+          <w:sz w:val="20"/>
+          <w:szCs w:val="20"/>
+        </w:rPr>
+        <w:t xml:space="preserve">E. </w:t>
+      </w:r>
+      <w:r>
+        <w:rPr>
+          <w:rFonts w:ascii="Arial" w:cs="Arial" w:eastAsia="Arial" w:hAnsi="Arial"/>
+          <w:sz w:val="20"/>
+          <w:szCs w:val="20"/>
+        </w:rPr>
         <w:t xml:space="preserve">Pabrik makanan dan ruko kecil membayar retribusi keamanan lebih tinggi kepada dinas perindustrian kota.</w:t>
-      </w:r>
-    </w:p>
-    <w:p>
-      <w:pPr>
-        <w:spacing w:after="80"/>
-        <w:ind w:left="400"/>
-      </w:pPr>
-      <w:r>
-        <w:rPr>
-          <w:rFonts w:ascii="Arial" w:cs="Arial" w:eastAsia="Arial" w:hAnsi="Arial"/>
-          <w:b/>
-          <w:bCs/>
-          <w:sz w:val="20"/>
-          <w:szCs w:val="20"/>
-        </w:rPr>
-        <w:t xml:space="preserve">B. </w:t>
-      </w:r>
-      <w:r>
-        <w:rPr>
-          <w:rFonts w:ascii="Arial" w:cs="Arial" w:eastAsia="Arial" w:hAnsi="Arial"/>
-          <w:sz w:val="20"/>
-          <w:szCs w:val="20"/>
-        </w:rPr>
-        <w:t xml:space="preserve">Warna seragam pekerja dan tahun berdiri pabrik merupakan rahasia negara yang dilindungi undang-undang intelijen bisnis.</w:t>
-      </w:r>
-    </w:p>
-    <w:p>
-      <w:pPr>
-        <w:spacing w:after="80"/>
-        <w:ind w:left="400"/>
-      </w:pPr>
-      <w:r>
-        <w:rPr>
-          <w:rFonts w:ascii="Arial" w:cs="Arial" w:eastAsia="Arial" w:hAnsi="Arial"/>
-          <w:b/>
-          <w:bCs/>
-          <w:sz w:val="20"/>
-          <w:szCs w:val="20"/>
-        </w:rPr>
-        <w:t xml:space="preserve">C. </w:t>
-      </w:r>
-      <w:r>
-        <w:rPr>
-          <w:rFonts w:ascii="Arial" w:cs="Arial" w:eastAsia="Arial" w:hAnsi="Arial"/>
-          <w:sz w:val="20"/>
-          <w:szCs w:val="20"/>
-        </w:rPr>
-        <w:t xml:space="preserve">Dr. Aris meyakini bahwa pabrik kayu dan makanan tidak menggunakan air sungai untuk membuang limbah domestik.</w:t>
-      </w:r>
-    </w:p>
-    <w:p>
-      <w:pPr>
-        <w:spacing w:after="80"/>
-        <w:ind w:left="400"/>
-      </w:pPr>
-      <w:r>
-        <w:rPr>
-          <w:rFonts w:ascii="Arial" w:cs="Arial" w:eastAsia="Arial" w:hAnsi="Arial"/>
-          <w:b/>
-          <w:bCs/>
-          <w:sz w:val="20"/>
-          <w:szCs w:val="20"/>
-        </w:rPr>
-        <w:t xml:space="preserve">D. </w:t>
-      </w:r>
-      <w:r>
-        <w:rPr>
-          <w:rFonts w:ascii="Arial" w:cs="Arial" w:eastAsia="Arial" w:hAnsi="Arial"/>
-          <w:sz w:val="20"/>
-          <w:szCs w:val="20"/>
-        </w:rPr>
-        <w:t xml:space="preserve">Pabrik aki baterai dan tekstil berada di bawah naungan kementerian yang berbeda dengan pabrik makanan.</w:t>
-      </w:r>
-    </w:p>
-    <w:p>
-      <w:pPr>
-        <w:spacing w:after="80"/>
-        <w:ind w:left="400"/>
-      </w:pPr>
-      <w:r>
-        <w:rPr>
-          <w:rFonts w:ascii="Arial" w:cs="Arial" w:eastAsia="Arial" w:hAnsi="Arial"/>
-          <w:b/>
-          <w:bCs/>
-          <w:sz w:val="20"/>
-          <w:szCs w:val="20"/>
-        </w:rPr>
-        <w:t xml:space="preserve">E. </w:t>
-      </w:r>
-      <w:r>
-        <w:rPr>
-          <w:rFonts w:ascii="Arial" w:cs="Arial" w:eastAsia="Arial" w:hAnsi="Arial"/>
-          <w:sz w:val="20"/>
-          <w:szCs w:val="20"/>
-        </w:rPr>
-        <w:t xml:space="preserve">Menyaring variabel yang tidak relevan (noise) agar fokus tim tercurah pada penghasil potensial kromium dan timbal, sehingga menghemat waktu dan sumber daya krusial.</w:t>
       </w:r>
     </w:p>
     <w:p>
@@ -2512,31 +2512,31 @@
           <w:sz w:val="20"/>
           <w:szCs w:val="20"/>
         </w:rPr>
+        <w:t xml:space="preserve">Percabangan kondisional logika ganda (IF curah_hujan &gt; 150 AND pasang_rob == TRUE THEN aktifkan_sirine_level_1).</w:t>
+      </w:r>
+    </w:p>
+    <w:p>
+      <w:pPr>
+        <w:spacing w:after="80"/>
+        <w:ind w:left="400"/>
+      </w:pPr>
+      <w:r>
+        <w:rPr>
+          <w:rFonts w:ascii="Arial" w:cs="Arial" w:eastAsia="Arial" w:hAnsi="Arial"/>
+          <w:b/>
+          <w:bCs/>
+          <w:sz w:val="20"/>
+          <w:szCs w:val="20"/>
+        </w:rPr>
+        <w:t xml:space="preserve">B. </w:t>
+      </w:r>
+      <w:r>
+        <w:rPr>
+          <w:rFonts w:ascii="Arial" w:cs="Arial" w:eastAsia="Arial" w:hAnsi="Arial"/>
+          <w:sz w:val="20"/>
+          <w:szCs w:val="20"/>
+        </w:rPr>
         <w:t xml:space="preserve">Perulangan tanpa henti (Infinite While Loop) yang membunyikan sirine sepanjang tahun tanpa memeriksa kondisi cuaca.</w:t>
-      </w:r>
-    </w:p>
-    <w:p>
-      <w:pPr>
-        <w:spacing w:after="80"/>
-        <w:ind w:left="400"/>
-      </w:pPr>
-      <w:r>
-        <w:rPr>
-          <w:rFonts w:ascii="Arial" w:cs="Arial" w:eastAsia="Arial" w:hAnsi="Arial"/>
-          <w:b/>
-          <w:bCs/>
-          <w:sz w:val="20"/>
-          <w:szCs w:val="20"/>
-        </w:rPr>
-        <w:t xml:space="preserve">B. </w:t>
-      </w:r>
-      <w:r>
-        <w:rPr>
-          <w:rFonts w:ascii="Arial" w:cs="Arial" w:eastAsia="Arial" w:hAnsi="Arial"/>
-          <w:sz w:val="20"/>
-          <w:szCs w:val="20"/>
-        </w:rPr>
-        <w:t xml:space="preserve">Percabangan kondisional logika ganda (IF curah_hujan &gt; 150 AND pasang_rob == TRUE THEN aktifkan_sirine_level_1).</w:t>
       </w:r>
     </w:p>
     <w:p>
@@ -2956,79 +2956,79 @@
           <w:sz w:val="20"/>
           <w:szCs w:val="20"/>
         </w:rPr>
+        <w:t xml:space="preserve">Komputer pemantau BMKG akan mengalami crash memori karena tidak sanggup membandingkan angka desimal di bawah 150.</w:t>
+      </w:r>
+    </w:p>
+    <w:p>
+      <w:pPr>
+        <w:spacing w:after="80"/>
+        <w:ind w:left="400"/>
+      </w:pPr>
+      <w:r>
+        <w:rPr>
+          <w:rFonts w:ascii="Arial" w:cs="Arial" w:eastAsia="Arial" w:hAnsi="Arial"/>
+          <w:b/>
+          <w:bCs/>
+          <w:sz w:val="20"/>
+          <w:szCs w:val="20"/>
+        </w:rPr>
+        <w:t xml:space="preserve">B. </w:t>
+      </w:r>
+      <w:r>
+        <w:rPr>
+          <w:rFonts w:ascii="Arial" w:cs="Arial" w:eastAsia="Arial" w:hAnsi="Arial"/>
+          <w:sz w:val="20"/>
+          <w:szCs w:val="20"/>
+        </w:rPr>
+        <w:t xml:space="preserve">Seluruh pabrik tekstil dan aki akan otomatis meledak karena saluran pipa limbah tidak menerima data sinyal peringatan.</w:t>
+      </w:r>
+    </w:p>
+    <w:p>
+      <w:pPr>
+        <w:spacing w:after="80"/>
+        <w:ind w:left="400"/>
+      </w:pPr>
+      <w:r>
+        <w:rPr>
+          <w:rFonts w:ascii="Arial" w:cs="Arial" w:eastAsia="Arial" w:hAnsi="Arial"/>
+          <w:b/>
+          <w:bCs/>
+          <w:sz w:val="20"/>
+          <w:szCs w:val="20"/>
+        </w:rPr>
+        <w:t xml:space="preserve">C. </w:t>
+      </w:r>
+      <w:r>
+        <w:rPr>
+          <w:rFonts w:ascii="Arial" w:cs="Arial" w:eastAsia="Arial" w:hAnsi="Arial"/>
+          <w:sz w:val="20"/>
+          <w:szCs w:val="20"/>
+        </w:rPr>
+        <w:t xml:space="preserve">Sirine Level 1 tidak akan berbunyi karena curah hujan 149 mm tidak memenuhi syarat &gt; 150, padahal kombinasi debit air dan pasang laut ekstrem tetap memicu bencana banjir besar.</w:t>
+      </w:r>
+    </w:p>
+    <w:p>
+      <w:pPr>
+        <w:spacing w:after="80"/>
+        <w:ind w:left="400"/>
+      </w:pPr>
+      <w:r>
+        <w:rPr>
+          <w:rFonts w:ascii="Arial" w:cs="Arial" w:eastAsia="Arial" w:hAnsi="Arial"/>
+          <w:b/>
+          <w:bCs/>
+          <w:sz w:val="20"/>
+          <w:szCs w:val="20"/>
+        </w:rPr>
+        <w:t xml:space="preserve">D. </w:t>
+      </w:r>
+      <w:r>
+        <w:rPr>
+          <w:rFonts w:ascii="Arial" w:cs="Arial" w:eastAsia="Arial" w:hAnsi="Arial"/>
+          <w:sz w:val="20"/>
+          <w:szCs w:val="20"/>
+        </w:rPr>
         <w:t xml:space="preserve">Pintu air Katulampa Utara akan otomatis terbuka 100% dan menyedot air laut masuk ke dalam kawasan hulu sungai.</w:t>
-      </w:r>
-    </w:p>
-    <w:p>
-      <w:pPr>
-        <w:spacing w:after="80"/>
-        <w:ind w:left="400"/>
-      </w:pPr>
-      <w:r>
-        <w:rPr>
-          <w:rFonts w:ascii="Arial" w:cs="Arial" w:eastAsia="Arial" w:hAnsi="Arial"/>
-          <w:b/>
-          <w:bCs/>
-          <w:sz w:val="20"/>
-          <w:szCs w:val="20"/>
-        </w:rPr>
-        <w:t xml:space="preserve">B. </w:t>
-      </w:r>
-      <w:r>
-        <w:rPr>
-          <w:rFonts w:ascii="Arial" w:cs="Arial" w:eastAsia="Arial" w:hAnsi="Arial"/>
-          <w:sz w:val="20"/>
-          <w:szCs w:val="20"/>
-        </w:rPr>
-        <w:t xml:space="preserve">Komputer pemantau BMKG akan mengalami crash memori karena tidak sanggup membandingkan angka desimal di bawah 150.</w:t>
-      </w:r>
-    </w:p>
-    <w:p>
-      <w:pPr>
-        <w:spacing w:after="80"/>
-        <w:ind w:left="400"/>
-      </w:pPr>
-      <w:r>
-        <w:rPr>
-          <w:rFonts w:ascii="Arial" w:cs="Arial" w:eastAsia="Arial" w:hAnsi="Arial"/>
-          <w:b/>
-          <w:bCs/>
-          <w:sz w:val="20"/>
-          <w:szCs w:val="20"/>
-        </w:rPr>
-        <w:t xml:space="preserve">C. </w:t>
-      </w:r>
-      <w:r>
-        <w:rPr>
-          <w:rFonts w:ascii="Arial" w:cs="Arial" w:eastAsia="Arial" w:hAnsi="Arial"/>
-          <w:sz w:val="20"/>
-          <w:szCs w:val="20"/>
-        </w:rPr>
-        <w:t xml:space="preserve">Seluruh pabrik tekstil dan aki akan otomatis meledak karena saluran pipa limbah tidak menerima data sinyal peringatan.</w:t>
-      </w:r>
-    </w:p>
-    <w:p>
-      <w:pPr>
-        <w:spacing w:after="80"/>
-        <w:ind w:left="400"/>
-      </w:pPr>
-      <w:r>
-        <w:rPr>
-          <w:rFonts w:ascii="Arial" w:cs="Arial" w:eastAsia="Arial" w:hAnsi="Arial"/>
-          <w:b/>
-          <w:bCs/>
-          <w:sz w:val="20"/>
-          <w:szCs w:val="20"/>
-        </w:rPr>
-        <w:t xml:space="preserve">D. </w:t>
-      </w:r>
-      <w:r>
-        <w:rPr>
-          <w:rFonts w:ascii="Arial" w:cs="Arial" w:eastAsia="Arial" w:hAnsi="Arial"/>
-          <w:sz w:val="20"/>
-          <w:szCs w:val="20"/>
-        </w:rPr>
-        <w:t xml:space="preserve">Sirine Level 1 tidak akan berbunyi karena curah hujan 149 mm tidak memenuhi syarat &gt; 150, padahal kombinasi debit air dan pasang laut ekstrem tetap memicu bencana banjir besar.</w:t>
       </w:r>
     </w:p>
     <w:p>
@@ -3178,55 +3178,55 @@
           <w:sz w:val="20"/>
           <w:szCs w:val="20"/>
         </w:rPr>
+        <w:t xml:space="preserve">Protokol dibuat sangat rahasia sehingga hanya dapat dibeli oleh pemerintah kota yang memiliki anggaran miliaran rupiah.</w:t>
+      </w:r>
+    </w:p>
+    <w:p>
+      <w:pPr>
+        <w:spacing w:after="80"/>
+        <w:ind w:left="400"/>
+      </w:pPr>
+      <w:r>
+        <w:rPr>
+          <w:rFonts w:ascii="Arial" w:cs="Arial" w:eastAsia="Arial" w:hAnsi="Arial"/>
+          <w:b/>
+          <w:bCs/>
+          <w:sz w:val="20"/>
+          <w:szCs w:val="20"/>
+        </w:rPr>
+        <w:t xml:space="preserve">B. </w:t>
+      </w:r>
+      <w:r>
+        <w:rPr>
+          <w:rFonts w:ascii="Arial" w:cs="Arial" w:eastAsia="Arial" w:hAnsi="Arial"/>
+          <w:sz w:val="20"/>
+          <w:szCs w:val="20"/>
+        </w:rPr>
+        <w:t xml:space="preserve">Protokol dirumuskan sebagai model algoritmik abstrak berbasis logika data empiris yang dapat disesuaikan parameter lokalnya di daerah lain tanpa mengubah esensi kerangka kerjanya.</w:t>
+      </w:r>
+    </w:p>
+    <w:p>
+      <w:pPr>
+        <w:spacing w:after="80"/>
+        <w:ind w:left="400"/>
+      </w:pPr>
+      <w:r>
+        <w:rPr>
+          <w:rFonts w:ascii="Arial" w:cs="Arial" w:eastAsia="Arial" w:hAnsi="Arial"/>
+          <w:b/>
+          <w:bCs/>
+          <w:sz w:val="20"/>
+          <w:szCs w:val="20"/>
+        </w:rPr>
+        <w:t xml:space="preserve">C. </w:t>
+      </w:r>
+      <w:r>
+        <w:rPr>
+          <w:rFonts w:ascii="Arial" w:cs="Arial" w:eastAsia="Arial" w:hAnsi="Arial"/>
+          <w:sz w:val="20"/>
+          <w:szCs w:val="20"/>
+        </w:rPr>
         <w:t xml:space="preserve">Protokol tersebut mewajibkan daerah lain memiliki luas wilayah, jumlah penduduk, dan letak geografis yang persis identik dengan Kota Delta.</w:t>
-      </w:r>
-    </w:p>
-    <w:p>
-      <w:pPr>
-        <w:spacing w:after="80"/>
-        <w:ind w:left="400"/>
-      </w:pPr>
-      <w:r>
-        <w:rPr>
-          <w:rFonts w:ascii="Arial" w:cs="Arial" w:eastAsia="Arial" w:hAnsi="Arial"/>
-          <w:b/>
-          <w:bCs/>
-          <w:sz w:val="20"/>
-          <w:szCs w:val="20"/>
-        </w:rPr>
-        <w:t xml:space="preserve">B. </w:t>
-      </w:r>
-      <w:r>
-        <w:rPr>
-          <w:rFonts w:ascii="Arial" w:cs="Arial" w:eastAsia="Arial" w:hAnsi="Arial"/>
-          <w:sz w:val="20"/>
-          <w:szCs w:val="20"/>
-        </w:rPr>
-        <w:t xml:space="preserve">Protokol dibuat sangat rahasia sehingga hanya dapat dibeli oleh pemerintah kota yang memiliki anggaran miliaran rupiah.</w:t>
-      </w:r>
-    </w:p>
-    <w:p>
-      <w:pPr>
-        <w:spacing w:after="80"/>
-        <w:ind w:left="400"/>
-      </w:pPr>
-      <w:r>
-        <w:rPr>
-          <w:rFonts w:ascii="Arial" w:cs="Arial" w:eastAsia="Arial" w:hAnsi="Arial"/>
-          <w:b/>
-          <w:bCs/>
-          <w:sz w:val="20"/>
-          <w:szCs w:val="20"/>
-        </w:rPr>
-        <w:t xml:space="preserve">C. </w:t>
-      </w:r>
-      <w:r>
-        <w:rPr>
-          <w:rFonts w:ascii="Arial" w:cs="Arial" w:eastAsia="Arial" w:hAnsi="Arial"/>
-          <w:sz w:val="20"/>
-          <w:szCs w:val="20"/>
-        </w:rPr>
-        <w:t xml:space="preserve">Protokol dirumuskan sebagai model algoritmik abstrak berbasis logika data empiris yang dapat disesuaikan parameter lokalnya di daerah lain tanpa mengubah esensi kerangka kerjanya.</w:t>
       </w:r>
     </w:p>
     <w:p>
@@ -3400,103 +3400,103 @@
           <w:sz w:val="20"/>
           <w:szCs w:val="20"/>
         </w:rPr>
+        <w:t xml:space="preserve">Tingginya kadar timbal pada sedimen muara sungai yang berdekatan dengan saluran pembuangan akhir pabrik aki kendaraan.</w:t>
+      </w:r>
+    </w:p>
+    <w:p>
+      <w:pPr>
+        <w:spacing w:after="80"/>
+        <w:ind w:left="400"/>
+      </w:pPr>
+      <w:r>
+        <w:rPr>
+          <w:rFonts w:ascii="Arial" w:cs="Arial" w:eastAsia="Arial" w:hAnsi="Arial"/>
+          <w:b/>
+          <w:bCs/>
+          <w:sz w:val="20"/>
+          <w:szCs w:val="20"/>
+        </w:rPr>
+        <w:t xml:space="preserve">B. </w:t>
+      </w:r>
+      <w:r>
+        <w:rPr>
+          <w:rFonts w:ascii="Arial" w:cs="Arial" w:eastAsia="Arial" w:hAnsi="Arial"/>
+          <w:sz w:val="20"/>
+          <w:szCs w:val="20"/>
+        </w:rPr>
+        <w:t xml:space="preserve">Penyempitan penampang melintang sungai akibat sedimentasi lumpur yang menurunkan daya tampung volume aliran air.</w:t>
+      </w:r>
+    </w:p>
+    <w:p>
+      <w:pPr>
+        <w:spacing w:after="80"/>
+        <w:ind w:left="400"/>
+      </w:pPr>
+      <w:r>
+        <w:rPr>
+          <w:rFonts w:ascii="Arial" w:cs="Arial" w:eastAsia="Arial" w:hAnsi="Arial"/>
+          <w:b/>
+          <w:bCs/>
+          <w:sz w:val="20"/>
+          <w:szCs w:val="20"/>
+        </w:rPr>
+        <w:t xml:space="preserve">C. </w:t>
+      </w:r>
+      <w:r>
+        <w:rPr>
+          <w:rFonts w:ascii="Arial" w:cs="Arial" w:eastAsia="Arial" w:hAnsi="Arial"/>
+          <w:sz w:val="20"/>
+          <w:szCs w:val="20"/>
+        </w:rPr>
+        <w:t xml:space="preserve">Kenaikan muka air pasang rob laut Jawa yang menghambat laju pembuangan gravitasi aliran sungai menuju lepas pantai.</w:t>
+      </w:r>
+    </w:p>
+    <w:p>
+      <w:pPr>
+        <w:spacing w:after="80"/>
+        <w:ind w:left="400"/>
+      </w:pPr>
+      <w:r>
+        <w:rPr>
+          <w:rFonts w:ascii="Arial" w:cs="Arial" w:eastAsia="Arial" w:hAnsi="Arial"/>
+          <w:b/>
+          <w:bCs/>
+          <w:sz w:val="20"/>
+          <w:szCs w:val="20"/>
+        </w:rPr>
+        <w:t xml:space="preserve">D. </w:t>
+      </w:r>
+      <w:r>
+        <w:rPr>
+          <w:rFonts w:ascii="Arial" w:cs="Arial" w:eastAsia="Arial" w:hAnsi="Arial"/>
+          <w:sz w:val="20"/>
+          <w:szCs w:val="20"/>
+        </w:rPr>
+        <w:t xml:space="preserve">Kenaikan drastis jumlah penjualan jas hujan dan payung di pasar swalayan Kota Delta pada setiap minggu yang bersamaan dengan terjadinya banjir lumpur.</w:t>
+      </w:r>
+    </w:p>
+    <w:p>
+      <w:pPr>
+        <w:spacing w:after="80"/>
+        <w:ind w:left="400"/>
+      </w:pPr>
+      <w:r>
+        <w:rPr>
+          <w:rFonts w:ascii="Arial" w:cs="Arial" w:eastAsia="Arial" w:hAnsi="Arial"/>
+          <w:b/>
+          <w:bCs/>
+          <w:sz w:val="20"/>
+          <w:szCs w:val="20"/>
+        </w:rPr>
+        <w:t xml:space="preserve">E. </w:t>
+      </w:r>
+      <w:r>
+        <w:rPr>
+          <w:rFonts w:ascii="Arial" w:cs="Arial" w:eastAsia="Arial" w:hAnsi="Arial"/>
+          <w:sz w:val="20"/>
+          <w:szCs w:val="20"/>
+        </w:rPr>
         <w:t xml:space="preserve">Peningkatan laju erosi tanah di lereng hulu sungai Ciliwung akibat pembukaan hutan lindung menjadi kawasan villa komersial.</w:t>
-      </w:r>
-    </w:p>
-    <w:p>
-      <w:pPr>
-        <w:spacing w:after="80"/>
-        <w:ind w:left="400"/>
-      </w:pPr>
-      <w:r>
-        <w:rPr>
-          <w:rFonts w:ascii="Arial" w:cs="Arial" w:eastAsia="Arial" w:hAnsi="Arial"/>
-          <w:b/>
-          <w:bCs/>
-          <w:sz w:val="20"/>
-          <w:szCs w:val="20"/>
-        </w:rPr>
-        <w:t xml:space="preserve">B. </w:t>
-      </w:r>
-      <w:r>
-        <w:rPr>
-          <w:rFonts w:ascii="Arial" w:cs="Arial" w:eastAsia="Arial" w:hAnsi="Arial"/>
-          <w:sz w:val="20"/>
-          <w:szCs w:val="20"/>
-        </w:rPr>
-        <w:t xml:space="preserve">Tingginya kadar timbal pada sedimen muara sungai yang berdekatan dengan saluran pembuangan akhir pabrik aki kendaraan.</w:t>
-      </w:r>
-    </w:p>
-    <w:p>
-      <w:pPr>
-        <w:spacing w:after="80"/>
-        <w:ind w:left="400"/>
-      </w:pPr>
-      <w:r>
-        <w:rPr>
-          <w:rFonts w:ascii="Arial" w:cs="Arial" w:eastAsia="Arial" w:hAnsi="Arial"/>
-          <w:b/>
-          <w:bCs/>
-          <w:sz w:val="20"/>
-          <w:szCs w:val="20"/>
-        </w:rPr>
-        <w:t xml:space="preserve">C. </w:t>
-      </w:r>
-      <w:r>
-        <w:rPr>
-          <w:rFonts w:ascii="Arial" w:cs="Arial" w:eastAsia="Arial" w:hAnsi="Arial"/>
-          <w:sz w:val="20"/>
-          <w:szCs w:val="20"/>
-        </w:rPr>
-        <w:t xml:space="preserve">Penyempitan penampang melintang sungai akibat sedimentasi lumpur yang menurunkan daya tampung volume aliran air.</w:t>
-      </w:r>
-    </w:p>
-    <w:p>
-      <w:pPr>
-        <w:spacing w:after="80"/>
-        <w:ind w:left="400"/>
-      </w:pPr>
-      <w:r>
-        <w:rPr>
-          <w:rFonts w:ascii="Arial" w:cs="Arial" w:eastAsia="Arial" w:hAnsi="Arial"/>
-          <w:b/>
-          <w:bCs/>
-          <w:sz w:val="20"/>
-          <w:szCs w:val="20"/>
-        </w:rPr>
-        <w:t xml:space="preserve">D. </w:t>
-      </w:r>
-      <w:r>
-        <w:rPr>
-          <w:rFonts w:ascii="Arial" w:cs="Arial" w:eastAsia="Arial" w:hAnsi="Arial"/>
-          <w:sz w:val="20"/>
-          <w:szCs w:val="20"/>
-        </w:rPr>
-        <w:t xml:space="preserve">Kenaikan muka air pasang rob laut Jawa yang menghambat laju pembuangan gravitasi aliran sungai menuju lepas pantai.</w:t>
-      </w:r>
-    </w:p>
-    <w:p>
-      <w:pPr>
-        <w:spacing w:after="80"/>
-        <w:ind w:left="400"/>
-      </w:pPr>
-      <w:r>
-        <w:rPr>
-          <w:rFonts w:ascii="Arial" w:cs="Arial" w:eastAsia="Arial" w:hAnsi="Arial"/>
-          <w:b/>
-          <w:bCs/>
-          <w:sz w:val="20"/>
-          <w:szCs w:val="20"/>
-        </w:rPr>
-        <w:t xml:space="preserve">E. </w:t>
-      </w:r>
-      <w:r>
-        <w:rPr>
-          <w:rFonts w:ascii="Arial" w:cs="Arial" w:eastAsia="Arial" w:hAnsi="Arial"/>
-          <w:sz w:val="20"/>
-          <w:szCs w:val="20"/>
-        </w:rPr>
-        <w:t xml:space="preserve">Kenaikan drastis jumlah penjualan jas hujan dan payung di pasar swalayan Kota Delta pada setiap minggu yang bersamaan dengan terjadinya banjir lumpur.</w:t>
       </w:r>
     </w:p>
     <w:p>
@@ -3831,55 +3831,55 @@
           <w:sz w:val="20"/>
           <w:szCs w:val="20"/>
         </w:rPr>
+        <w:t xml:space="preserve">Meminta satpam pabrik untuk mengisi kuesioner kejujuran tentang volume limbah yang dibuang oleh pihak manajemen.</w:t>
+      </w:r>
+    </w:p>
+    <w:p>
+      <w:pPr>
+        <w:spacing w:after="80"/>
+        <w:ind w:left="400"/>
+      </w:pPr>
+      <w:r>
+        <w:rPr>
+          <w:rFonts w:ascii="Arial" w:cs="Arial" w:eastAsia="Arial" w:hAnsi="Arial"/>
+          <w:b/>
+          <w:bCs/>
+          <w:sz w:val="20"/>
+          <w:szCs w:val="20"/>
+        </w:rPr>
+        <w:t xml:space="preserve">B. </w:t>
+      </w:r>
+      <w:r>
+        <w:rPr>
+          <w:rFonts w:ascii="Arial" w:cs="Arial" w:eastAsia="Arial" w:hAnsi="Arial"/>
+          <w:sz w:val="20"/>
+          <w:szCs w:val="20"/>
+        </w:rPr>
+        <w:t xml:space="preserve">Memasang sensor telemetri kualitas air otomatis di pipa outlet pabrik yang mengirimkan log data kadar kromium secara realtime 24 jam ke server pusat pengawas.</w:t>
+      </w:r>
+    </w:p>
+    <w:p>
+      <w:pPr>
+        <w:spacing w:after="80"/>
+        <w:ind w:left="400"/>
+      </w:pPr>
+      <w:r>
+        <w:rPr>
+          <w:rFonts w:ascii="Arial" w:cs="Arial" w:eastAsia="Arial" w:hAnsi="Arial"/>
+          <w:b/>
+          <w:bCs/>
+          <w:sz w:val="20"/>
+          <w:szCs w:val="20"/>
+        </w:rPr>
+        <w:t xml:space="preserve">C. </w:t>
+      </w:r>
+      <w:r>
+        <w:rPr>
+          <w:rFonts w:ascii="Arial" w:cs="Arial" w:eastAsia="Arial" w:hAnsi="Arial"/>
+          <w:sz w:val="20"/>
+          <w:szCs w:val="20"/>
+        </w:rPr>
         <w:t xml:space="preserve">Mengirimkan surat peringatan tertulis setiap tiga bulan sekali melalui kantor pos tanpa melakukan pengambilan sampel air.</w:t>
-      </w:r>
-    </w:p>
-    <w:p>
-      <w:pPr>
-        <w:spacing w:after="80"/>
-        <w:ind w:left="400"/>
-      </w:pPr>
-      <w:r>
-        <w:rPr>
-          <w:rFonts w:ascii="Arial" w:cs="Arial" w:eastAsia="Arial" w:hAnsi="Arial"/>
-          <w:b/>
-          <w:bCs/>
-          <w:sz w:val="20"/>
-          <w:szCs w:val="20"/>
-        </w:rPr>
-        <w:t xml:space="preserve">B. </w:t>
-      </w:r>
-      <w:r>
-        <w:rPr>
-          <w:rFonts w:ascii="Arial" w:cs="Arial" w:eastAsia="Arial" w:hAnsi="Arial"/>
-          <w:sz w:val="20"/>
-          <w:szCs w:val="20"/>
-        </w:rPr>
-        <w:t xml:space="preserve">Meminta satpam pabrik untuk mengisi kuesioner kejujuran tentang volume limbah yang dibuang oleh pihak manajemen.</w:t>
-      </w:r>
-    </w:p>
-    <w:p>
-      <w:pPr>
-        <w:spacing w:after="80"/>
-        <w:ind w:left="400"/>
-      </w:pPr>
-      <w:r>
-        <w:rPr>
-          <w:rFonts w:ascii="Arial" w:cs="Arial" w:eastAsia="Arial" w:hAnsi="Arial"/>
-          <w:b/>
-          <w:bCs/>
-          <w:sz w:val="20"/>
-          <w:szCs w:val="20"/>
-        </w:rPr>
-        <w:t xml:space="preserve">C. </w:t>
-      </w:r>
-      <w:r>
-        <w:rPr>
-          <w:rFonts w:ascii="Arial" w:cs="Arial" w:eastAsia="Arial" w:hAnsi="Arial"/>
-          <w:sz w:val="20"/>
-          <w:szCs w:val="20"/>
-        </w:rPr>
-        <w:t xml:space="preserve">Memasang sensor telemetri kualitas air otomatis di pipa outlet pabrik yang mengirimkan log data kadar kromium secara realtime 24 jam ke server pusat pengawas.</w:t>
       </w:r>
     </w:p>
     <w:p>
@@ -4066,79 +4066,79 @@
           <w:sz w:val="20"/>
           <w:szCs w:val="20"/>
         </w:rPr>
+        <w:t xml:space="preserve">Abstraksi Parsial; mengabaikan seluruh desa di Sektor Utara karena kerusakannya dianggap terlalu sulit untuk dijangkau.</w:t>
+      </w:r>
+    </w:p>
+    <w:p>
+      <w:pPr>
+        <w:spacing w:after="80"/>
+        <w:ind w:left="400"/>
+      </w:pPr>
+      <w:r>
+        <w:rPr>
+          <w:rFonts w:ascii="Arial" w:cs="Arial" w:eastAsia="Arial" w:hAnsi="Arial"/>
+          <w:b/>
+          <w:bCs/>
+          <w:sz w:val="20"/>
+          <w:szCs w:val="20"/>
+        </w:rPr>
+        <w:t xml:space="preserve">B. </w:t>
+      </w:r>
+      <w:r>
+        <w:rPr>
+          <w:rFonts w:ascii="Arial" w:cs="Arial" w:eastAsia="Arial" w:hAnsi="Arial"/>
+          <w:sz w:val="20"/>
+          <w:szCs w:val="20"/>
+        </w:rPr>
+        <w:t xml:space="preserve">Algoritma Buta; memerintahkan pilot menerbangkan helikopter ke arah mana pun sesuai arah tiupan angin pagi hari.</w:t>
+      </w:r>
+    </w:p>
+    <w:p>
+      <w:pPr>
+        <w:spacing w:after="80"/>
+        <w:ind w:left="400"/>
+      </w:pPr>
+      <w:r>
+        <w:rPr>
+          <w:rFonts w:ascii="Arial" w:cs="Arial" w:eastAsia="Arial" w:hAnsi="Arial"/>
+          <w:b/>
+          <w:bCs/>
+          <w:sz w:val="20"/>
+          <w:szCs w:val="20"/>
+        </w:rPr>
+        <w:t xml:space="preserve">C. </w:t>
+      </w:r>
+      <w:r>
+        <w:rPr>
+          <w:rFonts w:ascii="Arial" w:cs="Arial" w:eastAsia="Arial" w:hAnsi="Arial"/>
+          <w:sz w:val="20"/>
+          <w:szCs w:val="20"/>
+        </w:rPr>
+        <w:t xml:space="preserve">Dekomposisi; mereduksi kompleksitas tantangan logistik 15 lokasi terisolasi menjadi 3 kluster terkelola berbasis derajat keparahan kerusakan dan skala prioritas.</w:t>
+      </w:r>
+    </w:p>
+    <w:p>
+      <w:pPr>
+        <w:spacing w:after="80"/>
+        <w:ind w:left="400"/>
+      </w:pPr>
+      <w:r>
+        <w:rPr>
+          <w:rFonts w:ascii="Arial" w:cs="Arial" w:eastAsia="Arial" w:hAnsi="Arial"/>
+          <w:b/>
+          <w:bCs/>
+          <w:sz w:val="20"/>
+          <w:szCs w:val="20"/>
+        </w:rPr>
+        <w:t xml:space="preserve">D. </w:t>
+      </w:r>
+      <w:r>
+        <w:rPr>
+          <w:rFonts w:ascii="Arial" w:cs="Arial" w:eastAsia="Arial" w:hAnsi="Arial"/>
+          <w:sz w:val="20"/>
+          <w:szCs w:val="20"/>
+        </w:rPr>
         <w:t xml:space="preserve">Pengenalan Pola Acak; mencampuradukkan data korban bencana tanpa memperhatikan tingkat kerusakan wilayah.</w:t>
-      </w:r>
-    </w:p>
-    <w:p>
-      <w:pPr>
-        <w:spacing w:after="80"/>
-        <w:ind w:left="400"/>
-      </w:pPr>
-      <w:r>
-        <w:rPr>
-          <w:rFonts w:ascii="Arial" w:cs="Arial" w:eastAsia="Arial" w:hAnsi="Arial"/>
-          <w:b/>
-          <w:bCs/>
-          <w:sz w:val="20"/>
-          <w:szCs w:val="20"/>
-        </w:rPr>
-        <w:t xml:space="preserve">B. </w:t>
-      </w:r>
-      <w:r>
-        <w:rPr>
-          <w:rFonts w:ascii="Arial" w:cs="Arial" w:eastAsia="Arial" w:hAnsi="Arial"/>
-          <w:sz w:val="20"/>
-          <w:szCs w:val="20"/>
-        </w:rPr>
-        <w:t xml:space="preserve">Abstraksi Parsial; mengabaikan seluruh desa di Sektor Utara karena kerusakannya dianggap terlalu sulit untuk dijangkau.</w:t>
-      </w:r>
-    </w:p>
-    <w:p>
-      <w:pPr>
-        <w:spacing w:after="80"/>
-        <w:ind w:left="400"/>
-      </w:pPr>
-      <w:r>
-        <w:rPr>
-          <w:rFonts w:ascii="Arial" w:cs="Arial" w:eastAsia="Arial" w:hAnsi="Arial"/>
-          <w:b/>
-          <w:bCs/>
-          <w:sz w:val="20"/>
-          <w:szCs w:val="20"/>
-        </w:rPr>
-        <w:t xml:space="preserve">C. </w:t>
-      </w:r>
-      <w:r>
-        <w:rPr>
-          <w:rFonts w:ascii="Arial" w:cs="Arial" w:eastAsia="Arial" w:hAnsi="Arial"/>
-          <w:sz w:val="20"/>
-          <w:szCs w:val="20"/>
-        </w:rPr>
-        <w:t xml:space="preserve">Algoritma Buta; memerintahkan pilot menerbangkan helikopter ke arah mana pun sesuai arah tiupan angin pagi hari.</w:t>
-      </w:r>
-    </w:p>
-    <w:p>
-      <w:pPr>
-        <w:spacing w:after="80"/>
-        <w:ind w:left="400"/>
-      </w:pPr>
-      <w:r>
-        <w:rPr>
-          <w:rFonts w:ascii="Arial" w:cs="Arial" w:eastAsia="Arial" w:hAnsi="Arial"/>
-          <w:b/>
-          <w:bCs/>
-          <w:sz w:val="20"/>
-          <w:szCs w:val="20"/>
-        </w:rPr>
-        <w:t xml:space="preserve">D. </w:t>
-      </w:r>
-      <w:r>
-        <w:rPr>
-          <w:rFonts w:ascii="Arial" w:cs="Arial" w:eastAsia="Arial" w:hAnsi="Arial"/>
-          <w:sz w:val="20"/>
-          <w:szCs w:val="20"/>
-        </w:rPr>
-        <w:t xml:space="preserve">Dekomposisi; mereduksi kompleksitas tantangan logistik 15 lokasi terisolasi menjadi 3 kluster terkelola berbasis derajat keparahan kerusakan dan skala prioritas.</w:t>
       </w:r>
     </w:p>
     <w:p>
@@ -4288,31 +4288,31 @@
           <w:sz w:val="20"/>
           <w:szCs w:val="20"/>
         </w:rPr>
+        <w:t xml:space="preserve">Mendorong Kapten Rina mengalokasikan seluruh (5) helikopter secara maksimal ke Sektor Utara pada pagi hari (06.00 - 10.00) sebelum batas jendela cuaca berkabut tertutup.</w:t>
+      </w:r>
+    </w:p>
+    <w:p>
+      <w:pPr>
+        <w:spacing w:after="80"/>
+        <w:ind w:left="400"/>
+      </w:pPr>
+      <w:r>
+        <w:rPr>
+          <w:rFonts w:ascii="Arial" w:cs="Arial" w:eastAsia="Arial" w:hAnsi="Arial"/>
+          <w:b/>
+          <w:bCs/>
+          <w:sz w:val="20"/>
+          <w:szCs w:val="20"/>
+        </w:rPr>
+        <w:t xml:space="preserve">B. </w:t>
+      </w:r>
+      <w:r>
+        <w:rPr>
+          <w:rFonts w:ascii="Arial" w:cs="Arial" w:eastAsia="Arial" w:hAnsi="Arial"/>
+          <w:sz w:val="20"/>
+          <w:szCs w:val="20"/>
+        </w:rPr>
         <w:t xml:space="preserve">Menyebabkan operasi penerbangan ke Sektor Utara dibatalkan sama sekali demi melindungi keselamatan helikopter dari tetesan air kabut.</w:t>
-      </w:r>
-    </w:p>
-    <w:p>
-      <w:pPr>
-        <w:spacing w:after="80"/>
-        <w:ind w:left="400"/>
-      </w:pPr>
-      <w:r>
-        <w:rPr>
-          <w:rFonts w:ascii="Arial" w:cs="Arial" w:eastAsia="Arial" w:hAnsi="Arial"/>
-          <w:b/>
-          <w:bCs/>
-          <w:sz w:val="20"/>
-          <w:szCs w:val="20"/>
-        </w:rPr>
-        <w:t xml:space="preserve">B. </w:t>
-      </w:r>
-      <w:r>
-        <w:rPr>
-          <w:rFonts w:ascii="Arial" w:cs="Arial" w:eastAsia="Arial" w:hAnsi="Arial"/>
-          <w:sz w:val="20"/>
-          <w:szCs w:val="20"/>
-        </w:rPr>
-        <w:t xml:space="preserve">Mendorong Kapten Rina mengalokasikan seluruh (5) helikopter secara maksimal ke Sektor Utara pada pagi hari (06.00 - 10.00) sebelum batas jendela cuaca berkabut tertutup.</w:t>
       </w:r>
     </w:p>
     <w:p>
@@ -4510,103 +4510,103 @@
           <w:sz w:val="20"/>
           <w:szCs w:val="20"/>
         </w:rPr>
+        <w:t xml:space="preserve">Algoritma Buta; mengabaikan seluruh permintaan bantuan dan membiarkan helikopter terbang dalam keadaan kosong tanpa muatan.</w:t>
+      </w:r>
+    </w:p>
+    <w:p>
+      <w:pPr>
+        <w:spacing w:after="80"/>
+        <w:ind w:left="400"/>
+      </w:pPr>
+      <w:r>
+        <w:rPr>
+          <w:rFonts w:ascii="Arial" w:cs="Arial" w:eastAsia="Arial" w:hAnsi="Arial"/>
+          <w:b/>
+          <w:bCs/>
+          <w:sz w:val="20"/>
+          <w:szCs w:val="20"/>
+        </w:rPr>
+        <w:t xml:space="preserve">B. </w:t>
+      </w:r>
+      <w:r>
+        <w:rPr>
+          <w:rFonts w:ascii="Arial" w:cs="Arial" w:eastAsia="Arial" w:hAnsi="Arial"/>
+          <w:sz w:val="20"/>
+          <w:szCs w:val="20"/>
+        </w:rPr>
+        <w:t xml:space="preserve">Pengenalan Pola; menyimpulkan bahwa seluruh korban bencana gempa bumi tidak membutuhkan pakaian dan obat-obatan.</w:t>
+      </w:r>
+    </w:p>
+    <w:p>
+      <w:pPr>
+        <w:spacing w:after="80"/>
+        <w:ind w:left="400"/>
+      </w:pPr>
+      <w:r>
+        <w:rPr>
+          <w:rFonts w:ascii="Arial" w:cs="Arial" w:eastAsia="Arial" w:hAnsi="Arial"/>
+          <w:b/>
+          <w:bCs/>
+          <w:sz w:val="20"/>
+          <w:szCs w:val="20"/>
+        </w:rPr>
+        <w:t xml:space="preserve">C. </w:t>
+      </w:r>
+      <w:r>
+        <w:rPr>
+          <w:rFonts w:ascii="Arial" w:cs="Arial" w:eastAsia="Arial" w:hAnsi="Arial"/>
+          <w:sz w:val="20"/>
+          <w:szCs w:val="20"/>
+        </w:rPr>
+        <w:t xml:space="preserve">Otomatisasi Kargo; memprogram helikopter untuk menjatuhkan barang donasi di atas perairan danau tanpa parasut penerjun.</w:t>
+      </w:r>
+    </w:p>
+    <w:p>
+      <w:pPr>
+        <w:spacing w:after="80"/>
+        <w:ind w:left="400"/>
+      </w:pPr>
+      <w:r>
+        <w:rPr>
+          <w:rFonts w:ascii="Arial" w:cs="Arial" w:eastAsia="Arial" w:hAnsi="Arial"/>
+          <w:b/>
+          <w:bCs/>
+          <w:sz w:val="20"/>
+          <w:szCs w:val="20"/>
+        </w:rPr>
+        <w:t xml:space="preserve">D. </w:t>
+      </w:r>
+      <w:r>
+        <w:rPr>
+          <w:rFonts w:ascii="Arial" w:cs="Arial" w:eastAsia="Arial" w:hAnsi="Arial"/>
+          <w:sz w:val="20"/>
+          <w:szCs w:val="20"/>
+        </w:rPr>
+        <w:t xml:space="preserve">Abstraksi; membuang barang non-kritis dan memprioritaskan muatan penyelamat nyawa (life-saving) karena payload dan volume kargo helikopter sangat terbatas pada fase kritis 72 jam pertama.</w:t>
+      </w:r>
+    </w:p>
+    <w:p>
+      <w:pPr>
+        <w:spacing w:after="80"/>
+        <w:ind w:left="400"/>
+      </w:pPr>
+      <w:r>
+        <w:rPr>
+          <w:rFonts w:ascii="Arial" w:cs="Arial" w:eastAsia="Arial" w:hAnsi="Arial"/>
+          <w:b/>
+          <w:bCs/>
+          <w:sz w:val="20"/>
+          <w:szCs w:val="20"/>
+        </w:rPr>
+        <w:t xml:space="preserve">E. </w:t>
+      </w:r>
+      <w:r>
+        <w:rPr>
+          <w:rFonts w:ascii="Arial" w:cs="Arial" w:eastAsia="Arial" w:hAnsi="Arial"/>
+          <w:sz w:val="20"/>
+          <w:szCs w:val="20"/>
+        </w:rPr>
         <w:t xml:space="preserve">Dekomposisi; membagikan mainan anak-anak terlebih dahulu agar korban bencana tidak mengalami kesedihan berlarut-larut.</w:t>
-      </w:r>
-    </w:p>
-    <w:p>
-      <w:pPr>
-        <w:spacing w:after="80"/>
-        <w:ind w:left="400"/>
-      </w:pPr>
-      <w:r>
-        <w:rPr>
-          <w:rFonts w:ascii="Arial" w:cs="Arial" w:eastAsia="Arial" w:hAnsi="Arial"/>
-          <w:b/>
-          <w:bCs/>
-          <w:sz w:val="20"/>
-          <w:szCs w:val="20"/>
-        </w:rPr>
-        <w:t xml:space="preserve">B. </w:t>
-      </w:r>
-      <w:r>
-        <w:rPr>
-          <w:rFonts w:ascii="Arial" w:cs="Arial" w:eastAsia="Arial" w:hAnsi="Arial"/>
-          <w:sz w:val="20"/>
-          <w:szCs w:val="20"/>
-        </w:rPr>
-        <w:t xml:space="preserve">Algoritma Buta; mengabaikan seluruh permintaan bantuan dan membiarkan helikopter terbang dalam keadaan kosong tanpa muatan.</w:t>
-      </w:r>
-    </w:p>
-    <w:p>
-      <w:pPr>
-        <w:spacing w:after="80"/>
-        <w:ind w:left="400"/>
-      </w:pPr>
-      <w:r>
-        <w:rPr>
-          <w:rFonts w:ascii="Arial" w:cs="Arial" w:eastAsia="Arial" w:hAnsi="Arial"/>
-          <w:b/>
-          <w:bCs/>
-          <w:sz w:val="20"/>
-          <w:szCs w:val="20"/>
-        </w:rPr>
-        <w:t xml:space="preserve">C. </w:t>
-      </w:r>
-      <w:r>
-        <w:rPr>
-          <w:rFonts w:ascii="Arial" w:cs="Arial" w:eastAsia="Arial" w:hAnsi="Arial"/>
-          <w:sz w:val="20"/>
-          <w:szCs w:val="20"/>
-        </w:rPr>
-        <w:t xml:space="preserve">Pengenalan Pola; menyimpulkan bahwa seluruh korban bencana gempa bumi tidak membutuhkan pakaian dan obat-obatan.</w:t>
-      </w:r>
-    </w:p>
-    <w:p>
-      <w:pPr>
-        <w:spacing w:after="80"/>
-        <w:ind w:left="400"/>
-      </w:pPr>
-      <w:r>
-        <w:rPr>
-          <w:rFonts w:ascii="Arial" w:cs="Arial" w:eastAsia="Arial" w:hAnsi="Arial"/>
-          <w:b/>
-          <w:bCs/>
-          <w:sz w:val="20"/>
-          <w:szCs w:val="20"/>
-        </w:rPr>
-        <w:t xml:space="preserve">D. </w:t>
-      </w:r>
-      <w:r>
-        <w:rPr>
-          <w:rFonts w:ascii="Arial" w:cs="Arial" w:eastAsia="Arial" w:hAnsi="Arial"/>
-          <w:sz w:val="20"/>
-          <w:szCs w:val="20"/>
-        </w:rPr>
-        <w:t xml:space="preserve">Otomatisasi Kargo; memprogram helikopter untuk menjatuhkan barang donasi di atas perairan danau tanpa parasut penerjun.</w:t>
-      </w:r>
-    </w:p>
-    <w:p>
-      <w:pPr>
-        <w:spacing w:after="80"/>
-        <w:ind w:left="400"/>
-      </w:pPr>
-      <w:r>
-        <w:rPr>
-          <w:rFonts w:ascii="Arial" w:cs="Arial" w:eastAsia="Arial" w:hAnsi="Arial"/>
-          <w:b/>
-          <w:bCs/>
-          <w:sz w:val="20"/>
-          <w:szCs w:val="20"/>
-        </w:rPr>
-        <w:t xml:space="preserve">E. </w:t>
-      </w:r>
-      <w:r>
-        <w:rPr>
-          <w:rFonts w:ascii="Arial" w:cs="Arial" w:eastAsia="Arial" w:hAnsi="Arial"/>
-          <w:sz w:val="20"/>
-          <w:szCs w:val="20"/>
-        </w:rPr>
-        <w:t xml:space="preserve">Abstraksi; membuang barang non-kritis dan memprioritaskan muatan penyelamat nyawa (life-saving) karena payload dan volume kargo helikopter sangat terbatas pada fase kritis 72 jam pertama.</w:t>
       </w:r>
     </w:p>
     <w:p>
@@ -5006,79 +5006,79 @@
           <w:sz w:val="20"/>
           <w:szCs w:val="20"/>
         </w:rPr>
+        <w:t xml:space="preserve">Penduduk di Sektor Tengah akan menerima makanan instan dalam kondisi terlalu panas akibat panas mesin helikopter.</w:t>
+      </w:r>
+    </w:p>
+    <w:p>
+      <w:pPr>
+        <w:spacing w:after="80"/>
+        <w:ind w:left="400"/>
+      </w:pPr>
+      <w:r>
+        <w:rPr>
+          <w:rFonts w:ascii="Arial" w:cs="Arial" w:eastAsia="Arial" w:hAnsi="Arial"/>
+          <w:b/>
+          <w:bCs/>
+          <w:sz w:val="20"/>
+          <w:szCs w:val="20"/>
+        </w:rPr>
+        <w:t xml:space="preserve">B. </w:t>
+      </w:r>
+      <w:r>
+        <w:rPr>
+          <w:rFonts w:ascii="Arial" w:cs="Arial" w:eastAsia="Arial" w:hAnsi="Arial"/>
+          <w:sz w:val="20"/>
+          <w:szCs w:val="20"/>
+        </w:rPr>
+        <w:t xml:space="preserve">Cuaca buruk di sore hari akan tertunda kemunculannya hingga pengisian bahan bakar dilakukan pada malam hari.</w:t>
+      </w:r>
+    </w:p>
+    <w:p>
+      <w:pPr>
+        <w:spacing w:after="80"/>
+        <w:ind w:left="400"/>
+      </w:pPr>
+      <w:r>
+        <w:rPr>
+          <w:rFonts w:ascii="Arial" w:cs="Arial" w:eastAsia="Arial" w:hAnsi="Arial"/>
+          <w:b/>
+          <w:bCs/>
+          <w:sz w:val="20"/>
+          <w:szCs w:val="20"/>
+        </w:rPr>
+        <w:t xml:space="preserve">C. </w:t>
+      </w:r>
+      <w:r>
+        <w:rPr>
+          <w:rFonts w:ascii="Arial" w:cs="Arial" w:eastAsia="Arial" w:hAnsi="Arial"/>
+          <w:sz w:val="20"/>
+          <w:szCs w:val="20"/>
+        </w:rPr>
+        <w:t xml:space="preserve">Kehabisan daya sumber energi di tengah rute penerbangan sesi kedua (Resource Depletion), yang memicu insiden kecelakaan fatal dan kegagalan total seluruh misi kemanusiaan.</w:t>
+      </w:r>
+    </w:p>
+    <w:p>
+      <w:pPr>
+        <w:spacing w:after="80"/>
+        <w:ind w:left="400"/>
+      </w:pPr>
+      <w:r>
+        <w:rPr>
+          <w:rFonts w:ascii="Arial" w:cs="Arial" w:eastAsia="Arial" w:hAnsi="Arial"/>
+          <w:b/>
+          <w:bCs/>
+          <w:sz w:val="20"/>
+          <w:szCs w:val="20"/>
+        </w:rPr>
+        <w:t xml:space="preserve">D. </w:t>
+      </w:r>
+      <w:r>
+        <w:rPr>
+          <w:rFonts w:ascii="Arial" w:cs="Arial" w:eastAsia="Arial" w:hAnsi="Arial"/>
+          <w:sz w:val="20"/>
+          <w:szCs w:val="20"/>
+        </w:rPr>
         <w:t xml:space="preserve">Helikopter akan terbang lebih kencang karena muatan bahan bakar di dalam tangki menjadi kosong dan ringan.</w:t>
-      </w:r>
-    </w:p>
-    <w:p>
-      <w:pPr>
-        <w:spacing w:after="80"/>
-        <w:ind w:left="400"/>
-      </w:pPr>
-      <w:r>
-        <w:rPr>
-          <w:rFonts w:ascii="Arial" w:cs="Arial" w:eastAsia="Arial" w:hAnsi="Arial"/>
-          <w:b/>
-          <w:bCs/>
-          <w:sz w:val="20"/>
-          <w:szCs w:val="20"/>
-        </w:rPr>
-        <w:t xml:space="preserve">B. </w:t>
-      </w:r>
-      <w:r>
-        <w:rPr>
-          <w:rFonts w:ascii="Arial" w:cs="Arial" w:eastAsia="Arial" w:hAnsi="Arial"/>
-          <w:sz w:val="20"/>
-          <w:szCs w:val="20"/>
-        </w:rPr>
-        <w:t xml:space="preserve">Penduduk di Sektor Tengah akan menerima makanan instan dalam kondisi terlalu panas akibat panas mesin helikopter.</w:t>
-      </w:r>
-    </w:p>
-    <w:p>
-      <w:pPr>
-        <w:spacing w:after="80"/>
-        <w:ind w:left="400"/>
-      </w:pPr>
-      <w:r>
-        <w:rPr>
-          <w:rFonts w:ascii="Arial" w:cs="Arial" w:eastAsia="Arial" w:hAnsi="Arial"/>
-          <w:b/>
-          <w:bCs/>
-          <w:sz w:val="20"/>
-          <w:szCs w:val="20"/>
-        </w:rPr>
-        <w:t xml:space="preserve">C. </w:t>
-      </w:r>
-      <w:r>
-        <w:rPr>
-          <w:rFonts w:ascii="Arial" w:cs="Arial" w:eastAsia="Arial" w:hAnsi="Arial"/>
-          <w:sz w:val="20"/>
-          <w:szCs w:val="20"/>
-        </w:rPr>
-        <w:t xml:space="preserve">Cuaca buruk di sore hari akan tertunda kemunculannya hingga pengisian bahan bakar dilakukan pada malam hari.</w:t>
-      </w:r>
-    </w:p>
-    <w:p>
-      <w:pPr>
-        <w:spacing w:after="80"/>
-        <w:ind w:left="400"/>
-      </w:pPr>
-      <w:r>
-        <w:rPr>
-          <w:rFonts w:ascii="Arial" w:cs="Arial" w:eastAsia="Arial" w:hAnsi="Arial"/>
-          <w:b/>
-          <w:bCs/>
-          <w:sz w:val="20"/>
-          <w:szCs w:val="20"/>
-        </w:rPr>
-        <w:t xml:space="preserve">D. </w:t>
-      </w:r>
-      <w:r>
-        <w:rPr>
-          <w:rFonts w:ascii="Arial" w:cs="Arial" w:eastAsia="Arial" w:hAnsi="Arial"/>
-          <w:sz w:val="20"/>
-          <w:szCs w:val="20"/>
-        </w:rPr>
-        <w:t xml:space="preserve">Kehabisan daya sumber energi di tengah rute penerbangan sesi kedua (Resource Depletion), yang memicu insiden kecelakaan fatal dan kegagalan total seluruh misi kemanusiaan.</w:t>
       </w:r>
     </w:p>
     <w:p>
@@ -5228,31 +5228,31 @@
           <w:sz w:val="20"/>
           <w:szCs w:val="20"/>
         </w:rPr>
+        <w:t xml:space="preserve">Menerapkan batas toleransi keamanan (safety threshold) untuk mencegah risiko kerugian aset total akibat cuaca buruk dan menjamin kesiapan armada untuk beroperasi kembali keesokan paginya.</w:t>
+      </w:r>
+    </w:p>
+    <w:p>
+      <w:pPr>
+        <w:spacing w:after="80"/>
+        <w:ind w:left="400"/>
+      </w:pPr>
+      <w:r>
+        <w:rPr>
+          <w:rFonts w:ascii="Arial" w:cs="Arial" w:eastAsia="Arial" w:hAnsi="Arial"/>
+          <w:b/>
+          <w:bCs/>
+          <w:sz w:val="20"/>
+          <w:szCs w:val="20"/>
+        </w:rPr>
+        <w:t xml:space="preserve">B. </w:t>
+      </w:r>
+      <w:r>
+        <w:rPr>
+          <w:rFonts w:ascii="Arial" w:cs="Arial" w:eastAsia="Arial" w:hAnsi="Arial"/>
+          <w:sz w:val="20"/>
+          <w:szCs w:val="20"/>
+        </w:rPr>
         <w:t xml:space="preserve">Memberi kesempatan kepada Kapten Rina untuk meninggalkan lokasi posko bencana dan berlibur ke luar kota pegunungan.</w:t>
-      </w:r>
-    </w:p>
-    <w:p>
-      <w:pPr>
-        <w:spacing w:after="80"/>
-        <w:ind w:left="400"/>
-      </w:pPr>
-      <w:r>
-        <w:rPr>
-          <w:rFonts w:ascii="Arial" w:cs="Arial" w:eastAsia="Arial" w:hAnsi="Arial"/>
-          <w:b/>
-          <w:bCs/>
-          <w:sz w:val="20"/>
-          <w:szCs w:val="20"/>
-        </w:rPr>
-        <w:t xml:space="preserve">B. </w:t>
-      </w:r>
-      <w:r>
-        <w:rPr>
-          <w:rFonts w:ascii="Arial" w:cs="Arial" w:eastAsia="Arial" w:hAnsi="Arial"/>
-          <w:sz w:val="20"/>
-          <w:szCs w:val="20"/>
-        </w:rPr>
-        <w:t xml:space="preserve">Menerapkan batas toleransi keamanan (safety threshold) untuk mencegah risiko kerugian aset total akibat cuaca buruk dan menjamin kesiapan armada untuk beroperasi kembali keesokan paginya.</w:t>
       </w:r>
     </w:p>
     <w:p>
@@ -5450,55 +5450,55 @@
           <w:sz w:val="20"/>
           <w:szCs w:val="20"/>
         </w:rPr>
+        <w:t xml:space="preserve">Keduanya membagi daerah krisis menjadi sepuluh zona acak tanpa menggunakan data historis bencana masa lalu.</w:t>
+      </w:r>
+    </w:p>
+    <w:p>
+      <w:pPr>
+        <w:spacing w:after="80"/>
+        <w:ind w:left="400"/>
+      </w:pPr>
+      <w:r>
+        <w:rPr>
+          <w:rFonts w:ascii="Arial" w:cs="Arial" w:eastAsia="Arial" w:hAnsi="Arial"/>
+          <w:b/>
+          <w:bCs/>
+          <w:sz w:val="20"/>
+          <w:szCs w:val="20"/>
+        </w:rPr>
+        <w:t xml:space="preserve">B. </w:t>
+      </w:r>
+      <w:r>
+        <w:rPr>
+          <w:rFonts w:ascii="Arial" w:cs="Arial" w:eastAsia="Arial" w:hAnsi="Arial"/>
+          <w:sz w:val="20"/>
+          <w:szCs w:val="20"/>
+        </w:rPr>
+        <w:t xml:space="preserve">Keduanya secara disiplin menyaring dan membuang elemen non-kritis (pabrik non-B3 oleh Dr. Aris, dan barang non-medis oleh Kapten Rina) demi memusatkan kapasitas terbatas pada faktor penyelamat hidup utama.</w:t>
+      </w:r>
+    </w:p>
+    <w:p>
+      <w:pPr>
+        <w:spacing w:after="80"/>
+        <w:ind w:left="400"/>
+      </w:pPr>
+      <w:r>
+        <w:rPr>
+          <w:rFonts w:ascii="Arial" w:cs="Arial" w:eastAsia="Arial" w:hAnsi="Arial"/>
+          <w:b/>
+          <w:bCs/>
+          <w:sz w:val="20"/>
+          <w:szCs w:val="20"/>
+        </w:rPr>
+        <w:t xml:space="preserve">C. </w:t>
+      </w:r>
+      <w:r>
+        <w:rPr>
+          <w:rFonts w:ascii="Arial" w:cs="Arial" w:eastAsia="Arial" w:hAnsi="Arial"/>
+          <w:sz w:val="20"/>
+          <w:szCs w:val="20"/>
+        </w:rPr>
         <w:t xml:space="preserve">Keduanya menolak menggunakan bantuan teknologi komputer dan hanya mengandalkan firasat batin dalam memimpin operasi penyelamatan.</w:t>
-      </w:r>
-    </w:p>
-    <w:p>
-      <w:pPr>
-        <w:spacing w:after="80"/>
-        <w:ind w:left="400"/>
-      </w:pPr>
-      <w:r>
-        <w:rPr>
-          <w:rFonts w:ascii="Arial" w:cs="Arial" w:eastAsia="Arial" w:hAnsi="Arial"/>
-          <w:b/>
-          <w:bCs/>
-          <w:sz w:val="20"/>
-          <w:szCs w:val="20"/>
-        </w:rPr>
-        <w:t xml:space="preserve">B. </w:t>
-      </w:r>
-      <w:r>
-        <w:rPr>
-          <w:rFonts w:ascii="Arial" w:cs="Arial" w:eastAsia="Arial" w:hAnsi="Arial"/>
-          <w:sz w:val="20"/>
-          <w:szCs w:val="20"/>
-        </w:rPr>
-        <w:t xml:space="preserve">Keduanya membagi daerah krisis menjadi sepuluh zona acak tanpa menggunakan data historis bencana masa lalu.</w:t>
-      </w:r>
-    </w:p>
-    <w:p>
-      <w:pPr>
-        <w:spacing w:after="80"/>
-        <w:ind w:left="400"/>
-      </w:pPr>
-      <w:r>
-        <w:rPr>
-          <w:rFonts w:ascii="Arial" w:cs="Arial" w:eastAsia="Arial" w:hAnsi="Arial"/>
-          <w:b/>
-          <w:bCs/>
-          <w:sz w:val="20"/>
-          <w:szCs w:val="20"/>
-        </w:rPr>
-        <w:t xml:space="preserve">C. </w:t>
-      </w:r>
-      <w:r>
-        <w:rPr>
-          <w:rFonts w:ascii="Arial" w:cs="Arial" w:eastAsia="Arial" w:hAnsi="Arial"/>
-          <w:sz w:val="20"/>
-          <w:szCs w:val="20"/>
-        </w:rPr>
-        <w:t xml:space="preserve">Keduanya secara disiplin menyaring dan membuang elemen non-kritis (pabrik non-B3 oleh Dr. Aris, dan barang non-medis oleh Kapten Rina) demi memusatkan kapasitas terbatas pada faktor penyelamat hidup utama.</w:t>
       </w:r>
     </w:p>
     <w:p>
@@ -5672,103 +5672,103 @@
           <w:sz w:val="20"/>
           <w:szCs w:val="20"/>
         </w:rPr>
+        <w:t xml:space="preserve">Dekomposisi pada operasi tanggap bencana alam selalu gagal jika tidak menggunakan rumus matematika diferensial integral.</w:t>
+      </w:r>
+    </w:p>
+    <w:p>
+      <w:pPr>
+        <w:spacing w:after="80"/>
+        <w:ind w:left="400"/>
+      </w:pPr>
+      <w:r>
+        <w:rPr>
+          <w:rFonts w:ascii="Arial" w:cs="Arial" w:eastAsia="Arial" w:hAnsi="Arial"/>
+          <w:b/>
+          <w:bCs/>
+          <w:sz w:val="20"/>
+          <w:szCs w:val="20"/>
+        </w:rPr>
+        <w:t xml:space="preserve">B. </w:t>
+      </w:r>
+      <w:r>
+        <w:rPr>
+          <w:rFonts w:ascii="Arial" w:cs="Arial" w:eastAsia="Arial" w:hAnsi="Arial"/>
+          <w:sz w:val="20"/>
+          <w:szCs w:val="20"/>
+        </w:rPr>
+        <w:t xml:space="preserve">Dekomposisi fungsional sains lingkungan tidak boleh digabungkan dengan dekomposisi geografis dalam satu sistem pemerintahan.</w:t>
+      </w:r>
+    </w:p>
+    <w:p>
+      <w:pPr>
+        <w:spacing w:after="80"/>
+        <w:ind w:left="400"/>
+      </w:pPr>
+      <w:r>
+        <w:rPr>
+          <w:rFonts w:ascii="Arial" w:cs="Arial" w:eastAsia="Arial" w:hAnsi="Arial"/>
+          <w:b/>
+          <w:bCs/>
+          <w:sz w:val="20"/>
+          <w:szCs w:val="20"/>
+        </w:rPr>
+        <w:t xml:space="preserve">C. </w:t>
+      </w:r>
+      <w:r>
+        <w:rPr>
+          <w:rFonts w:ascii="Arial" w:cs="Arial" w:eastAsia="Arial" w:hAnsi="Arial"/>
+          <w:sz w:val="20"/>
+          <w:szCs w:val="20"/>
+        </w:rPr>
+        <w:t xml:space="preserve">Dekomposisi harus selalu menghasilkan bagian-bagian yang dikerjakan oleh robot tanpa keterlibatan tenaga manusia.</w:t>
+      </w:r>
+    </w:p>
+    <w:p>
+      <w:pPr>
+        <w:spacing w:after="80"/>
+        <w:ind w:left="400"/>
+      </w:pPr>
+      <w:r>
+        <w:rPr>
+          <w:rFonts w:ascii="Arial" w:cs="Arial" w:eastAsia="Arial" w:hAnsi="Arial"/>
+          <w:b/>
+          <w:bCs/>
+          <w:sz w:val="20"/>
+          <w:szCs w:val="20"/>
+        </w:rPr>
+        <w:t xml:space="preserve">D. </w:t>
+      </w:r>
+      <w:r>
+        <w:rPr>
+          <w:rFonts w:ascii="Arial" w:cs="Arial" w:eastAsia="Arial" w:hAnsi="Arial"/>
+          <w:sz w:val="20"/>
+          <w:szCs w:val="20"/>
+        </w:rPr>
+        <w:t xml:space="preserve">Dekomposisi dapat diterapkan melalui berbagai dimensi pemotongan (fungsional, spasial/geografis, kronologis, atau derajat keparahan), disesuaikan dengan arsitektur masalah dan tujuan operasional.</w:t>
+      </w:r>
+    </w:p>
+    <w:p>
+      <w:pPr>
+        <w:spacing w:after="80"/>
+        <w:ind w:left="400"/>
+      </w:pPr>
+      <w:r>
+        <w:rPr>
+          <w:rFonts w:ascii="Arial" w:cs="Arial" w:eastAsia="Arial" w:hAnsi="Arial"/>
+          <w:b/>
+          <w:bCs/>
+          <w:sz w:val="20"/>
+          <w:szCs w:val="20"/>
+        </w:rPr>
+        <w:t xml:space="preserve">E. </w:t>
+      </w:r>
+      <w:r>
+        <w:rPr>
+          <w:rFonts w:ascii="Arial" w:cs="Arial" w:eastAsia="Arial" w:hAnsi="Arial"/>
+          <w:sz w:val="20"/>
+          <w:szCs w:val="20"/>
+        </w:rPr>
         <w:t xml:space="preserve">Dekomposisi hanya sah dan benar jika membagi daerah menjadi tiga sektor geografis yang berbentuk bujur sangkar sempurna.</w:t>
-      </w:r>
-    </w:p>
-    <w:p>
-      <w:pPr>
-        <w:spacing w:after="80"/>
-        <w:ind w:left="400"/>
-      </w:pPr>
-      <w:r>
-        <w:rPr>
-          <w:rFonts w:ascii="Arial" w:cs="Arial" w:eastAsia="Arial" w:hAnsi="Arial"/>
-          <w:b/>
-          <w:bCs/>
-          <w:sz w:val="20"/>
-          <w:szCs w:val="20"/>
-        </w:rPr>
-        <w:t xml:space="preserve">B. </w:t>
-      </w:r>
-      <w:r>
-        <w:rPr>
-          <w:rFonts w:ascii="Arial" w:cs="Arial" w:eastAsia="Arial" w:hAnsi="Arial"/>
-          <w:sz w:val="20"/>
-          <w:szCs w:val="20"/>
-        </w:rPr>
-        <w:t xml:space="preserve">Dekomposisi pada operasi tanggap bencana alam selalu gagal jika tidak menggunakan rumus matematika diferensial integral.</w:t>
-      </w:r>
-    </w:p>
-    <w:p>
-      <w:pPr>
-        <w:spacing w:after="80"/>
-        <w:ind w:left="400"/>
-      </w:pPr>
-      <w:r>
-        <w:rPr>
-          <w:rFonts w:ascii="Arial" w:cs="Arial" w:eastAsia="Arial" w:hAnsi="Arial"/>
-          <w:b/>
-          <w:bCs/>
-          <w:sz w:val="20"/>
-          <w:szCs w:val="20"/>
-        </w:rPr>
-        <w:t xml:space="preserve">C. </w:t>
-      </w:r>
-      <w:r>
-        <w:rPr>
-          <w:rFonts w:ascii="Arial" w:cs="Arial" w:eastAsia="Arial" w:hAnsi="Arial"/>
-          <w:sz w:val="20"/>
-          <w:szCs w:val="20"/>
-        </w:rPr>
-        <w:t xml:space="preserve">Dekomposisi fungsional sains lingkungan tidak boleh digabungkan dengan dekomposisi geografis dalam satu sistem pemerintahan.</w:t>
-      </w:r>
-    </w:p>
-    <w:p>
-      <w:pPr>
-        <w:spacing w:after="80"/>
-        <w:ind w:left="400"/>
-      </w:pPr>
-      <w:r>
-        <w:rPr>
-          <w:rFonts w:ascii="Arial" w:cs="Arial" w:eastAsia="Arial" w:hAnsi="Arial"/>
-          <w:b/>
-          <w:bCs/>
-          <w:sz w:val="20"/>
-          <w:szCs w:val="20"/>
-        </w:rPr>
-        <w:t xml:space="preserve">D. </w:t>
-      </w:r>
-      <w:r>
-        <w:rPr>
-          <w:rFonts w:ascii="Arial" w:cs="Arial" w:eastAsia="Arial" w:hAnsi="Arial"/>
-          <w:sz w:val="20"/>
-          <w:szCs w:val="20"/>
-        </w:rPr>
-        <w:t xml:space="preserve">Dekomposisi harus selalu menghasilkan bagian-bagian yang dikerjakan oleh robot tanpa keterlibatan tenaga manusia.</w:t>
-      </w:r>
-    </w:p>
-    <w:p>
-      <w:pPr>
-        <w:spacing w:after="80"/>
-        <w:ind w:left="400"/>
-      </w:pPr>
-      <w:r>
-        <w:rPr>
-          <w:rFonts w:ascii="Arial" w:cs="Arial" w:eastAsia="Arial" w:hAnsi="Arial"/>
-          <w:b/>
-          <w:bCs/>
-          <w:sz w:val="20"/>
-          <w:szCs w:val="20"/>
-        </w:rPr>
-        <w:t xml:space="preserve">E. </w:t>
-      </w:r>
-      <w:r>
-        <w:rPr>
-          <w:rFonts w:ascii="Arial" w:cs="Arial" w:eastAsia="Arial" w:hAnsi="Arial"/>
-          <w:sz w:val="20"/>
-          <w:szCs w:val="20"/>
-        </w:rPr>
-        <w:t xml:space="preserve">Dekomposisi dapat diterapkan melalui berbagai dimensi pemotongan (fungsional, spasial/geografis, kronologis, atau derajat keparahan), disesuaikan dengan arsitektur masalah dan tujuan operasional.</w:t>
       </w:r>
     </w:p>
     <w:p>
@@ -5894,31 +5894,31 @@
           <w:sz w:val="20"/>
           <w:szCs w:val="20"/>
         </w:rPr>
+        <w:t xml:space="preserve">Menjaga prioritas penyelamatan Sektor Utara dengan mengerahkan ke-4 helikopter tersisa hingga pukul 10.00, lalu mengalokasikan masing-masing 2 helikopter untuk Sektor Tengah dan Selatan di sesi siang.</w:t>
+      </w:r>
+    </w:p>
+    <w:p>
+      <w:pPr>
+        <w:spacing w:after="80"/>
+        <w:ind w:left="400"/>
+      </w:pPr>
+      <w:r>
+        <w:rPr>
+          <w:rFonts w:ascii="Arial" w:cs="Arial" w:eastAsia="Arial" w:hAnsi="Arial"/>
+          <w:b/>
+          <w:bCs/>
+          <w:sz w:val="20"/>
+          <w:szCs w:val="20"/>
+        </w:rPr>
+        <w:t xml:space="preserve">B. </w:t>
+      </w:r>
+      <w:r>
+        <w:rPr>
+          <w:rFonts w:ascii="Arial" w:cs="Arial" w:eastAsia="Arial" w:hAnsi="Arial"/>
+          <w:sz w:val="20"/>
+          <w:szCs w:val="20"/>
+        </w:rPr>
         <w:t xml:space="preserve">Membatalkan seluruh penerbangan hari itu dan membiarkan warga di 15 desa menunggu hingga helikopter pengganti tiba minggu depan.</w:t>
-      </w:r>
-    </w:p>
-    <w:p>
-      <w:pPr>
-        <w:spacing w:after="80"/>
-        <w:ind w:left="400"/>
-      </w:pPr>
-      <w:r>
-        <w:rPr>
-          <w:rFonts w:ascii="Arial" w:cs="Arial" w:eastAsia="Arial" w:hAnsi="Arial"/>
-          <w:b/>
-          <w:bCs/>
-          <w:sz w:val="20"/>
-          <w:szCs w:val="20"/>
-        </w:rPr>
-        <w:t xml:space="preserve">B. </w:t>
-      </w:r>
-      <w:r>
-        <w:rPr>
-          <w:rFonts w:ascii="Arial" w:cs="Arial" w:eastAsia="Arial" w:hAnsi="Arial"/>
-          <w:sz w:val="20"/>
-          <w:szCs w:val="20"/>
-        </w:rPr>
-        <w:t xml:space="preserve">Menjaga prioritas penyelamatan Sektor Utara dengan mengerahkan ke-4 helikopter tersisa hingga pukul 10.00, lalu mengalokasikan masing-masing 2 helikopter untuk Sektor Tengah dan Selatan di sesi siang.</w:t>
       </w:r>
     </w:p>
     <w:p>
@@ -6338,79 +6338,79 @@
           <w:sz w:val="20"/>
           <w:szCs w:val="20"/>
         </w:rPr>
+        <w:t xml:space="preserve">Membeli pompa air berkapasitas terbesar di pasaran tanpa memeriksa debit sumber mata air alami di lereng bukit.</w:t>
+      </w:r>
+    </w:p>
+    <w:p>
+      <w:pPr>
+        <w:spacing w:after="80"/>
+        <w:ind w:left="400"/>
+      </w:pPr>
+      <w:r>
+        <w:rPr>
+          <w:rFonts w:ascii="Arial" w:cs="Arial" w:eastAsia="Arial" w:hAnsi="Arial"/>
+          <w:b/>
+          <w:bCs/>
+          <w:sz w:val="20"/>
+          <w:szCs w:val="20"/>
+        </w:rPr>
+        <w:t xml:space="preserve">B. </w:t>
+      </w:r>
+      <w:r>
+        <w:rPr>
+          <w:rFonts w:ascii="Arial" w:cs="Arial" w:eastAsia="Arial" w:hAnsi="Arial"/>
+          <w:sz w:val="20"/>
+          <w:szCs w:val="20"/>
+        </w:rPr>
+        <w:t xml:space="preserve">Mengganti seluruh pohon apel dengan tanaman padi sawah tanpa menguji kesesuaian jenis tanah dan ketinggian lereng.</w:t>
+      </w:r>
+    </w:p>
+    <w:p>
+      <w:pPr>
+        <w:spacing w:after="80"/>
+        <w:ind w:left="400"/>
+      </w:pPr>
+      <w:r>
+        <w:rPr>
+          <w:rFonts w:ascii="Arial" w:cs="Arial" w:eastAsia="Arial" w:hAnsi="Arial"/>
+          <w:b/>
+          <w:bCs/>
+          <w:sz w:val="20"/>
+          <w:szCs w:val="20"/>
+        </w:rPr>
+        <w:t xml:space="preserve">C. </w:t>
+      </w:r>
+      <w:r>
+        <w:rPr>
+          <w:rFonts w:ascii="Arial" w:cs="Arial" w:eastAsia="Arial" w:hAnsi="Arial"/>
+          <w:sz w:val="20"/>
+          <w:szCs w:val="20"/>
+        </w:rPr>
+        <w:t xml:space="preserve">Menganalisis korelasi data histori sensor kelembapan tanah, suhu udara, dan kecepatan angin selama 5 musim panen dengan siklus kemunculan ledakan populasi hama kutu sisik.</w:t>
+      </w:r>
+    </w:p>
+    <w:p>
+      <w:pPr>
+        <w:spacing w:after="80"/>
+        <w:ind w:left="400"/>
+      </w:pPr>
+      <w:r>
+        <w:rPr>
+          <w:rFonts w:ascii="Arial" w:cs="Arial" w:eastAsia="Arial" w:hAnsi="Arial"/>
+          <w:b/>
+          <w:bCs/>
+          <w:sz w:val="20"/>
+          <w:szCs w:val="20"/>
+        </w:rPr>
+        <w:t xml:space="preserve">D. </w:t>
+      </w:r>
+      <w:r>
+        <w:rPr>
+          <w:rFonts w:ascii="Arial" w:cs="Arial" w:eastAsia="Arial" w:hAnsi="Arial"/>
+          <w:sz w:val="20"/>
+          <w:szCs w:val="20"/>
+        </w:rPr>
         <w:t xml:space="preserve">Mengecat batang pohon apel dengan warna putih agar terlihat rapi saat difoto oleh wisatawan yang berkunjung ke kebun.</w:t>
-      </w:r>
-    </w:p>
-    <w:p>
-      <w:pPr>
-        <w:spacing w:after="80"/>
-        <w:ind w:left="400"/>
-      </w:pPr>
-      <w:r>
-        <w:rPr>
-          <w:rFonts w:ascii="Arial" w:cs="Arial" w:eastAsia="Arial" w:hAnsi="Arial"/>
-          <w:b/>
-          <w:bCs/>
-          <w:sz w:val="20"/>
-          <w:szCs w:val="20"/>
-        </w:rPr>
-        <w:t xml:space="preserve">B. </w:t>
-      </w:r>
-      <w:r>
-        <w:rPr>
-          <w:rFonts w:ascii="Arial" w:cs="Arial" w:eastAsia="Arial" w:hAnsi="Arial"/>
-          <w:sz w:val="20"/>
-          <w:szCs w:val="20"/>
-        </w:rPr>
-        <w:t xml:space="preserve">Membeli pompa air berkapasitas terbesar di pasaran tanpa memeriksa debit sumber mata air alami di lereng bukit.</w:t>
-      </w:r>
-    </w:p>
-    <w:p>
-      <w:pPr>
-        <w:spacing w:after="80"/>
-        <w:ind w:left="400"/>
-      </w:pPr>
-      <w:r>
-        <w:rPr>
-          <w:rFonts w:ascii="Arial" w:cs="Arial" w:eastAsia="Arial" w:hAnsi="Arial"/>
-          <w:b/>
-          <w:bCs/>
-          <w:sz w:val="20"/>
-          <w:szCs w:val="20"/>
-        </w:rPr>
-        <w:t xml:space="preserve">C. </w:t>
-      </w:r>
-      <w:r>
-        <w:rPr>
-          <w:rFonts w:ascii="Arial" w:cs="Arial" w:eastAsia="Arial" w:hAnsi="Arial"/>
-          <w:sz w:val="20"/>
-          <w:szCs w:val="20"/>
-        </w:rPr>
-        <w:t xml:space="preserve">Mengganti seluruh pohon apel dengan tanaman padi sawah tanpa menguji kesesuaian jenis tanah dan ketinggian lereng.</w:t>
-      </w:r>
-    </w:p>
-    <w:p>
-      <w:pPr>
-        <w:spacing w:after="80"/>
-        <w:ind w:left="400"/>
-      </w:pPr>
-      <w:r>
-        <w:rPr>
-          <w:rFonts w:ascii="Arial" w:cs="Arial" w:eastAsia="Arial" w:hAnsi="Arial"/>
-          <w:b/>
-          <w:bCs/>
-          <w:sz w:val="20"/>
-          <w:szCs w:val="20"/>
-        </w:rPr>
-        <w:t xml:space="preserve">D. </w:t>
-      </w:r>
-      <w:r>
-        <w:rPr>
-          <w:rFonts w:ascii="Arial" w:cs="Arial" w:eastAsia="Arial" w:hAnsi="Arial"/>
-          <w:sz w:val="20"/>
-          <w:szCs w:val="20"/>
-        </w:rPr>
-        <w:t xml:space="preserve">Menganalisis korelasi data histori sensor kelembapan tanah, suhu udara, dan kecepatan angin selama 5 musim panen dengan siklus kemunculan ledakan populasi hama kutu sisik.</w:t>
       </w:r>
     </w:p>
     <w:p>
@@ -6560,55 +6560,55 @@
           <w:sz w:val="20"/>
           <w:szCs w:val="20"/>
         </w:rPr>
+        <w:t xml:space="preserve">Mengharuskan setiap pengendara mobil wisata menyebutkan nama lengkap kakek-neneknya sebelum diizinkan melintasi jalan Diponegoro.</w:t>
+      </w:r>
+    </w:p>
+    <w:p>
+      <w:pPr>
+        <w:spacing w:after="80"/>
+        <w:ind w:left="400"/>
+      </w:pPr>
+      <w:r>
+        <w:rPr>
+          <w:rFonts w:ascii="Arial" w:cs="Arial" w:eastAsia="Arial" w:hAnsi="Arial"/>
+          <w:b/>
+          <w:bCs/>
+          <w:sz w:val="20"/>
+          <w:szCs w:val="20"/>
+        </w:rPr>
+        <w:t xml:space="preserve">B. </w:t>
+      </w:r>
+      <w:r>
+        <w:rPr>
+          <w:rFonts w:ascii="Arial" w:cs="Arial" w:eastAsia="Arial" w:hAnsi="Arial"/>
+          <w:sz w:val="20"/>
+          <w:szCs w:val="20"/>
+        </w:rPr>
+        <w:t xml:space="preserve">Merepresentasikan persimpangan sebagai titik (Nodes) dan ruas jalan sebagai garis berbobot (Edges) yang memuat panjang jalan serta kecepatan rata-rata, sembari mengabaikan warna cat ruko atau jenis pohon di tepi jalan.</w:t>
+      </w:r>
+    </w:p>
+    <w:p>
+      <w:pPr>
+        <w:spacing w:after="80"/>
+        <w:ind w:left="400"/>
+      </w:pPr>
+      <w:r>
+        <w:rPr>
+          <w:rFonts w:ascii="Arial" w:cs="Arial" w:eastAsia="Arial" w:hAnsi="Arial"/>
+          <w:b/>
+          <w:bCs/>
+          <w:sz w:val="20"/>
+          <w:szCs w:val="20"/>
+        </w:rPr>
+        <w:t xml:space="preserve">C. </w:t>
+      </w:r>
+      <w:r>
+        <w:rPr>
+          <w:rFonts w:ascii="Arial" w:cs="Arial" w:eastAsia="Arial" w:hAnsi="Arial"/>
+          <w:sz w:val="20"/>
+          <w:szCs w:val="20"/>
+        </w:rPr>
         <w:t xml:space="preserve">Menghitung secara rinci setiap helai daun dan jenis tanaman hias di median jalan sebelum menghitung volume kendaraan yang melintas.</w:t>
-      </w:r>
-    </w:p>
-    <w:p>
-      <w:pPr>
-        <w:spacing w:after="80"/>
-        <w:ind w:left="400"/>
-      </w:pPr>
-      <w:r>
-        <w:rPr>
-          <w:rFonts w:ascii="Arial" w:cs="Arial" w:eastAsia="Arial" w:hAnsi="Arial"/>
-          <w:b/>
-          <w:bCs/>
-          <w:sz w:val="20"/>
-          <w:szCs w:val="20"/>
-        </w:rPr>
-        <w:t xml:space="preserve">B. </w:t>
-      </w:r>
-      <w:r>
-        <w:rPr>
-          <w:rFonts w:ascii="Arial" w:cs="Arial" w:eastAsia="Arial" w:hAnsi="Arial"/>
-          <w:sz w:val="20"/>
-          <w:szCs w:val="20"/>
-        </w:rPr>
-        <w:t xml:space="preserve">Mengharuskan setiap pengendara mobil wisata menyebutkan nama lengkap kakek-neneknya sebelum diizinkan melintasi jalan Diponegoro.</w:t>
-      </w:r>
-    </w:p>
-    <w:p>
-      <w:pPr>
-        <w:spacing w:after="80"/>
-        <w:ind w:left="400"/>
-      </w:pPr>
-      <w:r>
-        <w:rPr>
-          <w:rFonts w:ascii="Arial" w:cs="Arial" w:eastAsia="Arial" w:hAnsi="Arial"/>
-          <w:b/>
-          <w:bCs/>
-          <w:sz w:val="20"/>
-          <w:szCs w:val="20"/>
-        </w:rPr>
-        <w:t xml:space="preserve">C. </w:t>
-      </w:r>
-      <w:r>
-        <w:rPr>
-          <w:rFonts w:ascii="Arial" w:cs="Arial" w:eastAsia="Arial" w:hAnsi="Arial"/>
-          <w:sz w:val="20"/>
-          <w:szCs w:val="20"/>
-        </w:rPr>
-        <w:t xml:space="preserve">Merepresentasikan persimpangan sebagai titik (Nodes) dan ruas jalan sebagai garis berbobot (Edges) yang memuat panjang jalan serta kecepatan rata-rata, sembari mengabaikan warna cat ruko atau jenis pohon di tepi jalan.</w:t>
       </w:r>
     </w:p>
     <w:p>
@@ -6782,103 +6782,103 @@
           <w:sz w:val="20"/>
           <w:szCs w:val="20"/>
         </w:rPr>
+        <w:t xml:space="preserve">Memprogram sistem agar selalu mendahulukan kepentingan kelompok elit pemilik modal terbesar dibanding keselamatan warga perkampungan kecil.</w:t>
+      </w:r>
+    </w:p>
+    <w:p>
+      <w:pPr>
+        <w:spacing w:after="80"/>
+        <w:ind w:left="400"/>
+      </w:pPr>
+      <w:r>
+        <w:rPr>
+          <w:rFonts w:ascii="Arial" w:cs="Arial" w:eastAsia="Arial" w:hAnsi="Arial"/>
+          <w:b/>
+          <w:bCs/>
+          <w:sz w:val="20"/>
+          <w:szCs w:val="20"/>
+        </w:rPr>
+        <w:t xml:space="preserve">B. </w:t>
+      </w:r>
+      <w:r>
+        <w:rPr>
+          <w:rFonts w:ascii="Arial" w:cs="Arial" w:eastAsia="Arial" w:hAnsi="Arial"/>
+          <w:sz w:val="20"/>
+          <w:szCs w:val="20"/>
+        </w:rPr>
+        <w:t xml:space="preserve">Menghapus rekaman log jejak audit secara otomatis jika terindikasi sistem melakukan kesalahan fatal yang merugikan masyarakat luas.</w:t>
+      </w:r>
+    </w:p>
+    <w:p>
+      <w:pPr>
+        <w:spacing w:after="80"/>
+        <w:ind w:left="400"/>
+      </w:pPr>
+      <w:r>
+        <w:rPr>
+          <w:rFonts w:ascii="Arial" w:cs="Arial" w:eastAsia="Arial" w:hAnsi="Arial"/>
+          <w:b/>
+          <w:bCs/>
+          <w:sz w:val="20"/>
+          <w:szCs w:val="20"/>
+        </w:rPr>
+        <w:t xml:space="preserve">C. </w:t>
+      </w:r>
+      <w:r>
+        <w:rPr>
+          <w:rFonts w:ascii="Arial" w:cs="Arial" w:eastAsia="Arial" w:hAnsi="Arial"/>
+          <w:sz w:val="20"/>
+          <w:szCs w:val="20"/>
+        </w:rPr>
+        <w:t xml:space="preserve">Menyerahkan seluruh keputusan etika dan moral kepada prosesor komputer tanpa menyediakan ruang banding atau pengawasan oleh manusia.</w:t>
+      </w:r>
+    </w:p>
+    <w:p>
+      <w:pPr>
+        <w:spacing w:after="80"/>
+        <w:ind w:left="400"/>
+      </w:pPr>
+      <w:r>
+        <w:rPr>
+          <w:rFonts w:ascii="Arial" w:cs="Arial" w:eastAsia="Arial" w:hAnsi="Arial"/>
+          <w:b/>
+          <w:bCs/>
+          <w:sz w:val="20"/>
+          <w:szCs w:val="20"/>
+        </w:rPr>
+        <w:t xml:space="preserve">D. </w:t>
+      </w:r>
+      <w:r>
+        <w:rPr>
+          <w:rFonts w:ascii="Arial" w:cs="Arial" w:eastAsia="Arial" w:hAnsi="Arial"/>
+          <w:sz w:val="20"/>
+          <w:szCs w:val="20"/>
+        </w:rPr>
+        <w:t xml:space="preserve">Menjaga transparansi logika pengambilan keputusan (Explainability), keadilan algoritma tanpa bias diskriminatif, perlindungan privasi data warga, dan akuntabilitas moral manusia terhadap dampak keputusan sistem.</w:t>
+      </w:r>
+    </w:p>
+    <w:p>
+      <w:pPr>
+        <w:spacing w:after="80"/>
+        <w:ind w:left="400"/>
+      </w:pPr>
+      <w:r>
+        <w:rPr>
+          <w:rFonts w:ascii="Arial" w:cs="Arial" w:eastAsia="Arial" w:hAnsi="Arial"/>
+          <w:b/>
+          <w:bCs/>
+          <w:sz w:val="20"/>
+          <w:szCs w:val="20"/>
+        </w:rPr>
+        <w:t xml:space="preserve">E. </w:t>
+      </w:r>
+      <w:r>
+        <w:rPr>
+          <w:rFonts w:ascii="Arial" w:cs="Arial" w:eastAsia="Arial" w:hAnsi="Arial"/>
+          <w:sz w:val="20"/>
+          <w:szCs w:val="20"/>
+        </w:rPr>
         <w:t xml:space="preserve">Merancang algoritma sebagai kotak hitam (Black Box) yang tertutup rapat agar tidak ada warga masyarakat yang dapat memprotes keputusan sistem.</w:t>
-      </w:r>
-    </w:p>
-    <w:p>
-      <w:pPr>
-        <w:spacing w:after="80"/>
-        <w:ind w:left="400"/>
-      </w:pPr>
-      <w:r>
-        <w:rPr>
-          <w:rFonts w:ascii="Arial" w:cs="Arial" w:eastAsia="Arial" w:hAnsi="Arial"/>
-          <w:b/>
-          <w:bCs/>
-          <w:sz w:val="20"/>
-          <w:szCs w:val="20"/>
-        </w:rPr>
-        <w:t xml:space="preserve">B. </w:t>
-      </w:r>
-      <w:r>
-        <w:rPr>
-          <w:rFonts w:ascii="Arial" w:cs="Arial" w:eastAsia="Arial" w:hAnsi="Arial"/>
-          <w:sz w:val="20"/>
-          <w:szCs w:val="20"/>
-        </w:rPr>
-        <w:t xml:space="preserve">Memprogram sistem agar selalu mendahulukan kepentingan kelompok elit pemilik modal terbesar dibanding keselamatan warga perkampungan kecil.</w:t>
-      </w:r>
-    </w:p>
-    <w:p>
-      <w:pPr>
-        <w:spacing w:after="80"/>
-        <w:ind w:left="400"/>
-      </w:pPr>
-      <w:r>
-        <w:rPr>
-          <w:rFonts w:ascii="Arial" w:cs="Arial" w:eastAsia="Arial" w:hAnsi="Arial"/>
-          <w:b/>
-          <w:bCs/>
-          <w:sz w:val="20"/>
-          <w:szCs w:val="20"/>
-        </w:rPr>
-        <w:t xml:space="preserve">C. </w:t>
-      </w:r>
-      <w:r>
-        <w:rPr>
-          <w:rFonts w:ascii="Arial" w:cs="Arial" w:eastAsia="Arial" w:hAnsi="Arial"/>
-          <w:sz w:val="20"/>
-          <w:szCs w:val="20"/>
-        </w:rPr>
-        <w:t xml:space="preserve">Menghapus rekaman log jejak audit secara otomatis jika terindikasi sistem melakukan kesalahan fatal yang merugikan masyarakat luas.</w:t>
-      </w:r>
-    </w:p>
-    <w:p>
-      <w:pPr>
-        <w:spacing w:after="80"/>
-        <w:ind w:left="400"/>
-      </w:pPr>
-      <w:r>
-        <w:rPr>
-          <w:rFonts w:ascii="Arial" w:cs="Arial" w:eastAsia="Arial" w:hAnsi="Arial"/>
-          <w:b/>
-          <w:bCs/>
-          <w:sz w:val="20"/>
-          <w:szCs w:val="20"/>
-        </w:rPr>
-        <w:t xml:space="preserve">D. </w:t>
-      </w:r>
-      <w:r>
-        <w:rPr>
-          <w:rFonts w:ascii="Arial" w:cs="Arial" w:eastAsia="Arial" w:hAnsi="Arial"/>
-          <w:sz w:val="20"/>
-          <w:szCs w:val="20"/>
-        </w:rPr>
-        <w:t xml:space="preserve">Menyerahkan seluruh keputusan etika dan moral kepada prosesor komputer tanpa menyediakan ruang banding atau pengawasan oleh manusia.</w:t>
-      </w:r>
-    </w:p>
-    <w:p>
-      <w:pPr>
-        <w:spacing w:after="80"/>
-        <w:ind w:left="400"/>
-      </w:pPr>
-      <w:r>
-        <w:rPr>
-          <w:rFonts w:ascii="Arial" w:cs="Arial" w:eastAsia="Arial" w:hAnsi="Arial"/>
-          <w:b/>
-          <w:bCs/>
-          <w:sz w:val="20"/>
-          <w:szCs w:val="20"/>
-        </w:rPr>
-        <w:t xml:space="preserve">E. </w:t>
-      </w:r>
-      <w:r>
-        <w:rPr>
-          <w:rFonts w:ascii="Arial" w:cs="Arial" w:eastAsia="Arial" w:hAnsi="Arial"/>
-          <w:sz w:val="20"/>
-          <w:szCs w:val="20"/>
-        </w:rPr>
-        <w:t xml:space="preserve">Menjaga transparansi logika pengambilan keputusan (Explainability), keadilan algoritma tanpa bias diskriminatif, perlindungan privasi data warga, dan akuntabilitas moral manusia terhadap dampak keputusan sistem.</w:t>
       </w:r>
     </w:p>
     <w:p>

</xml_diff>

<commit_message>
refactor(exam): hapus judul dan label kategori pada butir soal informatika agar langsung narasi soal
</commit_message>
<xml_diff>
--- a/Bank_Soal_30_CT_Informatika_SMAN_1_Batu.docx
+++ b/Bank_Soal_30_CT_Informatika_SMAN_1_Batu.docx
@@ -190,7 +190,7 @@
           <w:sz w:val="22"/>
           <w:szCs w:val="22"/>
         </w:rPr>
-        <w:t xml:space="preserve">SOAL NO. 1 [Konsep &amp; Filosofi CT]</w:t>
+        <w:t xml:space="preserve">SOAL NO. 1</w:t>
       </w:r>
     </w:p>
     <w:p>
@@ -203,7 +203,7 @@
           <w:sz w:val="20"/>
           <w:szCs w:val="20"/>
         </w:rPr>
-        <w:t xml:space="preserve">[STIMULUS LITERASI TEORI KOMPUTASI]</w:t>
+        <w:t xml:space="preserve">Pada tahun 2006, Jeannette M. Wing mempublikasikan karya ilmiah seminal berjudul "Computational Thinking" yang merevolusi cara pandang dunia pendidikan terhadap ilmu komputer. Wing menegaskan bahwa Berpikir Komputasional (Computational Thinking/CT) bukanlah keahlian untuk membuat manusia berpikir layaknya sebuah komputer yang mekanis, kaku, dan serba biner. Sebaliknya, CT adalah proses pemikiran kognitif tingkat tinggi (cognitive process) yang melibatkan perumusan masalah beserta solusinya secara presisi, sedemikian rupa sehingga solusi tersebut dapat direpresentasikan dalam format yang dapat dieksekusi secara efektif oleh agen pemroses informasi—baik agen tersebut berupa manusia, mesin komputer, maupun kombinasi keduanya.</w:t>
       </w:r>
     </w:p>
     <w:p>
@@ -216,19 +216,6 @@
           <w:sz w:val="20"/>
           <w:szCs w:val="20"/>
         </w:rPr>
-        <w:t xml:space="preserve">Pada tahun 2006, Jeannette M. Wing mempublikasikan karya ilmiah seminal berjudul "Computational Thinking" yang merevolusi cara pandang dunia pendidikan terhadap ilmu komputer. Wing menegaskan bahwa Berpikir Komputasional (Computational Thinking/CT) bukanlah keahlian untuk membuat manusia berpikir layaknya sebuah komputer yang mekanis, kaku, dan serba biner. Sebaliknya, CT adalah proses pemikiran kognitif tingkat tinggi (cognitive process) yang melibatkan perumusan masalah beserta solusinya secara presisi, sedemikian rupa sehingga solusi tersebut dapat direpresentasikan dalam format yang dapat dieksekusi secara efektif oleh agen pemroses informasi—baik agen tersebut berupa manusia, mesin komputer, maupun kombinasi keduanya.</w:t>
-      </w:r>
-    </w:p>
-    <w:p>
-      <w:pPr>
-        <w:spacing w:after="100"/>
-      </w:pPr>
-      <w:r>
-        <w:rPr>
-          <w:rFonts w:ascii="Arial" w:cs="Arial" w:eastAsia="Arial" w:hAnsi="Arial"/>
-          <w:sz w:val="20"/>
-          <w:szCs w:val="20"/>
-        </w:rPr>
         <w:t xml:space="preserve">Berdasarkan pemaparan mendalam di atas, manakah kesimpulan yang paling tepat mengenai hakikat sejati dari Berpikir Komputasional (CT) dalam konteks pembelajaran abad ke-21?</w:t>
       </w:r>
     </w:p>
@@ -253,55 +240,55 @@
           <w:sz w:val="20"/>
           <w:szCs w:val="20"/>
         </w:rPr>
+        <w:t xml:space="preserve">Sebuah kerangka kerja berpikir pemecahan masalah (problem solving) yang menyusun representasi solusi secara logis agar dapat dieksekusi oleh agen pemroses informasi, baik manusia maupun komputer.</w:t>
+      </w:r>
+    </w:p>
+    <w:p>
+      <w:pPr>
+        <w:spacing w:after="80"/>
+        <w:ind w:left="400"/>
+      </w:pPr>
+      <w:r>
+        <w:rPr>
+          <w:rFonts w:ascii="Arial" w:cs="Arial" w:eastAsia="Arial" w:hAnsi="Arial"/>
+          <w:b/>
+          <w:bCs/>
+          <w:sz w:val="20"/>
+          <w:szCs w:val="20"/>
+        </w:rPr>
+        <w:t xml:space="preserve">B. </w:t>
+      </w:r>
+      <w:r>
+        <w:rPr>
+          <w:rFonts w:ascii="Arial" w:cs="Arial" w:eastAsia="Arial" w:hAnsi="Arial"/>
+          <w:sz w:val="20"/>
+          <w:szCs w:val="20"/>
+        </w:rPr>
+        <w:t xml:space="preserve">Keahlian teknis tingkat lanjut untuk menghafal sintaks bahasa pemrograman dan merakit perangkat keras komputer secara mekanis.</w:t>
+      </w:r>
+    </w:p>
+    <w:p>
+      <w:pPr>
+        <w:spacing w:after="80"/>
+        <w:ind w:left="400"/>
+      </w:pPr>
+      <w:r>
+        <w:rPr>
+          <w:rFonts w:ascii="Arial" w:cs="Arial" w:eastAsia="Arial" w:hAnsi="Arial"/>
+          <w:b/>
+          <w:bCs/>
+          <w:sz w:val="20"/>
+          <w:szCs w:val="20"/>
+        </w:rPr>
+        <w:t xml:space="preserve">C. </w:t>
+      </w:r>
+      <w:r>
+        <w:rPr>
+          <w:rFonts w:ascii="Arial" w:cs="Arial" w:eastAsia="Arial" w:hAnsi="Arial"/>
+          <w:sz w:val="20"/>
+          <w:szCs w:val="20"/>
+        </w:rPr>
         <w:t xml:space="preserve">Keterampilan mengoperasikan berbagai aplikasi komersial perkantoran dan multimedia untuk meningkatkan kecepatan mengetik.</w:t>
-      </w:r>
-    </w:p>
-    <w:p>
-      <w:pPr>
-        <w:spacing w:after="80"/>
-        <w:ind w:left="400"/>
-      </w:pPr>
-      <w:r>
-        <w:rPr>
-          <w:rFonts w:ascii="Arial" w:cs="Arial" w:eastAsia="Arial" w:hAnsi="Arial"/>
-          <w:b/>
-          <w:bCs/>
-          <w:sz w:val="20"/>
-          <w:szCs w:val="20"/>
-        </w:rPr>
-        <w:t xml:space="preserve">B. </w:t>
-      </w:r>
-      <w:r>
-        <w:rPr>
-          <w:rFonts w:ascii="Arial" w:cs="Arial" w:eastAsia="Arial" w:hAnsi="Arial"/>
-          <w:sz w:val="20"/>
-          <w:szCs w:val="20"/>
-        </w:rPr>
-        <w:t xml:space="preserve">Sebuah kerangka kerja berpikir pemecahan masalah (problem solving) yang menyusun representasi solusi secara logis agar dapat dieksekusi oleh agen pemroses informasi, baik manusia maupun komputer.</w:t>
-      </w:r>
-    </w:p>
-    <w:p>
-      <w:pPr>
-        <w:spacing w:after="80"/>
-        <w:ind w:left="400"/>
-      </w:pPr>
-      <w:r>
-        <w:rPr>
-          <w:rFonts w:ascii="Arial" w:cs="Arial" w:eastAsia="Arial" w:hAnsi="Arial"/>
-          <w:b/>
-          <w:bCs/>
-          <w:sz w:val="20"/>
-          <w:szCs w:val="20"/>
-        </w:rPr>
-        <w:t xml:space="preserve">C. </w:t>
-      </w:r>
-      <w:r>
-        <w:rPr>
-          <w:rFonts w:ascii="Arial" w:cs="Arial" w:eastAsia="Arial" w:hAnsi="Arial"/>
-          <w:sz w:val="20"/>
-          <w:szCs w:val="20"/>
-        </w:rPr>
-        <w:t xml:space="preserve">Keahlian teknis tingkat lanjut untuk menghafal sintaks bahasa pemrograman dan merakit perangkat keras komputer secara mekanis.</w:t>
       </w:r>
     </w:p>
     <w:p>
@@ -412,20 +399,7 @@
           <w:sz w:val="22"/>
           <w:szCs w:val="22"/>
         </w:rPr>
-        <w:t xml:space="preserve">SOAL NO. 2 [Sinergi Pilar CT]</w:t>
-      </w:r>
-    </w:p>
-    <w:p>
-      <w:pPr>
-        <w:spacing w:after="100"/>
-      </w:pPr>
-      <w:r>
-        <w:rPr>
-          <w:rFonts w:ascii="Arial" w:cs="Arial" w:eastAsia="Arial" w:hAnsi="Arial"/>
-          <w:sz w:val="20"/>
-          <w:szCs w:val="20"/>
-        </w:rPr>
-        <w:t xml:space="preserve">[STIMULUS LITERASI METODOLOGI KOMPUTASIONAL]</w:t>
+        <w:t xml:space="preserve">SOAL NO. 2</w:t>
       </w:r>
     </w:p>
     <w:p>
@@ -634,7 +608,7 @@
           <w:sz w:val="22"/>
           <w:szCs w:val="22"/>
         </w:rPr>
-        <w:t xml:space="preserve">SOAL NO. 3 [Dekomposisi]</w:t>
+        <w:t xml:space="preserve">SOAL NO. 3</w:t>
       </w:r>
     </w:p>
     <w:p>
@@ -647,7 +621,7 @@
           <w:sz w:val="20"/>
           <w:szCs w:val="20"/>
         </w:rPr>
-        <w:t xml:space="preserve">[STIMULUS ANALISIS PILAR DEKOMPOSISI]</w:t>
+        <w:t xml:space="preserve">Otak manusia memiliki kapasitas memori kerja (working memory) yang terbatas. Ketika dihadapkan pada krisis multidimensi yang masif, kecenderungan alamiah manusia yang tidak terlatih dalam CT adalah merasa kewalahan (overwhelmed) atau mengambil tindakan reaktif sesaat. Dekomposisi hadir sebagai teknik dekonstruksi masalah besar menjadi sub-komponen yang lebih kecil, independen, dan terkelola (manageable).</w:t>
       </w:r>
     </w:p>
     <w:p>
@@ -660,19 +634,6 @@
           <w:sz w:val="20"/>
           <w:szCs w:val="20"/>
         </w:rPr>
-        <w:t xml:space="preserve">Otak manusia memiliki kapasitas memori kerja (working memory) yang terbatas. Ketika dihadapkan pada krisis multidimensi yang masif, kecenderungan alamiah manusia yang tidak terlatih dalam CT adalah merasa kewalahan (overwhelmed) atau mengambil tindakan reaktif sesaat. Dekomposisi hadir sebagai teknik dekonstruksi masalah besar menjadi sub-komponen yang lebih kecil, independen, dan terkelola (manageable).</w:t>
-      </w:r>
-    </w:p>
-    <w:p>
-      <w:pPr>
-        <w:spacing w:after="100"/>
-      </w:pPr>
-      <w:r>
-        <w:rPr>
-          <w:rFonts w:ascii="Arial" w:cs="Arial" w:eastAsia="Arial" w:hAnsi="Arial"/>
-          <w:sz w:val="20"/>
-          <w:szCs w:val="20"/>
-        </w:rPr>
         <w:t xml:space="preserve">Manakah di antara skenario berikut yang mencerminkan penerapan Dekomposisi yang paling tepat dan profesional menurut prinsip Berpikir Komputasional?</w:t>
       </w:r>
     </w:p>
@@ -697,79 +658,79 @@
           <w:sz w:val="20"/>
           <w:szCs w:val="20"/>
         </w:rPr>
+        <w:t xml:space="preserve">Menginstruksikan satu orang ahli untuk menyelesaikan seluruh penyelidikan krisis hulu-hilir sendirian secara bersamaan.</w:t>
+      </w:r>
+    </w:p>
+    <w:p>
+      <w:pPr>
+        <w:spacing w:after="80"/>
+        <w:ind w:left="400"/>
+      </w:pPr>
+      <w:r>
+        <w:rPr>
+          <w:rFonts w:ascii="Arial" w:cs="Arial" w:eastAsia="Arial" w:hAnsi="Arial"/>
+          <w:b/>
+          <w:bCs/>
+          <w:sz w:val="20"/>
+          <w:szCs w:val="20"/>
+        </w:rPr>
+        <w:t xml:space="preserve">B. </w:t>
+      </w:r>
+      <w:r>
+        <w:rPr>
+          <w:rFonts w:ascii="Arial" w:cs="Arial" w:eastAsia="Arial" w:hAnsi="Arial"/>
+          <w:sz w:val="20"/>
+          <w:szCs w:val="20"/>
+        </w:rPr>
+        <w:t xml:space="preserve">Memecah penanganan krisis banjir lumpur beracun kota ke dalam tiga fokus investigasi spesifik: hidrologi/cuaca, evaluasi tata guna lahan hulu, dan uji kimia limbah sedimen.</w:t>
+      </w:r>
+    </w:p>
+    <w:p>
+      <w:pPr>
+        <w:spacing w:after="80"/>
+        <w:ind w:left="400"/>
+      </w:pPr>
+      <w:r>
+        <w:rPr>
+          <w:rFonts w:ascii="Arial" w:cs="Arial" w:eastAsia="Arial" w:hAnsi="Arial"/>
+          <w:b/>
+          <w:bCs/>
+          <w:sz w:val="20"/>
+          <w:szCs w:val="20"/>
+        </w:rPr>
+        <w:t xml:space="preserve">C. </w:t>
+      </w:r>
+      <w:r>
+        <w:rPr>
+          <w:rFonts w:ascii="Arial" w:cs="Arial" w:eastAsia="Arial" w:hAnsi="Arial"/>
+          <w:sz w:val="20"/>
+          <w:szCs w:val="20"/>
+        </w:rPr>
+        <w:t xml:space="preserve">Membagi bantuan sembako kepada seluruh warga secara merata tanpa memeriksa apakah mereka terdampak langsung oleh banjir atau tidak.</w:t>
+      </w:r>
+    </w:p>
+    <w:p>
+      <w:pPr>
+        <w:spacing w:after="80"/>
+        <w:ind w:left="400"/>
+      </w:pPr>
+      <w:r>
+        <w:rPr>
+          <w:rFonts w:ascii="Arial" w:cs="Arial" w:eastAsia="Arial" w:hAnsi="Arial"/>
+          <w:b/>
+          <w:bCs/>
+          <w:sz w:val="20"/>
+          <w:szCs w:val="20"/>
+        </w:rPr>
+        <w:t xml:space="preserve">D. </w:t>
+      </w:r>
+      <w:r>
+        <w:rPr>
+          <w:rFonts w:ascii="Arial" w:cs="Arial" w:eastAsia="Arial" w:hAnsi="Arial"/>
+          <w:sz w:val="20"/>
+          <w:szCs w:val="20"/>
+        </w:rPr>
         <w:t xml:space="preserve">Mengelompokkan data industri di bantaran sungai semata-mata berdasarkan warna cat pagar dan tahun berdirinya bangunan pabrik.</w:t>
-      </w:r>
-    </w:p>
-    <w:p>
-      <w:pPr>
-        <w:spacing w:after="80"/>
-        <w:ind w:left="400"/>
-      </w:pPr>
-      <w:r>
-        <w:rPr>
-          <w:rFonts w:ascii="Arial" w:cs="Arial" w:eastAsia="Arial" w:hAnsi="Arial"/>
-          <w:b/>
-          <w:bCs/>
-          <w:sz w:val="20"/>
-          <w:szCs w:val="20"/>
-        </w:rPr>
-        <w:t xml:space="preserve">B. </w:t>
-      </w:r>
-      <w:r>
-        <w:rPr>
-          <w:rFonts w:ascii="Arial" w:cs="Arial" w:eastAsia="Arial" w:hAnsi="Arial"/>
-          <w:sz w:val="20"/>
-          <w:szCs w:val="20"/>
-        </w:rPr>
-        <w:t xml:space="preserve">Menginstruksikan satu orang ahli untuk menyelesaikan seluruh penyelidikan krisis hulu-hilir sendirian secara bersamaan.</w:t>
-      </w:r>
-    </w:p>
-    <w:p>
-      <w:pPr>
-        <w:spacing w:after="80"/>
-        <w:ind w:left="400"/>
-      </w:pPr>
-      <w:r>
-        <w:rPr>
-          <w:rFonts w:ascii="Arial" w:cs="Arial" w:eastAsia="Arial" w:hAnsi="Arial"/>
-          <w:b/>
-          <w:bCs/>
-          <w:sz w:val="20"/>
-          <w:szCs w:val="20"/>
-        </w:rPr>
-        <w:t xml:space="preserve">C. </w:t>
-      </w:r>
-      <w:r>
-        <w:rPr>
-          <w:rFonts w:ascii="Arial" w:cs="Arial" w:eastAsia="Arial" w:hAnsi="Arial"/>
-          <w:sz w:val="20"/>
-          <w:szCs w:val="20"/>
-        </w:rPr>
-        <w:t xml:space="preserve">Memecah penanganan krisis banjir lumpur beracun kota ke dalam tiga fokus investigasi spesifik: hidrologi/cuaca, evaluasi tata guna lahan hulu, dan uji kimia limbah sedimen.</w:t>
-      </w:r>
-    </w:p>
-    <w:p>
-      <w:pPr>
-        <w:spacing w:after="80"/>
-        <w:ind w:left="400"/>
-      </w:pPr>
-      <w:r>
-        <w:rPr>
-          <w:rFonts w:ascii="Arial" w:cs="Arial" w:eastAsia="Arial" w:hAnsi="Arial"/>
-          <w:b/>
-          <w:bCs/>
-          <w:sz w:val="20"/>
-          <w:szCs w:val="20"/>
-        </w:rPr>
-        <w:t xml:space="preserve">D. </w:t>
-      </w:r>
-      <w:r>
-        <w:rPr>
-          <w:rFonts w:ascii="Arial" w:cs="Arial" w:eastAsia="Arial" w:hAnsi="Arial"/>
-          <w:sz w:val="20"/>
-          <w:szCs w:val="20"/>
-        </w:rPr>
-        <w:t xml:space="preserve">Membagi bantuan sembako kepada seluruh warga secara merata tanpa memeriksa apakah mereka terdampak langsung oleh banjir atau tidak.</w:t>
       </w:r>
     </w:p>
     <w:p>
@@ -856,7 +817,7 @@
           <w:sz w:val="22"/>
           <w:szCs w:val="22"/>
         </w:rPr>
-        <w:t xml:space="preserve">SOAL NO. 4 [Pengenalan Pola]</w:t>
+        <w:t xml:space="preserve">SOAL NO. 4</w:t>
       </w:r>
     </w:p>
     <w:p>
@@ -869,7 +830,7 @@
           <w:sz w:val="20"/>
           <w:szCs w:val="20"/>
         </w:rPr>
-        <w:t xml:space="preserve">[STIMULUS LITERASI PENGENALAN POLA]</w:t>
+        <w:t xml:space="preserve">Dalam materi pembelajaran CT Informatika Kelas X SMAN 1 Batu, dicontohkan seorang dokter yang memeriksa pasien dengan keluhan demam tinggi, nyeri sendi persendian, dan munculnya ruam merah di kulit. Dokter tersebut tidak memperlakukan pasien itu sebagai teka-teki baru yang terisolasi, melainkan segera mengaitkannya dengan pola pasien demam berdarah dengue (DBD) yang ia tangani pada masa sebelumnya.</w:t>
       </w:r>
     </w:p>
     <w:p>
@@ -882,19 +843,6 @@
           <w:sz w:val="20"/>
           <w:szCs w:val="20"/>
         </w:rPr>
-        <w:t xml:space="preserve">Dalam materi pembelajaran CT Informatika Kelas X SMAN 1 Batu, dicontohkan seorang dokter yang memeriksa pasien dengan keluhan demam tinggi, nyeri sendi persendian, dan munculnya ruam merah di kulit. Dokter tersebut tidak memperlakukan pasien itu sebagai teka-teki baru yang terisolasi, melainkan segera mengaitkannya dengan pola pasien demam berdarah dengue (DBD) yang ia tangani pada masa sebelumnya.</w:t>
-      </w:r>
-    </w:p>
-    <w:p>
-      <w:pPr>
-        <w:spacing w:after="100"/>
-      </w:pPr>
-      <w:r>
-        <w:rPr>
-          <w:rFonts w:ascii="Arial" w:cs="Arial" w:eastAsia="Arial" w:hAnsi="Arial"/>
-          <w:sz w:val="20"/>
-          <w:szCs w:val="20"/>
-        </w:rPr>
         <w:t xml:space="preserve">Prinsip komputasional apakah yang mendasari proses kognitif dokter tersebut, dan mengapa hal itu sangat krusial dalam pemecahan masalah?</w:t>
       </w:r>
     </w:p>
@@ -919,31 +867,31 @@
           <w:sz w:val="20"/>
           <w:szCs w:val="20"/>
         </w:rPr>
+        <w:t xml:space="preserve">Dekomposisi; dokter membagi tubuh pasien ke dalam organ-organ terpisah sebelum mendengarkan keluhan demam pasien.</w:t>
+      </w:r>
+    </w:p>
+    <w:p>
+      <w:pPr>
+        <w:spacing w:after="80"/>
+        <w:ind w:left="400"/>
+      </w:pPr>
+      <w:r>
+        <w:rPr>
+          <w:rFonts w:ascii="Arial" w:cs="Arial" w:eastAsia="Arial" w:hAnsi="Arial"/>
+          <w:b/>
+          <w:bCs/>
+          <w:sz w:val="20"/>
+          <w:szCs w:val="20"/>
+        </w:rPr>
+        <w:t xml:space="preserve">B. </w:t>
+      </w:r>
+      <w:r>
+        <w:rPr>
+          <w:rFonts w:ascii="Arial" w:cs="Arial" w:eastAsia="Arial" w:hAnsi="Arial"/>
+          <w:sz w:val="20"/>
+          <w:szCs w:val="20"/>
+        </w:rPr>
         <w:t xml:space="preserve">Pengenalan Pola (Pattern Recognition); memungkinkan penggunaan model solusi masa lalu untuk mempercepat diagnosis akurat dan penentuan uji laboratorium kritis.</w:t>
-      </w:r>
-    </w:p>
-    <w:p>
-      <w:pPr>
-        <w:spacing w:after="80"/>
-        <w:ind w:left="400"/>
-      </w:pPr>
-      <w:r>
-        <w:rPr>
-          <w:rFonts w:ascii="Arial" w:cs="Arial" w:eastAsia="Arial" w:hAnsi="Arial"/>
-          <w:b/>
-          <w:bCs/>
-          <w:sz w:val="20"/>
-          <w:szCs w:val="20"/>
-        </w:rPr>
-        <w:t xml:space="preserve">B. </w:t>
-      </w:r>
-      <w:r>
-        <w:rPr>
-          <w:rFonts w:ascii="Arial" w:cs="Arial" w:eastAsia="Arial" w:hAnsi="Arial"/>
-          <w:sz w:val="20"/>
-          <w:szCs w:val="20"/>
-        </w:rPr>
-        <w:t xml:space="preserve">Dekomposisi; dokter membagi tubuh pasien ke dalam organ-organ terpisah sebelum mendengarkan keluhan demam pasien.</w:t>
       </w:r>
     </w:p>
     <w:p>
@@ -1078,7 +1026,7 @@
           <w:sz w:val="22"/>
           <w:szCs w:val="22"/>
         </w:rPr>
-        <w:t xml:space="preserve">SOAL NO. 5 [Abstraksi]</w:t>
+        <w:t xml:space="preserve">SOAL NO. 5</w:t>
       </w:r>
     </w:p>
     <w:p>
@@ -1091,7 +1039,7 @@
           <w:sz w:val="20"/>
           <w:szCs w:val="20"/>
         </w:rPr>
-        <w:t xml:space="preserve">[STIMULUS LITERASI ABSTRAKSI SISTEM]</w:t>
+        <w:t xml:space="preserve">Perhatikan diagram peta jaringan kereta bawah tanah (MRT) atau komuter perkotaan. Peta tersebut sengaja tidak menampilkan bentuk riil kelokan rel, pepohonan, luas bangunan gedung di atas permukaan tanah, maupun variasi kontur perbukitan. Peta hanya memvisualisasikan garis lurus berwarna, urutan nama stasiun, dan titik persimpangan transit antarlini.</w:t>
       </w:r>
     </w:p>
     <w:p>
@@ -1104,19 +1052,6 @@
           <w:sz w:val="20"/>
           <w:szCs w:val="20"/>
         </w:rPr>
-        <w:t xml:space="preserve">Perhatikan diagram peta jaringan kereta bawah tanah (MRT) atau komuter perkotaan. Peta tersebut sengaja tidak menampilkan bentuk riil kelokan rel, pepohonan, luas bangunan gedung di atas permukaan tanah, maupun variasi kontur perbukitan. Peta hanya memvisualisasikan garis lurus berwarna, urutan nama stasiun, dan titik persimpangan transit antarlini.</w:t>
-      </w:r>
-    </w:p>
-    <w:p>
-      <w:pPr>
-        <w:spacing w:after="100"/>
-      </w:pPr>
-      <w:r>
-        <w:rPr>
-          <w:rFonts w:ascii="Arial" w:cs="Arial" w:eastAsia="Arial" w:hAnsi="Arial"/>
-          <w:sz w:val="20"/>
-          <w:szCs w:val="20"/>
-        </w:rPr>
         <w:t xml:space="preserve">Mengapa penyederhanaan pada peta MRT tersebut dikategorikan sebagai bentuk Abstraksi tingkat tinggi yang berhasil?</w:t>
       </w:r>
     </w:p>
@@ -1141,103 +1076,103 @@
           <w:sz w:val="20"/>
           <w:szCs w:val="20"/>
         </w:rPr>
+        <w:t xml:space="preserve">Peta sengaja dibuat membingungkan agar masyarakat lebih memilih menggunakan kendaraan pribadi di jalan raya.</w:t>
+      </w:r>
+    </w:p>
+    <w:p>
+      <w:pPr>
+        <w:spacing w:after="80"/>
+        <w:ind w:left="400"/>
+      </w:pPr>
+      <w:r>
+        <w:rPr>
+          <w:rFonts w:ascii="Arial" w:cs="Arial" w:eastAsia="Arial" w:hAnsi="Arial"/>
+          <w:b/>
+          <w:bCs/>
+          <w:sz w:val="20"/>
+          <w:szCs w:val="20"/>
+        </w:rPr>
+        <w:t xml:space="preserve">B. </w:t>
+      </w:r>
+      <w:r>
+        <w:rPr>
+          <w:rFonts w:ascii="Arial" w:cs="Arial" w:eastAsia="Arial" w:hAnsi="Arial"/>
+          <w:sz w:val="20"/>
+          <w:szCs w:val="20"/>
+        </w:rPr>
+        <w:t xml:space="preserve">Agar ukuran file gambar digital pada aplikasi ponsel pintar menjadi sekecil mungkin tanpa memedulikan kenyamanan pengguna.</w:t>
+      </w:r>
+    </w:p>
+    <w:p>
+      <w:pPr>
+        <w:spacing w:after="80"/>
+        <w:ind w:left="400"/>
+      </w:pPr>
+      <w:r>
+        <w:rPr>
+          <w:rFonts w:ascii="Arial" w:cs="Arial" w:eastAsia="Arial" w:hAnsi="Arial"/>
+          <w:b/>
+          <w:bCs/>
+          <w:sz w:val="20"/>
+          <w:szCs w:val="20"/>
+        </w:rPr>
+        <w:t xml:space="preserve">C. </w:t>
+      </w:r>
+      <w:r>
+        <w:rPr>
+          <w:rFonts w:ascii="Arial" w:cs="Arial" w:eastAsia="Arial" w:hAnsi="Arial"/>
+          <w:sz w:val="20"/>
+          <w:szCs w:val="20"/>
+        </w:rPr>
+        <w:t xml:space="preserve">Menyaring dan mempertahankan informasi esensial yang diperlukan penumpang (rute, stasiun, transit) sembari mengeliminasi detail fisik yang tidak relevan (noise visual).</w:t>
+      </w:r>
+    </w:p>
+    <w:p>
+      <w:pPr>
+        <w:spacing w:after="80"/>
+        <w:ind w:left="400"/>
+      </w:pPr>
+      <w:r>
+        <w:rPr>
+          <w:rFonts w:ascii="Arial" w:cs="Arial" w:eastAsia="Arial" w:hAnsi="Arial"/>
+          <w:b/>
+          <w:bCs/>
+          <w:sz w:val="20"/>
+          <w:szCs w:val="20"/>
+        </w:rPr>
+        <w:t xml:space="preserve">D. </w:t>
+      </w:r>
+      <w:r>
+        <w:rPr>
+          <w:rFonts w:ascii="Arial" w:cs="Arial" w:eastAsia="Arial" w:hAnsi="Arial"/>
+          <w:sz w:val="20"/>
+          <w:szCs w:val="20"/>
+        </w:rPr>
+        <w:t xml:space="preserve">Perancang peta kekurangan waktu dan anggaran untuk menggambar gedung dan pohon di sekitar stasiun secara realistis.</w:t>
+      </w:r>
+    </w:p>
+    <w:p>
+      <w:pPr>
+        <w:spacing w:after="80"/>
+        <w:ind w:left="400"/>
+      </w:pPr>
+      <w:r>
+        <w:rPr>
+          <w:rFonts w:ascii="Arial" w:cs="Arial" w:eastAsia="Arial" w:hAnsi="Arial"/>
+          <w:b/>
+          <w:bCs/>
+          <w:sz w:val="20"/>
+          <w:szCs w:val="20"/>
+        </w:rPr>
+        <w:t xml:space="preserve">E. </w:t>
+      </w:r>
+      <w:r>
+        <w:rPr>
+          <w:rFonts w:ascii="Arial" w:cs="Arial" w:eastAsia="Arial" w:hAnsi="Arial"/>
+          <w:sz w:val="20"/>
+          <w:szCs w:val="20"/>
+        </w:rPr>
         <w:t xml:space="preserve">Jalur kereta bawah tanah tidak terikat dengan hukum gravitasi dan tata ruang permukaan bumi sehingga gedung diabaikan.</w:t>
-      </w:r>
-    </w:p>
-    <w:p>
-      <w:pPr>
-        <w:spacing w:after="80"/>
-        <w:ind w:left="400"/>
-      </w:pPr>
-      <w:r>
-        <w:rPr>
-          <w:rFonts w:ascii="Arial" w:cs="Arial" w:eastAsia="Arial" w:hAnsi="Arial"/>
-          <w:b/>
-          <w:bCs/>
-          <w:sz w:val="20"/>
-          <w:szCs w:val="20"/>
-        </w:rPr>
-        <w:t xml:space="preserve">B. </w:t>
-      </w:r>
-      <w:r>
-        <w:rPr>
-          <w:rFonts w:ascii="Arial" w:cs="Arial" w:eastAsia="Arial" w:hAnsi="Arial"/>
-          <w:sz w:val="20"/>
-          <w:szCs w:val="20"/>
-        </w:rPr>
-        <w:t xml:space="preserve">Peta sengaja dibuat membingungkan agar masyarakat lebih memilih menggunakan kendaraan pribadi di jalan raya.</w:t>
-      </w:r>
-    </w:p>
-    <w:p>
-      <w:pPr>
-        <w:spacing w:after="80"/>
-        <w:ind w:left="400"/>
-      </w:pPr>
-      <w:r>
-        <w:rPr>
-          <w:rFonts w:ascii="Arial" w:cs="Arial" w:eastAsia="Arial" w:hAnsi="Arial"/>
-          <w:b/>
-          <w:bCs/>
-          <w:sz w:val="20"/>
-          <w:szCs w:val="20"/>
-        </w:rPr>
-        <w:t xml:space="preserve">C. </w:t>
-      </w:r>
-      <w:r>
-        <w:rPr>
-          <w:rFonts w:ascii="Arial" w:cs="Arial" w:eastAsia="Arial" w:hAnsi="Arial"/>
-          <w:sz w:val="20"/>
-          <w:szCs w:val="20"/>
-        </w:rPr>
-        <w:t xml:space="preserve">Agar ukuran file gambar digital pada aplikasi ponsel pintar menjadi sekecil mungkin tanpa memedulikan kenyamanan pengguna.</w:t>
-      </w:r>
-    </w:p>
-    <w:p>
-      <w:pPr>
-        <w:spacing w:after="80"/>
-        <w:ind w:left="400"/>
-      </w:pPr>
-      <w:r>
-        <w:rPr>
-          <w:rFonts w:ascii="Arial" w:cs="Arial" w:eastAsia="Arial" w:hAnsi="Arial"/>
-          <w:b/>
-          <w:bCs/>
-          <w:sz w:val="20"/>
-          <w:szCs w:val="20"/>
-        </w:rPr>
-        <w:t xml:space="preserve">D. </w:t>
-      </w:r>
-      <w:r>
-        <w:rPr>
-          <w:rFonts w:ascii="Arial" w:cs="Arial" w:eastAsia="Arial" w:hAnsi="Arial"/>
-          <w:sz w:val="20"/>
-          <w:szCs w:val="20"/>
-        </w:rPr>
-        <w:t xml:space="preserve">Menyaring dan mempertahankan informasi esensial yang diperlukan penumpang (rute, stasiun, transit) sembari mengeliminasi detail fisik yang tidak relevan (noise visual).</w:t>
-      </w:r>
-    </w:p>
-    <w:p>
-      <w:pPr>
-        <w:spacing w:after="80"/>
-        <w:ind w:left="400"/>
-      </w:pPr>
-      <w:r>
-        <w:rPr>
-          <w:rFonts w:ascii="Arial" w:cs="Arial" w:eastAsia="Arial" w:hAnsi="Arial"/>
-          <w:b/>
-          <w:bCs/>
-          <w:sz w:val="20"/>
-          <w:szCs w:val="20"/>
-        </w:rPr>
-        <w:t xml:space="preserve">E. </w:t>
-      </w:r>
-      <w:r>
-        <w:rPr>
-          <w:rFonts w:ascii="Arial" w:cs="Arial" w:eastAsia="Arial" w:hAnsi="Arial"/>
-          <w:sz w:val="20"/>
-          <w:szCs w:val="20"/>
-        </w:rPr>
-        <w:t xml:space="preserve">Perancang peta kekurangan waktu dan anggaran untuk menggambar gedung dan pohon di sekitar stasiun secara realistis.</w:t>
       </w:r>
     </w:p>
     <w:p>
@@ -1300,20 +1235,7 @@
           <w:sz w:val="22"/>
           <w:szCs w:val="22"/>
         </w:rPr>
-        <w:t xml:space="preserve">SOAL NO. 6 [Berpikir Algoritma]</w:t>
-      </w:r>
-    </w:p>
-    <w:p>
-      <w:pPr>
-        <w:spacing w:after="100"/>
-      </w:pPr>
-      <w:r>
-        <w:rPr>
-          <w:rFonts w:ascii="Arial" w:cs="Arial" w:eastAsia="Arial" w:hAnsi="Arial"/>
-          <w:sz w:val="20"/>
-          <w:szCs w:val="20"/>
-        </w:rPr>
-        <w:t xml:space="preserve">[STIMULUS HAKIKAT ALGORITMA]</w:t>
+        <w:t xml:space="preserve">SOAL NO. 6</w:t>
       </w:r>
     </w:p>
     <w:p>
@@ -1522,7 +1444,7 @@
           <w:sz w:val="22"/>
           <w:szCs w:val="22"/>
         </w:rPr>
-        <w:t xml:space="preserve">SOAL NO. 7 [Kasus Kota Delta (Dekomposisi)]</w:t>
+        <w:t xml:space="preserve">SOAL NO. 7</w:t>
       </w:r>
     </w:p>
     <w:p>
@@ -1535,7 +1457,7 @@
           <w:sz w:val="20"/>
           <w:szCs w:val="20"/>
         </w:rPr>
-        <w:t xml:space="preserve">[BACAAN STUDI KASUS 1 - KOTA DELTA]</w:t>
+        <w:t xml:space="preserve">Kota Delta adalah kawasan industri padat yang dilintasi oleh Sungai Ciliwung. Selama tiga tahun terakhir pada setiap puncak musim hujan bulan Januari, wilayah hilir Kota Delta selalu dilanda banjir bandang bercampur lumpur beracun yang melumpuhkan aktivitas ekonomi dan menyebabkan ribuan warga mengungsi. Pemerintah daerah membentuk Tim Satgas Penanggulangan Krisis yang dipimpin oleh Dr. Aris.</w:t>
       </w:r>
     </w:p>
     <w:p>
@@ -1548,19 +1470,6 @@
           <w:sz w:val="20"/>
           <w:szCs w:val="20"/>
         </w:rPr>
-        <w:t xml:space="preserve">Kota Delta adalah kawasan industri padat yang dilintasi oleh Sungai Ciliwung. Selama tiga tahun terakhir pada setiap puncak musim hujan bulan Januari, wilayah hilir Kota Delta selalu dilanda banjir bandang bercampur lumpur beracun yang melumpuhkan aktivitas ekonomi dan menyebabkan ribuan warga mengungsi. Pemerintah daerah membentuk Tim Satgas Penanggulangan Krisis yang dipimpin oleh Dr. Aris.</w:t>
-      </w:r>
-    </w:p>
-    <w:p>
-      <w:pPr>
-        <w:spacing w:after="100"/>
-      </w:pPr>
-      <w:r>
-        <w:rPr>
-          <w:rFonts w:ascii="Arial" w:cs="Arial" w:eastAsia="Arial" w:hAnsi="Arial"/>
-          <w:sz w:val="20"/>
-          <w:szCs w:val="20"/>
-        </w:rPr>
         <w:t xml:space="preserve">Menghadapi krisis masif ini, Dr. Aris secara tegas menolak solusi reaktif semacam sekadar membagikan sembako atau menambal tanggul sementara. Mengapa penolakan Dr. Aris tersebut mencerminkan penerapan pola pikir Berpikir Komputasional tingkat tinggi?</w:t>
       </w:r>
     </w:p>
@@ -1585,55 +1494,55 @@
           <w:sz w:val="20"/>
           <w:szCs w:val="20"/>
         </w:rPr>
+        <w:t xml:space="preserve">Karena solusi reaktif hanya meredakan gejala permukaan (symptomatic) tanpa menyentuh analisis kausalitas sistemik yang menjadi akar utama bencana.</w:t>
+      </w:r>
+    </w:p>
+    <w:p>
+      <w:pPr>
+        <w:spacing w:after="80"/>
+        <w:ind w:left="400"/>
+      </w:pPr>
+      <w:r>
+        <w:rPr>
+          <w:rFonts w:ascii="Arial" w:cs="Arial" w:eastAsia="Arial" w:hAnsi="Arial"/>
+          <w:b/>
+          <w:bCs/>
+          <w:sz w:val="20"/>
+          <w:szCs w:val="20"/>
+        </w:rPr>
+        <w:t xml:space="preserve">B. </w:t>
+      </w:r>
+      <w:r>
+        <w:rPr>
+          <w:rFonts w:ascii="Arial" w:cs="Arial" w:eastAsia="Arial" w:hAnsi="Arial"/>
+          <w:sz w:val="20"/>
+          <w:szCs w:val="20"/>
+        </w:rPr>
+        <w:t xml:space="preserve">Karena Dr. Aris menilai anggaran belanja sembako daerah terlalu murah sehingga tidak mengangkat gengsi penelitian tim satgas.</w:t>
+      </w:r>
+    </w:p>
+    <w:p>
+      <w:pPr>
+        <w:spacing w:after="80"/>
+        <w:ind w:left="400"/>
+      </w:pPr>
+      <w:r>
+        <w:rPr>
+          <w:rFonts w:ascii="Arial" w:cs="Arial" w:eastAsia="Arial" w:hAnsi="Arial"/>
+          <w:b/>
+          <w:bCs/>
+          <w:sz w:val="20"/>
+          <w:szCs w:val="20"/>
+        </w:rPr>
+        <w:t xml:space="preserve">C. </w:t>
+      </w:r>
+      <w:r>
+        <w:rPr>
+          <w:rFonts w:ascii="Arial" w:cs="Arial" w:eastAsia="Arial" w:hAnsi="Arial"/>
+          <w:sz w:val="20"/>
+          <w:szCs w:val="20"/>
+        </w:rPr>
         <w:t xml:space="preserve">Karena warga pengungsi di hilir sungai menolak menerima bantuan logistik sebelum pabrik-pabrik ditutup secara paksa.</w:t>
-      </w:r>
-    </w:p>
-    <w:p>
-      <w:pPr>
-        <w:spacing w:after="80"/>
-        <w:ind w:left="400"/>
-      </w:pPr>
-      <w:r>
-        <w:rPr>
-          <w:rFonts w:ascii="Arial" w:cs="Arial" w:eastAsia="Arial" w:hAnsi="Arial"/>
-          <w:b/>
-          <w:bCs/>
-          <w:sz w:val="20"/>
-          <w:szCs w:val="20"/>
-        </w:rPr>
-        <w:t xml:space="preserve">B. </w:t>
-      </w:r>
-      <w:r>
-        <w:rPr>
-          <w:rFonts w:ascii="Arial" w:cs="Arial" w:eastAsia="Arial" w:hAnsi="Arial"/>
-          <w:sz w:val="20"/>
-          <w:szCs w:val="20"/>
-        </w:rPr>
-        <w:t xml:space="preserve">Karena solusi reaktif hanya meredakan gejala permukaan (symptomatic) tanpa menyentuh analisis kausalitas sistemik yang menjadi akar utama bencana.</w:t>
-      </w:r>
-    </w:p>
-    <w:p>
-      <w:pPr>
-        <w:spacing w:after="80"/>
-        <w:ind w:left="400"/>
-      </w:pPr>
-      <w:r>
-        <w:rPr>
-          <w:rFonts w:ascii="Arial" w:cs="Arial" w:eastAsia="Arial" w:hAnsi="Arial"/>
-          <w:b/>
-          <w:bCs/>
-          <w:sz w:val="20"/>
-          <w:szCs w:val="20"/>
-        </w:rPr>
-        <w:t xml:space="preserve">C. </w:t>
-      </w:r>
-      <w:r>
-        <w:rPr>
-          <w:rFonts w:ascii="Arial" w:cs="Arial" w:eastAsia="Arial" w:hAnsi="Arial"/>
-          <w:sz w:val="20"/>
-          <w:szCs w:val="20"/>
-        </w:rPr>
-        <w:t xml:space="preserve">Karena Dr. Aris menilai anggaran belanja sembako daerah terlalu murah sehingga tidak mengangkat gengsi penelitian tim satgas.</w:t>
       </w:r>
     </w:p>
     <w:p>
@@ -1744,7 +1653,7 @@
           <w:sz w:val="22"/>
           <w:szCs w:val="22"/>
         </w:rPr>
-        <w:t xml:space="preserve">SOAL NO. 8 [Kasus Kota Delta (Dekomposisi)]</w:t>
+        <w:t xml:space="preserve">SOAL NO. 8</w:t>
       </w:r>
     </w:p>
     <w:p>
@@ -1757,7 +1666,7 @@
           <w:sz w:val="20"/>
           <w:szCs w:val="20"/>
         </w:rPr>
-        <w:t xml:space="preserve">[ANALISIS METODOLOGI KOTA DELTA]</w:t>
+        <w:t xml:space="preserve">Untuk mengungkap akar bencana banjir lumpur beracun di Kota Delta, Dr. Aris membagi investigasi ke dalam tiga area fokus yang independen namun saling melengkapi: (1) Tim Analisis Curah Hujan dan Tata Air, (2) Tim Evaluasi Tata Guna Lahan dan Deforestasi di hulu sungai, dan (3) Tim Uji Kualitas Air untuk mengidentifikasi kandungan kimiawi lumpur sedimen.</w:t>
       </w:r>
     </w:p>
     <w:p>
@@ -1770,19 +1679,6 @@
           <w:sz w:val="20"/>
           <w:szCs w:val="20"/>
         </w:rPr>
-        <w:t xml:space="preserve">Untuk mengungkap akar bencana banjir lumpur beracun di Kota Delta, Dr. Aris membagi investigasi ke dalam tiga area fokus yang independen namun saling melengkapi: (1) Tim Analisis Curah Hujan dan Tata Air, (2) Tim Evaluasi Tata Guna Lahan dan Deforestasi di hulu sungai, dan (3) Tim Uji Kualitas Air untuk mengidentifikasi kandungan kimiawi lumpur sedimen.</w:t>
-      </w:r>
-    </w:p>
-    <w:p>
-      <w:pPr>
-        <w:spacing w:after="100"/>
-      </w:pPr>
-      <w:r>
-        <w:rPr>
-          <w:rFonts w:ascii="Arial" w:cs="Arial" w:eastAsia="Arial" w:hAnsi="Arial"/>
-          <w:sz w:val="20"/>
-          <w:szCs w:val="20"/>
-        </w:rPr>
         <w:t xml:space="preserve">Dari perspektif pemrosesan informasi, keunggulan ilmiah apakah yang diperoleh melalui dekomposisi tiga area fokus investigasi tersebut?</w:t>
       </w:r>
     </w:p>
@@ -1807,31 +1703,31 @@
           <w:sz w:val="20"/>
           <w:szCs w:val="20"/>
         </w:rPr>
+        <w:t xml:space="preserve">Menghilangkan kebutuhan rapat koordinasi karena ketiga tim dilarang saling bertukar data hingga bencana tahun berikutnya tiba.</w:t>
+      </w:r>
+    </w:p>
+    <w:p>
+      <w:pPr>
+        <w:spacing w:after="80"/>
+        <w:ind w:left="400"/>
+      </w:pPr>
+      <w:r>
+        <w:rPr>
+          <w:rFonts w:ascii="Arial" w:cs="Arial" w:eastAsia="Arial" w:hAnsi="Arial"/>
+          <w:b/>
+          <w:bCs/>
+          <w:sz w:val="20"/>
+          <w:szCs w:val="20"/>
+        </w:rPr>
+        <w:t xml:space="preserve">B. </w:t>
+      </w:r>
+      <w:r>
+        <w:rPr>
+          <w:rFonts w:ascii="Arial" w:cs="Arial" w:eastAsia="Arial" w:hAnsi="Arial"/>
+          <w:sz w:val="20"/>
+          <w:szCs w:val="20"/>
+        </w:rPr>
         <w:t xml:space="preserve">Memungkinkan investigasi mendalam dan pengumpulan bukti saintifik berjalan secara paralel pada tiga determinan kritis: atmosferik, bentang lahan, dan polutan kimia.</w:t>
-      </w:r>
-    </w:p>
-    <w:p>
-      <w:pPr>
-        <w:spacing w:after="80"/>
-        <w:ind w:left="400"/>
-      </w:pPr>
-      <w:r>
-        <w:rPr>
-          <w:rFonts w:ascii="Arial" w:cs="Arial" w:eastAsia="Arial" w:hAnsi="Arial"/>
-          <w:b/>
-          <w:bCs/>
-          <w:sz w:val="20"/>
-          <w:szCs w:val="20"/>
-        </w:rPr>
-        <w:t xml:space="preserve">B. </w:t>
-      </w:r>
-      <w:r>
-        <w:rPr>
-          <w:rFonts w:ascii="Arial" w:cs="Arial" w:eastAsia="Arial" w:hAnsi="Arial"/>
-          <w:sz w:val="20"/>
-          <w:szCs w:val="20"/>
-        </w:rPr>
-        <w:t xml:space="preserve">Menghilangkan kebutuhan rapat koordinasi karena ketiga tim dilarang saling bertukar data hingga bencana tahun berikutnya tiba.</w:t>
       </w:r>
     </w:p>
     <w:p>
@@ -1966,7 +1862,7 @@
           <w:sz w:val="22"/>
           <w:szCs w:val="22"/>
         </w:rPr>
-        <w:t xml:space="preserve">SOAL NO. 9 [Kasus Kota Delta (Pengenalan Pola)]</w:t>
+        <w:t xml:space="preserve">SOAL NO. 9</w:t>
       </w:r>
     </w:p>
     <w:p>
@@ -1979,7 +1875,7 @@
           <w:sz w:val="20"/>
           <w:szCs w:val="20"/>
         </w:rPr>
-        <w:t xml:space="preserve">[ANALISIS DATA HISTORIS KOTA DELTA]</w:t>
+        <w:t xml:space="preserve">Setelah satu bulan mengumpulkan dan merekonsiliasi data, Tim Analisis membandingkan catatan cuaca, hidrologi, dan pasang surut selama 20 tahun terakhir. Mereka menemukan kecenderungan konsisten: banjir bandang besar selalu dan HANYA terjadi jika curah hujan harian melebihi 150 mm/hari berturut-turut selama tiga hari yang bertepatan dengan fenomena pasang air laut maksimum (rob).</w:t>
       </w:r>
     </w:p>
     <w:p>
@@ -1992,19 +1888,6 @@
           <w:sz w:val="20"/>
           <w:szCs w:val="20"/>
         </w:rPr>
-        <w:t xml:space="preserve">Setelah satu bulan mengumpulkan dan merekonsiliasi data, Tim Analisis membandingkan catatan cuaca, hidrologi, dan pasang surut selama 20 tahun terakhir. Mereka menemukan kecenderungan konsisten: banjir bandang besar selalu dan HANYA terjadi jika curah hujan harian melebihi 150 mm/hari berturut-turut selama tiga hari yang bertepatan dengan fenomena pasang air laut maksimum (rob).</w:t>
-      </w:r>
-    </w:p>
-    <w:p>
-      <w:pPr>
-        <w:spacing w:after="100"/>
-      </w:pPr>
-      <w:r>
-        <w:rPr>
-          <w:rFonts w:ascii="Arial" w:cs="Arial" w:eastAsia="Arial" w:hAnsi="Arial"/>
-          <w:sz w:val="20"/>
-          <w:szCs w:val="20"/>
-        </w:rPr>
         <w:t xml:space="preserve">Penemuan kecenderungan konsisten tersebut merupakan manifestasi pilar Pengenalan Pola karena...</w:t>
       </w:r>
     </w:p>
@@ -2029,79 +1912,79 @@
           <w:sz w:val="20"/>
           <w:szCs w:val="20"/>
         </w:rPr>
+        <w:t xml:space="preserve">Mengabaikan faktor pasang air laut rob karena air laut berada di hilir dan tidak memengaruhi aliran air tawar sungai.</w:t>
+      </w:r>
+    </w:p>
+    <w:p>
+      <w:pPr>
+        <w:spacing w:after="80"/>
+        <w:ind w:left="400"/>
+      </w:pPr>
+      <w:r>
+        <w:rPr>
+          <w:rFonts w:ascii="Arial" w:cs="Arial" w:eastAsia="Arial" w:hAnsi="Arial"/>
+          <w:b/>
+          <w:bCs/>
+          <w:sz w:val="20"/>
+          <w:szCs w:val="20"/>
+        </w:rPr>
+        <w:t xml:space="preserve">B. </w:t>
+      </w:r>
+      <w:r>
+        <w:rPr>
+          <w:rFonts w:ascii="Arial" w:cs="Arial" w:eastAsia="Arial" w:hAnsi="Arial"/>
+          <w:sz w:val="20"/>
+          <w:szCs w:val="20"/>
+        </w:rPr>
+        <w:t xml:space="preserve">Menemukan keteraturan hubungan berulang dari rekaman data historis jangka panjang yang berfungsi sebagai kondisi batas pemicu (trigger boundary) bencana.</w:t>
+      </w:r>
+    </w:p>
+    <w:p>
+      <w:pPr>
+        <w:spacing w:after="80"/>
+        <w:ind w:left="400"/>
+      </w:pPr>
+      <w:r>
+        <w:rPr>
+          <w:rFonts w:ascii="Arial" w:cs="Arial" w:eastAsia="Arial" w:hAnsi="Arial"/>
+          <w:b/>
+          <w:bCs/>
+          <w:sz w:val="20"/>
+          <w:szCs w:val="20"/>
+        </w:rPr>
+        <w:t xml:space="preserve">C. </w:t>
+      </w:r>
+      <w:r>
+        <w:rPr>
+          <w:rFonts w:ascii="Arial" w:cs="Arial" w:eastAsia="Arial" w:hAnsi="Arial"/>
+          <w:sz w:val="20"/>
+          <w:szCs w:val="20"/>
+        </w:rPr>
+        <w:t xml:space="preserve">Merupakan kebetulan statistik yang tidak memiliki korelasi fisika atmosfer dengan meluapnya air sungai Ciliwung.</w:t>
+      </w:r>
+    </w:p>
+    <w:p>
+      <w:pPr>
+        <w:spacing w:after="80"/>
+        <w:ind w:left="400"/>
+      </w:pPr>
+      <w:r>
+        <w:rPr>
+          <w:rFonts w:ascii="Arial" w:cs="Arial" w:eastAsia="Arial" w:hAnsi="Arial"/>
+          <w:b/>
+          <w:bCs/>
+          <w:sz w:val="20"/>
+          <w:szCs w:val="20"/>
+        </w:rPr>
+        <w:t xml:space="preserve">D. </w:t>
+      </w:r>
+      <w:r>
+        <w:rPr>
+          <w:rFonts w:ascii="Arial" w:cs="Arial" w:eastAsia="Arial" w:hAnsi="Arial"/>
+          <w:sz w:val="20"/>
+          <w:szCs w:val="20"/>
+        </w:rPr>
         <w:t xml:space="preserve">Membuktikan bahwa prediksi banjir dapat dilakukan tanpa memerlukan data kuantitatif curah hujan dari BMKG.</w:t>
-      </w:r>
-    </w:p>
-    <w:p>
-      <w:pPr>
-        <w:spacing w:after="80"/>
-        <w:ind w:left="400"/>
-      </w:pPr>
-      <w:r>
-        <w:rPr>
-          <w:rFonts w:ascii="Arial" w:cs="Arial" w:eastAsia="Arial" w:hAnsi="Arial"/>
-          <w:b/>
-          <w:bCs/>
-          <w:sz w:val="20"/>
-          <w:szCs w:val="20"/>
-        </w:rPr>
-        <w:t xml:space="preserve">B. </w:t>
-      </w:r>
-      <w:r>
-        <w:rPr>
-          <w:rFonts w:ascii="Arial" w:cs="Arial" w:eastAsia="Arial" w:hAnsi="Arial"/>
-          <w:sz w:val="20"/>
-          <w:szCs w:val="20"/>
-        </w:rPr>
-        <w:t xml:space="preserve">Mengabaikan faktor pasang air laut rob karena air laut berada di hilir dan tidak memengaruhi aliran air tawar sungai.</w:t>
-      </w:r>
-    </w:p>
-    <w:p>
-      <w:pPr>
-        <w:spacing w:after="80"/>
-        <w:ind w:left="400"/>
-      </w:pPr>
-      <w:r>
-        <w:rPr>
-          <w:rFonts w:ascii="Arial" w:cs="Arial" w:eastAsia="Arial" w:hAnsi="Arial"/>
-          <w:b/>
-          <w:bCs/>
-          <w:sz w:val="20"/>
-          <w:szCs w:val="20"/>
-        </w:rPr>
-        <w:t xml:space="preserve">C. </w:t>
-      </w:r>
-      <w:r>
-        <w:rPr>
-          <w:rFonts w:ascii="Arial" w:cs="Arial" w:eastAsia="Arial" w:hAnsi="Arial"/>
-          <w:sz w:val="20"/>
-          <w:szCs w:val="20"/>
-        </w:rPr>
-        <w:t xml:space="preserve">Menemukan keteraturan hubungan berulang dari rekaman data historis jangka panjang yang berfungsi sebagai kondisi batas pemicu (trigger boundary) bencana.</w:t>
-      </w:r>
-    </w:p>
-    <w:p>
-      <w:pPr>
-        <w:spacing w:after="80"/>
-        <w:ind w:left="400"/>
-      </w:pPr>
-      <w:r>
-        <w:rPr>
-          <w:rFonts w:ascii="Arial" w:cs="Arial" w:eastAsia="Arial" w:hAnsi="Arial"/>
-          <w:b/>
-          <w:bCs/>
-          <w:sz w:val="20"/>
-          <w:szCs w:val="20"/>
-        </w:rPr>
-        <w:t xml:space="preserve">D. </w:t>
-      </w:r>
-      <w:r>
-        <w:rPr>
-          <w:rFonts w:ascii="Arial" w:cs="Arial" w:eastAsia="Arial" w:hAnsi="Arial"/>
-          <w:sz w:val="20"/>
-          <w:szCs w:val="20"/>
-        </w:rPr>
-        <w:t xml:space="preserve">Merupakan kebetulan statistik yang tidak memiliki korelasi fisika atmosfer dengan meluapnya air sungai Ciliwung.</w:t>
       </w:r>
     </w:p>
     <w:p>
@@ -2188,7 +2071,7 @@
           <w:sz w:val="22"/>
           <w:szCs w:val="22"/>
         </w:rPr>
-        <w:t xml:space="preserve">SOAL NO. 10 [Kasus Kota Delta (Abstraksi)]</w:t>
+        <w:t xml:space="preserve">SOAL NO. 10</w:t>
       </w:r>
     </w:p>
     <w:p>
@@ -2201,7 +2084,7 @@
           <w:sz w:val="20"/>
           <w:szCs w:val="20"/>
         </w:rPr>
-        <w:t xml:space="preserve">[PENELUSURAN POLUTAN KOTA DELTA]</w:t>
+        <w:t xml:space="preserve">Tim Uji Kualitas Air mendeteksi konsentrasi tinggi logam berat berbahaya kromium dan timbal di dalam lumpur banjir. Saat mengolah peta industri di sepanjang bantaran sungai, Dr. Aris memutuskan untuk HANYA memeriksa pabrik tekstil dan pabrik aki baterai. Ia secara sadar mengabaikan ratusan pabrik makanan, pabrik kayu, dan ruko-ruko kecil, serta tidak memedulikan warna seragam pekerja maupun tahun berdiri pabrik.</w:t>
       </w:r>
     </w:p>
     <w:p>
@@ -2214,19 +2097,6 @@
           <w:sz w:val="20"/>
           <w:szCs w:val="20"/>
         </w:rPr>
-        <w:t xml:space="preserve">Tim Uji Kualitas Air mendeteksi konsentrasi tinggi logam berat berbahaya kromium dan timbal di dalam lumpur banjir. Saat mengolah peta industri di sepanjang bantaran sungai, Dr. Aris memutuskan untuk HANYA memeriksa pabrik tekstil dan pabrik aki baterai. Ia secara sadar mengabaikan ratusan pabrik makanan, pabrik kayu, dan ruko-ruko kecil, serta tidak memedulikan warna seragam pekerja maupun tahun berdiri pabrik.</w:t>
-      </w:r>
-    </w:p>
-    <w:p>
-      <w:pPr>
-        <w:spacing w:after="100"/>
-      </w:pPr>
-      <w:r>
-        <w:rPr>
-          <w:rFonts w:ascii="Arial" w:cs="Arial" w:eastAsia="Arial" w:hAnsi="Arial"/>
-          <w:sz w:val="20"/>
-          <w:szCs w:val="20"/>
-        </w:rPr>
         <w:t xml:space="preserve">Alasan rasional paling mendasar mengapa pengabaian data tersebut merupakan penerapan Abstraksi yang sangat tepat adalah...</w:t>
       </w:r>
     </w:p>
@@ -2251,103 +2121,103 @@
           <w:sz w:val="20"/>
           <w:szCs w:val="20"/>
         </w:rPr>
+        <w:t xml:space="preserve">Dr. Aris meyakini bahwa pabrik kayu dan makanan tidak menggunakan air sungai untuk membuang limbah domestik.</w:t>
+      </w:r>
+    </w:p>
+    <w:p>
+      <w:pPr>
+        <w:spacing w:after="80"/>
+        <w:ind w:left="400"/>
+      </w:pPr>
+      <w:r>
+        <w:rPr>
+          <w:rFonts w:ascii="Arial" w:cs="Arial" w:eastAsia="Arial" w:hAnsi="Arial"/>
+          <w:b/>
+          <w:bCs/>
+          <w:sz w:val="20"/>
+          <w:szCs w:val="20"/>
+        </w:rPr>
+        <w:t xml:space="preserve">B. </w:t>
+      </w:r>
+      <w:r>
+        <w:rPr>
+          <w:rFonts w:ascii="Arial" w:cs="Arial" w:eastAsia="Arial" w:hAnsi="Arial"/>
+          <w:sz w:val="20"/>
+          <w:szCs w:val="20"/>
+        </w:rPr>
+        <w:t xml:space="preserve">Pabrik aki baterai dan tekstil berada di bawah naungan kementerian yang berbeda dengan pabrik makanan.</w:t>
+      </w:r>
+    </w:p>
+    <w:p>
+      <w:pPr>
+        <w:spacing w:after="80"/>
+        <w:ind w:left="400"/>
+      </w:pPr>
+      <w:r>
+        <w:rPr>
+          <w:rFonts w:ascii="Arial" w:cs="Arial" w:eastAsia="Arial" w:hAnsi="Arial"/>
+          <w:b/>
+          <w:bCs/>
+          <w:sz w:val="20"/>
+          <w:szCs w:val="20"/>
+        </w:rPr>
+        <w:t xml:space="preserve">C. </w:t>
+      </w:r>
+      <w:r>
+        <w:rPr>
+          <w:rFonts w:ascii="Arial" w:cs="Arial" w:eastAsia="Arial" w:hAnsi="Arial"/>
+          <w:sz w:val="20"/>
+          <w:szCs w:val="20"/>
+        </w:rPr>
+        <w:t xml:space="preserve">Menyaring variabel yang tidak relevan (noise) agar fokus tim tercurah pada penghasil potensial kromium dan timbal, sehingga menghemat waktu dan sumber daya krusial.</w:t>
+      </w:r>
+    </w:p>
+    <w:p>
+      <w:pPr>
+        <w:spacing w:after="80"/>
+        <w:ind w:left="400"/>
+      </w:pPr>
+      <w:r>
+        <w:rPr>
+          <w:rFonts w:ascii="Arial" w:cs="Arial" w:eastAsia="Arial" w:hAnsi="Arial"/>
+          <w:b/>
+          <w:bCs/>
+          <w:sz w:val="20"/>
+          <w:szCs w:val="20"/>
+        </w:rPr>
+        <w:t xml:space="preserve">D. </w:t>
+      </w:r>
+      <w:r>
+        <w:rPr>
+          <w:rFonts w:ascii="Arial" w:cs="Arial" w:eastAsia="Arial" w:hAnsi="Arial"/>
+          <w:sz w:val="20"/>
+          <w:szCs w:val="20"/>
+        </w:rPr>
+        <w:t xml:space="preserve">Pabrik makanan dan ruko kecil membayar retribusi keamanan lebih tinggi kepada dinas perindustrian kota.</w:t>
+      </w:r>
+    </w:p>
+    <w:p>
+      <w:pPr>
+        <w:spacing w:after="80"/>
+        <w:ind w:left="400"/>
+      </w:pPr>
+      <w:r>
+        <w:rPr>
+          <w:rFonts w:ascii="Arial" w:cs="Arial" w:eastAsia="Arial" w:hAnsi="Arial"/>
+          <w:b/>
+          <w:bCs/>
+          <w:sz w:val="20"/>
+          <w:szCs w:val="20"/>
+        </w:rPr>
+        <w:t xml:space="preserve">E. </w:t>
+      </w:r>
+      <w:r>
+        <w:rPr>
+          <w:rFonts w:ascii="Arial" w:cs="Arial" w:eastAsia="Arial" w:hAnsi="Arial"/>
+          <w:sz w:val="20"/>
+          <w:szCs w:val="20"/>
+        </w:rPr>
         <w:t xml:space="preserve">Warna seragam pekerja dan tahun berdiri pabrik merupakan rahasia negara yang dilindungi undang-undang intelijen bisnis.</w:t>
-      </w:r>
-    </w:p>
-    <w:p>
-      <w:pPr>
-        <w:spacing w:after="80"/>
-        <w:ind w:left="400"/>
-      </w:pPr>
-      <w:r>
-        <w:rPr>
-          <w:rFonts w:ascii="Arial" w:cs="Arial" w:eastAsia="Arial" w:hAnsi="Arial"/>
-          <w:b/>
-          <w:bCs/>
-          <w:sz w:val="20"/>
-          <w:szCs w:val="20"/>
-        </w:rPr>
-        <w:t xml:space="preserve">B. </w:t>
-      </w:r>
-      <w:r>
-        <w:rPr>
-          <w:rFonts w:ascii="Arial" w:cs="Arial" w:eastAsia="Arial" w:hAnsi="Arial"/>
-          <w:sz w:val="20"/>
-          <w:szCs w:val="20"/>
-        </w:rPr>
-        <w:t xml:space="preserve">Dr. Aris meyakini bahwa pabrik kayu dan makanan tidak menggunakan air sungai untuk membuang limbah domestik.</w:t>
-      </w:r>
-    </w:p>
-    <w:p>
-      <w:pPr>
-        <w:spacing w:after="80"/>
-        <w:ind w:left="400"/>
-      </w:pPr>
-      <w:r>
-        <w:rPr>
-          <w:rFonts w:ascii="Arial" w:cs="Arial" w:eastAsia="Arial" w:hAnsi="Arial"/>
-          <w:b/>
-          <w:bCs/>
-          <w:sz w:val="20"/>
-          <w:szCs w:val="20"/>
-        </w:rPr>
-        <w:t xml:space="preserve">C. </w:t>
-      </w:r>
-      <w:r>
-        <w:rPr>
-          <w:rFonts w:ascii="Arial" w:cs="Arial" w:eastAsia="Arial" w:hAnsi="Arial"/>
-          <w:sz w:val="20"/>
-          <w:szCs w:val="20"/>
-        </w:rPr>
-        <w:t xml:space="preserve">Pabrik aki baterai dan tekstil berada di bawah naungan kementerian yang berbeda dengan pabrik makanan.</w:t>
-      </w:r>
-    </w:p>
-    <w:p>
-      <w:pPr>
-        <w:spacing w:after="80"/>
-        <w:ind w:left="400"/>
-      </w:pPr>
-      <w:r>
-        <w:rPr>
-          <w:rFonts w:ascii="Arial" w:cs="Arial" w:eastAsia="Arial" w:hAnsi="Arial"/>
-          <w:b/>
-          <w:bCs/>
-          <w:sz w:val="20"/>
-          <w:szCs w:val="20"/>
-        </w:rPr>
-        <w:t xml:space="preserve">D. </w:t>
-      </w:r>
-      <w:r>
-        <w:rPr>
-          <w:rFonts w:ascii="Arial" w:cs="Arial" w:eastAsia="Arial" w:hAnsi="Arial"/>
-          <w:sz w:val="20"/>
-          <w:szCs w:val="20"/>
-        </w:rPr>
-        <w:t xml:space="preserve">Menyaring variabel yang tidak relevan (noise) agar fokus tim tercurah pada penghasil potensial kromium dan timbal, sehingga menghemat waktu dan sumber daya krusial.</w:t>
-      </w:r>
-    </w:p>
-    <w:p>
-      <w:pPr>
-        <w:spacing w:after="80"/>
-        <w:ind w:left="400"/>
-      </w:pPr>
-      <w:r>
-        <w:rPr>
-          <w:rFonts w:ascii="Arial" w:cs="Arial" w:eastAsia="Arial" w:hAnsi="Arial"/>
-          <w:b/>
-          <w:bCs/>
-          <w:sz w:val="20"/>
-          <w:szCs w:val="20"/>
-        </w:rPr>
-        <w:t xml:space="preserve">E. </w:t>
-      </w:r>
-      <w:r>
-        <w:rPr>
-          <w:rFonts w:ascii="Arial" w:cs="Arial" w:eastAsia="Arial" w:hAnsi="Arial"/>
-          <w:sz w:val="20"/>
-          <w:szCs w:val="20"/>
-        </w:rPr>
-        <w:t xml:space="preserve">Pabrik makanan dan ruko kecil membayar retribusi keamanan lebih tinggi kepada dinas perindustrian kota.</w:t>
       </w:r>
     </w:p>
     <w:p>
@@ -2410,7 +2280,7 @@
           <w:sz w:val="22"/>
           <w:szCs w:val="22"/>
         </w:rPr>
-        <w:t xml:space="preserve">SOAL NO. 11 [Kasus Kota Delta (Algoritma)]</w:t>
+        <w:t xml:space="preserve">SOAL NO. 11</w:t>
       </w:r>
     </w:p>
     <w:p>
@@ -2423,7 +2293,7 @@
           <w:sz w:val="20"/>
           <w:szCs w:val="20"/>
         </w:rPr>
-        <w:t xml:space="preserve">[PROTOKOL MITIGASI KOTA DELTA]</w:t>
+        <w:t xml:space="preserve">Pada akhirnya, Dr. Aris menyusun Protokol Mitigasi Kota Delta yang mengikat secara hukum:</w:t>
       </w:r>
     </w:p>
     <w:p>
@@ -2436,7 +2306,7 @@
           <w:sz w:val="20"/>
           <w:szCs w:val="20"/>
         </w:rPr>
-        <w:t xml:space="preserve">Pada akhirnya, Dr. Aris menyusun Protokol Mitigasi Kota Delta yang mengikat secara hukum:</w:t>
+        <w:t xml:space="preserve">Langkah 1: Jika BMKG merilis peringatan curah hujan &gt;150 mm/hari dan pasang laut maksimum terindikasi, maka sirine Level 1 dibunyikan.</w:t>
       </w:r>
     </w:p>
     <w:p>
@@ -2449,7 +2319,7 @@
           <w:sz w:val="20"/>
           <w:szCs w:val="20"/>
         </w:rPr>
-        <w:t xml:space="preserve">Langkah 1: Jika BMKG merilis peringatan curah hujan &gt;150 mm/hari dan pasang laut maksimum terindikasi, maka sirine Level 1 dibunyikan.</w:t>
+        <w:t xml:space="preserve">Langkah 2: Seluruh pabrik tekstil dan aki wajib menghentikan pembuangan limbah cair ke sungai dalam waktu 2x24 jam.</w:t>
       </w:r>
     </w:p>
     <w:p>
@@ -2462,7 +2332,7 @@
           <w:sz w:val="20"/>
           <w:szCs w:val="20"/>
         </w:rPr>
-        <w:t xml:space="preserve">Langkah 2: Seluruh pabrik tekstil dan aki wajib menghentikan pembuangan limbah cair ke sungai dalam waktu 2x24 jam.</w:t>
+        <w:t xml:space="preserve">Langkah 3: Pintu air Katulampa Utara dibuka 50% untuk memecah debit, sementara warga zona merah dievakuasi ke zona aman.</w:t>
       </w:r>
     </w:p>
     <w:p>
@@ -2475,19 +2345,6 @@
           <w:sz w:val="20"/>
           <w:szCs w:val="20"/>
         </w:rPr>
-        <w:t xml:space="preserve">Langkah 3: Pintu air Katulampa Utara dibuka 50% untuk memecah debit, sementara warga zona merah dievakuasi ke zona aman.</w:t>
-      </w:r>
-    </w:p>
-    <w:p>
-      <w:pPr>
-        <w:spacing w:after="100"/>
-      </w:pPr>
-      <w:r>
-        <w:rPr>
-          <w:rFonts w:ascii="Arial" w:cs="Arial" w:eastAsia="Arial" w:hAnsi="Arial"/>
-          <w:sz w:val="20"/>
-          <w:szCs w:val="20"/>
-        </w:rPr>
         <w:t xml:space="preserve">Struktur kontrol logika pemrograman komputasional apakah yang paling mendasari "Langkah 1" pada Protokol Mitigasi tersebut?</w:t>
       </w:r>
     </w:p>
@@ -2512,31 +2369,31 @@
           <w:sz w:val="20"/>
           <w:szCs w:val="20"/>
         </w:rPr>
+        <w:t xml:space="preserve">Perulangan tanpa henti (Infinite While Loop) yang membunyikan sirine sepanjang tahun tanpa memeriksa kondisi cuaca.</w:t>
+      </w:r>
+    </w:p>
+    <w:p>
+      <w:pPr>
+        <w:spacing w:after="80"/>
+        <w:ind w:left="400"/>
+      </w:pPr>
+      <w:r>
+        <w:rPr>
+          <w:rFonts w:ascii="Arial" w:cs="Arial" w:eastAsia="Arial" w:hAnsi="Arial"/>
+          <w:b/>
+          <w:bCs/>
+          <w:sz w:val="20"/>
+          <w:szCs w:val="20"/>
+        </w:rPr>
+        <w:t xml:space="preserve">B. </w:t>
+      </w:r>
+      <w:r>
+        <w:rPr>
+          <w:rFonts w:ascii="Arial" w:cs="Arial" w:eastAsia="Arial" w:hAnsi="Arial"/>
+          <w:sz w:val="20"/>
+          <w:szCs w:val="20"/>
+        </w:rPr>
         <w:t xml:space="preserve">Percabangan kondisional logika ganda (IF curah_hujan &gt; 150 AND pasang_rob == TRUE THEN aktifkan_sirine_level_1).</w:t>
-      </w:r>
-    </w:p>
-    <w:p>
-      <w:pPr>
-        <w:spacing w:after="80"/>
-        <w:ind w:left="400"/>
-      </w:pPr>
-      <w:r>
-        <w:rPr>
-          <w:rFonts w:ascii="Arial" w:cs="Arial" w:eastAsia="Arial" w:hAnsi="Arial"/>
-          <w:b/>
-          <w:bCs/>
-          <w:sz w:val="20"/>
-          <w:szCs w:val="20"/>
-        </w:rPr>
-        <w:t xml:space="preserve">B. </w:t>
-      </w:r>
-      <w:r>
-        <w:rPr>
-          <w:rFonts w:ascii="Arial" w:cs="Arial" w:eastAsia="Arial" w:hAnsi="Arial"/>
-          <w:sz w:val="20"/>
-          <w:szCs w:val="20"/>
-        </w:rPr>
-        <w:t xml:space="preserve">Perulangan tanpa henti (Infinite While Loop) yang membunyikan sirine sepanjang tahun tanpa memeriksa kondisi cuaca.</w:t>
       </w:r>
     </w:p>
     <w:p>
@@ -2671,20 +2528,7 @@
           <w:sz w:val="22"/>
           <w:szCs w:val="22"/>
         </w:rPr>
-        <w:t xml:space="preserve">SOAL NO. 12 [Kasus Kota Delta (Algoritma)]</w:t>
-      </w:r>
-    </w:p>
-    <w:p>
-      <w:pPr>
-        <w:spacing w:after="100"/>
-      </w:pPr>
-      <w:r>
-        <w:rPr>
-          <w:rFonts w:ascii="Arial" w:cs="Arial" w:eastAsia="Arial" w:hAnsi="Arial"/>
-          <w:sz w:val="20"/>
-          <w:szCs w:val="20"/>
-        </w:rPr>
-        <w:t xml:space="preserve">[ANALISIS DETERMINISTIK LANGKAH 2]</w:t>
+        <w:t xml:space="preserve">SOAL NO. 12</w:t>
       </w:r>
     </w:p>
     <w:p>
@@ -2893,7 +2737,7 @@
           <w:sz w:val="22"/>
           <w:szCs w:val="22"/>
         </w:rPr>
-        <w:t xml:space="preserve">SOAL NO. 13 [Kasus Kota Delta (HOTS Evaluasi)]</w:t>
+        <w:t xml:space="preserve">SOAL NO. 13</w:t>
       </w:r>
     </w:p>
     <w:p>
@@ -2906,7 +2750,7 @@
           <w:sz w:val="20"/>
           <w:szCs w:val="20"/>
         </w:rPr>
-        <w:t xml:space="preserve">[SIMULASI KASUS BATAS (EDGE CASE) KOTA DELTA]</w:t>
+        <w:t xml:space="preserve">Perhatikan skenario kondisi ekstrem berikut: Pada suatu hari di bulan Januari, BMKG mencatat curah hujan mencapai 149 mm/hari selama 3 hari berturut-turut (hanya berselisih 1 mm di bawah batas ambang 150 mm), sementara ketinggian pasang air laut rob mencapai rekor tertinggi dalam 50 tahun terakhir.</w:t>
       </w:r>
     </w:p>
     <w:p>
@@ -2919,19 +2763,6 @@
           <w:sz w:val="20"/>
           <w:szCs w:val="20"/>
         </w:rPr>
-        <w:t xml:space="preserve">Perhatikan skenario kondisi ekstrem berikut: Pada suatu hari di bulan Januari, BMKG mencatat curah hujan mencapai 149 mm/hari selama 3 hari berturut-turut (hanya berselisih 1 mm di bawah batas ambang 150 mm), sementara ketinggian pasang air laut rob mencapai rekor tertinggi dalam 50 tahun terakhir.</w:t>
-      </w:r>
-    </w:p>
-    <w:p>
-      <w:pPr>
-        <w:spacing w:after="100"/>
-      </w:pPr>
-      <w:r>
-        <w:rPr>
-          <w:rFonts w:ascii="Arial" w:cs="Arial" w:eastAsia="Arial" w:hAnsi="Arial"/>
-          <w:sz w:val="20"/>
-          <w:szCs w:val="20"/>
-        </w:rPr>
         <w:t xml:space="preserve">Jika sistem mitigasi otomatis Kota Delta diprogram secara kaku (hardcoded) murni menggunakan syarat logika "curah_hujan &gt; 150", kerentanan sistemik apakah yang akan terjadi (False Negative)?</w:t>
       </w:r>
     </w:p>
@@ -2956,79 +2787,79 @@
           <w:sz w:val="20"/>
           <w:szCs w:val="20"/>
         </w:rPr>
+        <w:t xml:space="preserve">Seluruh pabrik tekstil dan aki akan otomatis meledak karena saluran pipa limbah tidak menerima data sinyal peringatan.</w:t>
+      </w:r>
+    </w:p>
+    <w:p>
+      <w:pPr>
+        <w:spacing w:after="80"/>
+        <w:ind w:left="400"/>
+      </w:pPr>
+      <w:r>
+        <w:rPr>
+          <w:rFonts w:ascii="Arial" w:cs="Arial" w:eastAsia="Arial" w:hAnsi="Arial"/>
+          <w:b/>
+          <w:bCs/>
+          <w:sz w:val="20"/>
+          <w:szCs w:val="20"/>
+        </w:rPr>
+        <w:t xml:space="preserve">B. </w:t>
+      </w:r>
+      <w:r>
+        <w:rPr>
+          <w:rFonts w:ascii="Arial" w:cs="Arial" w:eastAsia="Arial" w:hAnsi="Arial"/>
+          <w:sz w:val="20"/>
+          <w:szCs w:val="20"/>
+        </w:rPr>
+        <w:t xml:space="preserve">Sirine Level 1 tidak akan berbunyi karena curah hujan 149 mm tidak memenuhi syarat &gt; 150, padahal kombinasi debit air dan pasang laut ekstrem tetap memicu bencana banjir besar.</w:t>
+      </w:r>
+    </w:p>
+    <w:p>
+      <w:pPr>
+        <w:spacing w:after="80"/>
+        <w:ind w:left="400"/>
+      </w:pPr>
+      <w:r>
+        <w:rPr>
+          <w:rFonts w:ascii="Arial" w:cs="Arial" w:eastAsia="Arial" w:hAnsi="Arial"/>
+          <w:b/>
+          <w:bCs/>
+          <w:sz w:val="20"/>
+          <w:szCs w:val="20"/>
+        </w:rPr>
+        <w:t xml:space="preserve">C. </w:t>
+      </w:r>
+      <w:r>
+        <w:rPr>
+          <w:rFonts w:ascii="Arial" w:cs="Arial" w:eastAsia="Arial" w:hAnsi="Arial"/>
+          <w:sz w:val="20"/>
+          <w:szCs w:val="20"/>
+        </w:rPr>
+        <w:t xml:space="preserve">Pintu air Katulampa Utara akan otomatis terbuka 100% dan menyedot air laut masuk ke dalam kawasan hulu sungai.</w:t>
+      </w:r>
+    </w:p>
+    <w:p>
+      <w:pPr>
+        <w:spacing w:after="80"/>
+        <w:ind w:left="400"/>
+      </w:pPr>
+      <w:r>
+        <w:rPr>
+          <w:rFonts w:ascii="Arial" w:cs="Arial" w:eastAsia="Arial" w:hAnsi="Arial"/>
+          <w:b/>
+          <w:bCs/>
+          <w:sz w:val="20"/>
+          <w:szCs w:val="20"/>
+        </w:rPr>
+        <w:t xml:space="preserve">D. </w:t>
+      </w:r>
+      <w:r>
+        <w:rPr>
+          <w:rFonts w:ascii="Arial" w:cs="Arial" w:eastAsia="Arial" w:hAnsi="Arial"/>
+          <w:sz w:val="20"/>
+          <w:szCs w:val="20"/>
+        </w:rPr>
         <w:t xml:space="preserve">Komputer pemantau BMKG akan mengalami crash memori karena tidak sanggup membandingkan angka desimal di bawah 150.</w:t>
-      </w:r>
-    </w:p>
-    <w:p>
-      <w:pPr>
-        <w:spacing w:after="80"/>
-        <w:ind w:left="400"/>
-      </w:pPr>
-      <w:r>
-        <w:rPr>
-          <w:rFonts w:ascii="Arial" w:cs="Arial" w:eastAsia="Arial" w:hAnsi="Arial"/>
-          <w:b/>
-          <w:bCs/>
-          <w:sz w:val="20"/>
-          <w:szCs w:val="20"/>
-        </w:rPr>
-        <w:t xml:space="preserve">B. </w:t>
-      </w:r>
-      <w:r>
-        <w:rPr>
-          <w:rFonts w:ascii="Arial" w:cs="Arial" w:eastAsia="Arial" w:hAnsi="Arial"/>
-          <w:sz w:val="20"/>
-          <w:szCs w:val="20"/>
-        </w:rPr>
-        <w:t xml:space="preserve">Seluruh pabrik tekstil dan aki akan otomatis meledak karena saluran pipa limbah tidak menerima data sinyal peringatan.</w:t>
-      </w:r>
-    </w:p>
-    <w:p>
-      <w:pPr>
-        <w:spacing w:after="80"/>
-        <w:ind w:left="400"/>
-      </w:pPr>
-      <w:r>
-        <w:rPr>
-          <w:rFonts w:ascii="Arial" w:cs="Arial" w:eastAsia="Arial" w:hAnsi="Arial"/>
-          <w:b/>
-          <w:bCs/>
-          <w:sz w:val="20"/>
-          <w:szCs w:val="20"/>
-        </w:rPr>
-        <w:t xml:space="preserve">C. </w:t>
-      </w:r>
-      <w:r>
-        <w:rPr>
-          <w:rFonts w:ascii="Arial" w:cs="Arial" w:eastAsia="Arial" w:hAnsi="Arial"/>
-          <w:sz w:val="20"/>
-          <w:szCs w:val="20"/>
-        </w:rPr>
-        <w:t xml:space="preserve">Sirine Level 1 tidak akan berbunyi karena curah hujan 149 mm tidak memenuhi syarat &gt; 150, padahal kombinasi debit air dan pasang laut ekstrem tetap memicu bencana banjir besar.</w:t>
-      </w:r>
-    </w:p>
-    <w:p>
-      <w:pPr>
-        <w:spacing w:after="80"/>
-        <w:ind w:left="400"/>
-      </w:pPr>
-      <w:r>
-        <w:rPr>
-          <w:rFonts w:ascii="Arial" w:cs="Arial" w:eastAsia="Arial" w:hAnsi="Arial"/>
-          <w:b/>
-          <w:bCs/>
-          <w:sz w:val="20"/>
-          <w:szCs w:val="20"/>
-        </w:rPr>
-        <w:t xml:space="preserve">D. </w:t>
-      </w:r>
-      <w:r>
-        <w:rPr>
-          <w:rFonts w:ascii="Arial" w:cs="Arial" w:eastAsia="Arial" w:hAnsi="Arial"/>
-          <w:sz w:val="20"/>
-          <w:szCs w:val="20"/>
-        </w:rPr>
-        <w:t xml:space="preserve">Pintu air Katulampa Utara akan otomatis terbuka 100% dan menyedot air laut masuk ke dalam kawasan hulu sungai.</w:t>
       </w:r>
     </w:p>
     <w:p>
@@ -3115,7 +2946,7 @@
           <w:sz w:val="22"/>
           <w:szCs w:val="22"/>
         </w:rPr>
-        <w:t xml:space="preserve">SOAL NO. 14 [Kasus Kota Delta (HOTS Analisis)]</w:t>
+        <w:t xml:space="preserve">SOAL NO. 14</w:t>
       </w:r>
     </w:p>
     <w:p>
@@ -3128,7 +2959,7 @@
           <w:sz w:val="20"/>
           <w:szCs w:val="20"/>
         </w:rPr>
-        <w:t xml:space="preserve">[EVALUASI MODEL KEBERLANJUTAN KOTA DELTA]</w:t>
+        <w:t xml:space="preserve">Keberhasilan Protokol Mitigasi Kota Delta menjadikannya sebagai "cetak biru" (blueprint) bagi kota-kota lain di provinsi tersebut. Dalam teori rekayasa perangkat lunak dan komputasi, konsep ini dikenal dengan prinsip Reusability (kemampuan digunakan ulang).</w:t>
       </w:r>
     </w:p>
     <w:p>
@@ -3141,19 +2972,6 @@
           <w:sz w:val="20"/>
           <w:szCs w:val="20"/>
         </w:rPr>
-        <w:t xml:space="preserve">Keberhasilan Protokol Mitigasi Kota Delta menjadikannya sebagai "cetak biru" (blueprint) bagi kota-kota lain di provinsi tersebut. Dalam teori rekayasa perangkat lunak dan komputasi, konsep ini dikenal dengan prinsip Reusability (kemampuan digunakan ulang).</w:t>
-      </w:r>
-    </w:p>
-    <w:p>
-      <w:pPr>
-        <w:spacing w:after="100"/>
-      </w:pPr>
-      <w:r>
-        <w:rPr>
-          <w:rFonts w:ascii="Arial" w:cs="Arial" w:eastAsia="Arial" w:hAnsi="Arial"/>
-          <w:sz w:val="20"/>
-          <w:szCs w:val="20"/>
-        </w:rPr>
         <w:t xml:space="preserve">Karakteristik apakah yang menjadikan sebuah solusi komputasional seperti protokol Dr. Aris memiliki daya guna ulang (reusability) yang tinggi di lokasi lain?</w:t>
       </w:r>
     </w:p>
@@ -3178,55 +2996,55 @@
           <w:sz w:val="20"/>
           <w:szCs w:val="20"/>
         </w:rPr>
+        <w:t xml:space="preserve">Protokol dirumuskan sebagai model algoritmik abstrak berbasis logika data empiris yang dapat disesuaikan parameter lokalnya di daerah lain tanpa mengubah esensi kerangka kerjanya.</w:t>
+      </w:r>
+    </w:p>
+    <w:p>
+      <w:pPr>
+        <w:spacing w:after="80"/>
+        <w:ind w:left="400"/>
+      </w:pPr>
+      <w:r>
+        <w:rPr>
+          <w:rFonts w:ascii="Arial" w:cs="Arial" w:eastAsia="Arial" w:hAnsi="Arial"/>
+          <w:b/>
+          <w:bCs/>
+          <w:sz w:val="20"/>
+          <w:szCs w:val="20"/>
+        </w:rPr>
+        <w:t xml:space="preserve">B. </w:t>
+      </w:r>
+      <w:r>
+        <w:rPr>
+          <w:rFonts w:ascii="Arial" w:cs="Arial" w:eastAsia="Arial" w:hAnsi="Arial"/>
+          <w:sz w:val="20"/>
+          <w:szCs w:val="20"/>
+        </w:rPr>
+        <w:t xml:space="preserve">Protokol tersebut mewajibkan daerah lain memiliki luas wilayah, jumlah penduduk, dan letak geografis yang persis identik dengan Kota Delta.</w:t>
+      </w:r>
+    </w:p>
+    <w:p>
+      <w:pPr>
+        <w:spacing w:after="80"/>
+        <w:ind w:left="400"/>
+      </w:pPr>
+      <w:r>
+        <w:rPr>
+          <w:rFonts w:ascii="Arial" w:cs="Arial" w:eastAsia="Arial" w:hAnsi="Arial"/>
+          <w:b/>
+          <w:bCs/>
+          <w:sz w:val="20"/>
+          <w:szCs w:val="20"/>
+        </w:rPr>
+        <w:t xml:space="preserve">C. </w:t>
+      </w:r>
+      <w:r>
+        <w:rPr>
+          <w:rFonts w:ascii="Arial" w:cs="Arial" w:eastAsia="Arial" w:hAnsi="Arial"/>
+          <w:sz w:val="20"/>
+          <w:szCs w:val="20"/>
+        </w:rPr>
         <w:t xml:space="preserve">Protokol dibuat sangat rahasia sehingga hanya dapat dibeli oleh pemerintah kota yang memiliki anggaran miliaran rupiah.</w:t>
-      </w:r>
-    </w:p>
-    <w:p>
-      <w:pPr>
-        <w:spacing w:after="80"/>
-        <w:ind w:left="400"/>
-      </w:pPr>
-      <w:r>
-        <w:rPr>
-          <w:rFonts w:ascii="Arial" w:cs="Arial" w:eastAsia="Arial" w:hAnsi="Arial"/>
-          <w:b/>
-          <w:bCs/>
-          <w:sz w:val="20"/>
-          <w:szCs w:val="20"/>
-        </w:rPr>
-        <w:t xml:space="preserve">B. </w:t>
-      </w:r>
-      <w:r>
-        <w:rPr>
-          <w:rFonts w:ascii="Arial" w:cs="Arial" w:eastAsia="Arial" w:hAnsi="Arial"/>
-          <w:sz w:val="20"/>
-          <w:szCs w:val="20"/>
-        </w:rPr>
-        <w:t xml:space="preserve">Protokol dirumuskan sebagai model algoritmik abstrak berbasis logika data empiris yang dapat disesuaikan parameter lokalnya di daerah lain tanpa mengubah esensi kerangka kerjanya.</w:t>
-      </w:r>
-    </w:p>
-    <w:p>
-      <w:pPr>
-        <w:spacing w:after="80"/>
-        <w:ind w:left="400"/>
-      </w:pPr>
-      <w:r>
-        <w:rPr>
-          <w:rFonts w:ascii="Arial" w:cs="Arial" w:eastAsia="Arial" w:hAnsi="Arial"/>
-          <w:b/>
-          <w:bCs/>
-          <w:sz w:val="20"/>
-          <w:szCs w:val="20"/>
-        </w:rPr>
-        <w:t xml:space="preserve">C. </w:t>
-      </w:r>
-      <w:r>
-        <w:rPr>
-          <w:rFonts w:ascii="Arial" w:cs="Arial" w:eastAsia="Arial" w:hAnsi="Arial"/>
-          <w:sz w:val="20"/>
-          <w:szCs w:val="20"/>
-        </w:rPr>
-        <w:t xml:space="preserve">Protokol tersebut mewajibkan daerah lain memiliki luas wilayah, jumlah penduduk, dan letak geografis yang persis identik dengan Kota Delta.</w:t>
       </w:r>
     </w:p>
     <w:p>
@@ -3337,7 +3155,7 @@
           <w:sz w:val="22"/>
           <w:szCs w:val="22"/>
         </w:rPr>
-        <w:t xml:space="preserve">SOAL NO. 15 [Kasus Kota Delta (Korelasi vs Kausalitas)]</w:t>
+        <w:t xml:space="preserve">SOAL NO. 15</w:t>
       </w:r>
     </w:p>
     <w:p>
@@ -3350,7 +3168,7 @@
           <w:sz w:val="20"/>
           <w:szCs w:val="20"/>
         </w:rPr>
-        <w:t xml:space="preserve">[UJI PENALARAN SAINS DATA KOTA DELTA]</w:t>
+        <w:t xml:space="preserve">Dalam tahapan Pengenalan Pola, seorang peneliti komputasional harus jeli memisahkan antara korelasi nyata yang bersifat sebab-akibat (kausal) dengan korelasi semu (spurious correlation) yang muncul secara kebetulan.</w:t>
       </w:r>
     </w:p>
     <w:p>
@@ -3363,19 +3181,6 @@
           <w:sz w:val="20"/>
           <w:szCs w:val="20"/>
         </w:rPr>
-        <w:t xml:space="preserve">Dalam tahapan Pengenalan Pola, seorang peneliti komputasional harus jeli memisahkan antara korelasi nyata yang bersifat sebab-akibat (kausal) dengan korelasi semu (spurious correlation) yang muncul secara kebetulan.</w:t>
-      </w:r>
-    </w:p>
-    <w:p>
-      <w:pPr>
-        <w:spacing w:after="100"/>
-      </w:pPr>
-      <w:r>
-        <w:rPr>
-          <w:rFonts w:ascii="Arial" w:cs="Arial" w:eastAsia="Arial" w:hAnsi="Arial"/>
-          <w:sz w:val="20"/>
-          <w:szCs w:val="20"/>
-        </w:rPr>
         <w:t xml:space="preserve">Di antara fenomena berikut di Kota Delta, manakah yang merupakan korelasi semu (spurious correlation) yang WAJIB disaring keluar melalui prinsip Abstraksi?</w:t>
       </w:r>
     </w:p>
@@ -3400,103 +3205,103 @@
           <w:sz w:val="20"/>
           <w:szCs w:val="20"/>
         </w:rPr>
+        <w:t xml:space="preserve">Penyempitan penampang melintang sungai akibat sedimentasi lumpur yang menurunkan daya tampung volume aliran air.</w:t>
+      </w:r>
+    </w:p>
+    <w:p>
+      <w:pPr>
+        <w:spacing w:after="80"/>
+        <w:ind w:left="400"/>
+      </w:pPr>
+      <w:r>
+        <w:rPr>
+          <w:rFonts w:ascii="Arial" w:cs="Arial" w:eastAsia="Arial" w:hAnsi="Arial"/>
+          <w:b/>
+          <w:bCs/>
+          <w:sz w:val="20"/>
+          <w:szCs w:val="20"/>
+        </w:rPr>
+        <w:t xml:space="preserve">B. </w:t>
+      </w:r>
+      <w:r>
+        <w:rPr>
+          <w:rFonts w:ascii="Arial" w:cs="Arial" w:eastAsia="Arial" w:hAnsi="Arial"/>
+          <w:sz w:val="20"/>
+          <w:szCs w:val="20"/>
+        </w:rPr>
+        <w:t xml:space="preserve">Kenaikan muka air pasang rob laut Jawa yang menghambat laju pembuangan gravitasi aliran sungai menuju lepas pantai.</w:t>
+      </w:r>
+    </w:p>
+    <w:p>
+      <w:pPr>
+        <w:spacing w:after="80"/>
+        <w:ind w:left="400"/>
+      </w:pPr>
+      <w:r>
+        <w:rPr>
+          <w:rFonts w:ascii="Arial" w:cs="Arial" w:eastAsia="Arial" w:hAnsi="Arial"/>
+          <w:b/>
+          <w:bCs/>
+          <w:sz w:val="20"/>
+          <w:szCs w:val="20"/>
+        </w:rPr>
+        <w:t xml:space="preserve">C. </w:t>
+      </w:r>
+      <w:r>
+        <w:rPr>
+          <w:rFonts w:ascii="Arial" w:cs="Arial" w:eastAsia="Arial" w:hAnsi="Arial"/>
+          <w:sz w:val="20"/>
+          <w:szCs w:val="20"/>
+        </w:rPr>
+        <w:t xml:space="preserve">Kenaikan drastis jumlah penjualan jas hujan dan payung di pasar swalayan Kota Delta pada setiap minggu yang bersamaan dengan terjadinya banjir lumpur.</w:t>
+      </w:r>
+    </w:p>
+    <w:p>
+      <w:pPr>
+        <w:spacing w:after="80"/>
+        <w:ind w:left="400"/>
+      </w:pPr>
+      <w:r>
+        <w:rPr>
+          <w:rFonts w:ascii="Arial" w:cs="Arial" w:eastAsia="Arial" w:hAnsi="Arial"/>
+          <w:b/>
+          <w:bCs/>
+          <w:sz w:val="20"/>
+          <w:szCs w:val="20"/>
+        </w:rPr>
+        <w:t xml:space="preserve">D. </w:t>
+      </w:r>
+      <w:r>
+        <w:rPr>
+          <w:rFonts w:ascii="Arial" w:cs="Arial" w:eastAsia="Arial" w:hAnsi="Arial"/>
+          <w:sz w:val="20"/>
+          <w:szCs w:val="20"/>
+        </w:rPr>
+        <w:t xml:space="preserve">Peningkatan laju erosi tanah di lereng hulu sungai Ciliwung akibat pembukaan hutan lindung menjadi kawasan villa komersial.</w:t>
+      </w:r>
+    </w:p>
+    <w:p>
+      <w:pPr>
+        <w:spacing w:after="80"/>
+        <w:ind w:left="400"/>
+      </w:pPr>
+      <w:r>
+        <w:rPr>
+          <w:rFonts w:ascii="Arial" w:cs="Arial" w:eastAsia="Arial" w:hAnsi="Arial"/>
+          <w:b/>
+          <w:bCs/>
+          <w:sz w:val="20"/>
+          <w:szCs w:val="20"/>
+        </w:rPr>
+        <w:t xml:space="preserve">E. </w:t>
+      </w:r>
+      <w:r>
+        <w:rPr>
+          <w:rFonts w:ascii="Arial" w:cs="Arial" w:eastAsia="Arial" w:hAnsi="Arial"/>
+          <w:sz w:val="20"/>
+          <w:szCs w:val="20"/>
+        </w:rPr>
         <w:t xml:space="preserve">Tingginya kadar timbal pada sedimen muara sungai yang berdekatan dengan saluran pembuangan akhir pabrik aki kendaraan.</w:t>
-      </w:r>
-    </w:p>
-    <w:p>
-      <w:pPr>
-        <w:spacing w:after="80"/>
-        <w:ind w:left="400"/>
-      </w:pPr>
-      <w:r>
-        <w:rPr>
-          <w:rFonts w:ascii="Arial" w:cs="Arial" w:eastAsia="Arial" w:hAnsi="Arial"/>
-          <w:b/>
-          <w:bCs/>
-          <w:sz w:val="20"/>
-          <w:szCs w:val="20"/>
-        </w:rPr>
-        <w:t xml:space="preserve">B. </w:t>
-      </w:r>
-      <w:r>
-        <w:rPr>
-          <w:rFonts w:ascii="Arial" w:cs="Arial" w:eastAsia="Arial" w:hAnsi="Arial"/>
-          <w:sz w:val="20"/>
-          <w:szCs w:val="20"/>
-        </w:rPr>
-        <w:t xml:space="preserve">Penyempitan penampang melintang sungai akibat sedimentasi lumpur yang menurunkan daya tampung volume aliran air.</w:t>
-      </w:r>
-    </w:p>
-    <w:p>
-      <w:pPr>
-        <w:spacing w:after="80"/>
-        <w:ind w:left="400"/>
-      </w:pPr>
-      <w:r>
-        <w:rPr>
-          <w:rFonts w:ascii="Arial" w:cs="Arial" w:eastAsia="Arial" w:hAnsi="Arial"/>
-          <w:b/>
-          <w:bCs/>
-          <w:sz w:val="20"/>
-          <w:szCs w:val="20"/>
-        </w:rPr>
-        <w:t xml:space="preserve">C. </w:t>
-      </w:r>
-      <w:r>
-        <w:rPr>
-          <w:rFonts w:ascii="Arial" w:cs="Arial" w:eastAsia="Arial" w:hAnsi="Arial"/>
-          <w:sz w:val="20"/>
-          <w:szCs w:val="20"/>
-        </w:rPr>
-        <w:t xml:space="preserve">Kenaikan muka air pasang rob laut Jawa yang menghambat laju pembuangan gravitasi aliran sungai menuju lepas pantai.</w:t>
-      </w:r>
-    </w:p>
-    <w:p>
-      <w:pPr>
-        <w:spacing w:after="80"/>
-        <w:ind w:left="400"/>
-      </w:pPr>
-      <w:r>
-        <w:rPr>
-          <w:rFonts w:ascii="Arial" w:cs="Arial" w:eastAsia="Arial" w:hAnsi="Arial"/>
-          <w:b/>
-          <w:bCs/>
-          <w:sz w:val="20"/>
-          <w:szCs w:val="20"/>
-        </w:rPr>
-        <w:t xml:space="preserve">D. </w:t>
-      </w:r>
-      <w:r>
-        <w:rPr>
-          <w:rFonts w:ascii="Arial" w:cs="Arial" w:eastAsia="Arial" w:hAnsi="Arial"/>
-          <w:sz w:val="20"/>
-          <w:szCs w:val="20"/>
-        </w:rPr>
-        <w:t xml:space="preserve">Kenaikan drastis jumlah penjualan jas hujan dan payung di pasar swalayan Kota Delta pada setiap minggu yang bersamaan dengan terjadinya banjir lumpur.</w:t>
-      </w:r>
-    </w:p>
-    <w:p>
-      <w:pPr>
-        <w:spacing w:after="80"/>
-        <w:ind w:left="400"/>
-      </w:pPr>
-      <w:r>
-        <w:rPr>
-          <w:rFonts w:ascii="Arial" w:cs="Arial" w:eastAsia="Arial" w:hAnsi="Arial"/>
-          <w:b/>
-          <w:bCs/>
-          <w:sz w:val="20"/>
-          <w:szCs w:val="20"/>
-        </w:rPr>
-        <w:t xml:space="preserve">E. </w:t>
-      </w:r>
-      <w:r>
-        <w:rPr>
-          <w:rFonts w:ascii="Arial" w:cs="Arial" w:eastAsia="Arial" w:hAnsi="Arial"/>
-          <w:sz w:val="20"/>
-          <w:szCs w:val="20"/>
-        </w:rPr>
-        <w:t xml:space="preserve">Peningkatan laju erosi tanah di lereng hulu sungai Ciliwung akibat pembukaan hutan lindung menjadi kawasan villa komersial.</w:t>
       </w:r>
     </w:p>
     <w:p>
@@ -3559,20 +3364,7 @@
           <w:sz w:val="22"/>
           <w:szCs w:val="22"/>
         </w:rPr>
-        <w:t xml:space="preserve">SOAL NO. 16 [Kasus Kota Delta (HOTS Sintesis)]</w:t>
-      </w:r>
-    </w:p>
-    <w:p>
-      <w:pPr>
-        <w:spacing w:after="100"/>
-      </w:pPr>
-      <w:r>
-        <w:rPr>
-          <w:rFonts w:ascii="Arial" w:cs="Arial" w:eastAsia="Arial" w:hAnsi="Arial"/>
-          <w:sz w:val="20"/>
-          <w:szCs w:val="20"/>
-        </w:rPr>
-        <w:t xml:space="preserve">[PENGEMBANGAN SISTEM DETEKSI OTOMATIS]</w:t>
+        <w:t xml:space="preserve">SOAL NO. 16</w:t>
       </w:r>
     </w:p>
     <w:p>
@@ -3768,7 +3560,7 @@
           <w:sz w:val="22"/>
           <w:szCs w:val="22"/>
         </w:rPr>
-        <w:t xml:space="preserve">SOAL NO. 17 [Kasus Kota Delta (Evaluasi Solusi)]</w:t>
+        <w:t xml:space="preserve">SOAL NO. 17</w:t>
       </w:r>
     </w:p>
     <w:p>
@@ -3781,7 +3573,7 @@
           <w:sz w:val="20"/>
           <w:szCs w:val="20"/>
         </w:rPr>
-        <w:t xml:space="preserve">[EVALUASI KEBIJAKAN PABRIK KOTA DELTA]</w:t>
+        <w:t xml:space="preserve">Pada evaluasi akhir tahun, ditemukan bahwa sebuah pabrik tekstil besar tetap membuang limbah cair kromium pada malam hari saat hujan deras karena mengira petugas pengawas sedang tidur dan tidak melakukan inspeksi lapangan.</w:t>
       </w:r>
     </w:p>
     <w:p>
@@ -3794,19 +3586,6 @@
           <w:sz w:val="20"/>
           <w:szCs w:val="20"/>
         </w:rPr>
-        <w:t xml:space="preserve">Pada evaluasi akhir tahun, ditemukan bahwa sebuah pabrik tekstil besar tetap membuang limbah cair kromium pada malam hari saat hujan deras karena mengira petugas pengawas sedang tidur dan tidak melakukan inspeksi lapangan.</w:t>
-      </w:r>
-    </w:p>
-    <w:p>
-      <w:pPr>
-        <w:spacing w:after="100"/>
-      </w:pPr>
-      <w:r>
-        <w:rPr>
-          <w:rFonts w:ascii="Arial" w:cs="Arial" w:eastAsia="Arial" w:hAnsi="Arial"/>
-          <w:sz w:val="20"/>
-          <w:szCs w:val="20"/>
-        </w:rPr>
         <w:t xml:space="preserve">Strategi algoritma pengawasan komputasional apakah yang paling efektif untuk mendeteksi pelanggaran tersembunyi tersebut secara berkelanjutan?</w:t>
       </w:r>
     </w:p>
@@ -3831,55 +3610,55 @@
           <w:sz w:val="20"/>
           <w:szCs w:val="20"/>
         </w:rPr>
+        <w:t xml:space="preserve">Memasang sensor telemetri kualitas air otomatis di pipa outlet pabrik yang mengirimkan log data kadar kromium secara realtime 24 jam ke server pusat pengawas.</w:t>
+      </w:r>
+    </w:p>
+    <w:p>
+      <w:pPr>
+        <w:spacing w:after="80"/>
+        <w:ind w:left="400"/>
+      </w:pPr>
+      <w:r>
+        <w:rPr>
+          <w:rFonts w:ascii="Arial" w:cs="Arial" w:eastAsia="Arial" w:hAnsi="Arial"/>
+          <w:b/>
+          <w:bCs/>
+          <w:sz w:val="20"/>
+          <w:szCs w:val="20"/>
+        </w:rPr>
+        <w:t xml:space="preserve">B. </w:t>
+      </w:r>
+      <w:r>
+        <w:rPr>
+          <w:rFonts w:ascii="Arial" w:cs="Arial" w:eastAsia="Arial" w:hAnsi="Arial"/>
+          <w:sz w:val="20"/>
+          <w:szCs w:val="20"/>
+        </w:rPr>
+        <w:t xml:space="preserve">Mengirimkan surat peringatan tertulis setiap tiga bulan sekali melalui kantor pos tanpa melakukan pengambilan sampel air.</w:t>
+      </w:r>
+    </w:p>
+    <w:p>
+      <w:pPr>
+        <w:spacing w:after="80"/>
+        <w:ind w:left="400"/>
+      </w:pPr>
+      <w:r>
+        <w:rPr>
+          <w:rFonts w:ascii="Arial" w:cs="Arial" w:eastAsia="Arial" w:hAnsi="Arial"/>
+          <w:b/>
+          <w:bCs/>
+          <w:sz w:val="20"/>
+          <w:szCs w:val="20"/>
+        </w:rPr>
+        <w:t xml:space="preserve">C. </w:t>
+      </w:r>
+      <w:r>
+        <w:rPr>
+          <w:rFonts w:ascii="Arial" w:cs="Arial" w:eastAsia="Arial" w:hAnsi="Arial"/>
+          <w:sz w:val="20"/>
+          <w:szCs w:val="20"/>
+        </w:rPr>
         <w:t xml:space="preserve">Meminta satpam pabrik untuk mengisi kuesioner kejujuran tentang volume limbah yang dibuang oleh pihak manajemen.</w:t>
-      </w:r>
-    </w:p>
-    <w:p>
-      <w:pPr>
-        <w:spacing w:after="80"/>
-        <w:ind w:left="400"/>
-      </w:pPr>
-      <w:r>
-        <w:rPr>
-          <w:rFonts w:ascii="Arial" w:cs="Arial" w:eastAsia="Arial" w:hAnsi="Arial"/>
-          <w:b/>
-          <w:bCs/>
-          <w:sz w:val="20"/>
-          <w:szCs w:val="20"/>
-        </w:rPr>
-        <w:t xml:space="preserve">B. </w:t>
-      </w:r>
-      <w:r>
-        <w:rPr>
-          <w:rFonts w:ascii="Arial" w:cs="Arial" w:eastAsia="Arial" w:hAnsi="Arial"/>
-          <w:sz w:val="20"/>
-          <w:szCs w:val="20"/>
-        </w:rPr>
-        <w:t xml:space="preserve">Memasang sensor telemetri kualitas air otomatis di pipa outlet pabrik yang mengirimkan log data kadar kromium secara realtime 24 jam ke server pusat pengawas.</w:t>
-      </w:r>
-    </w:p>
-    <w:p>
-      <w:pPr>
-        <w:spacing w:after="80"/>
-        <w:ind w:left="400"/>
-      </w:pPr>
-      <w:r>
-        <w:rPr>
-          <w:rFonts w:ascii="Arial" w:cs="Arial" w:eastAsia="Arial" w:hAnsi="Arial"/>
-          <w:b/>
-          <w:bCs/>
-          <w:sz w:val="20"/>
-          <w:szCs w:val="20"/>
-        </w:rPr>
-        <w:t xml:space="preserve">C. </w:t>
-      </w:r>
-      <w:r>
-        <w:rPr>
-          <w:rFonts w:ascii="Arial" w:cs="Arial" w:eastAsia="Arial" w:hAnsi="Arial"/>
-          <w:sz w:val="20"/>
-          <w:szCs w:val="20"/>
-        </w:rPr>
-        <w:t xml:space="preserve">Mengirimkan surat peringatan tertulis setiap tiga bulan sekali melalui kantor pos tanpa melakukan pengambilan sampel air.</w:t>
       </w:r>
     </w:p>
     <w:p>
@@ -3990,7 +3769,7 @@
           <w:sz w:val="22"/>
           <w:szCs w:val="22"/>
         </w:rPr>
-        <w:t xml:space="preserve">SOAL NO. 18 [Kasus Garuda Rescue (Dekomposisi)]</w:t>
+        <w:t xml:space="preserve">SOAL NO. 18</w:t>
       </w:r>
     </w:p>
     <w:p>
@@ -4003,7 +3782,7 @@
           <w:sz w:val="20"/>
           <w:szCs w:val="20"/>
         </w:rPr>
-        <w:t xml:space="preserve">[BACAAN STUDI KASUS 2 - GARUDA RESCUE]</w:t>
+        <w:t xml:space="preserve">Gempa bumi berkekuatan 7.2 Magnitudo melanda kawasan pegunungan Seribu Bukit. Akses jalan darat terputus total akibat longsor masif. Ribuan warga di 15 desa terisolasi tanpa makanan dan obat-obatan. Badan Nasional Penanggulangan Bencana (BNPB) harus segera mendistribusikan bantuan menggunakan 5 unit helikopter kargo yang dimiliki. Waktu sangat krusial karena kapasitas bahan bakar helikopter terbatas dan cuaca sering berubah buruk di sore hari.</w:t>
       </w:r>
     </w:p>
     <w:p>
@@ -4016,7 +3795,7 @@
           <w:sz w:val="20"/>
           <w:szCs w:val="20"/>
         </w:rPr>
-        <w:t xml:space="preserve">Gempa bumi berkekuatan 7.2 Magnitudo melanda kawasan pegunungan Seribu Bukit. Akses jalan darat terputus total akibat longsor masif. Ribuan warga di 15 desa terisolasi tanpa makanan dan obat-obatan. Badan Nasional Penanggulangan Bencana (BNPB) harus segera mendistribusikan bantuan menggunakan 5 unit helikopter kargo yang dimiliki. Waktu sangat krusial karena kapasitas bahan bakar helikopter terbatas dan cuaca sering berubah buruk di sore hari.</w:t>
+        <w:t xml:space="preserve">Komandan Logistik, Kapten Rina, menolak melihat 15 desa tersebut sebagai satu kekacauan acak. Ia mengelompokkan 15 desa ke dalam 3 Sektor Utama: Sektor Utara (kerusakan parah), Sektor Tengah (kerusakan sedang), dan Sektor Selatan (kerusakan ringan).</w:t>
       </w:r>
     </w:p>
     <w:p>
@@ -4029,19 +3808,6 @@
           <w:sz w:val="20"/>
           <w:szCs w:val="20"/>
         </w:rPr>
-        <w:t xml:space="preserve">Komandan Logistik, Kapten Rina, menolak melihat 15 desa tersebut sebagai satu kekacauan acak. Ia mengelompokkan 15 desa ke dalam 3 Sektor Utama: Sektor Utara (kerusakan parah), Sektor Tengah (kerusakan sedang), dan Sektor Selatan (kerusakan ringan).</w:t>
-      </w:r>
-    </w:p>
-    <w:p>
-      <w:pPr>
-        <w:spacing w:after="100"/>
-      </w:pPr>
-      <w:r>
-        <w:rPr>
-          <w:rFonts w:ascii="Arial" w:cs="Arial" w:eastAsia="Arial" w:hAnsi="Arial"/>
-          <w:sz w:val="20"/>
-          <w:szCs w:val="20"/>
-        </w:rPr>
         <w:t xml:space="preserve">Proses berpikir komputasional apakah yang diterapkan Kapten Rina melalui pengelompokan 15 desa tersebut?</w:t>
       </w:r>
     </w:p>
@@ -4066,79 +3832,79 @@
           <w:sz w:val="20"/>
           <w:szCs w:val="20"/>
         </w:rPr>
+        <w:t xml:space="preserve">Algoritma Buta; memerintahkan pilot menerbangkan helikopter ke arah mana pun sesuai arah tiupan angin pagi hari.</w:t>
+      </w:r>
+    </w:p>
+    <w:p>
+      <w:pPr>
+        <w:spacing w:after="80"/>
+        <w:ind w:left="400"/>
+      </w:pPr>
+      <w:r>
+        <w:rPr>
+          <w:rFonts w:ascii="Arial" w:cs="Arial" w:eastAsia="Arial" w:hAnsi="Arial"/>
+          <w:b/>
+          <w:bCs/>
+          <w:sz w:val="20"/>
+          <w:szCs w:val="20"/>
+        </w:rPr>
+        <w:t xml:space="preserve">B. </w:t>
+      </w:r>
+      <w:r>
+        <w:rPr>
+          <w:rFonts w:ascii="Arial" w:cs="Arial" w:eastAsia="Arial" w:hAnsi="Arial"/>
+          <w:sz w:val="20"/>
+          <w:szCs w:val="20"/>
+        </w:rPr>
+        <w:t xml:space="preserve">Dekomposisi; mereduksi kompleksitas tantangan logistik 15 lokasi terisolasi menjadi 3 kluster terkelola berbasis derajat keparahan kerusakan dan skala prioritas.</w:t>
+      </w:r>
+    </w:p>
+    <w:p>
+      <w:pPr>
+        <w:spacing w:after="80"/>
+        <w:ind w:left="400"/>
+      </w:pPr>
+      <w:r>
+        <w:rPr>
+          <w:rFonts w:ascii="Arial" w:cs="Arial" w:eastAsia="Arial" w:hAnsi="Arial"/>
+          <w:b/>
+          <w:bCs/>
+          <w:sz w:val="20"/>
+          <w:szCs w:val="20"/>
+        </w:rPr>
+        <w:t xml:space="preserve">C. </w:t>
+      </w:r>
+      <w:r>
+        <w:rPr>
+          <w:rFonts w:ascii="Arial" w:cs="Arial" w:eastAsia="Arial" w:hAnsi="Arial"/>
+          <w:sz w:val="20"/>
+          <w:szCs w:val="20"/>
+        </w:rPr>
+        <w:t xml:space="preserve">Pengenalan Pola Acak; mencampuradukkan data korban bencana tanpa memperhatikan tingkat kerusakan wilayah.</w:t>
+      </w:r>
+    </w:p>
+    <w:p>
+      <w:pPr>
+        <w:spacing w:after="80"/>
+        <w:ind w:left="400"/>
+      </w:pPr>
+      <w:r>
+        <w:rPr>
+          <w:rFonts w:ascii="Arial" w:cs="Arial" w:eastAsia="Arial" w:hAnsi="Arial"/>
+          <w:b/>
+          <w:bCs/>
+          <w:sz w:val="20"/>
+          <w:szCs w:val="20"/>
+        </w:rPr>
+        <w:t xml:space="preserve">D. </w:t>
+      </w:r>
+      <w:r>
+        <w:rPr>
+          <w:rFonts w:ascii="Arial" w:cs="Arial" w:eastAsia="Arial" w:hAnsi="Arial"/>
+          <w:sz w:val="20"/>
+          <w:szCs w:val="20"/>
+        </w:rPr>
         <w:t xml:space="preserve">Abstraksi Parsial; mengabaikan seluruh desa di Sektor Utara karena kerusakannya dianggap terlalu sulit untuk dijangkau.</w:t>
-      </w:r>
-    </w:p>
-    <w:p>
-      <w:pPr>
-        <w:spacing w:after="80"/>
-        <w:ind w:left="400"/>
-      </w:pPr>
-      <w:r>
-        <w:rPr>
-          <w:rFonts w:ascii="Arial" w:cs="Arial" w:eastAsia="Arial" w:hAnsi="Arial"/>
-          <w:b/>
-          <w:bCs/>
-          <w:sz w:val="20"/>
-          <w:szCs w:val="20"/>
-        </w:rPr>
-        <w:t xml:space="preserve">B. </w:t>
-      </w:r>
-      <w:r>
-        <w:rPr>
-          <w:rFonts w:ascii="Arial" w:cs="Arial" w:eastAsia="Arial" w:hAnsi="Arial"/>
-          <w:sz w:val="20"/>
-          <w:szCs w:val="20"/>
-        </w:rPr>
-        <w:t xml:space="preserve">Algoritma Buta; memerintahkan pilot menerbangkan helikopter ke arah mana pun sesuai arah tiupan angin pagi hari.</w:t>
-      </w:r>
-    </w:p>
-    <w:p>
-      <w:pPr>
-        <w:spacing w:after="80"/>
-        <w:ind w:left="400"/>
-      </w:pPr>
-      <w:r>
-        <w:rPr>
-          <w:rFonts w:ascii="Arial" w:cs="Arial" w:eastAsia="Arial" w:hAnsi="Arial"/>
-          <w:b/>
-          <w:bCs/>
-          <w:sz w:val="20"/>
-          <w:szCs w:val="20"/>
-        </w:rPr>
-        <w:t xml:space="preserve">C. </w:t>
-      </w:r>
-      <w:r>
-        <w:rPr>
-          <w:rFonts w:ascii="Arial" w:cs="Arial" w:eastAsia="Arial" w:hAnsi="Arial"/>
-          <w:sz w:val="20"/>
-          <w:szCs w:val="20"/>
-        </w:rPr>
-        <w:t xml:space="preserve">Dekomposisi; mereduksi kompleksitas tantangan logistik 15 lokasi terisolasi menjadi 3 kluster terkelola berbasis derajat keparahan kerusakan dan skala prioritas.</w:t>
-      </w:r>
-    </w:p>
-    <w:p>
-      <w:pPr>
-        <w:spacing w:after="80"/>
-        <w:ind w:left="400"/>
-      </w:pPr>
-      <w:r>
-        <w:rPr>
-          <w:rFonts w:ascii="Arial" w:cs="Arial" w:eastAsia="Arial" w:hAnsi="Arial"/>
-          <w:b/>
-          <w:bCs/>
-          <w:sz w:val="20"/>
-          <w:szCs w:val="20"/>
-        </w:rPr>
-        <w:t xml:space="preserve">D. </w:t>
-      </w:r>
-      <w:r>
-        <w:rPr>
-          <w:rFonts w:ascii="Arial" w:cs="Arial" w:eastAsia="Arial" w:hAnsi="Arial"/>
-          <w:sz w:val="20"/>
-          <w:szCs w:val="20"/>
-        </w:rPr>
-        <w:t xml:space="preserve">Pengenalan Pola Acak; mencampuradukkan data korban bencana tanpa memperhatikan tingkat kerusakan wilayah.</w:t>
       </w:r>
     </w:p>
     <w:p>
@@ -4225,7 +3991,7 @@
           <w:sz w:val="22"/>
           <w:szCs w:val="22"/>
         </w:rPr>
-        <w:t xml:space="preserve">SOAL NO. 19 [Kasus Garuda Rescue (Pengenalan Pola)]</w:t>
+        <w:t xml:space="preserve">SOAL NO. 19</w:t>
       </w:r>
     </w:p>
     <w:p>
@@ -4238,7 +4004,7 @@
           <w:sz w:val="20"/>
           <w:szCs w:val="20"/>
         </w:rPr>
-        <w:t xml:space="preserve">[ANALISIS JENDELA CUACA GARUDA RESCUE]</w:t>
+        <w:t xml:space="preserve">Berdasarkan evaluasi arsip misi penanggulangan bencana tahun-tahun sebelumnya di kawasan perbukitan, Kapten Rina dan tim mengenali sebuah pola mikroklimat konsisten: desa-desa yang berada di lembah curam (Sektor Utara) selalu diselimuti kabut tebal pekat setelah pukul 14.00 siang, yang membuat penerbangan helikopter menjadi mustahil dan berisiko mematikan.</w:t>
       </w:r>
     </w:p>
     <w:p>
@@ -4251,19 +4017,6 @@
           <w:sz w:val="20"/>
           <w:szCs w:val="20"/>
         </w:rPr>
-        <w:t xml:space="preserve">Berdasarkan evaluasi arsip misi penanggulangan bencana tahun-tahun sebelumnya di kawasan perbukitan, Kapten Rina dan tim mengenali sebuah pola mikroklimat konsisten: desa-desa yang berada di lembah curam (Sektor Utara) selalu diselimuti kabut tebal pekat setelah pukul 14.00 siang, yang membuat penerbangan helikopter menjadi mustahil dan berisiko mematikan.</w:t>
-      </w:r>
-    </w:p>
-    <w:p>
-      <w:pPr>
-        <w:spacing w:after="100"/>
-      </w:pPr>
-      <w:r>
-        <w:rPr>
-          <w:rFonts w:ascii="Arial" w:cs="Arial" w:eastAsia="Arial" w:hAnsi="Arial"/>
-          <w:sz w:val="20"/>
-          <w:szCs w:val="20"/>
-        </w:rPr>
         <w:t xml:space="preserve">Bagaimanakah rekognisi pola cuaca tersebut memengaruhi konstruksi strategi penerbangan Kapten Rina?</w:t>
       </w:r>
     </w:p>
@@ -4288,31 +4041,31 @@
           <w:sz w:val="20"/>
           <w:szCs w:val="20"/>
         </w:rPr>
+        <w:t xml:space="preserve">Menyebabkan operasi penerbangan ke Sektor Utara dibatalkan sama sekali demi melindungi keselamatan helikopter dari tetesan air kabut.</w:t>
+      </w:r>
+    </w:p>
+    <w:p>
+      <w:pPr>
+        <w:spacing w:after="80"/>
+        <w:ind w:left="400"/>
+      </w:pPr>
+      <w:r>
+        <w:rPr>
+          <w:rFonts w:ascii="Arial" w:cs="Arial" w:eastAsia="Arial" w:hAnsi="Arial"/>
+          <w:b/>
+          <w:bCs/>
+          <w:sz w:val="20"/>
+          <w:szCs w:val="20"/>
+        </w:rPr>
+        <w:t xml:space="preserve">B. </w:t>
+      </w:r>
+      <w:r>
+        <w:rPr>
+          <w:rFonts w:ascii="Arial" w:cs="Arial" w:eastAsia="Arial" w:hAnsi="Arial"/>
+          <w:sz w:val="20"/>
+          <w:szCs w:val="20"/>
+        </w:rPr>
         <w:t xml:space="preserve">Mendorong Kapten Rina mengalokasikan seluruh (5) helikopter secara maksimal ke Sektor Utara pada pagi hari (06.00 - 10.00) sebelum batas jendela cuaca berkabut tertutup.</w:t>
-      </w:r>
-    </w:p>
-    <w:p>
-      <w:pPr>
-        <w:spacing w:after="80"/>
-        <w:ind w:left="400"/>
-      </w:pPr>
-      <w:r>
-        <w:rPr>
-          <w:rFonts w:ascii="Arial" w:cs="Arial" w:eastAsia="Arial" w:hAnsi="Arial"/>
-          <w:b/>
-          <w:bCs/>
-          <w:sz w:val="20"/>
-          <w:szCs w:val="20"/>
-        </w:rPr>
-        <w:t xml:space="preserve">B. </w:t>
-      </w:r>
-      <w:r>
-        <w:rPr>
-          <w:rFonts w:ascii="Arial" w:cs="Arial" w:eastAsia="Arial" w:hAnsi="Arial"/>
-          <w:sz w:val="20"/>
-          <w:szCs w:val="20"/>
-        </w:rPr>
-        <w:t xml:space="preserve">Menyebabkan operasi penerbangan ke Sektor Utara dibatalkan sama sekali demi melindungi keselamatan helikopter dari tetesan air kabut.</w:t>
       </w:r>
     </w:p>
     <w:p>
@@ -4447,7 +4200,7 @@
           <w:sz w:val="22"/>
           <w:szCs w:val="22"/>
         </w:rPr>
-        <w:t xml:space="preserve">SOAL NO. 20 [Kasus Garuda Rescue (Abstraksi)]</w:t>
+        <w:t xml:space="preserve">SOAL NO. 20</w:t>
       </w:r>
     </w:p>
     <w:p>
@@ -4460,7 +4213,7 @@
           <w:sz w:val="20"/>
           <w:szCs w:val="20"/>
         </w:rPr>
-        <w:t xml:space="preserve">[SELEKSI MANIFES KARGO GARUDA RESCUE]</w:t>
+        <w:t xml:space="preserve">Saat mempersiapkan pemuatan barang ke helikopter, banyak warga dan relawan donatur menitipkan barang pribadi, tumpukan pakaian bekas, buku cerita, dan mainan anak-anak. Kapten Rina dengan tegas memfilter manifes kargo. Ia menetapkan bahwa untuk 72 jam pertama, helikopter HANYA akan memuat: air bersih, terpal medis (P3K), makanan instan padat kalori, dan perangkat komunikasi darurat.</w:t>
       </w:r>
     </w:p>
     <w:p>
@@ -4473,19 +4226,6 @@
           <w:sz w:val="20"/>
           <w:szCs w:val="20"/>
         </w:rPr>
-        <w:t xml:space="preserve">Saat mempersiapkan pemuatan barang ke helikopter, banyak warga dan relawan donatur menitipkan barang pribadi, tumpukan pakaian bekas, buku cerita, dan mainan anak-anak. Kapten Rina dengan tegas memfilter manifes kargo. Ia menetapkan bahwa untuk 72 jam pertama, helikopter HANYA akan memuat: air bersih, terpal medis (P3K), makanan instan padat kalori, dan perangkat komunikasi darurat.</w:t>
-      </w:r>
-    </w:p>
-    <w:p>
-      <w:pPr>
-        <w:spacing w:after="100"/>
-      </w:pPr>
-      <w:r>
-        <w:rPr>
-          <w:rFonts w:ascii="Arial" w:cs="Arial" w:eastAsia="Arial" w:hAnsi="Arial"/>
-          <w:sz w:val="20"/>
-          <w:szCs w:val="20"/>
-        </w:rPr>
         <w:t xml:space="preserve">Proses berpikir komputasional apakah yang diterapkan Kapten Rina, dan apakah justifikasi ilmiahnya dari sudut pandang keterbatasan sistem (system constraints)?</w:t>
       </w:r>
     </w:p>
@@ -4510,103 +4250,103 @@
           <w:sz w:val="20"/>
           <w:szCs w:val="20"/>
         </w:rPr>
+        <w:t xml:space="preserve">Pengenalan Pola; menyimpulkan bahwa seluruh korban bencana gempa bumi tidak membutuhkan pakaian dan obat-obatan.</w:t>
+      </w:r>
+    </w:p>
+    <w:p>
+      <w:pPr>
+        <w:spacing w:after="80"/>
+        <w:ind w:left="400"/>
+      </w:pPr>
+      <w:r>
+        <w:rPr>
+          <w:rFonts w:ascii="Arial" w:cs="Arial" w:eastAsia="Arial" w:hAnsi="Arial"/>
+          <w:b/>
+          <w:bCs/>
+          <w:sz w:val="20"/>
+          <w:szCs w:val="20"/>
+        </w:rPr>
+        <w:t xml:space="preserve">B. </w:t>
+      </w:r>
+      <w:r>
+        <w:rPr>
+          <w:rFonts w:ascii="Arial" w:cs="Arial" w:eastAsia="Arial" w:hAnsi="Arial"/>
+          <w:sz w:val="20"/>
+          <w:szCs w:val="20"/>
+        </w:rPr>
+        <w:t xml:space="preserve">Otomatisasi Kargo; memprogram helikopter untuk menjatuhkan barang donasi di atas perairan danau tanpa parasut penerjun.</w:t>
+      </w:r>
+    </w:p>
+    <w:p>
+      <w:pPr>
+        <w:spacing w:after="80"/>
+        <w:ind w:left="400"/>
+      </w:pPr>
+      <w:r>
+        <w:rPr>
+          <w:rFonts w:ascii="Arial" w:cs="Arial" w:eastAsia="Arial" w:hAnsi="Arial"/>
+          <w:b/>
+          <w:bCs/>
+          <w:sz w:val="20"/>
+          <w:szCs w:val="20"/>
+        </w:rPr>
+        <w:t xml:space="preserve">C. </w:t>
+      </w:r>
+      <w:r>
+        <w:rPr>
+          <w:rFonts w:ascii="Arial" w:cs="Arial" w:eastAsia="Arial" w:hAnsi="Arial"/>
+          <w:sz w:val="20"/>
+          <w:szCs w:val="20"/>
+        </w:rPr>
+        <w:t xml:space="preserve">Abstraksi; membuang barang non-kritis dan memprioritaskan muatan penyelamat nyawa (life-saving) karena payload dan volume kargo helikopter sangat terbatas pada fase kritis 72 jam pertama.</w:t>
+      </w:r>
+    </w:p>
+    <w:p>
+      <w:pPr>
+        <w:spacing w:after="80"/>
+        <w:ind w:left="400"/>
+      </w:pPr>
+      <w:r>
+        <w:rPr>
+          <w:rFonts w:ascii="Arial" w:cs="Arial" w:eastAsia="Arial" w:hAnsi="Arial"/>
+          <w:b/>
+          <w:bCs/>
+          <w:sz w:val="20"/>
+          <w:szCs w:val="20"/>
+        </w:rPr>
+        <w:t xml:space="preserve">D. </w:t>
+      </w:r>
+      <w:r>
+        <w:rPr>
+          <w:rFonts w:ascii="Arial" w:cs="Arial" w:eastAsia="Arial" w:hAnsi="Arial"/>
+          <w:sz w:val="20"/>
+          <w:szCs w:val="20"/>
+        </w:rPr>
+        <w:t xml:space="preserve">Dekomposisi; membagikan mainan anak-anak terlebih dahulu agar korban bencana tidak mengalami kesedihan berlarut-larut.</w:t>
+      </w:r>
+    </w:p>
+    <w:p>
+      <w:pPr>
+        <w:spacing w:after="80"/>
+        <w:ind w:left="400"/>
+      </w:pPr>
+      <w:r>
+        <w:rPr>
+          <w:rFonts w:ascii="Arial" w:cs="Arial" w:eastAsia="Arial" w:hAnsi="Arial"/>
+          <w:b/>
+          <w:bCs/>
+          <w:sz w:val="20"/>
+          <w:szCs w:val="20"/>
+        </w:rPr>
+        <w:t xml:space="preserve">E. </w:t>
+      </w:r>
+      <w:r>
+        <w:rPr>
+          <w:rFonts w:ascii="Arial" w:cs="Arial" w:eastAsia="Arial" w:hAnsi="Arial"/>
+          <w:sz w:val="20"/>
+          <w:szCs w:val="20"/>
+        </w:rPr>
         <w:t xml:space="preserve">Algoritma Buta; mengabaikan seluruh permintaan bantuan dan membiarkan helikopter terbang dalam keadaan kosong tanpa muatan.</w:t>
-      </w:r>
-    </w:p>
-    <w:p>
-      <w:pPr>
-        <w:spacing w:after="80"/>
-        <w:ind w:left="400"/>
-      </w:pPr>
-      <w:r>
-        <w:rPr>
-          <w:rFonts w:ascii="Arial" w:cs="Arial" w:eastAsia="Arial" w:hAnsi="Arial"/>
-          <w:b/>
-          <w:bCs/>
-          <w:sz w:val="20"/>
-          <w:szCs w:val="20"/>
-        </w:rPr>
-        <w:t xml:space="preserve">B. </w:t>
-      </w:r>
-      <w:r>
-        <w:rPr>
-          <w:rFonts w:ascii="Arial" w:cs="Arial" w:eastAsia="Arial" w:hAnsi="Arial"/>
-          <w:sz w:val="20"/>
-          <w:szCs w:val="20"/>
-        </w:rPr>
-        <w:t xml:space="preserve">Pengenalan Pola; menyimpulkan bahwa seluruh korban bencana gempa bumi tidak membutuhkan pakaian dan obat-obatan.</w:t>
-      </w:r>
-    </w:p>
-    <w:p>
-      <w:pPr>
-        <w:spacing w:after="80"/>
-        <w:ind w:left="400"/>
-      </w:pPr>
-      <w:r>
-        <w:rPr>
-          <w:rFonts w:ascii="Arial" w:cs="Arial" w:eastAsia="Arial" w:hAnsi="Arial"/>
-          <w:b/>
-          <w:bCs/>
-          <w:sz w:val="20"/>
-          <w:szCs w:val="20"/>
-        </w:rPr>
-        <w:t xml:space="preserve">C. </w:t>
-      </w:r>
-      <w:r>
-        <w:rPr>
-          <w:rFonts w:ascii="Arial" w:cs="Arial" w:eastAsia="Arial" w:hAnsi="Arial"/>
-          <w:sz w:val="20"/>
-          <w:szCs w:val="20"/>
-        </w:rPr>
-        <w:t xml:space="preserve">Otomatisasi Kargo; memprogram helikopter untuk menjatuhkan barang donasi di atas perairan danau tanpa parasut penerjun.</w:t>
-      </w:r>
-    </w:p>
-    <w:p>
-      <w:pPr>
-        <w:spacing w:after="80"/>
-        <w:ind w:left="400"/>
-      </w:pPr>
-      <w:r>
-        <w:rPr>
-          <w:rFonts w:ascii="Arial" w:cs="Arial" w:eastAsia="Arial" w:hAnsi="Arial"/>
-          <w:b/>
-          <w:bCs/>
-          <w:sz w:val="20"/>
-          <w:szCs w:val="20"/>
-        </w:rPr>
-        <w:t xml:space="preserve">D. </w:t>
-      </w:r>
-      <w:r>
-        <w:rPr>
-          <w:rFonts w:ascii="Arial" w:cs="Arial" w:eastAsia="Arial" w:hAnsi="Arial"/>
-          <w:sz w:val="20"/>
-          <w:szCs w:val="20"/>
-        </w:rPr>
-        <w:t xml:space="preserve">Abstraksi; membuang barang non-kritis dan memprioritaskan muatan penyelamat nyawa (life-saving) karena payload dan volume kargo helikopter sangat terbatas pada fase kritis 72 jam pertama.</w:t>
-      </w:r>
-    </w:p>
-    <w:p>
-      <w:pPr>
-        <w:spacing w:after="80"/>
-        <w:ind w:left="400"/>
-      </w:pPr>
-      <w:r>
-        <w:rPr>
-          <w:rFonts w:ascii="Arial" w:cs="Arial" w:eastAsia="Arial" w:hAnsi="Arial"/>
-          <w:b/>
-          <w:bCs/>
-          <w:sz w:val="20"/>
-          <w:szCs w:val="20"/>
-        </w:rPr>
-        <w:t xml:space="preserve">E. </w:t>
-      </w:r>
-      <w:r>
-        <w:rPr>
-          <w:rFonts w:ascii="Arial" w:cs="Arial" w:eastAsia="Arial" w:hAnsi="Arial"/>
-          <w:sz w:val="20"/>
-          <w:szCs w:val="20"/>
-        </w:rPr>
-        <w:t xml:space="preserve">Dekomposisi; membagikan mainan anak-anak terlebih dahulu agar korban bencana tidak mengalami kesedihan berlarut-larut.</w:t>
       </w:r>
     </w:p>
     <w:p>
@@ -4669,20 +4409,7 @@
           <w:sz w:val="22"/>
           <w:szCs w:val="22"/>
         </w:rPr>
-        <w:t xml:space="preserve">SOAL NO. 21 [Kasus Garuda Rescue (Algoritma)]</w:t>
-      </w:r>
-    </w:p>
-    <w:p>
-      <w:pPr>
-        <w:spacing w:after="100"/>
-      </w:pPr>
-      <w:r>
-        <w:rPr>
-          <w:rFonts w:ascii="Arial" w:cs="Arial" w:eastAsia="Arial" w:hAnsi="Arial"/>
-          <w:sz w:val="20"/>
-          <w:szCs w:val="20"/>
-        </w:rPr>
-        <w:t xml:space="preserve">[ANALISIS JADWAL FLIGHT PLAN]</w:t>
+        <w:t xml:space="preserve">SOAL NO. 21</w:t>
       </w:r>
     </w:p>
     <w:p>
@@ -4943,7 +4670,7 @@
           <w:sz w:val="22"/>
           <w:szCs w:val="22"/>
         </w:rPr>
-        <w:t xml:space="preserve">SOAL NO. 22 [Kasus Garuda Rescue (Keandalan Sistem)]</w:t>
+        <w:t xml:space="preserve">SOAL NO. 22</w:t>
       </w:r>
     </w:p>
     <w:p>
@@ -4956,7 +4683,7 @@
           <w:sz w:val="20"/>
           <w:szCs w:val="20"/>
         </w:rPr>
-        <w:t xml:space="preserve">[ANALISIS TAHAP REFUELING PUKUL 10.00]</w:t>
+        <w:t xml:space="preserve">Dalam jadwal penerbangan Kapten Rina, pukul 10.00 - 11.00 ditetapkan secara ketat: "Helikopter kembali ke pangkalan untuk isi bahan bakar ulang (refueling)".</w:t>
       </w:r>
     </w:p>
     <w:p>
@@ -4969,19 +4696,6 @@
           <w:sz w:val="20"/>
           <w:szCs w:val="20"/>
         </w:rPr>
-        <w:t xml:space="preserve">Dalam jadwal penerbangan Kapten Rina, pukul 10.00 - 11.00 ditetapkan secara ketat: "Helikopter kembali ke pangkalan untuk isi bahan bakar ulang (refueling)".</w:t>
-      </w:r>
-    </w:p>
-    <w:p>
-      <w:pPr>
-        <w:spacing w:after="100"/>
-      </w:pPr>
-      <w:r>
-        <w:rPr>
-          <w:rFonts w:ascii="Arial" w:cs="Arial" w:eastAsia="Arial" w:hAnsi="Arial"/>
-          <w:sz w:val="20"/>
-          <w:szCs w:val="20"/>
-        </w:rPr>
         <w:t xml:space="preserve">Jika seorang pejabat lapangan menuntut agar tahap refueling tersebut dihilangkan demi gengsi publikasi bahwa helikopter terbang tanpa jeda, konsekuensi kegagalan sistem komputasional (system failure) apakah yang pasti terjadi?</w:t>
       </w:r>
     </w:p>
@@ -5006,79 +4720,79 @@
           <w:sz w:val="20"/>
           <w:szCs w:val="20"/>
         </w:rPr>
+        <w:t xml:space="preserve">Cuaca buruk di sore hari akan tertunda kemunculannya hingga pengisian bahan bakar dilakukan pada malam hari.</w:t>
+      </w:r>
+    </w:p>
+    <w:p>
+      <w:pPr>
+        <w:spacing w:after="80"/>
+        <w:ind w:left="400"/>
+      </w:pPr>
+      <w:r>
+        <w:rPr>
+          <w:rFonts w:ascii="Arial" w:cs="Arial" w:eastAsia="Arial" w:hAnsi="Arial"/>
+          <w:b/>
+          <w:bCs/>
+          <w:sz w:val="20"/>
+          <w:szCs w:val="20"/>
+        </w:rPr>
+        <w:t xml:space="preserve">B. </w:t>
+      </w:r>
+      <w:r>
+        <w:rPr>
+          <w:rFonts w:ascii="Arial" w:cs="Arial" w:eastAsia="Arial" w:hAnsi="Arial"/>
+          <w:sz w:val="20"/>
+          <w:szCs w:val="20"/>
+        </w:rPr>
+        <w:t xml:space="preserve">Kehabisan daya sumber energi di tengah rute penerbangan sesi kedua (Resource Depletion), yang memicu insiden kecelakaan fatal dan kegagalan total seluruh misi kemanusiaan.</w:t>
+      </w:r>
+    </w:p>
+    <w:p>
+      <w:pPr>
+        <w:spacing w:after="80"/>
+        <w:ind w:left="400"/>
+      </w:pPr>
+      <w:r>
+        <w:rPr>
+          <w:rFonts w:ascii="Arial" w:cs="Arial" w:eastAsia="Arial" w:hAnsi="Arial"/>
+          <w:b/>
+          <w:bCs/>
+          <w:sz w:val="20"/>
+          <w:szCs w:val="20"/>
+        </w:rPr>
+        <w:t xml:space="preserve">C. </w:t>
+      </w:r>
+      <w:r>
+        <w:rPr>
+          <w:rFonts w:ascii="Arial" w:cs="Arial" w:eastAsia="Arial" w:hAnsi="Arial"/>
+          <w:sz w:val="20"/>
+          <w:szCs w:val="20"/>
+        </w:rPr>
+        <w:t xml:space="preserve">Helikopter akan terbang lebih kencang karena muatan bahan bakar di dalam tangki menjadi kosong dan ringan.</w:t>
+      </w:r>
+    </w:p>
+    <w:p>
+      <w:pPr>
+        <w:spacing w:after="80"/>
+        <w:ind w:left="400"/>
+      </w:pPr>
+      <w:r>
+        <w:rPr>
+          <w:rFonts w:ascii="Arial" w:cs="Arial" w:eastAsia="Arial" w:hAnsi="Arial"/>
+          <w:b/>
+          <w:bCs/>
+          <w:sz w:val="20"/>
+          <w:szCs w:val="20"/>
+        </w:rPr>
+        <w:t xml:space="preserve">D. </w:t>
+      </w:r>
+      <w:r>
+        <w:rPr>
+          <w:rFonts w:ascii="Arial" w:cs="Arial" w:eastAsia="Arial" w:hAnsi="Arial"/>
+          <w:sz w:val="20"/>
+          <w:szCs w:val="20"/>
+        </w:rPr>
         <w:t xml:space="preserve">Penduduk di Sektor Tengah akan menerima makanan instan dalam kondisi terlalu panas akibat panas mesin helikopter.</w:t>
-      </w:r>
-    </w:p>
-    <w:p>
-      <w:pPr>
-        <w:spacing w:after="80"/>
-        <w:ind w:left="400"/>
-      </w:pPr>
-      <w:r>
-        <w:rPr>
-          <w:rFonts w:ascii="Arial" w:cs="Arial" w:eastAsia="Arial" w:hAnsi="Arial"/>
-          <w:b/>
-          <w:bCs/>
-          <w:sz w:val="20"/>
-          <w:szCs w:val="20"/>
-        </w:rPr>
-        <w:t xml:space="preserve">B. </w:t>
-      </w:r>
-      <w:r>
-        <w:rPr>
-          <w:rFonts w:ascii="Arial" w:cs="Arial" w:eastAsia="Arial" w:hAnsi="Arial"/>
-          <w:sz w:val="20"/>
-          <w:szCs w:val="20"/>
-        </w:rPr>
-        <w:t xml:space="preserve">Cuaca buruk di sore hari akan tertunda kemunculannya hingga pengisian bahan bakar dilakukan pada malam hari.</w:t>
-      </w:r>
-    </w:p>
-    <w:p>
-      <w:pPr>
-        <w:spacing w:after="80"/>
-        <w:ind w:left="400"/>
-      </w:pPr>
-      <w:r>
-        <w:rPr>
-          <w:rFonts w:ascii="Arial" w:cs="Arial" w:eastAsia="Arial" w:hAnsi="Arial"/>
-          <w:b/>
-          <w:bCs/>
-          <w:sz w:val="20"/>
-          <w:szCs w:val="20"/>
-        </w:rPr>
-        <w:t xml:space="preserve">C. </w:t>
-      </w:r>
-      <w:r>
-        <w:rPr>
-          <w:rFonts w:ascii="Arial" w:cs="Arial" w:eastAsia="Arial" w:hAnsi="Arial"/>
-          <w:sz w:val="20"/>
-          <w:szCs w:val="20"/>
-        </w:rPr>
-        <w:t xml:space="preserve">Kehabisan daya sumber energi di tengah rute penerbangan sesi kedua (Resource Depletion), yang memicu insiden kecelakaan fatal dan kegagalan total seluruh misi kemanusiaan.</w:t>
-      </w:r>
-    </w:p>
-    <w:p>
-      <w:pPr>
-        <w:spacing w:after="80"/>
-        <w:ind w:left="400"/>
-      </w:pPr>
-      <w:r>
-        <w:rPr>
-          <w:rFonts w:ascii="Arial" w:cs="Arial" w:eastAsia="Arial" w:hAnsi="Arial"/>
-          <w:b/>
-          <w:bCs/>
-          <w:sz w:val="20"/>
-          <w:szCs w:val="20"/>
-        </w:rPr>
-        <w:t xml:space="preserve">D. </w:t>
-      </w:r>
-      <w:r>
-        <w:rPr>
-          <w:rFonts w:ascii="Arial" w:cs="Arial" w:eastAsia="Arial" w:hAnsi="Arial"/>
-          <w:sz w:val="20"/>
-          <w:szCs w:val="20"/>
-        </w:rPr>
-        <w:t xml:space="preserve">Helikopter akan terbang lebih kencang karena muatan bahan bakar di dalam tangki menjadi kosong dan ringan.</w:t>
       </w:r>
     </w:p>
     <w:p>
@@ -5165,7 +4879,7 @@
           <w:sz w:val="22"/>
           <w:szCs w:val="22"/>
         </w:rPr>
-        <w:t xml:space="preserve">SOAL NO. 23 [Kasus Garuda Rescue (Inspeksi Mesin)]</w:t>
+        <w:t xml:space="preserve">SOAL NO. 23</w:t>
       </w:r>
     </w:p>
     <w:p>
@@ -5178,7 +4892,7 @@
           <w:sz w:val="20"/>
           <w:szCs w:val="20"/>
         </w:rPr>
-        <w:t xml:space="preserve">[ANALISIS TAHAP 4: SAFETY MARGIN]</w:t>
+        <w:t xml:space="preserve">Pada tahapan ke-4 jadwal Kapten Rina tertulis: "Pukul 14.00 - Selesai: Operasi dihentikan untuk inspeksi mesin harian dan menghindari cuaca buruk sore hari."</w:t>
       </w:r>
     </w:p>
     <w:p>
@@ -5191,19 +4905,6 @@
           <w:sz w:val="20"/>
           <w:szCs w:val="20"/>
         </w:rPr>
-        <w:t xml:space="preserve">Pada tahapan ke-4 jadwal Kapten Rina tertulis: "Pukul 14.00 - Selesai: Operasi dihentikan untuk inspeksi mesin harian dan menghindari cuaca buruk sore hari."</w:t>
-      </w:r>
-    </w:p>
-    <w:p>
-      <w:pPr>
-        <w:spacing w:after="100"/>
-      </w:pPr>
-      <w:r>
-        <w:rPr>
-          <w:rFonts w:ascii="Arial" w:cs="Arial" w:eastAsia="Arial" w:hAnsi="Arial"/>
-          <w:sz w:val="20"/>
-          <w:szCs w:val="20"/>
-        </w:rPr>
         <w:t xml:space="preserve">Dari perspektif pemeliharaan sistem komputasional yang tangguh (robust &amp; sustainable system), mengapa penghentian operasi pada pukul 14.00 merupakan keputusan yang sangat cerdas, alih-alih bentuk pemalasan?</w:t>
       </w:r>
     </w:p>
@@ -5228,31 +4929,31 @@
           <w:sz w:val="20"/>
           <w:szCs w:val="20"/>
         </w:rPr>
+        <w:t xml:space="preserve">Memberi kesempatan kepada Kapten Rina untuk meninggalkan lokasi posko bencana dan berlibur ke luar kota pegunungan.</w:t>
+      </w:r>
+    </w:p>
+    <w:p>
+      <w:pPr>
+        <w:spacing w:after="80"/>
+        <w:ind w:left="400"/>
+      </w:pPr>
+      <w:r>
+        <w:rPr>
+          <w:rFonts w:ascii="Arial" w:cs="Arial" w:eastAsia="Arial" w:hAnsi="Arial"/>
+          <w:b/>
+          <w:bCs/>
+          <w:sz w:val="20"/>
+          <w:szCs w:val="20"/>
+        </w:rPr>
+        <w:t xml:space="preserve">B. </w:t>
+      </w:r>
+      <w:r>
+        <w:rPr>
+          <w:rFonts w:ascii="Arial" w:cs="Arial" w:eastAsia="Arial" w:hAnsi="Arial"/>
+          <w:sz w:val="20"/>
+          <w:szCs w:val="20"/>
+        </w:rPr>
         <w:t xml:space="preserve">Menerapkan batas toleransi keamanan (safety threshold) untuk mencegah risiko kerugian aset total akibat cuaca buruk dan menjamin kesiapan armada untuk beroperasi kembali keesokan paginya.</w:t>
-      </w:r>
-    </w:p>
-    <w:p>
-      <w:pPr>
-        <w:spacing w:after="80"/>
-        <w:ind w:left="400"/>
-      </w:pPr>
-      <w:r>
-        <w:rPr>
-          <w:rFonts w:ascii="Arial" w:cs="Arial" w:eastAsia="Arial" w:hAnsi="Arial"/>
-          <w:b/>
-          <w:bCs/>
-          <w:sz w:val="20"/>
-          <w:szCs w:val="20"/>
-        </w:rPr>
-        <w:t xml:space="preserve">B. </w:t>
-      </w:r>
-      <w:r>
-        <w:rPr>
-          <w:rFonts w:ascii="Arial" w:cs="Arial" w:eastAsia="Arial" w:hAnsi="Arial"/>
-          <w:sz w:val="20"/>
-          <w:szCs w:val="20"/>
-        </w:rPr>
-        <w:t xml:space="preserve">Memberi kesempatan kepada Kapten Rina untuk meninggalkan lokasi posko bencana dan berlibur ke luar kota pegunungan.</w:t>
       </w:r>
     </w:p>
     <w:p>
@@ -5387,7 +5088,7 @@
           <w:sz w:val="22"/>
           <w:szCs w:val="22"/>
         </w:rPr>
-        <w:t xml:space="preserve">SOAL NO. 24 [Sintesis Kasus 1 &amp; 2 (Abstraksi)]</w:t>
+        <w:t xml:space="preserve">SOAL NO. 24</w:t>
       </w:r>
     </w:p>
     <w:p>
@@ -5400,7 +5101,7 @@
           <w:sz w:val="20"/>
           <w:szCs w:val="20"/>
         </w:rPr>
-        <w:t xml:space="preserve">[SINTESIS KOMPARATIF KASUS 1 &amp; 2]</w:t>
+        <w:t xml:space="preserve">Bandingkan tindakan Dr. Aris pada Kasus 1 (Kota Delta) dan Kapten Rina pada Kasus 2 (Garuda Rescue). Keduanya sama-sama memimpin tim penyelamat dalam situasi darurat berskala besar dengan keterbatasan sumber daya.</w:t>
       </w:r>
     </w:p>
     <w:p>
@@ -5413,19 +5114,6 @@
           <w:sz w:val="20"/>
           <w:szCs w:val="20"/>
         </w:rPr>
-        <w:t xml:space="preserve">Bandingkan tindakan Dr. Aris pada Kasus 1 (Kota Delta) dan Kapten Rina pada Kasus 2 (Garuda Rescue). Keduanya sama-sama memimpin tim penyelamat dalam situasi darurat berskala besar dengan keterbatasan sumber daya.</w:t>
-      </w:r>
-    </w:p>
-    <w:p>
-      <w:pPr>
-        <w:spacing w:after="100"/>
-      </w:pPr>
-      <w:r>
-        <w:rPr>
-          <w:rFonts w:ascii="Arial" w:cs="Arial" w:eastAsia="Arial" w:hAnsi="Arial"/>
-          <w:sz w:val="20"/>
-          <w:szCs w:val="20"/>
-        </w:rPr>
         <w:t xml:space="preserve">Persamaan mendasar apakah yang dapat disintesis dari cara kedua tokoh tersebut menerapkan pilar ABSTRAKSI dalam menyelesaikan krisis masing-masing?</w:t>
       </w:r>
     </w:p>
@@ -5450,55 +5138,55 @@
           <w:sz w:val="20"/>
           <w:szCs w:val="20"/>
         </w:rPr>
+        <w:t xml:space="preserve">Keduanya secara disiplin menyaring dan membuang elemen non-kritis (pabrik non-B3 oleh Dr. Aris, dan barang non-medis oleh Kapten Rina) demi memusatkan kapasitas terbatas pada faktor penyelamat hidup utama.</w:t>
+      </w:r>
+    </w:p>
+    <w:p>
+      <w:pPr>
+        <w:spacing w:after="80"/>
+        <w:ind w:left="400"/>
+      </w:pPr>
+      <w:r>
+        <w:rPr>
+          <w:rFonts w:ascii="Arial" w:cs="Arial" w:eastAsia="Arial" w:hAnsi="Arial"/>
+          <w:b/>
+          <w:bCs/>
+          <w:sz w:val="20"/>
+          <w:szCs w:val="20"/>
+        </w:rPr>
+        <w:t xml:space="preserve">B. </w:t>
+      </w:r>
+      <w:r>
+        <w:rPr>
+          <w:rFonts w:ascii="Arial" w:cs="Arial" w:eastAsia="Arial" w:hAnsi="Arial"/>
+          <w:sz w:val="20"/>
+          <w:szCs w:val="20"/>
+        </w:rPr>
+        <w:t xml:space="preserve">Keduanya menolak menggunakan bantuan teknologi komputer dan hanya mengandalkan firasat batin dalam memimpin operasi penyelamatan.</w:t>
+      </w:r>
+    </w:p>
+    <w:p>
+      <w:pPr>
+        <w:spacing w:after="80"/>
+        <w:ind w:left="400"/>
+      </w:pPr>
+      <w:r>
+        <w:rPr>
+          <w:rFonts w:ascii="Arial" w:cs="Arial" w:eastAsia="Arial" w:hAnsi="Arial"/>
+          <w:b/>
+          <w:bCs/>
+          <w:sz w:val="20"/>
+          <w:szCs w:val="20"/>
+        </w:rPr>
+        <w:t xml:space="preserve">C. </w:t>
+      </w:r>
+      <w:r>
+        <w:rPr>
+          <w:rFonts w:ascii="Arial" w:cs="Arial" w:eastAsia="Arial" w:hAnsi="Arial"/>
+          <w:sz w:val="20"/>
+          <w:szCs w:val="20"/>
+        </w:rPr>
         <w:t xml:space="preserve">Keduanya membagi daerah krisis menjadi sepuluh zona acak tanpa menggunakan data historis bencana masa lalu.</w:t>
-      </w:r>
-    </w:p>
-    <w:p>
-      <w:pPr>
-        <w:spacing w:after="80"/>
-        <w:ind w:left="400"/>
-      </w:pPr>
-      <w:r>
-        <w:rPr>
-          <w:rFonts w:ascii="Arial" w:cs="Arial" w:eastAsia="Arial" w:hAnsi="Arial"/>
-          <w:b/>
-          <w:bCs/>
-          <w:sz w:val="20"/>
-          <w:szCs w:val="20"/>
-        </w:rPr>
-        <w:t xml:space="preserve">B. </w:t>
-      </w:r>
-      <w:r>
-        <w:rPr>
-          <w:rFonts w:ascii="Arial" w:cs="Arial" w:eastAsia="Arial" w:hAnsi="Arial"/>
-          <w:sz w:val="20"/>
-          <w:szCs w:val="20"/>
-        </w:rPr>
-        <w:t xml:space="preserve">Keduanya secara disiplin menyaring dan membuang elemen non-kritis (pabrik non-B3 oleh Dr. Aris, dan barang non-medis oleh Kapten Rina) demi memusatkan kapasitas terbatas pada faktor penyelamat hidup utama.</w:t>
-      </w:r>
-    </w:p>
-    <w:p>
-      <w:pPr>
-        <w:spacing w:after="80"/>
-        <w:ind w:left="400"/>
-      </w:pPr>
-      <w:r>
-        <w:rPr>
-          <w:rFonts w:ascii="Arial" w:cs="Arial" w:eastAsia="Arial" w:hAnsi="Arial"/>
-          <w:b/>
-          <w:bCs/>
-          <w:sz w:val="20"/>
-          <w:szCs w:val="20"/>
-        </w:rPr>
-        <w:t xml:space="preserve">C. </w:t>
-      </w:r>
-      <w:r>
-        <w:rPr>
-          <w:rFonts w:ascii="Arial" w:cs="Arial" w:eastAsia="Arial" w:hAnsi="Arial"/>
-          <w:sz w:val="20"/>
-          <w:szCs w:val="20"/>
-        </w:rPr>
-        <w:t xml:space="preserve">Keduanya menolak menggunakan bantuan teknologi komputer dan hanya mengandalkan firasat batin dalam memimpin operasi penyelamatan.</w:t>
       </w:r>
     </w:p>
     <w:p>
@@ -5609,7 +5297,7 @@
           <w:sz w:val="22"/>
           <w:szCs w:val="22"/>
         </w:rPr>
-        <w:t xml:space="preserve">SOAL NO. 25 [Sintesis Kasus 1 &amp; 2 (Dekomposisi)]</w:t>
+        <w:t xml:space="preserve">SOAL NO. 25</w:t>
       </w:r>
     </w:p>
     <w:p>
@@ -5622,7 +5310,7 @@
           <w:sz w:val="20"/>
           <w:szCs w:val="20"/>
         </w:rPr>
-        <w:t xml:space="preserve">[SINTESIS DIMENSI DEKOMPOSISI]</w:t>
+        <w:t xml:space="preserve">Pada Kasus 1 (Kota Delta), Dr. Aris melakukan dekomposisi berdasarkan *aspek sains investigasi* (hidrologi, tata lahan, uji kimiawi). Sementara pada Kasus 2 (Garuda Rescue), Kapten Rina melakukan dekomposisi berdasarkan *kluster geografis dan tingkat kerusakan* (Sektor Utara, Tengah, Selatan).</w:t>
       </w:r>
     </w:p>
     <w:p>
@@ -5635,19 +5323,6 @@
           <w:sz w:val="20"/>
           <w:szCs w:val="20"/>
         </w:rPr>
-        <w:t xml:space="preserve">Pada Kasus 1 (Kota Delta), Dr. Aris melakukan dekomposisi berdasarkan *aspek sains investigasi* (hidrologi, tata lahan, uji kimiawi). Sementara pada Kasus 2 (Garuda Rescue), Kapten Rina melakukan dekomposisi berdasarkan *kluster geografis dan tingkat kerusakan* (Sektor Utara, Tengah, Selatan).</w:t>
-      </w:r>
-    </w:p>
-    <w:p>
-      <w:pPr>
-        <w:spacing w:after="100"/>
-      </w:pPr>
-      <w:r>
-        <w:rPr>
-          <w:rFonts w:ascii="Arial" w:cs="Arial" w:eastAsia="Arial" w:hAnsi="Arial"/>
-          <w:sz w:val="20"/>
-          <w:szCs w:val="20"/>
-        </w:rPr>
         <w:t xml:space="preserve">Kesimpulan konseptual apakah yang paling valid mengenai fleksibilitas pilar Dekomposisi dalam pemecahan masalah dunia nyata?</w:t>
       </w:r>
     </w:p>
@@ -5672,103 +5347,103 @@
           <w:sz w:val="20"/>
           <w:szCs w:val="20"/>
         </w:rPr>
+        <w:t xml:space="preserve">Dekomposisi fungsional sains lingkungan tidak boleh digabungkan dengan dekomposisi geografis dalam satu sistem pemerintahan.</w:t>
+      </w:r>
+    </w:p>
+    <w:p>
+      <w:pPr>
+        <w:spacing w:after="80"/>
+        <w:ind w:left="400"/>
+      </w:pPr>
+      <w:r>
+        <w:rPr>
+          <w:rFonts w:ascii="Arial" w:cs="Arial" w:eastAsia="Arial" w:hAnsi="Arial"/>
+          <w:b/>
+          <w:bCs/>
+          <w:sz w:val="20"/>
+          <w:szCs w:val="20"/>
+        </w:rPr>
+        <w:t xml:space="preserve">B. </w:t>
+      </w:r>
+      <w:r>
+        <w:rPr>
+          <w:rFonts w:ascii="Arial" w:cs="Arial" w:eastAsia="Arial" w:hAnsi="Arial"/>
+          <w:sz w:val="20"/>
+          <w:szCs w:val="20"/>
+        </w:rPr>
+        <w:t xml:space="preserve">Dekomposisi harus selalu menghasilkan bagian-bagian yang dikerjakan oleh robot tanpa keterlibatan tenaga manusia.</w:t>
+      </w:r>
+    </w:p>
+    <w:p>
+      <w:pPr>
+        <w:spacing w:after="80"/>
+        <w:ind w:left="400"/>
+      </w:pPr>
+      <w:r>
+        <w:rPr>
+          <w:rFonts w:ascii="Arial" w:cs="Arial" w:eastAsia="Arial" w:hAnsi="Arial"/>
+          <w:b/>
+          <w:bCs/>
+          <w:sz w:val="20"/>
+          <w:szCs w:val="20"/>
+        </w:rPr>
+        <w:t xml:space="preserve">C. </w:t>
+      </w:r>
+      <w:r>
+        <w:rPr>
+          <w:rFonts w:ascii="Arial" w:cs="Arial" w:eastAsia="Arial" w:hAnsi="Arial"/>
+          <w:sz w:val="20"/>
+          <w:szCs w:val="20"/>
+        </w:rPr>
+        <w:t xml:space="preserve">Dekomposisi dapat diterapkan melalui berbagai dimensi pemotongan (fungsional, spasial/geografis, kronologis, atau derajat keparahan), disesuaikan dengan arsitektur masalah dan tujuan operasional.</w:t>
+      </w:r>
+    </w:p>
+    <w:p>
+      <w:pPr>
+        <w:spacing w:after="80"/>
+        <w:ind w:left="400"/>
+      </w:pPr>
+      <w:r>
+        <w:rPr>
+          <w:rFonts w:ascii="Arial" w:cs="Arial" w:eastAsia="Arial" w:hAnsi="Arial"/>
+          <w:b/>
+          <w:bCs/>
+          <w:sz w:val="20"/>
+          <w:szCs w:val="20"/>
+        </w:rPr>
+        <w:t xml:space="preserve">D. </w:t>
+      </w:r>
+      <w:r>
+        <w:rPr>
+          <w:rFonts w:ascii="Arial" w:cs="Arial" w:eastAsia="Arial" w:hAnsi="Arial"/>
+          <w:sz w:val="20"/>
+          <w:szCs w:val="20"/>
+        </w:rPr>
+        <w:t xml:space="preserve">Dekomposisi hanya sah dan benar jika membagi daerah menjadi tiga sektor geografis yang berbentuk bujur sangkar sempurna.</w:t>
+      </w:r>
+    </w:p>
+    <w:p>
+      <w:pPr>
+        <w:spacing w:after="80"/>
+        <w:ind w:left="400"/>
+      </w:pPr>
+      <w:r>
+        <w:rPr>
+          <w:rFonts w:ascii="Arial" w:cs="Arial" w:eastAsia="Arial" w:hAnsi="Arial"/>
+          <w:b/>
+          <w:bCs/>
+          <w:sz w:val="20"/>
+          <w:szCs w:val="20"/>
+        </w:rPr>
+        <w:t xml:space="preserve">E. </w:t>
+      </w:r>
+      <w:r>
+        <w:rPr>
+          <w:rFonts w:ascii="Arial" w:cs="Arial" w:eastAsia="Arial" w:hAnsi="Arial"/>
+          <w:sz w:val="20"/>
+          <w:szCs w:val="20"/>
+        </w:rPr>
         <w:t xml:space="preserve">Dekomposisi pada operasi tanggap bencana alam selalu gagal jika tidak menggunakan rumus matematika diferensial integral.</w:t>
-      </w:r>
-    </w:p>
-    <w:p>
-      <w:pPr>
-        <w:spacing w:after="80"/>
-        <w:ind w:left="400"/>
-      </w:pPr>
-      <w:r>
-        <w:rPr>
-          <w:rFonts w:ascii="Arial" w:cs="Arial" w:eastAsia="Arial" w:hAnsi="Arial"/>
-          <w:b/>
-          <w:bCs/>
-          <w:sz w:val="20"/>
-          <w:szCs w:val="20"/>
-        </w:rPr>
-        <w:t xml:space="preserve">B. </w:t>
-      </w:r>
-      <w:r>
-        <w:rPr>
-          <w:rFonts w:ascii="Arial" w:cs="Arial" w:eastAsia="Arial" w:hAnsi="Arial"/>
-          <w:sz w:val="20"/>
-          <w:szCs w:val="20"/>
-        </w:rPr>
-        <w:t xml:space="preserve">Dekomposisi fungsional sains lingkungan tidak boleh digabungkan dengan dekomposisi geografis dalam satu sistem pemerintahan.</w:t>
-      </w:r>
-    </w:p>
-    <w:p>
-      <w:pPr>
-        <w:spacing w:after="80"/>
-        <w:ind w:left="400"/>
-      </w:pPr>
-      <w:r>
-        <w:rPr>
-          <w:rFonts w:ascii="Arial" w:cs="Arial" w:eastAsia="Arial" w:hAnsi="Arial"/>
-          <w:b/>
-          <w:bCs/>
-          <w:sz w:val="20"/>
-          <w:szCs w:val="20"/>
-        </w:rPr>
-        <w:t xml:space="preserve">C. </w:t>
-      </w:r>
-      <w:r>
-        <w:rPr>
-          <w:rFonts w:ascii="Arial" w:cs="Arial" w:eastAsia="Arial" w:hAnsi="Arial"/>
-          <w:sz w:val="20"/>
-          <w:szCs w:val="20"/>
-        </w:rPr>
-        <w:t xml:space="preserve">Dekomposisi harus selalu menghasilkan bagian-bagian yang dikerjakan oleh robot tanpa keterlibatan tenaga manusia.</w:t>
-      </w:r>
-    </w:p>
-    <w:p>
-      <w:pPr>
-        <w:spacing w:after="80"/>
-        <w:ind w:left="400"/>
-      </w:pPr>
-      <w:r>
-        <w:rPr>
-          <w:rFonts w:ascii="Arial" w:cs="Arial" w:eastAsia="Arial" w:hAnsi="Arial"/>
-          <w:b/>
-          <w:bCs/>
-          <w:sz w:val="20"/>
-          <w:szCs w:val="20"/>
-        </w:rPr>
-        <w:t xml:space="preserve">D. </w:t>
-      </w:r>
-      <w:r>
-        <w:rPr>
-          <w:rFonts w:ascii="Arial" w:cs="Arial" w:eastAsia="Arial" w:hAnsi="Arial"/>
-          <w:sz w:val="20"/>
-          <w:szCs w:val="20"/>
-        </w:rPr>
-        <w:t xml:space="preserve">Dekomposisi dapat diterapkan melalui berbagai dimensi pemotongan (fungsional, spasial/geografis, kronologis, atau derajat keparahan), disesuaikan dengan arsitektur masalah dan tujuan operasional.</w:t>
-      </w:r>
-    </w:p>
-    <w:p>
-      <w:pPr>
-        <w:spacing w:after="80"/>
-        <w:ind w:left="400"/>
-      </w:pPr>
-      <w:r>
-        <w:rPr>
-          <w:rFonts w:ascii="Arial" w:cs="Arial" w:eastAsia="Arial" w:hAnsi="Arial"/>
-          <w:b/>
-          <w:bCs/>
-          <w:sz w:val="20"/>
-          <w:szCs w:val="20"/>
-        </w:rPr>
-        <w:t xml:space="preserve">E. </w:t>
-      </w:r>
-      <w:r>
-        <w:rPr>
-          <w:rFonts w:ascii="Arial" w:cs="Arial" w:eastAsia="Arial" w:hAnsi="Arial"/>
-          <w:sz w:val="20"/>
-          <w:szCs w:val="20"/>
-        </w:rPr>
-        <w:t xml:space="preserve">Dekomposisi hanya sah dan benar jika membagi daerah menjadi tiga sektor geografis yang berbentuk bujur sangkar sempurna.</w:t>
       </w:r>
     </w:p>
     <w:p>
@@ -5831,7 +5506,7 @@
           <w:sz w:val="22"/>
           <w:szCs w:val="22"/>
         </w:rPr>
-        <w:t xml:space="preserve">SOAL NO. 26 [Adaptasi Algoritma Dinamis]</w:t>
+        <w:t xml:space="preserve">SOAL NO. 26</w:t>
       </w:r>
     </w:p>
     <w:p>
@@ -5844,7 +5519,7 @@
           <w:sz w:val="20"/>
           <w:szCs w:val="20"/>
         </w:rPr>
-        <w:t xml:space="preserve">[SIMULASI KENDALA TAK TERDUGA GARUDA RESCUE]</w:t>
+        <w:t xml:space="preserve">Pada pukul 08.00 pagi dalam misi Garuda Rescue, sebuah helikopter kargo mengalami kerusakan pompa oli darurat dan harus diistirahatkan di pangkalan, sehingga armada yang siap terbang tersisa 4 unit.</w:t>
       </w:r>
     </w:p>
     <w:p>
@@ -5857,19 +5532,6 @@
           <w:sz w:val="20"/>
           <w:szCs w:val="20"/>
         </w:rPr>
-        <w:t xml:space="preserve">Pada pukul 08.00 pagi dalam misi Garuda Rescue, sebuah helikopter kargo mengalami kerusakan pompa oli darurat dan harus diistirahatkan di pangkalan, sehingga armada yang siap terbang tersisa 4 unit.</w:t>
-      </w:r>
-    </w:p>
-    <w:p>
-      <w:pPr>
-        <w:spacing w:after="100"/>
-      </w:pPr>
-      <w:r>
-        <w:rPr>
-          <w:rFonts w:ascii="Arial" w:cs="Arial" w:eastAsia="Arial" w:hAnsi="Arial"/>
-          <w:sz w:val="20"/>
-          <w:szCs w:val="20"/>
-        </w:rPr>
         <w:t xml:space="preserve">Berdasarkan prinsip berpikir komputasional yang tangguh dan adaptif, modifikasi algoritma jadwal manakah yang paling rasional diambil oleh Kapten Rina?</w:t>
       </w:r>
     </w:p>
@@ -5894,31 +5556,31 @@
           <w:sz w:val="20"/>
           <w:szCs w:val="20"/>
         </w:rPr>
+        <w:t xml:space="preserve">Membatalkan seluruh penerbangan hari itu dan membiarkan warga di 15 desa menunggu hingga helikopter pengganti tiba minggu depan.</w:t>
+      </w:r>
+    </w:p>
+    <w:p>
+      <w:pPr>
+        <w:spacing w:after="80"/>
+        <w:ind w:left="400"/>
+      </w:pPr>
+      <w:r>
+        <w:rPr>
+          <w:rFonts w:ascii="Arial" w:cs="Arial" w:eastAsia="Arial" w:hAnsi="Arial"/>
+          <w:b/>
+          <w:bCs/>
+          <w:sz w:val="20"/>
+          <w:szCs w:val="20"/>
+        </w:rPr>
+        <w:t xml:space="preserve">B. </w:t>
+      </w:r>
+      <w:r>
+        <w:rPr>
+          <w:rFonts w:ascii="Arial" w:cs="Arial" w:eastAsia="Arial" w:hAnsi="Arial"/>
+          <w:sz w:val="20"/>
+          <w:szCs w:val="20"/>
+        </w:rPr>
         <w:t xml:space="preserve">Menjaga prioritas penyelamatan Sektor Utara dengan mengerahkan ke-4 helikopter tersisa hingga pukul 10.00, lalu mengalokasikan masing-masing 2 helikopter untuk Sektor Tengah dan Selatan di sesi siang.</w:t>
-      </w:r>
-    </w:p>
-    <w:p>
-      <w:pPr>
-        <w:spacing w:after="80"/>
-        <w:ind w:left="400"/>
-      </w:pPr>
-      <w:r>
-        <w:rPr>
-          <w:rFonts w:ascii="Arial" w:cs="Arial" w:eastAsia="Arial" w:hAnsi="Arial"/>
-          <w:b/>
-          <w:bCs/>
-          <w:sz w:val="20"/>
-          <w:szCs w:val="20"/>
-        </w:rPr>
-        <w:t xml:space="preserve">B. </w:t>
-      </w:r>
-      <w:r>
-        <w:rPr>
-          <w:rFonts w:ascii="Arial" w:cs="Arial" w:eastAsia="Arial" w:hAnsi="Arial"/>
-          <w:sz w:val="20"/>
-          <w:szCs w:val="20"/>
-        </w:rPr>
-        <w:t xml:space="preserve">Membatalkan seluruh penerbangan hari itu dan membiarkan warga di 15 desa menunggu hingga helikopter pengganti tiba minggu depan.</w:t>
       </w:r>
     </w:p>
     <w:p>
@@ -6053,20 +5715,7 @@
           <w:sz w:val="22"/>
           <w:szCs w:val="22"/>
         </w:rPr>
-        <w:t xml:space="preserve">SOAL NO. 27 [Kognitif &amp; Bias Data]</w:t>
-      </w:r>
-    </w:p>
-    <w:p>
-      <w:pPr>
-        <w:spacing w:after="100"/>
-      </w:pPr>
-      <w:r>
-        <w:rPr>
-          <w:rFonts w:ascii="Arial" w:cs="Arial" w:eastAsia="Arial" w:hAnsi="Arial"/>
-          <w:sz w:val="20"/>
-          <w:szCs w:val="20"/>
-        </w:rPr>
-        <w:t xml:space="preserve">[ANALISIS BIAS KONFIRMASI DALAM CT]</w:t>
+        <w:t xml:space="preserve">SOAL NO. 27</w:t>
       </w:r>
     </w:p>
     <w:p>
@@ -6275,7 +5924,7 @@
           <w:sz w:val="22"/>
           <w:szCs w:val="22"/>
         </w:rPr>
-        <w:t xml:space="preserve">SOAL NO. 28 [Transfer Kontekstual SMAN 1 Batu]</w:t>
+        <w:t xml:space="preserve">SOAL NO. 28</w:t>
       </w:r>
     </w:p>
     <w:p>
@@ -6288,7 +5937,7 @@
           <w:sz w:val="20"/>
           <w:szCs w:val="20"/>
         </w:rPr>
-        <w:t xml:space="preserve">[STUDI KASUS KONTEKSTUAL LOKAL - PERTANIAN APEL KOTA BATU]</w:t>
+        <w:t xml:space="preserve">Kawasan pertanian apel di lereng Bumiaji dan Panderman Kota Batu menghadapi tantangan serius berupa anomali cuaca mikro, serangan hama kutu sisik, dan fluktuasi kelembapan tanah yang menurunkan produksi buah apel Manalagi.</w:t>
       </w:r>
     </w:p>
     <w:p>
@@ -6301,19 +5950,6 @@
           <w:sz w:val="20"/>
           <w:szCs w:val="20"/>
         </w:rPr>
-        <w:t xml:space="preserve">Kawasan pertanian apel di lereng Bumiaji dan Panderman Kota Batu menghadapi tantangan serius berupa anomali cuaca mikro, serangan hama kutu sisik, dan fluktuasi kelembapan tanah yang menurunkan produksi buah apel Manalagi.</w:t>
-      </w:r>
-    </w:p>
-    <w:p>
-      <w:pPr>
-        <w:spacing w:after="100"/>
-      </w:pPr>
-      <w:r>
-        <w:rPr>
-          <w:rFonts w:ascii="Arial" w:cs="Arial" w:eastAsia="Arial" w:hAnsi="Arial"/>
-          <w:sz w:val="20"/>
-          <w:szCs w:val="20"/>
-        </w:rPr>
         <w:t xml:space="preserve">Siswa Kelas X SMAN 1 Batu ditugaskan merancang solusi sistem Pertanian Presisi (Smart Precision Farming) berbasis Berpikir Komputasional. Tindakan manakah yang merepresentasikan pilar PENGENALAN POLA secara tepat dalam proyek ini?</w:t>
       </w:r>
     </w:p>
@@ -6338,79 +5974,79 @@
           <w:sz w:val="20"/>
           <w:szCs w:val="20"/>
         </w:rPr>
+        <w:t xml:space="preserve">Mengganti seluruh pohon apel dengan tanaman padi sawah tanpa menguji kesesuaian jenis tanah dan ketinggian lereng.</w:t>
+      </w:r>
+    </w:p>
+    <w:p>
+      <w:pPr>
+        <w:spacing w:after="80"/>
+        <w:ind w:left="400"/>
+      </w:pPr>
+      <w:r>
+        <w:rPr>
+          <w:rFonts w:ascii="Arial" w:cs="Arial" w:eastAsia="Arial" w:hAnsi="Arial"/>
+          <w:b/>
+          <w:bCs/>
+          <w:sz w:val="20"/>
+          <w:szCs w:val="20"/>
+        </w:rPr>
+        <w:t xml:space="preserve">B. </w:t>
+      </w:r>
+      <w:r>
+        <w:rPr>
+          <w:rFonts w:ascii="Arial" w:cs="Arial" w:eastAsia="Arial" w:hAnsi="Arial"/>
+          <w:sz w:val="20"/>
+          <w:szCs w:val="20"/>
+        </w:rPr>
+        <w:t xml:space="preserve">Menganalisis korelasi data histori sensor kelembapan tanah, suhu udara, dan kecepatan angin selama 5 musim panen dengan siklus kemunculan ledakan populasi hama kutu sisik.</w:t>
+      </w:r>
+    </w:p>
+    <w:p>
+      <w:pPr>
+        <w:spacing w:after="80"/>
+        <w:ind w:left="400"/>
+      </w:pPr>
+      <w:r>
+        <w:rPr>
+          <w:rFonts w:ascii="Arial" w:cs="Arial" w:eastAsia="Arial" w:hAnsi="Arial"/>
+          <w:b/>
+          <w:bCs/>
+          <w:sz w:val="20"/>
+          <w:szCs w:val="20"/>
+        </w:rPr>
+        <w:t xml:space="preserve">C. </w:t>
+      </w:r>
+      <w:r>
+        <w:rPr>
+          <w:rFonts w:ascii="Arial" w:cs="Arial" w:eastAsia="Arial" w:hAnsi="Arial"/>
+          <w:sz w:val="20"/>
+          <w:szCs w:val="20"/>
+        </w:rPr>
+        <w:t xml:space="preserve">Mengecat batang pohon apel dengan warna putih agar terlihat rapi saat difoto oleh wisatawan yang berkunjung ke kebun.</w:t>
+      </w:r>
+    </w:p>
+    <w:p>
+      <w:pPr>
+        <w:spacing w:after="80"/>
+        <w:ind w:left="400"/>
+      </w:pPr>
+      <w:r>
+        <w:rPr>
+          <w:rFonts w:ascii="Arial" w:cs="Arial" w:eastAsia="Arial" w:hAnsi="Arial"/>
+          <w:b/>
+          <w:bCs/>
+          <w:sz w:val="20"/>
+          <w:szCs w:val="20"/>
+        </w:rPr>
+        <w:t xml:space="preserve">D. </w:t>
+      </w:r>
+      <w:r>
+        <w:rPr>
+          <w:rFonts w:ascii="Arial" w:cs="Arial" w:eastAsia="Arial" w:hAnsi="Arial"/>
+          <w:sz w:val="20"/>
+          <w:szCs w:val="20"/>
+        </w:rPr>
         <w:t xml:space="preserve">Membeli pompa air berkapasitas terbesar di pasaran tanpa memeriksa debit sumber mata air alami di lereng bukit.</w:t>
-      </w:r>
-    </w:p>
-    <w:p>
-      <w:pPr>
-        <w:spacing w:after="80"/>
-        <w:ind w:left="400"/>
-      </w:pPr>
-      <w:r>
-        <w:rPr>
-          <w:rFonts w:ascii="Arial" w:cs="Arial" w:eastAsia="Arial" w:hAnsi="Arial"/>
-          <w:b/>
-          <w:bCs/>
-          <w:sz w:val="20"/>
-          <w:szCs w:val="20"/>
-        </w:rPr>
-        <w:t xml:space="preserve">B. </w:t>
-      </w:r>
-      <w:r>
-        <w:rPr>
-          <w:rFonts w:ascii="Arial" w:cs="Arial" w:eastAsia="Arial" w:hAnsi="Arial"/>
-          <w:sz w:val="20"/>
-          <w:szCs w:val="20"/>
-        </w:rPr>
-        <w:t xml:space="preserve">Mengganti seluruh pohon apel dengan tanaman padi sawah tanpa menguji kesesuaian jenis tanah dan ketinggian lereng.</w:t>
-      </w:r>
-    </w:p>
-    <w:p>
-      <w:pPr>
-        <w:spacing w:after="80"/>
-        <w:ind w:left="400"/>
-      </w:pPr>
-      <w:r>
-        <w:rPr>
-          <w:rFonts w:ascii="Arial" w:cs="Arial" w:eastAsia="Arial" w:hAnsi="Arial"/>
-          <w:b/>
-          <w:bCs/>
-          <w:sz w:val="20"/>
-          <w:szCs w:val="20"/>
-        </w:rPr>
-        <w:t xml:space="preserve">C. </w:t>
-      </w:r>
-      <w:r>
-        <w:rPr>
-          <w:rFonts w:ascii="Arial" w:cs="Arial" w:eastAsia="Arial" w:hAnsi="Arial"/>
-          <w:sz w:val="20"/>
-          <w:szCs w:val="20"/>
-        </w:rPr>
-        <w:t xml:space="preserve">Menganalisis korelasi data histori sensor kelembapan tanah, suhu udara, dan kecepatan angin selama 5 musim panen dengan siklus kemunculan ledakan populasi hama kutu sisik.</w:t>
-      </w:r>
-    </w:p>
-    <w:p>
-      <w:pPr>
-        <w:spacing w:after="80"/>
-        <w:ind w:left="400"/>
-      </w:pPr>
-      <w:r>
-        <w:rPr>
-          <w:rFonts w:ascii="Arial" w:cs="Arial" w:eastAsia="Arial" w:hAnsi="Arial"/>
-          <w:b/>
-          <w:bCs/>
-          <w:sz w:val="20"/>
-          <w:szCs w:val="20"/>
-        </w:rPr>
-        <w:t xml:space="preserve">D. </w:t>
-      </w:r>
-      <w:r>
-        <w:rPr>
-          <w:rFonts w:ascii="Arial" w:cs="Arial" w:eastAsia="Arial" w:hAnsi="Arial"/>
-          <w:sz w:val="20"/>
-          <w:szCs w:val="20"/>
-        </w:rPr>
-        <w:t xml:space="preserve">Mengecat batang pohon apel dengan warna putih agar terlihat rapi saat difoto oleh wisatawan yang berkunjung ke kebun.</w:t>
       </w:r>
     </w:p>
     <w:p>
@@ -6497,7 +6133,7 @@
           <w:sz w:val="22"/>
           <w:szCs w:val="22"/>
         </w:rPr>
-        <w:t xml:space="preserve">SOAL NO. 29 [Transfer Kontekstual SMAN 1 Batu]</w:t>
+        <w:t xml:space="preserve">SOAL NO. 29</w:t>
       </w:r>
     </w:p>
     <w:p>
@@ -6510,7 +6146,7 @@
           <w:sz w:val="20"/>
           <w:szCs w:val="20"/>
         </w:rPr>
-        <w:t xml:space="preserve">[STUDI KASUS KONTEKSTUAL LOKAL - MANAJEMEN LALU LINTAS WISATA BATU]</w:t>
+        <w:t xml:space="preserve">Setiap akhir pekan panjang, kemacetan parah melanda ruas jalan protokol Kota Batu menuju kawasan wisata utama (Jalan Diponegoro, Pattimura, dan Oro-Oro Ombo). Siswa SMAN 1 Batu diminta merancang purwarupa algoritma rute alternatif cerdas (Dynamic Re-routing) untuk mengurai kepadatan kendaraan.</w:t>
       </w:r>
     </w:p>
     <w:p>
@@ -6523,19 +6159,6 @@
           <w:sz w:val="20"/>
           <w:szCs w:val="20"/>
         </w:rPr>
-        <w:t xml:space="preserve">Setiap akhir pekan panjang, kemacetan parah melanda ruas jalan protokol Kota Batu menuju kawasan wisata utama (Jalan Diponegoro, Pattimura, dan Oro-Oro Ombo). Siswa SMAN 1 Batu diminta merancang purwarupa algoritma rute alternatif cerdas (Dynamic Re-routing) untuk mengurai kepadatan kendaraan.</w:t>
-      </w:r>
-    </w:p>
-    <w:p>
-      <w:pPr>
-        <w:spacing w:after="100"/>
-      </w:pPr>
-      <w:r>
-        <w:rPr>
-          <w:rFonts w:ascii="Arial" w:cs="Arial" w:eastAsia="Arial" w:hAnsi="Arial"/>
-          <w:sz w:val="20"/>
-          <w:szCs w:val="20"/>
-        </w:rPr>
         <w:t xml:space="preserve">Dalam proses memodelkan jaringan jalan Kota Batu ke dalam bentuk graf (Graph Modeling), tindakan ABSTRAKSI manakah yang paling esensial dilakukan?</w:t>
       </w:r>
     </w:p>
@@ -6560,55 +6183,55 @@
           <w:sz w:val="20"/>
           <w:szCs w:val="20"/>
         </w:rPr>
+        <w:t xml:space="preserve">Merepresentasikan persimpangan sebagai titik (Nodes) dan ruas jalan sebagai garis berbobot (Edges) yang memuat panjang jalan serta kecepatan rata-rata, sembari mengabaikan warna cat ruko atau jenis pohon di tepi jalan.</w:t>
+      </w:r>
+    </w:p>
+    <w:p>
+      <w:pPr>
+        <w:spacing w:after="80"/>
+        <w:ind w:left="400"/>
+      </w:pPr>
+      <w:r>
+        <w:rPr>
+          <w:rFonts w:ascii="Arial" w:cs="Arial" w:eastAsia="Arial" w:hAnsi="Arial"/>
+          <w:b/>
+          <w:bCs/>
+          <w:sz w:val="20"/>
+          <w:szCs w:val="20"/>
+        </w:rPr>
+        <w:t xml:space="preserve">B. </w:t>
+      </w:r>
+      <w:r>
+        <w:rPr>
+          <w:rFonts w:ascii="Arial" w:cs="Arial" w:eastAsia="Arial" w:hAnsi="Arial"/>
+          <w:sz w:val="20"/>
+          <w:szCs w:val="20"/>
+        </w:rPr>
+        <w:t xml:space="preserve">Menghitung secara rinci setiap helai daun dan jenis tanaman hias di median jalan sebelum menghitung volume kendaraan yang melintas.</w:t>
+      </w:r>
+    </w:p>
+    <w:p>
+      <w:pPr>
+        <w:spacing w:after="80"/>
+        <w:ind w:left="400"/>
+      </w:pPr>
+      <w:r>
+        <w:rPr>
+          <w:rFonts w:ascii="Arial" w:cs="Arial" w:eastAsia="Arial" w:hAnsi="Arial"/>
+          <w:b/>
+          <w:bCs/>
+          <w:sz w:val="20"/>
+          <w:szCs w:val="20"/>
+        </w:rPr>
+        <w:t xml:space="preserve">C. </w:t>
+      </w:r>
+      <w:r>
+        <w:rPr>
+          <w:rFonts w:ascii="Arial" w:cs="Arial" w:eastAsia="Arial" w:hAnsi="Arial"/>
+          <w:sz w:val="20"/>
+          <w:szCs w:val="20"/>
+        </w:rPr>
         <w:t xml:space="preserve">Mengharuskan setiap pengendara mobil wisata menyebutkan nama lengkap kakek-neneknya sebelum diizinkan melintasi jalan Diponegoro.</w:t>
-      </w:r>
-    </w:p>
-    <w:p>
-      <w:pPr>
-        <w:spacing w:after="80"/>
-        <w:ind w:left="400"/>
-      </w:pPr>
-      <w:r>
-        <w:rPr>
-          <w:rFonts w:ascii="Arial" w:cs="Arial" w:eastAsia="Arial" w:hAnsi="Arial"/>
-          <w:b/>
-          <w:bCs/>
-          <w:sz w:val="20"/>
-          <w:szCs w:val="20"/>
-        </w:rPr>
-        <w:t xml:space="preserve">B. </w:t>
-      </w:r>
-      <w:r>
-        <w:rPr>
-          <w:rFonts w:ascii="Arial" w:cs="Arial" w:eastAsia="Arial" w:hAnsi="Arial"/>
-          <w:sz w:val="20"/>
-          <w:szCs w:val="20"/>
-        </w:rPr>
-        <w:t xml:space="preserve">Merepresentasikan persimpangan sebagai titik (Nodes) dan ruas jalan sebagai garis berbobot (Edges) yang memuat panjang jalan serta kecepatan rata-rata, sembari mengabaikan warna cat ruko atau jenis pohon di tepi jalan.</w:t>
-      </w:r>
-    </w:p>
-    <w:p>
-      <w:pPr>
-        <w:spacing w:after="80"/>
-        <w:ind w:left="400"/>
-      </w:pPr>
-      <w:r>
-        <w:rPr>
-          <w:rFonts w:ascii="Arial" w:cs="Arial" w:eastAsia="Arial" w:hAnsi="Arial"/>
-          <w:b/>
-          <w:bCs/>
-          <w:sz w:val="20"/>
-          <w:szCs w:val="20"/>
-        </w:rPr>
-        <w:t xml:space="preserve">C. </w:t>
-      </w:r>
-      <w:r>
-        <w:rPr>
-          <w:rFonts w:ascii="Arial" w:cs="Arial" w:eastAsia="Arial" w:hAnsi="Arial"/>
-          <w:sz w:val="20"/>
-          <w:szCs w:val="20"/>
-        </w:rPr>
-        <w:t xml:space="preserve">Menghitung secara rinci setiap helai daun dan jenis tanaman hias di median jalan sebelum menghitung volume kendaraan yang melintas.</w:t>
       </w:r>
     </w:p>
     <w:p>
@@ -6719,7 +6342,7 @@
           <w:sz w:val="22"/>
           <w:szCs w:val="22"/>
         </w:rPr>
-        <w:t xml:space="preserve">SOAL NO. 30 [Etika &amp; Refleksi Rekayasa Sistem]</w:t>
+        <w:t xml:space="preserve">SOAL NO. 30</w:t>
       </w:r>
     </w:p>
     <w:p>
@@ -6732,7 +6355,7 @@
           <w:sz w:val="20"/>
           <w:szCs w:val="20"/>
         </w:rPr>
-        <w:t xml:space="preserve">[REFLEKSI AKHIR - ETIKA KOMPUTASIONAL &amp; PEMBELAJARAN MENDALAM]</w:t>
+        <w:t xml:space="preserve">Sebagai generasi muda yang mempelajari Informatika dan Berpikir Komputasional di SMAN 1 Batu, siswa kelak akan merancang dan mengoperasikan berbagai algoritma otomasi serta kecerdasan buatan yang memengaruhi hajat hidup masyarakat (seperti algoritma evakuasi bencana, kuota air irigasi, atau seleksi penerimaan beasiswa).</w:t>
       </w:r>
     </w:p>
     <w:p>
@@ -6745,19 +6368,6 @@
           <w:sz w:val="20"/>
           <w:szCs w:val="20"/>
         </w:rPr>
-        <w:t xml:space="preserve">Sebagai generasi muda yang mempelajari Informatika dan Berpikir Komputasional di SMAN 1 Batu, siswa kelak akan merancang dan mengoperasikan berbagai algoritma otomasi serta kecerdasan buatan yang memengaruhi hajat hidup masyarakat (seperti algoritma evakuasi bencana, kuota air irigasi, atau seleksi penerimaan beasiswa).</w:t>
-      </w:r>
-    </w:p>
-    <w:p>
-      <w:pPr>
-        <w:spacing w:after="100"/>
-      </w:pPr>
-      <w:r>
-        <w:rPr>
-          <w:rFonts w:ascii="Arial" w:cs="Arial" w:eastAsia="Arial" w:hAnsi="Arial"/>
-          <w:sz w:val="20"/>
-          <w:szCs w:val="20"/>
-        </w:rPr>
         <w:t xml:space="preserve">Prinsip etis dan humanis manakah yang paling fundamental dijaga oleh seorang perancang sistem komputasi yang bertanggung jawab?</w:t>
       </w:r>
     </w:p>
@@ -6782,103 +6392,103 @@
           <w:sz w:val="20"/>
           <w:szCs w:val="20"/>
         </w:rPr>
+        <w:t xml:space="preserve">Menghapus rekaman log jejak audit secara otomatis jika terindikasi sistem melakukan kesalahan fatal yang merugikan masyarakat luas.</w:t>
+      </w:r>
+    </w:p>
+    <w:p>
+      <w:pPr>
+        <w:spacing w:after="80"/>
+        <w:ind w:left="400"/>
+      </w:pPr>
+      <w:r>
+        <w:rPr>
+          <w:rFonts w:ascii="Arial" w:cs="Arial" w:eastAsia="Arial" w:hAnsi="Arial"/>
+          <w:b/>
+          <w:bCs/>
+          <w:sz w:val="20"/>
+          <w:szCs w:val="20"/>
+        </w:rPr>
+        <w:t xml:space="preserve">B. </w:t>
+      </w:r>
+      <w:r>
+        <w:rPr>
+          <w:rFonts w:ascii="Arial" w:cs="Arial" w:eastAsia="Arial" w:hAnsi="Arial"/>
+          <w:sz w:val="20"/>
+          <w:szCs w:val="20"/>
+        </w:rPr>
+        <w:t xml:space="preserve">Menyerahkan seluruh keputusan etika dan moral kepada prosesor komputer tanpa menyediakan ruang banding atau pengawasan oleh manusia.</w:t>
+      </w:r>
+    </w:p>
+    <w:p>
+      <w:pPr>
+        <w:spacing w:after="80"/>
+        <w:ind w:left="400"/>
+      </w:pPr>
+      <w:r>
+        <w:rPr>
+          <w:rFonts w:ascii="Arial" w:cs="Arial" w:eastAsia="Arial" w:hAnsi="Arial"/>
+          <w:b/>
+          <w:bCs/>
+          <w:sz w:val="20"/>
+          <w:szCs w:val="20"/>
+        </w:rPr>
+        <w:t xml:space="preserve">C. </w:t>
+      </w:r>
+      <w:r>
+        <w:rPr>
+          <w:rFonts w:ascii="Arial" w:cs="Arial" w:eastAsia="Arial" w:hAnsi="Arial"/>
+          <w:sz w:val="20"/>
+          <w:szCs w:val="20"/>
+        </w:rPr>
+        <w:t xml:space="preserve">Menjaga transparansi logika pengambilan keputusan (Explainability), keadilan algoritma tanpa bias diskriminatif, perlindungan privasi data warga, dan akuntabilitas moral manusia terhadap dampak keputusan sistem.</w:t>
+      </w:r>
+    </w:p>
+    <w:p>
+      <w:pPr>
+        <w:spacing w:after="80"/>
+        <w:ind w:left="400"/>
+      </w:pPr>
+      <w:r>
+        <w:rPr>
+          <w:rFonts w:ascii="Arial" w:cs="Arial" w:eastAsia="Arial" w:hAnsi="Arial"/>
+          <w:b/>
+          <w:bCs/>
+          <w:sz w:val="20"/>
+          <w:szCs w:val="20"/>
+        </w:rPr>
+        <w:t xml:space="preserve">D. </w:t>
+      </w:r>
+      <w:r>
+        <w:rPr>
+          <w:rFonts w:ascii="Arial" w:cs="Arial" w:eastAsia="Arial" w:hAnsi="Arial"/>
+          <w:sz w:val="20"/>
+          <w:szCs w:val="20"/>
+        </w:rPr>
+        <w:t xml:space="preserve">Merancang algoritma sebagai kotak hitam (Black Box) yang tertutup rapat agar tidak ada warga masyarakat yang dapat memprotes keputusan sistem.</w:t>
+      </w:r>
+    </w:p>
+    <w:p>
+      <w:pPr>
+        <w:spacing w:after="80"/>
+        <w:ind w:left="400"/>
+      </w:pPr>
+      <w:r>
+        <w:rPr>
+          <w:rFonts w:ascii="Arial" w:cs="Arial" w:eastAsia="Arial" w:hAnsi="Arial"/>
+          <w:b/>
+          <w:bCs/>
+          <w:sz w:val="20"/>
+          <w:szCs w:val="20"/>
+        </w:rPr>
+        <w:t xml:space="preserve">E. </w:t>
+      </w:r>
+      <w:r>
+        <w:rPr>
+          <w:rFonts w:ascii="Arial" w:cs="Arial" w:eastAsia="Arial" w:hAnsi="Arial"/>
+          <w:sz w:val="20"/>
+          <w:szCs w:val="20"/>
+        </w:rPr>
         <w:t xml:space="preserve">Memprogram sistem agar selalu mendahulukan kepentingan kelompok elit pemilik modal terbesar dibanding keselamatan warga perkampungan kecil.</w:t>
-      </w:r>
-    </w:p>
-    <w:p>
-      <w:pPr>
-        <w:spacing w:after="80"/>
-        <w:ind w:left="400"/>
-      </w:pPr>
-      <w:r>
-        <w:rPr>
-          <w:rFonts w:ascii="Arial" w:cs="Arial" w:eastAsia="Arial" w:hAnsi="Arial"/>
-          <w:b/>
-          <w:bCs/>
-          <w:sz w:val="20"/>
-          <w:szCs w:val="20"/>
-        </w:rPr>
-        <w:t xml:space="preserve">B. </w:t>
-      </w:r>
-      <w:r>
-        <w:rPr>
-          <w:rFonts w:ascii="Arial" w:cs="Arial" w:eastAsia="Arial" w:hAnsi="Arial"/>
-          <w:sz w:val="20"/>
-          <w:szCs w:val="20"/>
-        </w:rPr>
-        <w:t xml:space="preserve">Menghapus rekaman log jejak audit secara otomatis jika terindikasi sistem melakukan kesalahan fatal yang merugikan masyarakat luas.</w:t>
-      </w:r>
-    </w:p>
-    <w:p>
-      <w:pPr>
-        <w:spacing w:after="80"/>
-        <w:ind w:left="400"/>
-      </w:pPr>
-      <w:r>
-        <w:rPr>
-          <w:rFonts w:ascii="Arial" w:cs="Arial" w:eastAsia="Arial" w:hAnsi="Arial"/>
-          <w:b/>
-          <w:bCs/>
-          <w:sz w:val="20"/>
-          <w:szCs w:val="20"/>
-        </w:rPr>
-        <w:t xml:space="preserve">C. </w:t>
-      </w:r>
-      <w:r>
-        <w:rPr>
-          <w:rFonts w:ascii="Arial" w:cs="Arial" w:eastAsia="Arial" w:hAnsi="Arial"/>
-          <w:sz w:val="20"/>
-          <w:szCs w:val="20"/>
-        </w:rPr>
-        <w:t xml:space="preserve">Menyerahkan seluruh keputusan etika dan moral kepada prosesor komputer tanpa menyediakan ruang banding atau pengawasan oleh manusia.</w:t>
-      </w:r>
-    </w:p>
-    <w:p>
-      <w:pPr>
-        <w:spacing w:after="80"/>
-        <w:ind w:left="400"/>
-      </w:pPr>
-      <w:r>
-        <w:rPr>
-          <w:rFonts w:ascii="Arial" w:cs="Arial" w:eastAsia="Arial" w:hAnsi="Arial"/>
-          <w:b/>
-          <w:bCs/>
-          <w:sz w:val="20"/>
-          <w:szCs w:val="20"/>
-        </w:rPr>
-        <w:t xml:space="preserve">D. </w:t>
-      </w:r>
-      <w:r>
-        <w:rPr>
-          <w:rFonts w:ascii="Arial" w:cs="Arial" w:eastAsia="Arial" w:hAnsi="Arial"/>
-          <w:sz w:val="20"/>
-          <w:szCs w:val="20"/>
-        </w:rPr>
-        <w:t xml:space="preserve">Menjaga transparansi logika pengambilan keputusan (Explainability), keadilan algoritma tanpa bias diskriminatif, perlindungan privasi data warga, dan akuntabilitas moral manusia terhadap dampak keputusan sistem.</w:t>
-      </w:r>
-    </w:p>
-    <w:p>
-      <w:pPr>
-        <w:spacing w:after="80"/>
-        <w:ind w:left="400"/>
-      </w:pPr>
-      <w:r>
-        <w:rPr>
-          <w:rFonts w:ascii="Arial" w:cs="Arial" w:eastAsia="Arial" w:hAnsi="Arial"/>
-          <w:b/>
-          <w:bCs/>
-          <w:sz w:val="20"/>
-          <w:szCs w:val="20"/>
-        </w:rPr>
-        <w:t xml:space="preserve">E. </w:t>
-      </w:r>
-      <w:r>
-        <w:rPr>
-          <w:rFonts w:ascii="Arial" w:cs="Arial" w:eastAsia="Arial" w:hAnsi="Arial"/>
-          <w:sz w:val="20"/>
-          <w:szCs w:val="20"/>
-        </w:rPr>
-        <w:t xml:space="preserve">Merancang algoritma sebagai kotak hitam (Black Box) yang tertutup rapat agar tidak ada warga masyarakat yang dapat memprotes keputusan sistem.</w:t>
       </w:r>
     </w:p>
     <w:p>
@@ -7008,7 +6618,7 @@
                 <w:sz w:val="18"/>
                 <w:szCs w:val="18"/>
               </w:rPr>
-              <w:t xml:space="preserve">Kategori</w:t>
+              <w:t xml:space="preserve">Topik</w:t>
             </w:r>
           </w:p>
         </w:tc>
@@ -7056,7 +6666,7 @@
                 <w:sz w:val="18"/>
                 <w:szCs w:val="18"/>
               </w:rPr>
-              <w:t xml:space="preserve">Kategori</w:t>
+              <w:t xml:space="preserve">Topik</w:t>
             </w:r>
           </w:p>
         </w:tc>
@@ -7102,7 +6712,7 @@
                 <w:sz w:val="16"/>
                 <w:szCs w:val="16"/>
               </w:rPr>
-              <w:t xml:space="preserve">Konsep &amp; Filosofi CT</w:t>
+              <w:t xml:space="preserve">Berpikir Komputasional</w:t>
             </w:r>
           </w:p>
         </w:tc>
@@ -7146,7 +6756,7 @@
                 <w:sz w:val="16"/>
                 <w:szCs w:val="16"/>
               </w:rPr>
-              <w:t xml:space="preserve">Kasus Kota Delta (HOTS Sintesis)</w:t>
+              <w:t xml:space="preserve">Berpikir Komputasional</w:t>
             </w:r>
           </w:p>
         </w:tc>
@@ -7192,7 +6802,7 @@
                 <w:sz w:val="16"/>
                 <w:szCs w:val="16"/>
               </w:rPr>
-              <w:t xml:space="preserve">Sinergi Pilar CT</w:t>
+              <w:t xml:space="preserve">Berpikir Komputasional</w:t>
             </w:r>
           </w:p>
         </w:tc>
@@ -7236,7 +6846,7 @@
                 <w:sz w:val="16"/>
                 <w:szCs w:val="16"/>
               </w:rPr>
-              <w:t xml:space="preserve">Kasus Kota Delta (Evaluasi Solusi)</w:t>
+              <w:t xml:space="preserve">Berpikir Komputasional</w:t>
             </w:r>
           </w:p>
         </w:tc>
@@ -7282,7 +6892,7 @@
                 <w:sz w:val="16"/>
                 <w:szCs w:val="16"/>
               </w:rPr>
-              <w:t xml:space="preserve">Dekomposisi</w:t>
+              <w:t xml:space="preserve">Berpikir Komputasional</w:t>
             </w:r>
           </w:p>
         </w:tc>
@@ -7326,7 +6936,7 @@
                 <w:sz w:val="16"/>
                 <w:szCs w:val="16"/>
               </w:rPr>
-              <w:t xml:space="preserve">Kasus Garuda Rescue (Dekomposisi)</w:t>
+              <w:t xml:space="preserve">Berpikir Komputasional</w:t>
             </w:r>
           </w:p>
         </w:tc>
@@ -7372,7 +6982,7 @@
                 <w:sz w:val="16"/>
                 <w:szCs w:val="16"/>
               </w:rPr>
-              <w:t xml:space="preserve">Pengenalan Pola</w:t>
+              <w:t xml:space="preserve">Berpikir Komputasional</w:t>
             </w:r>
           </w:p>
         </w:tc>
@@ -7416,7 +7026,7 @@
                 <w:sz w:val="16"/>
                 <w:szCs w:val="16"/>
               </w:rPr>
-              <w:t xml:space="preserve">Kasus Garuda Rescue (Pengenalan Pola)</w:t>
+              <w:t xml:space="preserve">Berpikir Komputasional</w:t>
             </w:r>
           </w:p>
         </w:tc>
@@ -7462,7 +7072,7 @@
                 <w:sz w:val="16"/>
                 <w:szCs w:val="16"/>
               </w:rPr>
-              <w:t xml:space="preserve">Abstraksi</w:t>
+              <w:t xml:space="preserve">Berpikir Komputasional</w:t>
             </w:r>
           </w:p>
         </w:tc>
@@ -7506,7 +7116,7 @@
                 <w:sz w:val="16"/>
                 <w:szCs w:val="16"/>
               </w:rPr>
-              <w:t xml:space="preserve">Kasus Garuda Rescue (Abstraksi)</w:t>
+              <w:t xml:space="preserve">Berpikir Komputasional</w:t>
             </w:r>
           </w:p>
         </w:tc>
@@ -7552,7 +7162,7 @@
                 <w:sz w:val="16"/>
                 <w:szCs w:val="16"/>
               </w:rPr>
-              <w:t xml:space="preserve">Berpikir Algoritma</w:t>
+              <w:t xml:space="preserve">Berpikir Komputasional</w:t>
             </w:r>
           </w:p>
         </w:tc>
@@ -7596,7 +7206,7 @@
                 <w:sz w:val="16"/>
                 <w:szCs w:val="16"/>
               </w:rPr>
-              <w:t xml:space="preserve">Kasus Garuda Rescue (Algoritma)</w:t>
+              <w:t xml:space="preserve">Berpikir Komputasional</w:t>
             </w:r>
           </w:p>
         </w:tc>
@@ -7642,7 +7252,7 @@
                 <w:sz w:val="16"/>
                 <w:szCs w:val="16"/>
               </w:rPr>
-              <w:t xml:space="preserve">Kasus Kota Delta (Dekomposisi)</w:t>
+              <w:t xml:space="preserve">Berpikir Komputasional</w:t>
             </w:r>
           </w:p>
         </w:tc>
@@ -7686,7 +7296,7 @@
                 <w:sz w:val="16"/>
                 <w:szCs w:val="16"/>
               </w:rPr>
-              <w:t xml:space="preserve">Kasus Garuda Rescue (Keandalan Sistem)</w:t>
+              <w:t xml:space="preserve">Berpikir Komputasional</w:t>
             </w:r>
           </w:p>
         </w:tc>
@@ -7732,7 +7342,7 @@
                 <w:sz w:val="16"/>
                 <w:szCs w:val="16"/>
               </w:rPr>
-              <w:t xml:space="preserve">Kasus Kota Delta (Dekomposisi)</w:t>
+              <w:t xml:space="preserve">Berpikir Komputasional</w:t>
             </w:r>
           </w:p>
         </w:tc>
@@ -7776,7 +7386,7 @@
                 <w:sz w:val="16"/>
                 <w:szCs w:val="16"/>
               </w:rPr>
-              <w:t xml:space="preserve">Kasus Garuda Rescue (Inspeksi Mesin)</w:t>
+              <w:t xml:space="preserve">Berpikir Komputasional</w:t>
             </w:r>
           </w:p>
         </w:tc>
@@ -7822,7 +7432,7 @@
                 <w:sz w:val="16"/>
                 <w:szCs w:val="16"/>
               </w:rPr>
-              <w:t xml:space="preserve">Kasus Kota Delta (Pengenalan Pola)</w:t>
+              <w:t xml:space="preserve">Berpikir Komputasional</w:t>
             </w:r>
           </w:p>
         </w:tc>
@@ -7866,7 +7476,7 @@
                 <w:sz w:val="16"/>
                 <w:szCs w:val="16"/>
               </w:rPr>
-              <w:t xml:space="preserve">Sintesis Kasus 1 &amp; 2 (Abstraksi)</w:t>
+              <w:t xml:space="preserve">Berpikir Komputasional</w:t>
             </w:r>
           </w:p>
         </w:tc>
@@ -7912,7 +7522,7 @@
                 <w:sz w:val="16"/>
                 <w:szCs w:val="16"/>
               </w:rPr>
-              <w:t xml:space="preserve">Kasus Kota Delta (Abstraksi)</w:t>
+              <w:t xml:space="preserve">Berpikir Komputasional</w:t>
             </w:r>
           </w:p>
         </w:tc>
@@ -7956,7 +7566,7 @@
                 <w:sz w:val="16"/>
                 <w:szCs w:val="16"/>
               </w:rPr>
-              <w:t xml:space="preserve">Sintesis Kasus 1 &amp; 2 (Dekomposisi)</w:t>
+              <w:t xml:space="preserve">Berpikir Komputasional</w:t>
             </w:r>
           </w:p>
         </w:tc>
@@ -8002,7 +7612,7 @@
                 <w:sz w:val="16"/>
                 <w:szCs w:val="16"/>
               </w:rPr>
-              <w:t xml:space="preserve">Kasus Kota Delta (Algoritma)</w:t>
+              <w:t xml:space="preserve">Berpikir Komputasional</w:t>
             </w:r>
           </w:p>
         </w:tc>
@@ -8046,7 +7656,7 @@
                 <w:sz w:val="16"/>
                 <w:szCs w:val="16"/>
               </w:rPr>
-              <w:t xml:space="preserve">Adaptasi Algoritma Dinamis</w:t>
+              <w:t xml:space="preserve">Berpikir Komputasional</w:t>
             </w:r>
           </w:p>
         </w:tc>
@@ -8092,7 +7702,7 @@
                 <w:sz w:val="16"/>
                 <w:szCs w:val="16"/>
               </w:rPr>
-              <w:t xml:space="preserve">Kasus Kota Delta (Algoritma)</w:t>
+              <w:t xml:space="preserve">Berpikir Komputasional</w:t>
             </w:r>
           </w:p>
         </w:tc>
@@ -8136,7 +7746,7 @@
                 <w:sz w:val="16"/>
                 <w:szCs w:val="16"/>
               </w:rPr>
-              <w:t xml:space="preserve">Kognitif &amp; Bias Data</w:t>
+              <w:t xml:space="preserve">Berpikir Komputasional</w:t>
             </w:r>
           </w:p>
         </w:tc>
@@ -8182,7 +7792,7 @@
                 <w:sz w:val="16"/>
                 <w:szCs w:val="16"/>
               </w:rPr>
-              <w:t xml:space="preserve">Kasus Kota Delta (HOTS Evaluasi)</w:t>
+              <w:t xml:space="preserve">Berpikir Komputasional</w:t>
             </w:r>
           </w:p>
         </w:tc>
@@ -8226,7 +7836,7 @@
                 <w:sz w:val="16"/>
                 <w:szCs w:val="16"/>
               </w:rPr>
-              <w:t xml:space="preserve">Transfer Kontekstual SMAN 1 Batu</w:t>
+              <w:t xml:space="preserve">Berpikir Komputasional</w:t>
             </w:r>
           </w:p>
         </w:tc>
@@ -8272,7 +7882,7 @@
                 <w:sz w:val="16"/>
                 <w:szCs w:val="16"/>
               </w:rPr>
-              <w:t xml:space="preserve">Kasus Kota Delta (HOTS Analisis)</w:t>
+              <w:t xml:space="preserve">Berpikir Komputasional</w:t>
             </w:r>
           </w:p>
         </w:tc>
@@ -8316,7 +7926,7 @@
                 <w:sz w:val="16"/>
                 <w:szCs w:val="16"/>
               </w:rPr>
-              <w:t xml:space="preserve">Transfer Kontekstual SMAN 1 Batu</w:t>
+              <w:t xml:space="preserve">Berpikir Komputasional</w:t>
             </w:r>
           </w:p>
         </w:tc>
@@ -8362,7 +7972,7 @@
                 <w:sz w:val="16"/>
                 <w:szCs w:val="16"/>
               </w:rPr>
-              <w:t xml:space="preserve">Kasus Kota Delta (Korelasi vs Kausalitas)</w:t>
+              <w:t xml:space="preserve">Berpikir Komputasional</w:t>
             </w:r>
           </w:p>
         </w:tc>
@@ -8406,7 +8016,7 @@
                 <w:sz w:val="16"/>
                 <w:szCs w:val="16"/>
               </w:rPr>
-              <w:t xml:space="preserve">Etika &amp; Refleksi Rekayasa Sistem</w:t>
+              <w:t xml:space="preserve">Berpikir Komputasional</w:t>
             </w:r>
           </w:p>
         </w:tc>

</xml_diff>

<commit_message>
fix(exam): perbaiki seluruh 30 kunci jawaban CT agar selalu di opsi A pada master admin dan sinkron dengan pembahasan
</commit_message>
<xml_diff>
--- a/Bank_Soal_30_CT_Informatika_SMAN_1_Batu.docx
+++ b/Bank_Soal_30_CT_Informatika_SMAN_1_Batu.docx
@@ -362,7 +362,7 @@
           <w:sz w:val="18"/>
           <w:szCs w:val="18"/>
         </w:rPr>
-        <w:t xml:space="preserve">C | </w:t>
+        <w:t xml:space="preserve">A | </w:t>
       </w:r>
       <w:r>
         <w:rPr>
@@ -658,6 +658,30 @@
           <w:sz w:val="20"/>
           <w:szCs w:val="20"/>
         </w:rPr>
+        <w:t xml:space="preserve">Memecah penanganan krisis banjir lumpur beracun kota ke dalam tiga fokus investigasi spesifik: hidrologi/cuaca, evaluasi tata guna lahan hulu, dan uji kimia limbah sedimen.</w:t>
+      </w:r>
+    </w:p>
+    <w:p>
+      <w:pPr>
+        <w:spacing w:after="80"/>
+        <w:ind w:left="400"/>
+      </w:pPr>
+      <w:r>
+        <w:rPr>
+          <w:rFonts w:ascii="Arial" w:cs="Arial" w:eastAsia="Arial" w:hAnsi="Arial"/>
+          <w:b/>
+          <w:bCs/>
+          <w:sz w:val="20"/>
+          <w:szCs w:val="20"/>
+        </w:rPr>
+        <w:t xml:space="preserve">B. </w:t>
+      </w:r>
+      <w:r>
+        <w:rPr>
+          <w:rFonts w:ascii="Arial" w:cs="Arial" w:eastAsia="Arial" w:hAnsi="Arial"/>
+          <w:sz w:val="20"/>
+          <w:szCs w:val="20"/>
+        </w:rPr>
         <w:t xml:space="preserve">Menginstruksikan satu orang ahli untuk menyelesaikan seluruh penyelidikan krisis hulu-hilir sendirian secara bersamaan.</w:t>
       </w:r>
     </w:p>
@@ -674,30 +698,6 @@
           <w:sz w:val="20"/>
           <w:szCs w:val="20"/>
         </w:rPr>
-        <w:t xml:space="preserve">B. </w:t>
-      </w:r>
-      <w:r>
-        <w:rPr>
-          <w:rFonts w:ascii="Arial" w:cs="Arial" w:eastAsia="Arial" w:hAnsi="Arial"/>
-          <w:sz w:val="20"/>
-          <w:szCs w:val="20"/>
-        </w:rPr>
-        <w:t xml:space="preserve">Memecah penanganan krisis banjir lumpur beracun kota ke dalam tiga fokus investigasi spesifik: hidrologi/cuaca, evaluasi tata guna lahan hulu, dan uji kimia limbah sedimen.</w:t>
-      </w:r>
-    </w:p>
-    <w:p>
-      <w:pPr>
-        <w:spacing w:after="80"/>
-        <w:ind w:left="400"/>
-      </w:pPr>
-      <w:r>
-        <w:rPr>
-          <w:rFonts w:ascii="Arial" w:cs="Arial" w:eastAsia="Arial" w:hAnsi="Arial"/>
-          <w:b/>
-          <w:bCs/>
-          <w:sz w:val="20"/>
-          <w:szCs w:val="20"/>
-        </w:rPr>
         <w:t xml:space="preserve">C. </w:t>
       </w:r>
       <w:r>
@@ -780,7 +780,7 @@
           <w:sz w:val="18"/>
           <w:szCs w:val="18"/>
         </w:rPr>
-        <w:t xml:space="preserve">D | </w:t>
+        <w:t xml:space="preserve">A | </w:t>
       </w:r>
       <w:r>
         <w:rPr>
@@ -867,6 +867,30 @@
           <w:sz w:val="20"/>
           <w:szCs w:val="20"/>
         </w:rPr>
+        <w:t xml:space="preserve">Pengenalan Pola (Pattern Recognition); memungkinkan penggunaan model solusi masa lalu untuk mempercepat diagnosis akurat dan penentuan uji laboratorium kritis.</w:t>
+      </w:r>
+    </w:p>
+    <w:p>
+      <w:pPr>
+        <w:spacing w:after="80"/>
+        <w:ind w:left="400"/>
+      </w:pPr>
+      <w:r>
+        <w:rPr>
+          <w:rFonts w:ascii="Arial" w:cs="Arial" w:eastAsia="Arial" w:hAnsi="Arial"/>
+          <w:b/>
+          <w:bCs/>
+          <w:sz w:val="20"/>
+          <w:szCs w:val="20"/>
+        </w:rPr>
+        <w:t xml:space="preserve">B. </w:t>
+      </w:r>
+      <w:r>
+        <w:rPr>
+          <w:rFonts w:ascii="Arial" w:cs="Arial" w:eastAsia="Arial" w:hAnsi="Arial"/>
+          <w:sz w:val="20"/>
+          <w:szCs w:val="20"/>
+        </w:rPr>
         <w:t xml:space="preserve">Dekomposisi; dokter membagi tubuh pasien ke dalam organ-organ terpisah sebelum mendengarkan keluhan demam pasien.</w:t>
       </w:r>
     </w:p>
@@ -883,30 +907,6 @@
           <w:sz w:val="20"/>
           <w:szCs w:val="20"/>
         </w:rPr>
-        <w:t xml:space="preserve">B. </w:t>
-      </w:r>
-      <w:r>
-        <w:rPr>
-          <w:rFonts w:ascii="Arial" w:cs="Arial" w:eastAsia="Arial" w:hAnsi="Arial"/>
-          <w:sz w:val="20"/>
-          <w:szCs w:val="20"/>
-        </w:rPr>
-        <w:t xml:space="preserve">Pengenalan Pola (Pattern Recognition); memungkinkan penggunaan model solusi masa lalu untuk mempercepat diagnosis akurat dan penentuan uji laboratorium kritis.</w:t>
-      </w:r>
-    </w:p>
-    <w:p>
-      <w:pPr>
-        <w:spacing w:after="80"/>
-        <w:ind w:left="400"/>
-      </w:pPr>
-      <w:r>
-        <w:rPr>
-          <w:rFonts w:ascii="Arial" w:cs="Arial" w:eastAsia="Arial" w:hAnsi="Arial"/>
-          <w:b/>
-          <w:bCs/>
-          <w:sz w:val="20"/>
-          <w:szCs w:val="20"/>
-        </w:rPr>
         <w:t xml:space="preserve">C. </w:t>
       </w:r>
       <w:r>
@@ -989,7 +989,7 @@
           <w:sz w:val="18"/>
           <w:szCs w:val="18"/>
         </w:rPr>
-        <w:t xml:space="preserve">B | </w:t>
+        <w:t xml:space="preserve">A | </w:t>
       </w:r>
       <w:r>
         <w:rPr>
@@ -1076,6 +1076,30 @@
           <w:sz w:val="20"/>
           <w:szCs w:val="20"/>
         </w:rPr>
+        <w:t xml:space="preserve">Menyaring dan mempertahankan informasi esensial yang diperlukan penumpang (rute, stasiun, transit) sembari mengeliminasi detail fisik yang tidak relevan (noise visual).</w:t>
+      </w:r>
+    </w:p>
+    <w:p>
+      <w:pPr>
+        <w:spacing w:after="80"/>
+        <w:ind w:left="400"/>
+      </w:pPr>
+      <w:r>
+        <w:rPr>
+          <w:rFonts w:ascii="Arial" w:cs="Arial" w:eastAsia="Arial" w:hAnsi="Arial"/>
+          <w:b/>
+          <w:bCs/>
+          <w:sz w:val="20"/>
+          <w:szCs w:val="20"/>
+        </w:rPr>
+        <w:t xml:space="preserve">B. </w:t>
+      </w:r>
+      <w:r>
+        <w:rPr>
+          <w:rFonts w:ascii="Arial" w:cs="Arial" w:eastAsia="Arial" w:hAnsi="Arial"/>
+          <w:sz w:val="20"/>
+          <w:szCs w:val="20"/>
+        </w:rPr>
         <w:t xml:space="preserve">Peta sengaja dibuat membingungkan agar masyarakat lebih memilih menggunakan kendaraan pribadi di jalan raya.</w:t>
       </w:r>
     </w:p>
@@ -1092,7 +1116,7 @@
           <w:sz w:val="20"/>
           <w:szCs w:val="20"/>
         </w:rPr>
-        <w:t xml:space="preserve">B. </w:t>
+        <w:t xml:space="preserve">C. </w:t>
       </w:r>
       <w:r>
         <w:rPr>
@@ -1116,30 +1140,6 @@
           <w:sz w:val="20"/>
           <w:szCs w:val="20"/>
         </w:rPr>
-        <w:t xml:space="preserve">C. </w:t>
-      </w:r>
-      <w:r>
-        <w:rPr>
-          <w:rFonts w:ascii="Arial" w:cs="Arial" w:eastAsia="Arial" w:hAnsi="Arial"/>
-          <w:sz w:val="20"/>
-          <w:szCs w:val="20"/>
-        </w:rPr>
-        <w:t xml:space="preserve">Menyaring dan mempertahankan informasi esensial yang diperlukan penumpang (rute, stasiun, transit) sembari mengeliminasi detail fisik yang tidak relevan (noise visual).</w:t>
-      </w:r>
-    </w:p>
-    <w:p>
-      <w:pPr>
-        <w:spacing w:after="80"/>
-        <w:ind w:left="400"/>
-      </w:pPr>
-      <w:r>
-        <w:rPr>
-          <w:rFonts w:ascii="Arial" w:cs="Arial" w:eastAsia="Arial" w:hAnsi="Arial"/>
-          <w:b/>
-          <w:bCs/>
-          <w:sz w:val="20"/>
-          <w:szCs w:val="20"/>
-        </w:rPr>
         <w:t xml:space="preserve">D. </w:t>
       </w:r>
       <w:r>
@@ -1198,7 +1198,7 @@
           <w:sz w:val="18"/>
           <w:szCs w:val="18"/>
         </w:rPr>
-        <w:t xml:space="preserve">E | </w:t>
+        <w:t xml:space="preserve">A | </w:t>
       </w:r>
       <w:r>
         <w:rPr>
@@ -1616,7 +1616,7 @@
           <w:sz w:val="18"/>
           <w:szCs w:val="18"/>
         </w:rPr>
-        <w:t xml:space="preserve">C | </w:t>
+        <w:t xml:space="preserve">A | </w:t>
       </w:r>
       <w:r>
         <w:rPr>
@@ -1703,6 +1703,30 @@
           <w:sz w:val="20"/>
           <w:szCs w:val="20"/>
         </w:rPr>
+        <w:t xml:space="preserve">Memungkinkan investigasi mendalam dan pengumpulan bukti saintifik berjalan secara paralel pada tiga determinan kritis: atmosferik, bentang lahan, dan polutan kimia.</w:t>
+      </w:r>
+    </w:p>
+    <w:p>
+      <w:pPr>
+        <w:spacing w:after="80"/>
+        <w:ind w:left="400"/>
+      </w:pPr>
+      <w:r>
+        <w:rPr>
+          <w:rFonts w:ascii="Arial" w:cs="Arial" w:eastAsia="Arial" w:hAnsi="Arial"/>
+          <w:b/>
+          <w:bCs/>
+          <w:sz w:val="20"/>
+          <w:szCs w:val="20"/>
+        </w:rPr>
+        <w:t xml:space="preserve">B. </w:t>
+      </w:r>
+      <w:r>
+        <w:rPr>
+          <w:rFonts w:ascii="Arial" w:cs="Arial" w:eastAsia="Arial" w:hAnsi="Arial"/>
+          <w:sz w:val="20"/>
+          <w:szCs w:val="20"/>
+        </w:rPr>
         <w:t xml:space="preserve">Menghilangkan kebutuhan rapat koordinasi karena ketiga tim dilarang saling bertukar data hingga bencana tahun berikutnya tiba.</w:t>
       </w:r>
     </w:p>
@@ -1719,30 +1743,6 @@
           <w:sz w:val="20"/>
           <w:szCs w:val="20"/>
         </w:rPr>
-        <w:t xml:space="preserve">B. </w:t>
-      </w:r>
-      <w:r>
-        <w:rPr>
-          <w:rFonts w:ascii="Arial" w:cs="Arial" w:eastAsia="Arial" w:hAnsi="Arial"/>
-          <w:sz w:val="20"/>
-          <w:szCs w:val="20"/>
-        </w:rPr>
-        <w:t xml:space="preserve">Memungkinkan investigasi mendalam dan pengumpulan bukti saintifik berjalan secara paralel pada tiga determinan kritis: atmosferik, bentang lahan, dan polutan kimia.</w:t>
-      </w:r>
-    </w:p>
-    <w:p>
-      <w:pPr>
-        <w:spacing w:after="80"/>
-        <w:ind w:left="400"/>
-      </w:pPr>
-      <w:r>
-        <w:rPr>
-          <w:rFonts w:ascii="Arial" w:cs="Arial" w:eastAsia="Arial" w:hAnsi="Arial"/>
-          <w:b/>
-          <w:bCs/>
-          <w:sz w:val="20"/>
-          <w:szCs w:val="20"/>
-        </w:rPr>
         <w:t xml:space="preserve">C. </w:t>
       </w:r>
       <w:r>
@@ -1825,7 +1825,7 @@
           <w:sz w:val="18"/>
           <w:szCs w:val="18"/>
         </w:rPr>
-        <w:t xml:space="preserve">B | </w:t>
+        <w:t xml:space="preserve">A | </w:t>
       </w:r>
       <w:r>
         <w:rPr>
@@ -1912,6 +1912,30 @@
           <w:sz w:val="20"/>
           <w:szCs w:val="20"/>
         </w:rPr>
+        <w:t xml:space="preserve">Menemukan keteraturan hubungan berulang dari rekaman data historis jangka panjang yang berfungsi sebagai kondisi batas pemicu (trigger boundary) bencana.</w:t>
+      </w:r>
+    </w:p>
+    <w:p>
+      <w:pPr>
+        <w:spacing w:after="80"/>
+        <w:ind w:left="400"/>
+      </w:pPr>
+      <w:r>
+        <w:rPr>
+          <w:rFonts w:ascii="Arial" w:cs="Arial" w:eastAsia="Arial" w:hAnsi="Arial"/>
+          <w:b/>
+          <w:bCs/>
+          <w:sz w:val="20"/>
+          <w:szCs w:val="20"/>
+        </w:rPr>
+        <w:t xml:space="preserve">B. </w:t>
+      </w:r>
+      <w:r>
+        <w:rPr>
+          <w:rFonts w:ascii="Arial" w:cs="Arial" w:eastAsia="Arial" w:hAnsi="Arial"/>
+          <w:sz w:val="20"/>
+          <w:szCs w:val="20"/>
+        </w:rPr>
         <w:t xml:space="preserve">Mengabaikan faktor pasang air laut rob karena air laut berada di hilir dan tidak memengaruhi aliran air tawar sungai.</w:t>
       </w:r>
     </w:p>
@@ -1928,30 +1952,6 @@
           <w:sz w:val="20"/>
           <w:szCs w:val="20"/>
         </w:rPr>
-        <w:t xml:space="preserve">B. </w:t>
-      </w:r>
-      <w:r>
-        <w:rPr>
-          <w:rFonts w:ascii="Arial" w:cs="Arial" w:eastAsia="Arial" w:hAnsi="Arial"/>
-          <w:sz w:val="20"/>
-          <w:szCs w:val="20"/>
-        </w:rPr>
-        <w:t xml:space="preserve">Menemukan keteraturan hubungan berulang dari rekaman data historis jangka panjang yang berfungsi sebagai kondisi batas pemicu (trigger boundary) bencana.</w:t>
-      </w:r>
-    </w:p>
-    <w:p>
-      <w:pPr>
-        <w:spacing w:after="80"/>
-        <w:ind w:left="400"/>
-      </w:pPr>
-      <w:r>
-        <w:rPr>
-          <w:rFonts w:ascii="Arial" w:cs="Arial" w:eastAsia="Arial" w:hAnsi="Arial"/>
-          <w:b/>
-          <w:bCs/>
-          <w:sz w:val="20"/>
-          <w:szCs w:val="20"/>
-        </w:rPr>
         <w:t xml:space="preserve">C. </w:t>
       </w:r>
       <w:r>
@@ -2034,7 +2034,7 @@
           <w:sz w:val="18"/>
           <w:szCs w:val="18"/>
         </w:rPr>
-        <w:t xml:space="preserve">D | </w:t>
+        <w:t xml:space="preserve">A | </w:t>
       </w:r>
       <w:r>
         <w:rPr>
@@ -2121,6 +2121,30 @@
           <w:sz w:val="20"/>
           <w:szCs w:val="20"/>
         </w:rPr>
+        <w:t xml:space="preserve">Menyaring variabel yang tidak relevan (noise) agar fokus tim tercurah pada penghasil potensial kromium dan timbal, sehingga menghemat waktu dan sumber daya krusial.</w:t>
+      </w:r>
+    </w:p>
+    <w:p>
+      <w:pPr>
+        <w:spacing w:after="80"/>
+        <w:ind w:left="400"/>
+      </w:pPr>
+      <w:r>
+        <w:rPr>
+          <w:rFonts w:ascii="Arial" w:cs="Arial" w:eastAsia="Arial" w:hAnsi="Arial"/>
+          <w:b/>
+          <w:bCs/>
+          <w:sz w:val="20"/>
+          <w:szCs w:val="20"/>
+        </w:rPr>
+        <w:t xml:space="preserve">B. </w:t>
+      </w:r>
+      <w:r>
+        <w:rPr>
+          <w:rFonts w:ascii="Arial" w:cs="Arial" w:eastAsia="Arial" w:hAnsi="Arial"/>
+          <w:sz w:val="20"/>
+          <w:szCs w:val="20"/>
+        </w:rPr>
         <w:t xml:space="preserve">Dr. Aris meyakini bahwa pabrik kayu dan makanan tidak menggunakan air sungai untuk membuang limbah domestik.</w:t>
       </w:r>
     </w:p>
@@ -2137,7 +2161,7 @@
           <w:sz w:val="20"/>
           <w:szCs w:val="20"/>
         </w:rPr>
-        <w:t xml:space="preserve">B. </w:t>
+        <w:t xml:space="preserve">C. </w:t>
       </w:r>
       <w:r>
         <w:rPr>
@@ -2161,30 +2185,6 @@
           <w:sz w:val="20"/>
           <w:szCs w:val="20"/>
         </w:rPr>
-        <w:t xml:space="preserve">C. </w:t>
-      </w:r>
-      <w:r>
-        <w:rPr>
-          <w:rFonts w:ascii="Arial" w:cs="Arial" w:eastAsia="Arial" w:hAnsi="Arial"/>
-          <w:sz w:val="20"/>
-          <w:szCs w:val="20"/>
-        </w:rPr>
-        <w:t xml:space="preserve">Menyaring variabel yang tidak relevan (noise) agar fokus tim tercurah pada penghasil potensial kromium dan timbal, sehingga menghemat waktu dan sumber daya krusial.</w:t>
-      </w:r>
-    </w:p>
-    <w:p>
-      <w:pPr>
-        <w:spacing w:after="80"/>
-        <w:ind w:left="400"/>
-      </w:pPr>
-      <w:r>
-        <w:rPr>
-          <w:rFonts w:ascii="Arial" w:cs="Arial" w:eastAsia="Arial" w:hAnsi="Arial"/>
-          <w:b/>
-          <w:bCs/>
-          <w:sz w:val="20"/>
-          <w:szCs w:val="20"/>
-        </w:rPr>
         <w:t xml:space="preserve">D. </w:t>
       </w:r>
       <w:r>
@@ -2243,7 +2243,7 @@
           <w:sz w:val="18"/>
           <w:szCs w:val="18"/>
         </w:rPr>
-        <w:t xml:space="preserve">E | </w:t>
+        <w:t xml:space="preserve">A | </w:t>
       </w:r>
       <w:r>
         <w:rPr>
@@ -2369,6 +2369,30 @@
           <w:sz w:val="20"/>
           <w:szCs w:val="20"/>
         </w:rPr>
+        <w:t xml:space="preserve">Percabangan kondisional logika ganda (IF curah_hujan &gt; 150 AND pasang_rob == TRUE THEN aktifkan_sirine_level_1).</w:t>
+      </w:r>
+    </w:p>
+    <w:p>
+      <w:pPr>
+        <w:spacing w:after="80"/>
+        <w:ind w:left="400"/>
+      </w:pPr>
+      <w:r>
+        <w:rPr>
+          <w:rFonts w:ascii="Arial" w:cs="Arial" w:eastAsia="Arial" w:hAnsi="Arial"/>
+          <w:b/>
+          <w:bCs/>
+          <w:sz w:val="20"/>
+          <w:szCs w:val="20"/>
+        </w:rPr>
+        <w:t xml:space="preserve">B. </w:t>
+      </w:r>
+      <w:r>
+        <w:rPr>
+          <w:rFonts w:ascii="Arial" w:cs="Arial" w:eastAsia="Arial" w:hAnsi="Arial"/>
+          <w:sz w:val="20"/>
+          <w:szCs w:val="20"/>
+        </w:rPr>
         <w:t xml:space="preserve">Perulangan tanpa henti (Infinite While Loop) yang membunyikan sirine sepanjang tahun tanpa memeriksa kondisi cuaca.</w:t>
       </w:r>
     </w:p>
@@ -2385,30 +2409,6 @@
           <w:sz w:val="20"/>
           <w:szCs w:val="20"/>
         </w:rPr>
-        <w:t xml:space="preserve">B. </w:t>
-      </w:r>
-      <w:r>
-        <w:rPr>
-          <w:rFonts w:ascii="Arial" w:cs="Arial" w:eastAsia="Arial" w:hAnsi="Arial"/>
-          <w:sz w:val="20"/>
-          <w:szCs w:val="20"/>
-        </w:rPr>
-        <w:t xml:space="preserve">Percabangan kondisional logika ganda (IF curah_hujan &gt; 150 AND pasang_rob == TRUE THEN aktifkan_sirine_level_1).</w:t>
-      </w:r>
-    </w:p>
-    <w:p>
-      <w:pPr>
-        <w:spacing w:after="80"/>
-        <w:ind w:left="400"/>
-      </w:pPr>
-      <w:r>
-        <w:rPr>
-          <w:rFonts w:ascii="Arial" w:cs="Arial" w:eastAsia="Arial" w:hAnsi="Arial"/>
-          <w:b/>
-          <w:bCs/>
-          <w:sz w:val="20"/>
-          <w:szCs w:val="20"/>
-        </w:rPr>
         <w:t xml:space="preserve">C. </w:t>
       </w:r>
       <w:r>
@@ -2491,7 +2491,7 @@
           <w:sz w:val="18"/>
           <w:szCs w:val="18"/>
         </w:rPr>
-        <w:t xml:space="preserve">B | </w:t>
+        <w:t xml:space="preserve">A | </w:t>
       </w:r>
       <w:r>
         <w:rPr>
@@ -2787,6 +2787,30 @@
           <w:sz w:val="20"/>
           <w:szCs w:val="20"/>
         </w:rPr>
+        <w:t xml:space="preserve">Sirine Level 1 tidak akan berbunyi karena curah hujan 149 mm tidak memenuhi syarat &gt; 150, padahal kombinasi debit air dan pasang laut ekstrem tetap memicu bencana banjir besar.</w:t>
+      </w:r>
+    </w:p>
+    <w:p>
+      <w:pPr>
+        <w:spacing w:after="80"/>
+        <w:ind w:left="400"/>
+      </w:pPr>
+      <w:r>
+        <w:rPr>
+          <w:rFonts w:ascii="Arial" w:cs="Arial" w:eastAsia="Arial" w:hAnsi="Arial"/>
+          <w:b/>
+          <w:bCs/>
+          <w:sz w:val="20"/>
+          <w:szCs w:val="20"/>
+        </w:rPr>
+        <w:t xml:space="preserve">B. </w:t>
+      </w:r>
+      <w:r>
+        <w:rPr>
+          <w:rFonts w:ascii="Arial" w:cs="Arial" w:eastAsia="Arial" w:hAnsi="Arial"/>
+          <w:sz w:val="20"/>
+          <w:szCs w:val="20"/>
+        </w:rPr>
         <w:t xml:space="preserve">Seluruh pabrik tekstil dan aki akan otomatis meledak karena saluran pipa limbah tidak menerima data sinyal peringatan.</w:t>
       </w:r>
     </w:p>
@@ -2803,30 +2827,6 @@
           <w:sz w:val="20"/>
           <w:szCs w:val="20"/>
         </w:rPr>
-        <w:t xml:space="preserve">B. </w:t>
-      </w:r>
-      <w:r>
-        <w:rPr>
-          <w:rFonts w:ascii="Arial" w:cs="Arial" w:eastAsia="Arial" w:hAnsi="Arial"/>
-          <w:sz w:val="20"/>
-          <w:szCs w:val="20"/>
-        </w:rPr>
-        <w:t xml:space="preserve">Sirine Level 1 tidak akan berbunyi karena curah hujan 149 mm tidak memenuhi syarat &gt; 150, padahal kombinasi debit air dan pasang laut ekstrem tetap memicu bencana banjir besar.</w:t>
-      </w:r>
-    </w:p>
-    <w:p>
-      <w:pPr>
-        <w:spacing w:after="80"/>
-        <w:ind w:left="400"/>
-      </w:pPr>
-      <w:r>
-        <w:rPr>
-          <w:rFonts w:ascii="Arial" w:cs="Arial" w:eastAsia="Arial" w:hAnsi="Arial"/>
-          <w:b/>
-          <w:bCs/>
-          <w:sz w:val="20"/>
-          <w:szCs w:val="20"/>
-        </w:rPr>
         <w:t xml:space="preserve">C. </w:t>
       </w:r>
       <w:r>
@@ -2909,7 +2909,7 @@
           <w:sz w:val="18"/>
           <w:szCs w:val="18"/>
         </w:rPr>
-        <w:t xml:space="preserve">D | </w:t>
+        <w:t xml:space="preserve">A | </w:t>
       </w:r>
       <w:r>
         <w:rPr>
@@ -3118,7 +3118,7 @@
           <w:sz w:val="18"/>
           <w:szCs w:val="18"/>
         </w:rPr>
-        <w:t xml:space="preserve">C | </w:t>
+        <w:t xml:space="preserve">A | </w:t>
       </w:r>
       <w:r>
         <w:rPr>
@@ -3205,6 +3205,30 @@
           <w:sz w:val="20"/>
           <w:szCs w:val="20"/>
         </w:rPr>
+        <w:t xml:space="preserve">Kenaikan drastis jumlah penjualan jas hujan dan payung di pasar swalayan Kota Delta pada setiap minggu yang bersamaan dengan terjadinya banjir lumpur.</w:t>
+      </w:r>
+    </w:p>
+    <w:p>
+      <w:pPr>
+        <w:spacing w:after="80"/>
+        <w:ind w:left="400"/>
+      </w:pPr>
+      <w:r>
+        <w:rPr>
+          <w:rFonts w:ascii="Arial" w:cs="Arial" w:eastAsia="Arial" w:hAnsi="Arial"/>
+          <w:b/>
+          <w:bCs/>
+          <w:sz w:val="20"/>
+          <w:szCs w:val="20"/>
+        </w:rPr>
+        <w:t xml:space="preserve">B. </w:t>
+      </w:r>
+      <w:r>
+        <w:rPr>
+          <w:rFonts w:ascii="Arial" w:cs="Arial" w:eastAsia="Arial" w:hAnsi="Arial"/>
+          <w:sz w:val="20"/>
+          <w:szCs w:val="20"/>
+        </w:rPr>
         <w:t xml:space="preserve">Penyempitan penampang melintang sungai akibat sedimentasi lumpur yang menurunkan daya tampung volume aliran air.</w:t>
       </w:r>
     </w:p>
@@ -3221,7 +3245,7 @@
           <w:sz w:val="20"/>
           <w:szCs w:val="20"/>
         </w:rPr>
-        <w:t xml:space="preserve">B. </w:t>
+        <w:t xml:space="preserve">C. </w:t>
       </w:r>
       <w:r>
         <w:rPr>
@@ -3245,30 +3269,6 @@
           <w:sz w:val="20"/>
           <w:szCs w:val="20"/>
         </w:rPr>
-        <w:t xml:space="preserve">C. </w:t>
-      </w:r>
-      <w:r>
-        <w:rPr>
-          <w:rFonts w:ascii="Arial" w:cs="Arial" w:eastAsia="Arial" w:hAnsi="Arial"/>
-          <w:sz w:val="20"/>
-          <w:szCs w:val="20"/>
-        </w:rPr>
-        <w:t xml:space="preserve">Kenaikan drastis jumlah penjualan jas hujan dan payung di pasar swalayan Kota Delta pada setiap minggu yang bersamaan dengan terjadinya banjir lumpur.</w:t>
-      </w:r>
-    </w:p>
-    <w:p>
-      <w:pPr>
-        <w:spacing w:after="80"/>
-        <w:ind w:left="400"/>
-      </w:pPr>
-      <w:r>
-        <w:rPr>
-          <w:rFonts w:ascii="Arial" w:cs="Arial" w:eastAsia="Arial" w:hAnsi="Arial"/>
-          <w:b/>
-          <w:bCs/>
-          <w:sz w:val="20"/>
-          <w:szCs w:val="20"/>
-        </w:rPr>
         <w:t xml:space="preserve">D. </w:t>
       </w:r>
       <w:r>
@@ -3327,7 +3327,7 @@
           <w:sz w:val="18"/>
           <w:szCs w:val="18"/>
         </w:rPr>
-        <w:t xml:space="preserve">E | </w:t>
+        <w:t xml:space="preserve">A | </w:t>
       </w:r>
       <w:r>
         <w:rPr>
@@ -3732,7 +3732,7 @@
           <w:sz w:val="18"/>
           <w:szCs w:val="18"/>
         </w:rPr>
-        <w:t xml:space="preserve">C | </w:t>
+        <w:t xml:space="preserve">A | </w:t>
       </w:r>
       <w:r>
         <w:rPr>
@@ -3832,6 +3832,30 @@
           <w:sz w:val="20"/>
           <w:szCs w:val="20"/>
         </w:rPr>
+        <w:t xml:space="preserve">Dekomposisi; mereduksi kompleksitas tantangan logistik 15 lokasi terisolasi menjadi 3 kluster terkelola berbasis derajat keparahan kerusakan dan skala prioritas.</w:t>
+      </w:r>
+    </w:p>
+    <w:p>
+      <w:pPr>
+        <w:spacing w:after="80"/>
+        <w:ind w:left="400"/>
+      </w:pPr>
+      <w:r>
+        <w:rPr>
+          <w:rFonts w:ascii="Arial" w:cs="Arial" w:eastAsia="Arial" w:hAnsi="Arial"/>
+          <w:b/>
+          <w:bCs/>
+          <w:sz w:val="20"/>
+          <w:szCs w:val="20"/>
+        </w:rPr>
+        <w:t xml:space="preserve">B. </w:t>
+      </w:r>
+      <w:r>
+        <w:rPr>
+          <w:rFonts w:ascii="Arial" w:cs="Arial" w:eastAsia="Arial" w:hAnsi="Arial"/>
+          <w:sz w:val="20"/>
+          <w:szCs w:val="20"/>
+        </w:rPr>
         <w:t xml:space="preserve">Algoritma Buta; memerintahkan pilot menerbangkan helikopter ke arah mana pun sesuai arah tiupan angin pagi hari.</w:t>
       </w:r>
     </w:p>
@@ -3848,30 +3872,6 @@
           <w:sz w:val="20"/>
           <w:szCs w:val="20"/>
         </w:rPr>
-        <w:t xml:space="preserve">B. </w:t>
-      </w:r>
-      <w:r>
-        <w:rPr>
-          <w:rFonts w:ascii="Arial" w:cs="Arial" w:eastAsia="Arial" w:hAnsi="Arial"/>
-          <w:sz w:val="20"/>
-          <w:szCs w:val="20"/>
-        </w:rPr>
-        <w:t xml:space="preserve">Dekomposisi; mereduksi kompleksitas tantangan logistik 15 lokasi terisolasi menjadi 3 kluster terkelola berbasis derajat keparahan kerusakan dan skala prioritas.</w:t>
-      </w:r>
-    </w:p>
-    <w:p>
-      <w:pPr>
-        <w:spacing w:after="80"/>
-        <w:ind w:left="400"/>
-      </w:pPr>
-      <w:r>
-        <w:rPr>
-          <w:rFonts w:ascii="Arial" w:cs="Arial" w:eastAsia="Arial" w:hAnsi="Arial"/>
-          <w:b/>
-          <w:bCs/>
-          <w:sz w:val="20"/>
-          <w:szCs w:val="20"/>
-        </w:rPr>
         <w:t xml:space="preserve">C. </w:t>
       </w:r>
       <w:r>
@@ -3954,7 +3954,7 @@
           <w:sz w:val="18"/>
           <w:szCs w:val="18"/>
         </w:rPr>
-        <w:t xml:space="preserve">D | </w:t>
+        <w:t xml:space="preserve">A | </w:t>
       </w:r>
       <w:r>
         <w:rPr>
@@ -4041,6 +4041,30 @@
           <w:sz w:val="20"/>
           <w:szCs w:val="20"/>
         </w:rPr>
+        <w:t xml:space="preserve">Mendorong Kapten Rina mengalokasikan seluruh (5) helikopter secara maksimal ke Sektor Utara pada pagi hari (06.00 - 10.00) sebelum batas jendela cuaca berkabut tertutup.</w:t>
+      </w:r>
+    </w:p>
+    <w:p>
+      <w:pPr>
+        <w:spacing w:after="80"/>
+        <w:ind w:left="400"/>
+      </w:pPr>
+      <w:r>
+        <w:rPr>
+          <w:rFonts w:ascii="Arial" w:cs="Arial" w:eastAsia="Arial" w:hAnsi="Arial"/>
+          <w:b/>
+          <w:bCs/>
+          <w:sz w:val="20"/>
+          <w:szCs w:val="20"/>
+        </w:rPr>
+        <w:t xml:space="preserve">B. </w:t>
+      </w:r>
+      <w:r>
+        <w:rPr>
+          <w:rFonts w:ascii="Arial" w:cs="Arial" w:eastAsia="Arial" w:hAnsi="Arial"/>
+          <w:sz w:val="20"/>
+          <w:szCs w:val="20"/>
+        </w:rPr>
         <w:t xml:space="preserve">Menyebabkan operasi penerbangan ke Sektor Utara dibatalkan sama sekali demi melindungi keselamatan helikopter dari tetesan air kabut.</w:t>
       </w:r>
     </w:p>
@@ -4057,30 +4081,6 @@
           <w:sz w:val="20"/>
           <w:szCs w:val="20"/>
         </w:rPr>
-        <w:t xml:space="preserve">B. </w:t>
-      </w:r>
-      <w:r>
-        <w:rPr>
-          <w:rFonts w:ascii="Arial" w:cs="Arial" w:eastAsia="Arial" w:hAnsi="Arial"/>
-          <w:sz w:val="20"/>
-          <w:szCs w:val="20"/>
-        </w:rPr>
-        <w:t xml:space="preserve">Mendorong Kapten Rina mengalokasikan seluruh (5) helikopter secara maksimal ke Sektor Utara pada pagi hari (06.00 - 10.00) sebelum batas jendela cuaca berkabut tertutup.</w:t>
-      </w:r>
-    </w:p>
-    <w:p>
-      <w:pPr>
-        <w:spacing w:after="80"/>
-        <w:ind w:left="400"/>
-      </w:pPr>
-      <w:r>
-        <w:rPr>
-          <w:rFonts w:ascii="Arial" w:cs="Arial" w:eastAsia="Arial" w:hAnsi="Arial"/>
-          <w:b/>
-          <w:bCs/>
-          <w:sz w:val="20"/>
-          <w:szCs w:val="20"/>
-        </w:rPr>
         <w:t xml:space="preserve">C. </w:t>
       </w:r>
       <w:r>
@@ -4163,7 +4163,7 @@
           <w:sz w:val="18"/>
           <w:szCs w:val="18"/>
         </w:rPr>
-        <w:t xml:space="preserve">B | </w:t>
+        <w:t xml:space="preserve">A | </w:t>
       </w:r>
       <w:r>
         <w:rPr>
@@ -4250,6 +4250,30 @@
           <w:sz w:val="20"/>
           <w:szCs w:val="20"/>
         </w:rPr>
+        <w:t xml:space="preserve">Abstraksi; membuang barang non-kritis dan memprioritaskan muatan penyelamat nyawa (life-saving) karena payload dan volume kargo helikopter sangat terbatas pada fase kritis 72 jam pertama.</w:t>
+      </w:r>
+    </w:p>
+    <w:p>
+      <w:pPr>
+        <w:spacing w:after="80"/>
+        <w:ind w:left="400"/>
+      </w:pPr>
+      <w:r>
+        <w:rPr>
+          <w:rFonts w:ascii="Arial" w:cs="Arial" w:eastAsia="Arial" w:hAnsi="Arial"/>
+          <w:b/>
+          <w:bCs/>
+          <w:sz w:val="20"/>
+          <w:szCs w:val="20"/>
+        </w:rPr>
+        <w:t xml:space="preserve">B. </w:t>
+      </w:r>
+      <w:r>
+        <w:rPr>
+          <w:rFonts w:ascii="Arial" w:cs="Arial" w:eastAsia="Arial" w:hAnsi="Arial"/>
+          <w:sz w:val="20"/>
+          <w:szCs w:val="20"/>
+        </w:rPr>
         <w:t xml:space="preserve">Pengenalan Pola; menyimpulkan bahwa seluruh korban bencana gempa bumi tidak membutuhkan pakaian dan obat-obatan.</w:t>
       </w:r>
     </w:p>
@@ -4266,7 +4290,7 @@
           <w:sz w:val="20"/>
           <w:szCs w:val="20"/>
         </w:rPr>
-        <w:t xml:space="preserve">B. </w:t>
+        <w:t xml:space="preserve">C. </w:t>
       </w:r>
       <w:r>
         <w:rPr>
@@ -4290,30 +4314,6 @@
           <w:sz w:val="20"/>
           <w:szCs w:val="20"/>
         </w:rPr>
-        <w:t xml:space="preserve">C. </w:t>
-      </w:r>
-      <w:r>
-        <w:rPr>
-          <w:rFonts w:ascii="Arial" w:cs="Arial" w:eastAsia="Arial" w:hAnsi="Arial"/>
-          <w:sz w:val="20"/>
-          <w:szCs w:val="20"/>
-        </w:rPr>
-        <w:t xml:space="preserve">Abstraksi; membuang barang non-kritis dan memprioritaskan muatan penyelamat nyawa (life-saving) karena payload dan volume kargo helikopter sangat terbatas pada fase kritis 72 jam pertama.</w:t>
-      </w:r>
-    </w:p>
-    <w:p>
-      <w:pPr>
-        <w:spacing w:after="80"/>
-        <w:ind w:left="400"/>
-      </w:pPr>
-      <w:r>
-        <w:rPr>
-          <w:rFonts w:ascii="Arial" w:cs="Arial" w:eastAsia="Arial" w:hAnsi="Arial"/>
-          <w:b/>
-          <w:bCs/>
-          <w:sz w:val="20"/>
-          <w:szCs w:val="20"/>
-        </w:rPr>
         <w:t xml:space="preserve">D. </w:t>
       </w:r>
       <w:r>
@@ -4372,7 +4372,7 @@
           <w:sz w:val="18"/>
           <w:szCs w:val="18"/>
         </w:rPr>
-        <w:t xml:space="preserve">E | </w:t>
+        <w:t xml:space="preserve">A | </w:t>
       </w:r>
       <w:r>
         <w:rPr>
@@ -4720,6 +4720,30 @@
           <w:sz w:val="20"/>
           <w:szCs w:val="20"/>
         </w:rPr>
+        <w:t xml:space="preserve">Kehabisan daya sumber energi di tengah rute penerbangan sesi kedua (Resource Depletion), yang memicu insiden kecelakaan fatal dan kegagalan total seluruh misi kemanusiaan.</w:t>
+      </w:r>
+    </w:p>
+    <w:p>
+      <w:pPr>
+        <w:spacing w:after="80"/>
+        <w:ind w:left="400"/>
+      </w:pPr>
+      <w:r>
+        <w:rPr>
+          <w:rFonts w:ascii="Arial" w:cs="Arial" w:eastAsia="Arial" w:hAnsi="Arial"/>
+          <w:b/>
+          <w:bCs/>
+          <w:sz w:val="20"/>
+          <w:szCs w:val="20"/>
+        </w:rPr>
+        <w:t xml:space="preserve">B. </w:t>
+      </w:r>
+      <w:r>
+        <w:rPr>
+          <w:rFonts w:ascii="Arial" w:cs="Arial" w:eastAsia="Arial" w:hAnsi="Arial"/>
+          <w:sz w:val="20"/>
+          <w:szCs w:val="20"/>
+        </w:rPr>
         <w:t xml:space="preserve">Cuaca buruk di sore hari akan tertunda kemunculannya hingga pengisian bahan bakar dilakukan pada malam hari.</w:t>
       </w:r>
     </w:p>
@@ -4736,30 +4760,6 @@
           <w:sz w:val="20"/>
           <w:szCs w:val="20"/>
         </w:rPr>
-        <w:t xml:space="preserve">B. </w:t>
-      </w:r>
-      <w:r>
-        <w:rPr>
-          <w:rFonts w:ascii="Arial" w:cs="Arial" w:eastAsia="Arial" w:hAnsi="Arial"/>
-          <w:sz w:val="20"/>
-          <w:szCs w:val="20"/>
-        </w:rPr>
-        <w:t xml:space="preserve">Kehabisan daya sumber energi di tengah rute penerbangan sesi kedua (Resource Depletion), yang memicu insiden kecelakaan fatal dan kegagalan total seluruh misi kemanusiaan.</w:t>
-      </w:r>
-    </w:p>
-    <w:p>
-      <w:pPr>
-        <w:spacing w:after="80"/>
-        <w:ind w:left="400"/>
-      </w:pPr>
-      <w:r>
-        <w:rPr>
-          <w:rFonts w:ascii="Arial" w:cs="Arial" w:eastAsia="Arial" w:hAnsi="Arial"/>
-          <w:b/>
-          <w:bCs/>
-          <w:sz w:val="20"/>
-          <w:szCs w:val="20"/>
-        </w:rPr>
         <w:t xml:space="preserve">C. </w:t>
       </w:r>
       <w:r>
@@ -4842,7 +4842,7 @@
           <w:sz w:val="18"/>
           <w:szCs w:val="18"/>
         </w:rPr>
-        <w:t xml:space="preserve">D | </w:t>
+        <w:t xml:space="preserve">A | </w:t>
       </w:r>
       <w:r>
         <w:rPr>
@@ -4929,6 +4929,30 @@
           <w:sz w:val="20"/>
           <w:szCs w:val="20"/>
         </w:rPr>
+        <w:t xml:space="preserve">Menerapkan batas toleransi keamanan (safety threshold) untuk mencegah risiko kerugian aset total akibat cuaca buruk dan menjamin kesiapan armada untuk beroperasi kembali keesokan paginya.</w:t>
+      </w:r>
+    </w:p>
+    <w:p>
+      <w:pPr>
+        <w:spacing w:after="80"/>
+        <w:ind w:left="400"/>
+      </w:pPr>
+      <w:r>
+        <w:rPr>
+          <w:rFonts w:ascii="Arial" w:cs="Arial" w:eastAsia="Arial" w:hAnsi="Arial"/>
+          <w:b/>
+          <w:bCs/>
+          <w:sz w:val="20"/>
+          <w:szCs w:val="20"/>
+        </w:rPr>
+        <w:t xml:space="preserve">B. </w:t>
+      </w:r>
+      <w:r>
+        <w:rPr>
+          <w:rFonts w:ascii="Arial" w:cs="Arial" w:eastAsia="Arial" w:hAnsi="Arial"/>
+          <w:sz w:val="20"/>
+          <w:szCs w:val="20"/>
+        </w:rPr>
         <w:t xml:space="preserve">Memberi kesempatan kepada Kapten Rina untuk meninggalkan lokasi posko bencana dan berlibur ke luar kota pegunungan.</w:t>
       </w:r>
     </w:p>
@@ -4945,30 +4969,6 @@
           <w:sz w:val="20"/>
           <w:szCs w:val="20"/>
         </w:rPr>
-        <w:t xml:space="preserve">B. </w:t>
-      </w:r>
-      <w:r>
-        <w:rPr>
-          <w:rFonts w:ascii="Arial" w:cs="Arial" w:eastAsia="Arial" w:hAnsi="Arial"/>
-          <w:sz w:val="20"/>
-          <w:szCs w:val="20"/>
-        </w:rPr>
-        <w:t xml:space="preserve">Menerapkan batas toleransi keamanan (safety threshold) untuk mencegah risiko kerugian aset total akibat cuaca buruk dan menjamin kesiapan armada untuk beroperasi kembali keesokan paginya.</w:t>
-      </w:r>
-    </w:p>
-    <w:p>
-      <w:pPr>
-        <w:spacing w:after="80"/>
-        <w:ind w:left="400"/>
-      </w:pPr>
-      <w:r>
-        <w:rPr>
-          <w:rFonts w:ascii="Arial" w:cs="Arial" w:eastAsia="Arial" w:hAnsi="Arial"/>
-          <w:b/>
-          <w:bCs/>
-          <w:sz w:val="20"/>
-          <w:szCs w:val="20"/>
-        </w:rPr>
         <w:t xml:space="preserve">C. </w:t>
       </w:r>
       <w:r>
@@ -5051,7 +5051,7 @@
           <w:sz w:val="18"/>
           <w:szCs w:val="18"/>
         </w:rPr>
-        <w:t xml:space="preserve">B | </w:t>
+        <w:t xml:space="preserve">A | </w:t>
       </w:r>
       <w:r>
         <w:rPr>
@@ -5260,7 +5260,7 @@
           <w:sz w:val="18"/>
           <w:szCs w:val="18"/>
         </w:rPr>
-        <w:t xml:space="preserve">C | </w:t>
+        <w:t xml:space="preserve">A | </w:t>
       </w:r>
       <w:r>
         <w:rPr>
@@ -5347,6 +5347,30 @@
           <w:sz w:val="20"/>
           <w:szCs w:val="20"/>
         </w:rPr>
+        <w:t xml:space="preserve">Dekomposisi dapat diterapkan melalui berbagai dimensi pemotongan (fungsional, spasial/geografis, kronologis, atau derajat keparahan), disesuaikan dengan arsitektur masalah dan tujuan operasional.</w:t>
+      </w:r>
+    </w:p>
+    <w:p>
+      <w:pPr>
+        <w:spacing w:after="80"/>
+        <w:ind w:left="400"/>
+      </w:pPr>
+      <w:r>
+        <w:rPr>
+          <w:rFonts w:ascii="Arial" w:cs="Arial" w:eastAsia="Arial" w:hAnsi="Arial"/>
+          <w:b/>
+          <w:bCs/>
+          <w:sz w:val="20"/>
+          <w:szCs w:val="20"/>
+        </w:rPr>
+        <w:t xml:space="preserve">B. </w:t>
+      </w:r>
+      <w:r>
+        <w:rPr>
+          <w:rFonts w:ascii="Arial" w:cs="Arial" w:eastAsia="Arial" w:hAnsi="Arial"/>
+          <w:sz w:val="20"/>
+          <w:szCs w:val="20"/>
+        </w:rPr>
         <w:t xml:space="preserve">Dekomposisi fungsional sains lingkungan tidak boleh digabungkan dengan dekomposisi geografis dalam satu sistem pemerintahan.</w:t>
       </w:r>
     </w:p>
@@ -5363,7 +5387,7 @@
           <w:sz w:val="20"/>
           <w:szCs w:val="20"/>
         </w:rPr>
-        <w:t xml:space="preserve">B. </w:t>
+        <w:t xml:space="preserve">C. </w:t>
       </w:r>
       <w:r>
         <w:rPr>
@@ -5387,30 +5411,6 @@
           <w:sz w:val="20"/>
           <w:szCs w:val="20"/>
         </w:rPr>
-        <w:t xml:space="preserve">C. </w:t>
-      </w:r>
-      <w:r>
-        <w:rPr>
-          <w:rFonts w:ascii="Arial" w:cs="Arial" w:eastAsia="Arial" w:hAnsi="Arial"/>
-          <w:sz w:val="20"/>
-          <w:szCs w:val="20"/>
-        </w:rPr>
-        <w:t xml:space="preserve">Dekomposisi dapat diterapkan melalui berbagai dimensi pemotongan (fungsional, spasial/geografis, kronologis, atau derajat keparahan), disesuaikan dengan arsitektur masalah dan tujuan operasional.</w:t>
-      </w:r>
-    </w:p>
-    <w:p>
-      <w:pPr>
-        <w:spacing w:after="80"/>
-        <w:ind w:left="400"/>
-      </w:pPr>
-      <w:r>
-        <w:rPr>
-          <w:rFonts w:ascii="Arial" w:cs="Arial" w:eastAsia="Arial" w:hAnsi="Arial"/>
-          <w:b/>
-          <w:bCs/>
-          <w:sz w:val="20"/>
-          <w:szCs w:val="20"/>
-        </w:rPr>
         <w:t xml:space="preserve">D. </w:t>
       </w:r>
       <w:r>
@@ -5469,7 +5469,7 @@
           <w:sz w:val="18"/>
           <w:szCs w:val="18"/>
         </w:rPr>
-        <w:t xml:space="preserve">E | </w:t>
+        <w:t xml:space="preserve">A | </w:t>
       </w:r>
       <w:r>
         <w:rPr>
@@ -5556,6 +5556,30 @@
           <w:sz w:val="20"/>
           <w:szCs w:val="20"/>
         </w:rPr>
+        <w:t xml:space="preserve">Menjaga prioritas penyelamatan Sektor Utara dengan mengerahkan ke-4 helikopter tersisa hingga pukul 10.00, lalu mengalokasikan masing-masing 2 helikopter untuk Sektor Tengah dan Selatan di sesi siang.</w:t>
+      </w:r>
+    </w:p>
+    <w:p>
+      <w:pPr>
+        <w:spacing w:after="80"/>
+        <w:ind w:left="400"/>
+      </w:pPr>
+      <w:r>
+        <w:rPr>
+          <w:rFonts w:ascii="Arial" w:cs="Arial" w:eastAsia="Arial" w:hAnsi="Arial"/>
+          <w:b/>
+          <w:bCs/>
+          <w:sz w:val="20"/>
+          <w:szCs w:val="20"/>
+        </w:rPr>
+        <w:t xml:space="preserve">B. </w:t>
+      </w:r>
+      <w:r>
+        <w:rPr>
+          <w:rFonts w:ascii="Arial" w:cs="Arial" w:eastAsia="Arial" w:hAnsi="Arial"/>
+          <w:sz w:val="20"/>
+          <w:szCs w:val="20"/>
+        </w:rPr>
         <w:t xml:space="preserve">Membatalkan seluruh penerbangan hari itu dan membiarkan warga di 15 desa menunggu hingga helikopter pengganti tiba minggu depan.</w:t>
       </w:r>
     </w:p>
@@ -5572,30 +5596,6 @@
           <w:sz w:val="20"/>
           <w:szCs w:val="20"/>
         </w:rPr>
-        <w:t xml:space="preserve">B. </w:t>
-      </w:r>
-      <w:r>
-        <w:rPr>
-          <w:rFonts w:ascii="Arial" w:cs="Arial" w:eastAsia="Arial" w:hAnsi="Arial"/>
-          <w:sz w:val="20"/>
-          <w:szCs w:val="20"/>
-        </w:rPr>
-        <w:t xml:space="preserve">Menjaga prioritas penyelamatan Sektor Utara dengan mengerahkan ke-4 helikopter tersisa hingga pukul 10.00, lalu mengalokasikan masing-masing 2 helikopter untuk Sektor Tengah dan Selatan di sesi siang.</w:t>
-      </w:r>
-    </w:p>
-    <w:p>
-      <w:pPr>
-        <w:spacing w:after="80"/>
-        <w:ind w:left="400"/>
-      </w:pPr>
-      <w:r>
-        <w:rPr>
-          <w:rFonts w:ascii="Arial" w:cs="Arial" w:eastAsia="Arial" w:hAnsi="Arial"/>
-          <w:b/>
-          <w:bCs/>
-          <w:sz w:val="20"/>
-          <w:szCs w:val="20"/>
-        </w:rPr>
         <w:t xml:space="preserve">C. </w:t>
       </w:r>
       <w:r>
@@ -5678,7 +5678,7 @@
           <w:sz w:val="18"/>
           <w:szCs w:val="18"/>
         </w:rPr>
-        <w:t xml:space="preserve">B | </w:t>
+        <w:t xml:space="preserve">A | </w:t>
       </w:r>
       <w:r>
         <w:rPr>
@@ -5974,6 +5974,30 @@
           <w:sz w:val="20"/>
           <w:szCs w:val="20"/>
         </w:rPr>
+        <w:t xml:space="preserve">Menganalisis korelasi data histori sensor kelembapan tanah, suhu udara, dan kecepatan angin selama 5 musim panen dengan siklus kemunculan ledakan populasi hama kutu sisik.</w:t>
+      </w:r>
+    </w:p>
+    <w:p>
+      <w:pPr>
+        <w:spacing w:after="80"/>
+        <w:ind w:left="400"/>
+      </w:pPr>
+      <w:r>
+        <w:rPr>
+          <w:rFonts w:ascii="Arial" w:cs="Arial" w:eastAsia="Arial" w:hAnsi="Arial"/>
+          <w:b/>
+          <w:bCs/>
+          <w:sz w:val="20"/>
+          <w:szCs w:val="20"/>
+        </w:rPr>
+        <w:t xml:space="preserve">B. </w:t>
+      </w:r>
+      <w:r>
+        <w:rPr>
+          <w:rFonts w:ascii="Arial" w:cs="Arial" w:eastAsia="Arial" w:hAnsi="Arial"/>
+          <w:sz w:val="20"/>
+          <w:szCs w:val="20"/>
+        </w:rPr>
         <w:t xml:space="preserve">Mengganti seluruh pohon apel dengan tanaman padi sawah tanpa menguji kesesuaian jenis tanah dan ketinggian lereng.</w:t>
       </w:r>
     </w:p>
@@ -5990,30 +6014,6 @@
           <w:sz w:val="20"/>
           <w:szCs w:val="20"/>
         </w:rPr>
-        <w:t xml:space="preserve">B. </w:t>
-      </w:r>
-      <w:r>
-        <w:rPr>
-          <w:rFonts w:ascii="Arial" w:cs="Arial" w:eastAsia="Arial" w:hAnsi="Arial"/>
-          <w:sz w:val="20"/>
-          <w:szCs w:val="20"/>
-        </w:rPr>
-        <w:t xml:space="preserve">Menganalisis korelasi data histori sensor kelembapan tanah, suhu udara, dan kecepatan angin selama 5 musim panen dengan siklus kemunculan ledakan populasi hama kutu sisik.</w:t>
-      </w:r>
-    </w:p>
-    <w:p>
-      <w:pPr>
-        <w:spacing w:after="80"/>
-        <w:ind w:left="400"/>
-      </w:pPr>
-      <w:r>
-        <w:rPr>
-          <w:rFonts w:ascii="Arial" w:cs="Arial" w:eastAsia="Arial" w:hAnsi="Arial"/>
-          <w:b/>
-          <w:bCs/>
-          <w:sz w:val="20"/>
-          <w:szCs w:val="20"/>
-        </w:rPr>
         <w:t xml:space="preserve">C. </w:t>
       </w:r>
       <w:r>
@@ -6096,7 +6096,7 @@
           <w:sz w:val="18"/>
           <w:szCs w:val="18"/>
         </w:rPr>
-        <w:t xml:space="preserve">D | </w:t>
+        <w:t xml:space="preserve">A | </w:t>
       </w:r>
       <w:r>
         <w:rPr>
@@ -6305,7 +6305,7 @@
           <w:sz w:val="18"/>
           <w:szCs w:val="18"/>
         </w:rPr>
-        <w:t xml:space="preserve">C | </w:t>
+        <w:t xml:space="preserve">A | </w:t>
       </w:r>
       <w:r>
         <w:rPr>
@@ -6392,6 +6392,30 @@
           <w:sz w:val="20"/>
           <w:szCs w:val="20"/>
         </w:rPr>
+        <w:t xml:space="preserve">Menjaga transparansi logika pengambilan keputusan (Explainability), keadilan algoritma tanpa bias diskriminatif, perlindungan privasi data warga, dan akuntabilitas moral manusia terhadap dampak keputusan sistem.</w:t>
+      </w:r>
+    </w:p>
+    <w:p>
+      <w:pPr>
+        <w:spacing w:after="80"/>
+        <w:ind w:left="400"/>
+      </w:pPr>
+      <w:r>
+        <w:rPr>
+          <w:rFonts w:ascii="Arial" w:cs="Arial" w:eastAsia="Arial" w:hAnsi="Arial"/>
+          <w:b/>
+          <w:bCs/>
+          <w:sz w:val="20"/>
+          <w:szCs w:val="20"/>
+        </w:rPr>
+        <w:t xml:space="preserve">B. </w:t>
+      </w:r>
+      <w:r>
+        <w:rPr>
+          <w:rFonts w:ascii="Arial" w:cs="Arial" w:eastAsia="Arial" w:hAnsi="Arial"/>
+          <w:sz w:val="20"/>
+          <w:szCs w:val="20"/>
+        </w:rPr>
         <w:t xml:space="preserve">Menghapus rekaman log jejak audit secara otomatis jika terindikasi sistem melakukan kesalahan fatal yang merugikan masyarakat luas.</w:t>
       </w:r>
     </w:p>
@@ -6408,7 +6432,7 @@
           <w:sz w:val="20"/>
           <w:szCs w:val="20"/>
         </w:rPr>
-        <w:t xml:space="preserve">B. </w:t>
+        <w:t xml:space="preserve">C. </w:t>
       </w:r>
       <w:r>
         <w:rPr>
@@ -6432,30 +6456,6 @@
           <w:sz w:val="20"/>
           <w:szCs w:val="20"/>
         </w:rPr>
-        <w:t xml:space="preserve">C. </w:t>
-      </w:r>
-      <w:r>
-        <w:rPr>
-          <w:rFonts w:ascii="Arial" w:cs="Arial" w:eastAsia="Arial" w:hAnsi="Arial"/>
-          <w:sz w:val="20"/>
-          <w:szCs w:val="20"/>
-        </w:rPr>
-        <w:t xml:space="preserve">Menjaga transparansi logika pengambilan keputusan (Explainability), keadilan algoritma tanpa bias diskriminatif, perlindungan privasi data warga, dan akuntabilitas moral manusia terhadap dampak keputusan sistem.</w:t>
-      </w:r>
-    </w:p>
-    <w:p>
-      <w:pPr>
-        <w:spacing w:after="80"/>
-        <w:ind w:left="400"/>
-      </w:pPr>
-      <w:r>
-        <w:rPr>
-          <w:rFonts w:ascii="Arial" w:cs="Arial" w:eastAsia="Arial" w:hAnsi="Arial"/>
-          <w:b/>
-          <w:bCs/>
-          <w:sz w:val="20"/>
-          <w:szCs w:val="20"/>
-        </w:rPr>
         <w:t xml:space="preserve">D. </w:t>
       </w:r>
       <w:r>
@@ -6514,7 +6514,7 @@
           <w:sz w:val="18"/>
           <w:szCs w:val="18"/>
         </w:rPr>
-        <w:t xml:space="preserve">E | </w:t>
+        <w:t xml:space="preserve">A | </w:t>
       </w:r>
       <w:r>
         <w:rPr>
@@ -6698,7 +6698,7 @@
                 <w:sz w:val="18"/>
                 <w:szCs w:val="18"/>
               </w:rPr>
-              <w:t xml:space="preserve">C</w:t>
+              <w:t xml:space="preserve">A</w:t>
             </w:r>
           </w:p>
         </w:tc>
@@ -6832,7 +6832,7 @@
                 <w:sz w:val="18"/>
                 <w:szCs w:val="18"/>
               </w:rPr>
-              <w:t xml:space="preserve">C</w:t>
+              <w:t xml:space="preserve">A</w:t>
             </w:r>
           </w:p>
         </w:tc>
@@ -6878,7 +6878,7 @@
                 <w:sz w:val="18"/>
                 <w:szCs w:val="18"/>
               </w:rPr>
-              <w:t xml:space="preserve">D</w:t>
+              <w:t xml:space="preserve">A</w:t>
             </w:r>
           </w:p>
         </w:tc>
@@ -6922,7 +6922,7 @@
                 <w:sz w:val="18"/>
                 <w:szCs w:val="18"/>
               </w:rPr>
-              <w:t xml:space="preserve">D</w:t>
+              <w:t xml:space="preserve">A</w:t>
             </w:r>
           </w:p>
         </w:tc>
@@ -6968,7 +6968,7 @@
                 <w:sz w:val="18"/>
                 <w:szCs w:val="18"/>
               </w:rPr>
-              <w:t xml:space="preserve">B</w:t>
+              <w:t xml:space="preserve">A</w:t>
             </w:r>
           </w:p>
         </w:tc>
@@ -7012,7 +7012,7 @@
                 <w:sz w:val="18"/>
                 <w:szCs w:val="18"/>
               </w:rPr>
-              <w:t xml:space="preserve">B</w:t>
+              <w:t xml:space="preserve">A</w:t>
             </w:r>
           </w:p>
         </w:tc>
@@ -7058,7 +7058,7 @@
                 <w:sz w:val="18"/>
                 <w:szCs w:val="18"/>
               </w:rPr>
-              <w:t xml:space="preserve">E</w:t>
+              <w:t xml:space="preserve">A</w:t>
             </w:r>
           </w:p>
         </w:tc>
@@ -7102,7 +7102,7 @@
                 <w:sz w:val="18"/>
                 <w:szCs w:val="18"/>
               </w:rPr>
-              <w:t xml:space="preserve">E</w:t>
+              <w:t xml:space="preserve">A</w:t>
             </w:r>
           </w:p>
         </w:tc>
@@ -7238,7 +7238,7 @@
                 <w:sz w:val="18"/>
                 <w:szCs w:val="18"/>
               </w:rPr>
-              <w:t xml:space="preserve">C</w:t>
+              <w:t xml:space="preserve">A</w:t>
             </w:r>
           </w:p>
         </w:tc>
@@ -7282,7 +7282,7 @@
                 <w:sz w:val="18"/>
                 <w:szCs w:val="18"/>
               </w:rPr>
-              <w:t xml:space="preserve">D</w:t>
+              <w:t xml:space="preserve">A</w:t>
             </w:r>
           </w:p>
         </w:tc>
@@ -7328,7 +7328,7 @@
                 <w:sz w:val="18"/>
                 <w:szCs w:val="18"/>
               </w:rPr>
-              <w:t xml:space="preserve">B</w:t>
+              <w:t xml:space="preserve">A</w:t>
             </w:r>
           </w:p>
         </w:tc>
@@ -7372,7 +7372,7 @@
                 <w:sz w:val="18"/>
                 <w:szCs w:val="18"/>
               </w:rPr>
-              <w:t xml:space="preserve">B</w:t>
+              <w:t xml:space="preserve">A</w:t>
             </w:r>
           </w:p>
         </w:tc>
@@ -7418,7 +7418,7 @@
                 <w:sz w:val="18"/>
                 <w:szCs w:val="18"/>
               </w:rPr>
-              <w:t xml:space="preserve">D</w:t>
+              <w:t xml:space="preserve">A</w:t>
             </w:r>
           </w:p>
         </w:tc>
@@ -7462,7 +7462,7 @@
                 <w:sz w:val="18"/>
                 <w:szCs w:val="18"/>
               </w:rPr>
-              <w:t xml:space="preserve">C</w:t>
+              <w:t xml:space="preserve">A</w:t>
             </w:r>
           </w:p>
         </w:tc>
@@ -7508,7 +7508,7 @@
                 <w:sz w:val="18"/>
                 <w:szCs w:val="18"/>
               </w:rPr>
-              <w:t xml:space="preserve">E</w:t>
+              <w:t xml:space="preserve">A</w:t>
             </w:r>
           </w:p>
         </w:tc>
@@ -7552,7 +7552,7 @@
                 <w:sz w:val="18"/>
                 <w:szCs w:val="18"/>
               </w:rPr>
-              <w:t xml:space="preserve">E</w:t>
+              <w:t xml:space="preserve">A</w:t>
             </w:r>
           </w:p>
         </w:tc>
@@ -7598,7 +7598,7 @@
                 <w:sz w:val="18"/>
                 <w:szCs w:val="18"/>
               </w:rPr>
-              <w:t xml:space="preserve">B</w:t>
+              <w:t xml:space="preserve">A</w:t>
             </w:r>
           </w:p>
         </w:tc>
@@ -7642,7 +7642,7 @@
                 <w:sz w:val="18"/>
                 <w:szCs w:val="18"/>
               </w:rPr>
-              <w:t xml:space="preserve">B</w:t>
+              <w:t xml:space="preserve">A</w:t>
             </w:r>
           </w:p>
         </w:tc>
@@ -7778,7 +7778,7 @@
                 <w:sz w:val="18"/>
                 <w:szCs w:val="18"/>
               </w:rPr>
-              <w:t xml:space="preserve">D</w:t>
+              <w:t xml:space="preserve">A</w:t>
             </w:r>
           </w:p>
         </w:tc>
@@ -7822,7 +7822,7 @@
                 <w:sz w:val="18"/>
                 <w:szCs w:val="18"/>
               </w:rPr>
-              <w:t xml:space="preserve">D</w:t>
+              <w:t xml:space="preserve">A</w:t>
             </w:r>
           </w:p>
         </w:tc>
@@ -7868,7 +7868,7 @@
                 <w:sz w:val="18"/>
                 <w:szCs w:val="18"/>
               </w:rPr>
-              <w:t xml:space="preserve">C</w:t>
+              <w:t xml:space="preserve">A</w:t>
             </w:r>
           </w:p>
         </w:tc>
@@ -7912,7 +7912,7 @@
                 <w:sz w:val="18"/>
                 <w:szCs w:val="18"/>
               </w:rPr>
-              <w:t xml:space="preserve">C</w:t>
+              <w:t xml:space="preserve">A</w:t>
             </w:r>
           </w:p>
         </w:tc>
@@ -7958,7 +7958,7 @@
                 <w:sz w:val="18"/>
                 <w:szCs w:val="18"/>
               </w:rPr>
-              <w:t xml:space="preserve">E</w:t>
+              <w:t xml:space="preserve">A</w:t>
             </w:r>
           </w:p>
         </w:tc>
@@ -8002,7 +8002,7 @@
                 <w:sz w:val="18"/>
                 <w:szCs w:val="18"/>
               </w:rPr>
-              <w:t xml:space="preserve">E</w:t>
+              <w:t xml:space="preserve">A</w:t>
             </w:r>
           </w:p>
         </w:tc>

</xml_diff>

<commit_message>
feat(exam): ubah 30 soal CT kelas X sesuai Materi_CT_SMAN_1_Batu dengan literasi panjang kontekstual sehari-hari, bahasa Indonesia lugas, dan kunci opsi A
</commit_message>
<xml_diff>
--- a/Bank_Soal_30_CT_Informatika_SMAN_1_Batu.docx
+++ b/Bank_Soal_30_CT_Informatika_SMAN_1_Batu.docx
@@ -59,7 +59,7 @@
           <w:sz w:val="18"/>
           <w:szCs w:val="18"/>
         </w:rPr>
-        <w:t xml:space="preserve">Jl. Ngaglik No. 1, Kota Batu, Jawa Timur 65311</w:t>
+        <w:t xml:space="preserve">Jl. Ngaglik No. 1, Kota Batu, Jawa Timur 65311 | Telp: (0341) 591310</w:t>
       </w:r>
     </w:p>
     <w:p>
@@ -92,7 +92,7 @@
           <w:sz w:val="26"/>
           <w:szCs w:val="26"/>
         </w:rPr>
-        <w:t xml:space="preserve">ASESMEN SUMATIF / UJIAN CBT BERPIKIR KOMPUTASIONAL</w:t>
+        <w:t xml:space="preserve">ASESMEN SUMATIF / BANK SOAL BERPIKIR KOMPUTASIONAL</w:t>
       </w:r>
     </w:p>
     <w:p>
@@ -122,7 +122,7 @@
           <w:sz w:val="18"/>
           <w:szCs w:val="18"/>
         </w:rPr>
-        <w:t xml:space="preserve">Guru Pengampu: Abdul Aziz., S.Kom., Gr | Materi Rujukan: Materi_CT_Informatika_SMAN_1_Batu.pdf</w:t>
+        <w:t xml:space="preserve">Guru Pengampu: Abdul Aziz., S.Kom., Gr | Bahan Ajar: Materi_CT_Informatika_SMAN_1_Batu.pdf</w:t>
       </w:r>
     </w:p>
     <w:p>
@@ -149,27 +149,27 @@
           <w:sz w:val="18"/>
           <w:szCs w:val="18"/>
         </w:rPr>
-        <w:t xml:space="preserve">1. Pilihlah salah satu jawaban yang paling tepat dengan memberikan tanda silang (X) atau memilih opsi A, B, C, D, atau E.</w:t>
-      </w:r>
-    </w:p>
-    <w:p>
-      <w:r>
-        <w:rPr>
-          <w:rFonts w:ascii="Arial" w:cs="Arial" w:eastAsia="Arial" w:hAnsi="Arial"/>
-          <w:sz w:val="18"/>
-          <w:szCs w:val="18"/>
-        </w:rPr>
-        <w:t xml:space="preserve">2. Cermati teks literasi dan konteks studi kasus pada setiap butir soal dengan seksama.</w:t>
-      </w:r>
-    </w:p>
-    <w:p>
-      <w:r>
-        <w:rPr>
-          <w:rFonts w:ascii="Arial" w:cs="Arial" w:eastAsia="Arial" w:hAnsi="Arial"/>
-          <w:sz w:val="18"/>
-          <w:szCs w:val="18"/>
-        </w:rPr>
-        <w:t xml:space="preserve">3. Soal berbasis Higher Order Thinking Skills (HOTS) yang menguji integrasi 4 pilar Computational Thinking.</w:t>
+        <w:t xml:space="preserve">1. Cermati narasi situasi dan studi kasus kehidupan sehari-hari pada setiap butir soal dengan seksama.</w:t>
+      </w:r>
+    </w:p>
+    <w:p>
+      <w:r>
+        <w:rPr>
+          <w:rFonts w:ascii="Arial" w:cs="Arial" w:eastAsia="Arial" w:hAnsi="Arial"/>
+          <w:sz w:val="18"/>
+          <w:szCs w:val="18"/>
+        </w:rPr>
+        <w:t xml:space="preserve">2. Pilihlah salah satu jawaban yang paling tepat dari pilihan A, B, C, D, atau E.</w:t>
+      </w:r>
+    </w:p>
+    <w:p>
+      <w:r>
+        <w:rPr>
+          <w:rFonts w:ascii="Arial" w:cs="Arial" w:eastAsia="Arial" w:hAnsi="Arial"/>
+          <w:sz w:val="18"/>
+          <w:szCs w:val="18"/>
+        </w:rPr>
+        <w:t xml:space="preserve">3. Soal menguji kemampuan nalar analitis Higher Order Thinking Skills (HOTS) pada pilar Dekomposisi, Pengenalan Pola, Abstraksi, dan Algoritma.</w:t>
       </w:r>
     </w:p>
     <w:p>
@@ -203,7 +203,7 @@
           <w:sz w:val="20"/>
           <w:szCs w:val="20"/>
         </w:rPr>
-        <w:t xml:space="preserve">Pada tahun 2006, Jeannette M. Wing mempublikasikan karya ilmiah seminal berjudul "Computational Thinking" yang merevolusi cara pandang dunia pendidikan terhadap ilmu komputer. Wing menegaskan bahwa Berpikir Komputasional (Computational Thinking/CT) bukanlah keahlian untuk membuat manusia berpikir layaknya sebuah komputer yang mekanis, kaku, dan serba biner. Sebaliknya, CT adalah proses pemikiran kognitif tingkat tinggi (cognitive process) yang melibatkan perumusan masalah beserta solusinya secara presisi, sedemikian rupa sehingga solusi tersebut dapat direpresentasikan dalam format yang dapat dieksekusi secara efektif oleh agen pemroses informasi—baik agen tersebut berupa manusia, mesin komputer, maupun kombinasi keduanya.</w:t>
+        <w:t xml:space="preserve">Kota Delta yang padat penduduk dilanda banjir lumpur beracun setiap puncak musim hujan di bulan Januari. Alih-alih langsung mengambil tindakan tergesa-gesa seperti sekadar membagikan bantuan sembako, Dr. Aris sebagai ketua tim penyelidik membagi persoalan besar tersebut ke dalam tiga kelompok kerja terpisah: tim pengamat curah hujan dan aliran sungai, tim penilai alih fungsi hutan di kawasan hulu, serta tim uji laboratorium untuk memeriksa kandungan zat beracun pada lumpur endapan.</w:t>
       </w:r>
     </w:p>
     <w:p>
@@ -216,7 +216,7 @@
           <w:sz w:val="20"/>
           <w:szCs w:val="20"/>
         </w:rPr>
-        <w:t xml:space="preserve">Berdasarkan pemaparan mendalam di atas, manakah kesimpulan yang paling tepat mengenai hakikat sejati dari Berpikir Komputasional (CT) dalam konteks pembelajaran abad ke-21?</w:t>
+        <w:t xml:space="preserve">Berdasarkan prinsip kerja berpikir komputasional, apakah tujuan utama Dr. Aris memecah krisis besar tersebut menjadi tiga bidang penyelidikan yang terpisah?</w:t>
       </w:r>
     </w:p>
     <w:p>
@@ -240,7 +240,7 @@
           <w:sz w:val="20"/>
           <w:szCs w:val="20"/>
         </w:rPr>
-        <w:t xml:space="preserve">Sebuah kerangka kerja berpikir pemecahan masalah (problem solving) yang menyusun representasi solusi secara logis agar dapat dieksekusi oleh agen pemroses informasi, baik manusia maupun komputer.</w:t>
+        <w:t xml:space="preserve">Membuat masalah besar yang rumit menjadi bagian-bagian kecil yang terkelola sehingga setiap tim ahli dapat fokus bekerja secara mendalam dan terarah.</w:t>
       </w:r>
     </w:p>
     <w:p>
@@ -264,7 +264,7 @@
           <w:sz w:val="20"/>
           <w:szCs w:val="20"/>
         </w:rPr>
-        <w:t xml:space="preserve">Keahlian teknis tingkat lanjut untuk menghafal sintaks bahasa pemrograman dan merakit perangkat keras komputer secara mekanis.</w:t>
+        <w:t xml:space="preserve">Memperpanjang durasi penyelidikan agar pemerintah daerah memiliki alasan untuk menambah alokasi anggaran proyek penanganan bencana.</w:t>
       </w:r>
     </w:p>
     <w:p>
@@ -288,7 +288,7 @@
           <w:sz w:val="20"/>
           <w:szCs w:val="20"/>
         </w:rPr>
-        <w:t xml:space="preserve">Keterampilan mengoperasikan berbagai aplikasi komersial perkantoran dan multimedia untuk meningkatkan kecepatan mengetik.</w:t>
+        <w:t xml:space="preserve">Menghindari tanggung jawab langsung atas kegagalan penanganan banjir dengan menyerahkan keputusan sepenuhnya kepada kelompok kerja.</w:t>
       </w:r>
     </w:p>
     <w:p>
@@ -312,7 +312,7 @@
           <w:sz w:val="20"/>
           <w:szCs w:val="20"/>
         </w:rPr>
-        <w:t xml:space="preserve">Metode berpikir yang mewajibkan manusia bertindak seperti robot biner guna mengeliminasi seluruh emosi dalam pengambilan keputusan.</w:t>
+        <w:t xml:space="preserve">Mengalihkan perhatian warga dari bahaya limbah beracun dengan menyibukkan relawan pada pencatatan ketinggian air sungai.</w:t>
       </w:r>
     </w:p>
     <w:p>
@@ -336,7 +336,7 @@
           <w:sz w:val="20"/>
           <w:szCs w:val="20"/>
         </w:rPr>
-        <w:t xml:space="preserve">Proses otomatisasi penuh yang bertujuan menggantikan peran akal budi manusia seutuhnya dengan algoritma kecerdasan buatan.</w:t>
+        <w:t xml:space="preserve">Memastikan seluruh warga di sepanjang bantaran sungai terlibat langsung sebagai peneliti lapangan tanpa memandang keahlian mereka.</w:t>
       </w:r>
     </w:p>
     <w:p>
@@ -383,7 +383,7 @@
           <w:sz w:val="18"/>
           <w:szCs w:val="18"/>
         </w:rPr>
-        <w:t xml:space="preserve">Sesuai naskah Jeannette M. Wing (2006), CT adalah proses kognitif pemecahan masalah di mana solusinya diformulasikan agar dapat dieksekusi oleh agen pemroses informasi (manusia maupun komputer), bukan sekadar mengetik kode atau berpikir mekanis seperti robot.</w:t>
+        <w:t xml:space="preserve">Tindakan Dr. Aris mencerminkan pilar Dekomposisi. Tujuan utama dekomposisi adalah memecah masalah yang rumit dan besar menjadi bagian-bagian yang lebih kecil dan terkelola agar dapat diselesaikan secara mendalam, efektif, dan terstruktur oleh pihak yang berkompeten.</w:t>
       </w:r>
     </w:p>
     <w:p>
@@ -412,7 +412,7 @@
           <w:sz w:val="20"/>
           <w:szCs w:val="20"/>
         </w:rPr>
-        <w:t xml:space="preserve">Di era disrupsi digital saat ini, masyarakat dihadapkan pada fenomena luapan data (data deluge) dan persoalan multidimensi yang belum pernah terjadi sebelumnya. Untuk memecahkan tantangan besar tersebut, Berpikir Komputasional menyediakan empat pilar fondasi utama: Dekomposisi, Pengenalan Pola, Abstraksi, dan Berpikir Algoritma. Keempat fondasi ini bukanlah tahapan yang terpisah secara kaku, melainkan sebuah siklus sinergis.</w:t>
+        <w:t xml:space="preserve">Tim pengamat cuaca Kota Delta mengumpulkan dan membandingkan catatan data cuaca selama 20 tahun ke belakang. Dari pengolahan data tersebut, tim menemukan sebuah keteraturan nyata: bencana banjir lumpur besar selalu dan hanya terjadi apabila curah hujan harian melampaui 150 milimeter per hari selama tiga hari berturut-turut yang terjadi bersamaan dengan peristiwa pasang naik air laut maksimum.</w:t>
       </w:r>
     </w:p>
     <w:p>
@@ -425,7 +425,7 @@
           <w:sz w:val="20"/>
           <w:szCs w:val="20"/>
         </w:rPr>
-        <w:t xml:space="preserve">Jika seorang peneliti lingkungan langsung menyusun serangkaian instruksi operasional lapangan (Algoritma) tanpa terlebih dahulu melakukan Dekomposisi masalah dan Abstraksi data, risiko sistemik apakah yang paling mungkin terjadi?</w:t>
+        <w:t xml:space="preserve">Penerapan pilar berpikir komputasional apakah yang ditunjukkan oleh tim dalam menarik kesimpulan tersebut, dan apa manfaat praktisnya bagi warga?</w:t>
       </w:r>
     </w:p>
     <w:p>
@@ -449,7 +449,7 @@
           <w:sz w:val="20"/>
           <w:szCs w:val="20"/>
         </w:rPr>
-        <w:t xml:space="preserve">Instruksi operasional akan dibanjiri oleh variabel tidak relevan (noise), tidak fokus pada akar kausalitas, dan rentan mengalami kegagalan fatal saat diimplementasikan.</w:t>
+        <w:t xml:space="preserve">Pengenalan pola; membantu tim menemukan keteraturan hubungan sebab-akibat masa lalu untuk memprediksi saat bahaya akan datang di masa depan.</w:t>
       </w:r>
     </w:p>
     <w:p>
@@ -473,7 +473,7 @@
           <w:sz w:val="20"/>
           <w:szCs w:val="20"/>
         </w:rPr>
-        <w:t xml:space="preserve">Waktu eksekusi algoritma akan menjadi terlalu cepat sehingga sensor digital lapangan tidak sanggup merekam data sekunder.</w:t>
+        <w:t xml:space="preserve">Dekomposisi; memilah data cuaca menjadi dokumen digital yang tersimpan rapi di dalam arsip kantor dinas kebersihan.</w:t>
       </w:r>
     </w:p>
     <w:p>
@@ -497,7 +497,7 @@
           <w:sz w:val="20"/>
           <w:szCs w:val="20"/>
         </w:rPr>
-        <w:t xml:space="preserve">Algoritma secara otomatis membersihkan seluruh noise data tanpa memerlukan penalaran awal dari manusia perancangnya.</w:t>
+        <w:t xml:space="preserve">Abstraksi; menghapus seluruh catatan curah hujan masa lalu agar komputer tidak mengalami kelambatan memori saat bekerja.</w:t>
       </w:r>
     </w:p>
     <w:p>
@@ -521,7 +521,7 @@
           <w:sz w:val="20"/>
           <w:szCs w:val="20"/>
         </w:rPr>
-        <w:t xml:space="preserve">Langkah penyelesaian masalah menjadi lebih hemat biaya karena melewati tahapan analisis konseptual yang memakan waktu.</w:t>
+        <w:t xml:space="preserve">Pemrograman mekanis; memaksa sensor cuaca untuk otomatis menurunkan curah hujan ketika angka 150 milimeter tercapai.</w:t>
       </w:r>
     </w:p>
     <w:p>
@@ -545,7 +545,7 @@
           <w:sz w:val="20"/>
           <w:szCs w:val="20"/>
         </w:rPr>
-        <w:t xml:space="preserve">Komputer yang digunakan untuk menyimulasikan model akan menolak mengeksekusi instruksi karena format dokumen tidak kompatibel.</w:t>
+        <w:t xml:space="preserve">Penyusunan aturan hukum; melarang awan mendung berkumpul di atas kawasan hulu selama musim hujan berlangsung.</w:t>
       </w:r>
     </w:p>
     <w:p>
@@ -592,7 +592,7 @@
           <w:sz w:val="18"/>
           <w:szCs w:val="18"/>
         </w:rPr>
-        <w:t xml:space="preserve">Tanpa dekomposisi untuk memilah akar masalah dan abstraksi untuk menyaring informasi esensial dari gangguan (noise), algoritma yang dirancang akan menjadi rumit, salah sasaran, dan gagal mengatasi titik kritis masalah.</w:t>
+        <w:t xml:space="preserve">Menganalisis data selama 20 tahun untuk menemukan kecenderungan berulang adalah penerapan pilar Pengenalan Pola. Manfaatnya adalah mengubah rekaman data masa lalu menjadi model prediksi yang akurat untuk sistem peringatan dini bencana.</w:t>
       </w:r>
     </w:p>
     <w:p>
@@ -621,7 +621,7 @@
           <w:sz w:val="20"/>
           <w:szCs w:val="20"/>
         </w:rPr>
-        <w:t xml:space="preserve">Otak manusia memiliki kapasitas memori kerja (working memory) yang terbatas. Ketika dihadapkan pada krisis multidimensi yang masif, kecenderungan alamiah manusia yang tidak terlatih dalam CT adalah merasa kewalahan (overwhelmed) atau mengambil tindakan reaktif sesaat. Dekomposisi hadir sebagai teknik dekonstruksi masalah besar menjadi sub-komponen yang lebih kecil, independen, dan terkelola (manageable).</w:t>
+        <w:t xml:space="preserve">Hasil uji air menunjukkan adanya kandungan logam berbahaya berupa kromium dan timbal pada lumpur banjir. Di bantaran sungai terdapat ratusan bangunan yang terdiri dari pabrik makanan ringan, perajin mebel kayu, toko kelontong, pabrik tekstil pencelupan kain, dan pabrik aki kendaraan. Dr. Aris memutuskan untuk hanya menyelidiki pabrik tekstil dan pabrik aki, serta mengabaikan ratusan toko kecil, warna seragam pekerja, maupun tahun berdirinya pabrik.</w:t>
       </w:r>
     </w:p>
     <w:p>
@@ -634,7 +634,7 @@
           <w:sz w:val="20"/>
           <w:szCs w:val="20"/>
         </w:rPr>
-        <w:t xml:space="preserve">Manakah di antara skenario berikut yang mencerminkan penerapan Dekomposisi yang paling tepat dan profesional menurut prinsip Berpikir Komputasional?</w:t>
+        <w:t xml:space="preserve">Mengapa keputusan Dr. Aris mengabaikan sebagian besar bangunan dan informasi tersebut dipandang sebagai penerapan abstraksi yang sangat tepat?</w:t>
       </w:r>
     </w:p>
     <w:p>
@@ -658,7 +658,7 @@
           <w:sz w:val="20"/>
           <w:szCs w:val="20"/>
         </w:rPr>
-        <w:t xml:space="preserve">Memecah penanganan krisis banjir lumpur beracun kota ke dalam tiga fokus investigasi spesifik: hidrologi/cuaca, evaluasi tata guna lahan hulu, dan uji kimia limbah sedimen.</w:t>
+        <w:t xml:space="preserve">Karena menyaring dan membuang informasi yang tidak berkaitan dengan sumber zat beracun, sehingga tenaga dan waktu penyelidikan terpusat pada sasaran yang tepat.</w:t>
       </w:r>
     </w:p>
     <w:p>
@@ -682,7 +682,7 @@
           <w:sz w:val="20"/>
           <w:szCs w:val="20"/>
         </w:rPr>
-        <w:t xml:space="preserve">Menginstruksikan satu orang ahli untuk menyelesaikan seluruh penyelidikan krisis hulu-hilir sendirian secara bersamaan.</w:t>
+        <w:t xml:space="preserve">Karena pabrik makanan dan toko kelontong telah membayar pajak perlindungan kepada pemerintah kota sehingga tidak boleh diperiksa.</w:t>
       </w:r>
     </w:p>
     <w:p>
@@ -706,7 +706,7 @@
           <w:sz w:val="20"/>
           <w:szCs w:val="20"/>
         </w:rPr>
-        <w:t xml:space="preserve">Membagi bantuan sembako kepada seluruh warga secara merata tanpa memeriksa apakah mereka terdampak langsung oleh banjir atau tidak.</w:t>
+        <w:t xml:space="preserve">Karena tim tidak memiliki peralatan yang memadai untuk menguji sampel dari pabrik kayu dan bangunan ruko warga.</w:t>
       </w:r>
     </w:p>
     <w:p>
@@ -730,7 +730,7 @@
           <w:sz w:val="20"/>
           <w:szCs w:val="20"/>
         </w:rPr>
-        <w:t xml:space="preserve">Mengelompokkan data industri di bantaran sungai semata-mata berdasarkan warna cat pagar dan tahun berdirinya bangunan pabrik.</w:t>
+        <w:t xml:space="preserve">Karena Dr. Aris ingin mempercepat penutupan kasus tanpa perlu membuktikan keterkaitan kimiawi dari limbah yang dibuang.</w:t>
       </w:r>
     </w:p>
     <w:p>
@@ -754,7 +754,7 @@
           <w:sz w:val="20"/>
           <w:szCs w:val="20"/>
         </w:rPr>
-        <w:t xml:space="preserve">Menghentikan seluruh operasional transportasi perkotaan secara mendadak tanpa menganalisis titik simpul kemacetan yang kritis.</w:t>
+        <w:t xml:space="preserve">Karena pilar abstraksi menuntut agar hanya pabrik berukuran paling besar yang berhak mendapatkan pemeriksaan lingkungan.</w:t>
       </w:r>
     </w:p>
     <w:p>
@@ -801,7 +801,7 @@
           <w:sz w:val="18"/>
           <w:szCs w:val="18"/>
         </w:rPr>
-        <w:t xml:space="preserve">Dekomposisi yang tepat memecah masalah besar menjadi sub-masalah logis dan terkelola berdasarkan domain determinan (cuaca, tata lahan, uji kimiawi) seperti yang dilakukan Dr. Aris pada materi CT.</w:t>
+        <w:t xml:space="preserve">Abstraksi adalah kemampuan memisahkan hal penting dari detail yang tidak penting. Mengabaikan pabrik non-logam (makanan/kayu) dan detail fisik (warna seragam/tahun berdiri) membantu tim memusatkan seluruh daya pada pabrik yang secara kimiawi membuang kromium dan timbal.</w:t>
       </w:r>
     </w:p>
     <w:p>
@@ -830,7 +830,7 @@
           <w:sz w:val="20"/>
           <w:szCs w:val="20"/>
         </w:rPr>
-        <w:t xml:space="preserve">Dalam materi pembelajaran CT Informatika Kelas X SMAN 1 Batu, dicontohkan seorang dokter yang memeriksa pasien dengan keluhan demam tinggi, nyeri sendi persendian, dan munculnya ruam merah di kulit. Dokter tersebut tidak memperlakukan pasien itu sebagai teka-teki baru yang terisolasi, melainkan segera mengaitkannya dengan pola pasien demam berdarah dengue (DBD) yang ia tangani pada masa sebelumnya.</w:t>
+        <w:t xml:space="preserve">Untuk mencegah terulangnya bencana, Dr. Aris menerbitkan pedoman kerja darurat: (1) Apabila ramalan cuaca menunjukkan hujan lebat di atas 150 milimeter per hari dan air laut pasang, maka sirine tanda bahaya dibunyikan; (2) Seluruh pabrik tekstil dan aki wajib menghentikan pembuangan limbah ke sungai dalam batas waktu paling lambat dua hari; (3) Petugas membuka pintu air pengatur arus sebesar 50 persen dan mengevakuasi penduduk zona bahaya.</w:t>
       </w:r>
     </w:p>
     <w:p>
@@ -843,7 +843,7 @@
           <w:sz w:val="20"/>
           <w:szCs w:val="20"/>
         </w:rPr>
-        <w:t xml:space="preserve">Prinsip komputasional apakah yang mendasari proses kognitif dokter tersebut, dan mengapa hal itu sangat krusial dalam pemecahan masalah?</w:t>
+        <w:t xml:space="preserve">Kriteria apa yang membuat rangkaian petunjuk kerja di atas memenuhi syarat sebagai sebuah algoritma yang baik?</w:t>
       </w:r>
     </w:p>
     <w:p>
@@ -867,7 +867,7 @@
           <w:sz w:val="20"/>
           <w:szCs w:val="20"/>
         </w:rPr>
-        <w:t xml:space="preserve">Pengenalan Pola (Pattern Recognition); memungkinkan penggunaan model solusi masa lalu untuk mempercepat diagnosis akurat dan penentuan uji laboratorium kritis.</w:t>
+        <w:t xml:space="preserve">Langkah-langkahnya tersusun runtut, memiliki batasan syarat yang pasti dan tegas, serta dapat dijalankan secara konsisten oleh seluruh petugas.</w:t>
       </w:r>
     </w:p>
     <w:p>
@@ -891,7 +891,7 @@
           <w:sz w:val="20"/>
           <w:szCs w:val="20"/>
         </w:rPr>
-        <w:t xml:space="preserve">Dekomposisi; dokter membagi tubuh pasien ke dalam organ-organ terpisah sebelum mendengarkan keluhan demam pasien.</w:t>
+        <w:t xml:space="preserve">Petunjuk tersebut ditulis menggunakan bahasa pemrograman komputer tingkat tinggi yang hanya dimengerti oleh mesin pemindai.</w:t>
       </w:r>
     </w:p>
     <w:p>
@@ -915,7 +915,7 @@
           <w:sz w:val="20"/>
           <w:szCs w:val="20"/>
         </w:rPr>
-        <w:t xml:space="preserve">Abstraksi Buta; dokter menolak mendengarkan keluhan pasien dan langsung menyalin resep obat dari buku pedoman umum.</w:t>
+        <w:t xml:space="preserve">Instruksi di dalamnya bersifat lentur dan bebas ditafsirkan berbeda-beda oleh masing-masing penjaga pintu air di lapangan.</w:t>
       </w:r>
     </w:p>
     <w:p>
@@ -939,7 +939,7 @@
           <w:sz w:val="20"/>
           <w:szCs w:val="20"/>
         </w:rPr>
-        <w:t xml:space="preserve">Algoritma Acak; dokter mencoba berbagai macam obat secara bergantian hingga salah satunya menunjukkan efek penyembuhan.</w:t>
+        <w:t xml:space="preserve">Rangkaian tindakan tersebut disusun tanpa mempertimbangkan kondisi keselamatan warga dan ketersediaan petugas tanggap darurat.</w:t>
       </w:r>
     </w:p>
     <w:p>
@@ -963,7 +963,7 @@
           <w:sz w:val="20"/>
           <w:szCs w:val="20"/>
         </w:rPr>
-        <w:t xml:space="preserve">Automasi Robotik; dokter menyerahkan seluruh pemeriksaan fisik kepada mesin rontgen tanpa melakukan wawancara anamnesis.</w:t>
+        <w:t xml:space="preserve">Aturan tersebut hanya berlaku satu kali saja dan tidak dapat digunakan kembali jika bencana banjir datang pada tahun berikutnya.</w:t>
       </w:r>
     </w:p>
     <w:p>
@@ -1010,7 +1010,7 @@
           <w:sz w:val="18"/>
           <w:szCs w:val="18"/>
         </w:rPr>
-        <w:t xml:space="preserve">Pengenalan Pola (Pattern Recognition) mengenali keteraturan dan kesamaan gejala saat ini dengan pengalaman historis, sehingga dokter dapat segera merekomendasikan tes trombosit darah secara efisien dan tepat sasaran.</w:t>
+        <w:t xml:space="preserve">Algoritma yang baik harus memiliki karakteristik langkah yang logis, berurutan, jelas tanpa makna ganda, memiliki kondisi bersyarat yang pasti, dan memberikan hasil yang seragam ketika dijalankan oleh siapa pun.</w:t>
       </w:r>
     </w:p>
     <w:p>
@@ -1039,7 +1039,7 @@
           <w:sz w:val="20"/>
           <w:szCs w:val="20"/>
         </w:rPr>
-        <w:t xml:space="preserve">Perhatikan diagram peta jaringan kereta bawah tanah (MRT) atau komuter perkotaan. Peta tersebut sengaja tidak menampilkan bentuk riil kelokan rel, pepohonan, luas bangunan gedung di atas permukaan tanah, maupun variasi kontur perbukitan. Peta hanya memvisualisasikan garis lurus berwarna, urutan nama stasiun, dan titik persimpangan transit antarlini.</w:t>
+        <w:t xml:space="preserve">Bayangkan jika Dr. Aris tidak menerapkan pilar abstraksi dalam penyelidikan limbah di Kota Delta, melainkan mewajibkan timnya mendata secara lengkap setiap pohon di pinggir sungai, mewawancarai seluruh pemilik warung kopi, mencatat tanggal lahir setiap buruh pabrik, dan mengukur luas jendela setiap ruko.</w:t>
       </w:r>
     </w:p>
     <w:p>
@@ -1052,7 +1052,7 @@
           <w:sz w:val="20"/>
           <w:szCs w:val="20"/>
         </w:rPr>
-        <w:t xml:space="preserve">Mengapa penyederhanaan pada peta MRT tersebut dikategorikan sebagai bentuk Abstraksi tingkat tinggi yang berhasil?</w:t>
+        <w:t xml:space="preserve">Risiko sistemik apakah yang paling mungkin terjadi terhadap operasi penanggulangan bencana akibat kelalaian tersebut?</w:t>
       </w:r>
     </w:p>
     <w:p>
@@ -1076,7 +1076,7 @@
           <w:sz w:val="20"/>
           <w:szCs w:val="20"/>
         </w:rPr>
-        <w:t xml:space="preserve">Menyaring dan mempertahankan informasi esensial yang diperlukan penumpang (rute, stasiun, transit) sembari mengeliminasi detail fisik yang tidak relevan (noise visual).</w:t>
+        <w:t xml:space="preserve">Tim penyelidik akan kehabisan waktu dan tenaga karena tenggelam dalam lautan data yang tidak penting, sehingga sumber racun utama gagal dihentikan tepat waktu.</w:t>
       </w:r>
     </w:p>
     <w:p>
@@ -1100,7 +1100,7 @@
           <w:sz w:val="20"/>
           <w:szCs w:val="20"/>
         </w:rPr>
-        <w:t xml:space="preserve">Peta sengaja dibuat membingungkan agar masyarakat lebih memilih menggunakan kendaraan pribadi di jalan raya.</w:t>
+        <w:t xml:space="preserve">Sungai Kota Delta akan secara otomatis kembali jernih karena seluruh warga merasa diawasi oleh petugas pemeriksa.</w:t>
       </w:r>
     </w:p>
     <w:p>
@@ -1124,7 +1124,7 @@
           <w:sz w:val="20"/>
           <w:szCs w:val="20"/>
         </w:rPr>
-        <w:t xml:space="preserve">Agar ukuran file gambar digital pada aplikasi ponsel pintar menjadi sekecil mungkin tanpa memedulikan kenyamanan pengguna.</w:t>
+        <w:t xml:space="preserve">Pabrik tekstil dan aki pembuang limbah berbahaya akan secara sukarela menyerahkan diri tanpa perlu diuji sampel limbahnya.</w:t>
       </w:r>
     </w:p>
     <w:p>
@@ -1148,7 +1148,7 @@
           <w:sz w:val="20"/>
           <w:szCs w:val="20"/>
         </w:rPr>
-        <w:t xml:space="preserve">Perancang peta kekurangan waktu dan anggaran untuk menggambar gedung dan pohon di sekitar stasiun secara realistis.</w:t>
+        <w:t xml:space="preserve">Waktu eksekusi penanganan menjadi jauh lebih singkat karena semakin banyak informasi yang dikumpulkan maka komputer semakin cepat mengolahnya.</w:t>
       </w:r>
     </w:p>
     <w:p>
@@ -1172,7 +1172,7 @@
           <w:sz w:val="20"/>
           <w:szCs w:val="20"/>
         </w:rPr>
-        <w:t xml:space="preserve">Jalur kereta bawah tanah tidak terikat dengan hukum gravitasi dan tata ruang permukaan bumi sehingga gedung diabaikan.</w:t>
+        <w:t xml:space="preserve">Curah hujan ekstrem akan berhenti secara mendadak karena proses pendataan administratif berlangsung sangat terperinci.</w:t>
       </w:r>
     </w:p>
     <w:p>
@@ -1219,7 +1219,7 @@
           <w:sz w:val="18"/>
           <w:szCs w:val="18"/>
         </w:rPr>
-        <w:t xml:space="preserve">Abstraksi adalah seni memilah informasi esensial (stasiun &amp; jalur) yang dibutuhkan agen pemroses (penumpang) dan mengabaikan detail tidak relevan (gedung, pohon, belokan riil) yang hanya mengotori persepsi.</w:t>
+        <w:t xml:space="preserve">Tanpa abstraksi untuk memilah data yang relevan, penyelesaian masalah akan tertimbun oleh detail yang tidak berguna (informasi pengganggu). Akibatnya, sumber daya habis dan akar penyebab masalah gagal dituntaskan sebelum bencana berikutnya melanda.</w:t>
       </w:r>
     </w:p>
     <w:p>
@@ -1248,7 +1248,7 @@
           <w:sz w:val="20"/>
           <w:szCs w:val="20"/>
         </w:rPr>
-        <w:t xml:space="preserve">Dalam pilar Berpikir Algoritma (Algorithmic Thinking), suatu rancangan instruksi penyelesaian masalah dituntut memenuhi serangkaian syarat formal agar dapat dijalankan secara konsisten oleh manusia maupun komputer. Instruksi tersebut tidak boleh mengandalkan asumsi implisit atau interpretasi emosional pelaksananya.</w:t>
+        <w:t xml:space="preserve">Pedoman penanganan banjir yang dirancang di Kota Delta diadaptasi oleh pemerintah daerah lain yang memiliki kondisi perbukitan terjal dan sungai berarus deras tanpa fenomena pasang laut. Tim perancang di daerah baru tersebut mempertahankan kerangka kerja logika Dr. Aris, namun mengganti variabel kondisi laut pasang dengan variabel kemiringan lereng tanah yang rawan longsor.</w:t>
       </w:r>
     </w:p>
     <w:p>
@@ -1261,7 +1261,7 @@
           <w:sz w:val="20"/>
           <w:szCs w:val="20"/>
         </w:rPr>
-        <w:t xml:space="preserve">Manakah kriteria yang PALING MENENTUKAN bahwa suatu prosedur telah memenuhi kaidah algoritma komputasional yang berkualitas?</w:t>
+        <w:t xml:space="preserve">Prinsip berpikir komputasional apa yang ditunjukkan oleh tim perancang di daerah baru tersebut?</w:t>
       </w:r>
     </w:p>
     <w:p>
@@ -1285,7 +1285,7 @@
           <w:sz w:val="20"/>
           <w:szCs w:val="20"/>
         </w:rPr>
-        <w:t xml:space="preserve">Memiliki urutan langkah logis yang terperinci, berhingga (finite), tidak ambigu (unambiguous), dan menghasilkan luaran deterministik yang sama saat diuji ulang.</w:t>
+        <w:t xml:space="preserve">Pemanfaatan kembali solusi umum dengan menyesuaikan parameter yang sesuai dengan kondisi lingkungan setempat.</w:t>
       </w:r>
     </w:p>
     <w:p>
@@ -1309,7 +1309,7 @@
           <w:sz w:val="20"/>
           <w:szCs w:val="20"/>
         </w:rPr>
-        <w:t xml:space="preserve">Ditulis dalam bahasa Inggris tingkat tinggi dan hanya dapat dipahami oleh programmer bersertifikasi internasional.</w:t>
+        <w:t xml:space="preserve">Penyalinan tanpa modifikasi yang membuktikan bahwa seluruh bencana alam di dunia memiliki karakter yang persis sama.</w:t>
       </w:r>
     </w:p>
     <w:p>
@@ -1333,7 +1333,7 @@
           <w:sz w:val="20"/>
           <w:szCs w:val="20"/>
         </w:rPr>
-        <w:t xml:space="preserve">Memiliki minimal seratus tahapan kerja agar prosedur terlihat sangat rumit dan canggih di mata publik.</w:t>
+        <w:t xml:space="preserve">Penolakan terhadap pilar algoritma karena pedoman dari daerah lain tidak boleh diterapkan di wilayah berbeda.</w:t>
       </w:r>
     </w:p>
     <w:p>
@@ -1357,7 +1357,7 @@
           <w:sz w:val="20"/>
           <w:szCs w:val="20"/>
         </w:rPr>
-        <w:t xml:space="preserve">Setiap instruksi bersifat lentur dan sengaja multitafsir agar pelaksana lapangan bebas mengubah urutan sesuka hati.</w:t>
+        <w:t xml:space="preserve">Penerapan coba-coba tanpa dasar perhitungan nalar yang jelas untuk melihat apakah bencana tanah longsor bisa dicegah.</w:t>
       </w:r>
     </w:p>
     <w:p>
@@ -1381,7 +1381,7 @@
           <w:sz w:val="20"/>
           <w:szCs w:val="20"/>
         </w:rPr>
-        <w:t xml:space="preserve">Hanya dapat dijalankan jika perangkat komputer terhubung dengan jaringan internet satelit berkecepatan gigabit.</w:t>
+        <w:t xml:space="preserve">Penghapusan seluruh data lingkungan karena penanganan tanah longsor sama sekali tidak memerlukan data masa lalu.</w:t>
       </w:r>
     </w:p>
     <w:p>
@@ -1428,7 +1428,7 @@
           <w:sz w:val="18"/>
           <w:szCs w:val="18"/>
         </w:rPr>
-        <w:t xml:space="preserve">Algoritma yang baik wajib bersifat presisi, deterministik (tidak ambigu), memiliki batas langkah jelas (finiteness), dan menghasilkan output konsisten jika diberi input yang sama.</w:t>
+        <w:t xml:space="preserve">Salah satu keunggulan berpikir komputasional adalah kemampuan menghasilkan model solusi yang dapat digunakan kembali (reusable model). Kerangka dasar algoritma tetap dipakai, sementara variabel input disesuaikan dengan kondisi setempat.</w:t>
       </w:r>
     </w:p>
     <w:p>
@@ -1457,7 +1457,7 @@
           <w:sz w:val="20"/>
           <w:szCs w:val="20"/>
         </w:rPr>
-        <w:t xml:space="preserve">Kota Delta adalah kawasan industri padat yang dilintasi oleh Sungai Ciliwung. Selama tiga tahun terakhir pada setiap puncak musim hujan bulan Januari, wilayah hilir Kota Delta selalu dilanda banjir bandang bercampur lumpur beracun yang melumpuhkan aktivitas ekonomi dan menyebabkan ribuan warga mengungsi. Pemerintah daerah membentuk Tim Satgas Penanggulangan Krisis yang dipimpin oleh Dr. Aris.</w:t>
+        <w:t xml:space="preserve">Gempa bumi besar melanda kawasan pegunungan dan memutus seluruh jalan raya darat menuju 15 desa. Kapten Rina dari tim penyelamat udara ditugaskan mengantarkan bantuan dengan 5 unit helikopter. Melihat situasi yang kacau, Kapten Rina tidak langsung menerbangkan armada tanpa rencana. Ia mengelompokkan 15 desa tersebut ke dalam tiga wilayah: Wilayah Utara (kerusakan paling berat dan medan sangat terjal), Wilayah Tengah (kerusakan sedang), dan Wilayah Selatan (kerusakan ringan dengan akses relatif aman).</w:t>
       </w:r>
     </w:p>
     <w:p>
@@ -1470,7 +1470,7 @@
           <w:sz w:val="20"/>
           <w:szCs w:val="20"/>
         </w:rPr>
-        <w:t xml:space="preserve">Menghadapi krisis masif ini, Dr. Aris secara tegas menolak solusi reaktif semacam sekadar membagikan sembako atau menambal tanggul sementara. Mengapa penolakan Dr. Aris tersebut mencerminkan penerapan pola pikir Berpikir Komputasional tingkat tinggi?</w:t>
+        <w:t xml:space="preserve">Tindakan Kapten Rina dalam mengelompokkan desa-desa terdampak tersebut merupakan cerminan dari pilar:</w:t>
       </w:r>
     </w:p>
     <w:p>
@@ -1494,7 +1494,7 @@
           <w:sz w:val="20"/>
           <w:szCs w:val="20"/>
         </w:rPr>
-        <w:t xml:space="preserve">Karena solusi reaktif hanya meredakan gejala permukaan (symptomatic) tanpa menyentuh analisis kausalitas sistemik yang menjadi akar utama bencana.</w:t>
+        <w:t xml:space="preserve">Dekomposisi; mengurai wilayah operasi yang luas dan rumit menjadi satuan-satuan area yang lebih teratur berdasarkan skala prioritas.</w:t>
       </w:r>
     </w:p>
     <w:p>
@@ -1518,7 +1518,7 @@
           <w:sz w:val="20"/>
           <w:szCs w:val="20"/>
         </w:rPr>
-        <w:t xml:space="preserve">Karena Dr. Aris menilai anggaran belanja sembako daerah terlalu murah sehingga tidak mengangkat gengsi penelitian tim satgas.</w:t>
+        <w:t xml:space="preserve">Abstraksi semu; meniadakan desa-desa di Wilayah Selatan agar tim tidak perlu mengirimkan bantuan ke sana.</w:t>
       </w:r>
     </w:p>
     <w:p>
@@ -1542,7 +1542,7 @@
           <w:sz w:val="20"/>
           <w:szCs w:val="20"/>
         </w:rPr>
-        <w:t xml:space="preserve">Karena warga pengungsi di hilir sungai menolak menerima bantuan logistik sebelum pabrik-pabrik ditutup secara paksa.</w:t>
+        <w:t xml:space="preserve">Algoritma acak; memilih rute penerbangan secara mendadak tergantung pada arah hembusan angin di pagi hari.</w:t>
       </w:r>
     </w:p>
     <w:p>
@@ -1566,7 +1566,7 @@
           <w:sz w:val="20"/>
           <w:szCs w:val="20"/>
         </w:rPr>
-        <w:t xml:space="preserve">Karena Dr. Aris ingin menunggu hingga banjir surut dengan sendirinya tanpa intervensi manusia sama sekali.</w:t>
+        <w:t xml:space="preserve">Otomatisasi mesin; memprogram komputer helikopter agar terbang sendiri tanpa memerlukan pilot manusia.</w:t>
       </w:r>
     </w:p>
     <w:p>
@@ -1590,7 +1590,7 @@
           <w:sz w:val="20"/>
           <w:szCs w:val="20"/>
         </w:rPr>
-        <w:t xml:space="preserve">Karena pembagian sembako secara hukum dilarang dalam undang-undang manajemen penanggulangan bencana alam darurat.</w:t>
+        <w:t xml:space="preserve">Pengenalan pola cuaca; membuktikan bahwa gempa bumi selalu terjadi bersamaan dengan kabut tebal di pegunungan.</w:t>
       </w:r>
     </w:p>
     <w:p>
@@ -1637,7 +1637,7 @@
           <w:sz w:val="18"/>
           <w:szCs w:val="18"/>
         </w:rPr>
-        <w:t xml:space="preserve">CT berorientasi pada pemecahan masalah berbasis akar penyebab (root-cause solving). Membagikan sembako adalah respons reaktif yang tidak menyelesaikan akar masalah hidrologi, alih fungsi lahan hulu, maupun pencemaran B3.</w:t>
+        <w:t xml:space="preserve">Memetakan 15 desa menjadi 3 sektor berdasarkan tingkat keparahan adalah bentuk Dekomposisi. Masalah logistik yang luar biasa rumit diurai menjadi unit-unit kerja yang terkelola sehingga alokasi armada helikopter dapat diprioritaskan secara adil dan tepat.</w:t>
       </w:r>
     </w:p>
     <w:p>
@@ -1666,7 +1666,7 @@
           <w:sz w:val="20"/>
           <w:szCs w:val="20"/>
         </w:rPr>
-        <w:t xml:space="preserve">Untuk mengungkap akar bencana banjir lumpur beracun di Kota Delta, Dr. Aris membagi investigasi ke dalam tiga area fokus yang independen namun saling melengkapi: (1) Tim Analisis Curah Hujan dan Tata Air, (2) Tim Evaluasi Tata Guna Lahan dan Deforestasi di hulu sungai, dan (3) Tim Uji Kualitas Air untuk mengidentifikasi kandungan kimiawi lumpur sedimen.</w:t>
+        <w:t xml:space="preserve">Dari laporan operasi darurat tahun-tahun sebelumnya di daerah pegunungan yang sama, Kapten Rina menyadari adanya keteraturan alam: wilayah lembah curam di Wilayah Utara selalu tertutup kabut tebal yang sangat pekat setelah pukul 14.00 siang, sehingga penerbangan helikopter menjadi mustahil dan berbahaya.</w:t>
       </w:r>
     </w:p>
     <w:p>
@@ -1679,7 +1679,7 @@
           <w:sz w:val="20"/>
           <w:szCs w:val="20"/>
         </w:rPr>
-        <w:t xml:space="preserve">Dari perspektif pemrosesan informasi, keunggulan ilmiah apakah yang diperoleh melalui dekomposisi tiga area fokus investigasi tersebut?</w:t>
+        <w:t xml:space="preserve">Bagaimana Kapten Rina memanfaatkan pengenalan pola tersebut dalam menyusun strategi misi penyelamatan?</w:t>
       </w:r>
     </w:p>
     <w:p>
@@ -1703,7 +1703,7 @@
           <w:sz w:val="20"/>
           <w:szCs w:val="20"/>
         </w:rPr>
-        <w:t xml:space="preserve">Memungkinkan investigasi mendalam dan pengumpulan bukti saintifik berjalan secara paralel pada tiga determinan kritis: atmosferik, bentang lahan, dan polutan kimia.</w:t>
+        <w:t xml:space="preserve">Mengerahkan seluruh kekuatan armada helikopter ke Wilayah Utara sejak pagi hari sebelum jendela waktu penerbangan tertutup oleh kabut tebal.</w:t>
       </w:r>
     </w:p>
     <w:p>
@@ -1727,7 +1727,7 @@
           <w:sz w:val="20"/>
           <w:szCs w:val="20"/>
         </w:rPr>
-        <w:t xml:space="preserve">Menghilangkan kebutuhan rapat koordinasi karena ketiga tim dilarang saling bertukar data hingga bencana tahun berikutnya tiba.</w:t>
+        <w:t xml:space="preserve">Membatalkan seluruh misi penerbangan ke Wilayah Utara dan membiarkan warga di sana menunggu hingga musim kemarau tiba.</w:t>
       </w:r>
     </w:p>
     <w:p>
@@ -1751,7 +1751,7 @@
           <w:sz w:val="20"/>
           <w:szCs w:val="20"/>
         </w:rPr>
-        <w:t xml:space="preserve">Memastikan seluruh anggaran belanja investigasi terbagi rata menjadi sepertiga bagian tanpa sisa di rekening kas daerah.</w:t>
+        <w:t xml:space="preserve">Memerintahkan para pilot untuk tetap nekat menerobos kabut tebal pada sore hari demi menunjukkan keberanian tim penyelamat.</w:t>
       </w:r>
     </w:p>
     <w:p>
@@ -1775,7 +1775,7 @@
           <w:sz w:val="20"/>
           <w:szCs w:val="20"/>
         </w:rPr>
-        <w:t xml:space="preserve">Membuktikan bahwa banjir lumpur sebenarnya tidak berkaitan sama sekali dengan kondisi lingkungan di hulu sungai.</w:t>
+        <w:t xml:space="preserve">Mengalihkan seluruh helikopter ke Wilayah Selatan di pagi hari karena wilayah tersebut tidak pernah berkabut.</w:t>
       </w:r>
     </w:p>
     <w:p>
@@ -1799,7 +1799,7 @@
           <w:sz w:val="20"/>
           <w:szCs w:val="20"/>
         </w:rPr>
-        <w:t xml:space="preserve">Membebaskan Dr. Aris dari tanggung jawab pelaporan kepada gubernur karena investigasi telah didelegasikan kepada ketua tim.</w:t>
+        <w:t xml:space="preserve">Menghapus catatan kabut masa lalu dari papan rencana operasi karena dianggap hanya perkiraan cuaca yang belum tentu terulang.</w:t>
       </w:r>
     </w:p>
     <w:p>
@@ -1846,7 +1846,7 @@
           <w:sz w:val="18"/>
           <w:szCs w:val="18"/>
         </w:rPr>
-        <w:t xml:space="preserve">Dekomposisi memecah kompleksitas krisis lingkungan menjadi 3 subsistem (atmosferik cuaca, hidrologi hulu, polutan industri) yang dapat dianalisis secara saintifik, paralel, dan mendalam.</w:t>
+        <w:t xml:space="preserve">Pengenalan pola membantu memprediksi batasan kritis lingkungan. Mengetahui bahwa kabut tebal menutup lembah utara setelah jam 14.00 siang mendasari keputusan logis untuk memfokuskan seluruh helikopter ke sektor paling berbahaya tersebut pada pagi hari (06.00-10.00).</w:t>
       </w:r>
     </w:p>
     <w:p>
@@ -1875,7 +1875,7 @@
           <w:sz w:val="20"/>
           <w:szCs w:val="20"/>
         </w:rPr>
-        <w:t xml:space="preserve">Setelah satu bulan mengumpulkan dan merekonsiliasi data, Tim Analisis membandingkan catatan cuaca, hidrologi, dan pasang surut selama 20 tahun terakhir. Mereka menemukan kecenderungan konsisten: banjir bandang besar selalu dan HANYA terjadi jika curah hujan harian melebihi 150 mm/hari berturut-turut selama tiga hari yang bertepatan dengan fenomena pasang air laut maksimum (rob).</w:t>
+        <w:t xml:space="preserve">Saat proses pemuatan barang ke helikopter, para sukarelawan menerima berbagai macam sumbangan berupa pakaian pesta bekas, boneka, buku cerita, mi instan, obat-obatan darurat, air minum dalam kemasan, dan perangkat radio komunikasi. Karena daya angkut beban helikopter sangat terbatas, Kapten Rina menegaskan bahwa selama tiga hari pertama armada hanya mengangkut air bersih, obat pertolongan pertama, makanan berkalori tinggi, dan radio komunikasi.</w:t>
       </w:r>
     </w:p>
     <w:p>
@@ -1888,7 +1888,7 @@
           <w:sz w:val="20"/>
           <w:szCs w:val="20"/>
         </w:rPr>
-        <w:t xml:space="preserve">Penemuan kecenderungan konsisten tersebut merupakan manifestasi pilar Pengenalan Pola karena...</w:t>
+        <w:t xml:space="preserve">Argumentasi rasional apa yang mendasari penerapan abstraksi oleh Kapten Rina dalam situasi darurat tersebut?</w:t>
       </w:r>
     </w:p>
     <w:p>
@@ -1912,7 +1912,7 @@
           <w:sz w:val="20"/>
           <w:szCs w:val="20"/>
         </w:rPr>
-        <w:t xml:space="preserve">Menemukan keteraturan hubungan berulang dari rekaman data historis jangka panjang yang berfungsi sebagai kondisi batas pemicu (trigger boundary) bencana.</w:t>
+        <w:t xml:space="preserve">Mengabaikan barang-barang yang bukan kebutuhan penyelamat jiwa demi memaksimalkan muatan kebutuhan pokok yang menentukan kelangsungan hidup korban.</w:t>
       </w:r>
     </w:p>
     <w:p>
@@ -1936,7 +1936,7 @@
           <w:sz w:val="20"/>
           <w:szCs w:val="20"/>
         </w:rPr>
-        <w:t xml:space="preserve">Mengabaikan faktor pasang air laut rob karena air laut berada di hilir dan tidak memengaruhi aliran air tawar sungai.</w:t>
+        <w:t xml:space="preserve">Menolak barang sumbangan warga karena helikopter hanya diperbolehkan membawa barang yang dibeli oleh dinas pemerintah.</w:t>
       </w:r>
     </w:p>
     <w:p>
@@ -1960,7 +1960,7 @@
           <w:sz w:val="20"/>
           <w:szCs w:val="20"/>
         </w:rPr>
-        <w:t xml:space="preserve">Merupakan kebetulan statistik yang tidak memiliki korelasi fisika atmosfer dengan meluapnya air sungai Ciliwung.</w:t>
+        <w:t xml:space="preserve">Mengurangi beban kerja petugas gudang agar mereka memiliki waktu istirahat yang lebih lama di pangkalan posko.</w:t>
       </w:r>
     </w:p>
     <w:p>
@@ -1984,7 +1984,7 @@
           <w:sz w:val="20"/>
           <w:szCs w:val="20"/>
         </w:rPr>
-        <w:t xml:space="preserve">Membuktikan bahwa prediksi banjir dapat dilakukan tanpa memerlukan data kuantitatif curah hujan dari BMKG.</w:t>
+        <w:t xml:space="preserve">Menyenangkan hati para penyumbang makanan dengan mendahulukan produk makanan pabrik tertentu.</w:t>
       </w:r>
     </w:p>
     <w:p>
@@ -2008,7 +2008,7 @@
           <w:sz w:val="20"/>
           <w:szCs w:val="20"/>
         </w:rPr>
-        <w:t xml:space="preserve">Menunjukkan bahwa data cuaca selama 20 tahun tidak dapat dipercaya untuk menyusun model peringatan dini banjir.</w:t>
+        <w:t xml:space="preserve">Menunjukkan wewenang mutlak seorang pimpinan operasi logistik tanpa perlu menjelaskan alasannya kepada sukarelawan.</w:t>
       </w:r>
     </w:p>
     <w:p>
@@ -2055,7 +2055,7 @@
           <w:sz w:val="18"/>
           <w:szCs w:val="18"/>
         </w:rPr>
-        <w:t xml:space="preserve">Pengenalan Pola menemukan keteraturan (curah hujan &gt;150mm/hari 3 hari berturut-turut + pasang rob maksimum) dari data 20 tahun sebagai pemicu deterministik bencana untuk dijadikan basis sistem deteksi dini.</w:t>
+        <w:t xml:space="preserve">Abstraksi diterapkan dengan menyortir muatan: menyingkirkan barang non-kritis (pakaian bekas, mainan) dan memusatkan kapasitas terbatas helikopter pada kebutuhan paling esensial (air, obat, makanan bergizi, alat komunikasi) yang menyelamatkan nyawa pada 72 jam pertama.</w:t>
       </w:r>
     </w:p>
     <w:p>
@@ -2084,7 +2084,7 @@
           <w:sz w:val="20"/>
           <w:szCs w:val="20"/>
         </w:rPr>
-        <w:t xml:space="preserve">Tim Uji Kualitas Air mendeteksi konsentrasi tinggi logam berat berbahaya kromium dan timbal di dalam lumpur banjir. Saat mengolah peta industri di sepanjang bantaran sungai, Dr. Aris memutuskan untuk HANYA memeriksa pabrik tekstil dan pabrik aki baterai. Ia secara sadar mengabaikan ratusan pabrik makanan, pabrik kayu, dan ruko-ruko kecil, serta tidak memedulikan warna seragam pekerja maupun tahun berdiri pabrik.</w:t>
+        <w:t xml:space="preserve">Jadwal penerbangan yang disusun Kapten Rina memuat rincian: Pukul 06.00–10.00 pengerahan seluruh helikopter ke Wilayah Utara; Pukul 10.00–11.00 seluruh armada kembali ke pangkalan untuk pengisian ulang bahan bakar dan pengecekan mesin; Pukul 11.00–14.00 pembagian armada ke Wilayah Tengah dan Selatan; Pukul 14.00 operasi udara dihentikan untuk perawatan rutin dan menghindari kabut sore.</w:t>
       </w:r>
     </w:p>
     <w:p>
@@ -2097,7 +2097,7 @@
           <w:sz w:val="20"/>
           <w:szCs w:val="20"/>
         </w:rPr>
-        <w:t xml:space="preserve">Alasan rasional paling mendasar mengapa pengabaian data tersebut merupakan penerapan Abstraksi yang sangat tepat adalah...</w:t>
+        <w:t xml:space="preserve">Mengapa jadwal kerja terstruktur tersebut dipandang sebagai implementasi pilar algoritma yang sangat efektif?</w:t>
       </w:r>
     </w:p>
     <w:p>
@@ -2121,7 +2121,7 @@
           <w:sz w:val="20"/>
           <w:szCs w:val="20"/>
         </w:rPr>
-        <w:t xml:space="preserve">Menyaring variabel yang tidak relevan (noise) agar fokus tim tercurah pada penghasil potensial kromium dan timbal, sehingga menghemat waktu dan sumber daya krusial.</w:t>
+        <w:t xml:space="preserve">Menyediakan panduan langkah kerja yang runtut waktu, terukur alokasi sumber dayanya, dan mencegah kebingungan para pilot di lapangan.</w:t>
       </w:r>
     </w:p>
     <w:p>
@@ -2145,7 +2145,7 @@
           <w:sz w:val="20"/>
           <w:szCs w:val="20"/>
         </w:rPr>
-        <w:t xml:space="preserve">Dr. Aris meyakini bahwa pabrik kayu dan makanan tidak menggunakan air sungai untuk membuang limbah domestik.</w:t>
+        <w:t xml:space="preserve">Membuat helikopter dapat terbang lebih cepat melampaui batas kecepatan maksimal yang ditentukan pabrik pembuatnya.</w:t>
       </w:r>
     </w:p>
     <w:p>
@@ -2169,7 +2169,7 @@
           <w:sz w:val="20"/>
           <w:szCs w:val="20"/>
         </w:rPr>
-        <w:t xml:space="preserve">Pabrik aki baterai dan tekstil berada di bawah naungan kementerian yang berbeda dengan pabrik makanan.</w:t>
+        <w:t xml:space="preserve">Menjamin bahwa seluruh warga di 15 desa akan mendapatkan jumlah pasokan beras yang sama persis tanpa selisih satu butir pun.</w:t>
       </w:r>
     </w:p>
     <w:p>
@@ -2193,7 +2193,7 @@
           <w:sz w:val="20"/>
           <w:szCs w:val="20"/>
         </w:rPr>
-        <w:t xml:space="preserve">Pabrik makanan dan ruko kecil membayar retribusi keamanan lebih tinggi kepada dinas perindustrian kota.</w:t>
+        <w:t xml:space="preserve">Menghilangkan kebutuhan pilot manusia karena helikopter dapat terbang secara mandiri mengikuti tulisan di papan tulis posko.</w:t>
       </w:r>
     </w:p>
     <w:p>
@@ -2217,7 +2217,7 @@
           <w:sz w:val="20"/>
           <w:szCs w:val="20"/>
         </w:rPr>
-        <w:t xml:space="preserve">Warna seragam pekerja dan tahun berdiri pabrik merupakan rahasia negara yang dilindungi undang-undang intelijen bisnis.</w:t>
+        <w:t xml:space="preserve">Memastikan seluruh anggaran operasional bahan bakar avtur habis digunakan dalam satu hari pelaksanaan misi.</w:t>
       </w:r>
     </w:p>
     <w:p>
@@ -2264,7 +2264,7 @@
           <w:sz w:val="18"/>
           <w:szCs w:val="18"/>
         </w:rPr>
-        <w:t xml:space="preserve">Abstraksi mengeliminasi variabel noise (pabrik non-B3, warna seragam, usia bangunan) dan memusatkan investigasi hanya pada pabrik yang secara kimiawi memproduksi limbah kromium dan timbal.</w:t>
+        <w:t xml:space="preserve">Algoritma memberikan petunjuk langkah demi langkah yang pasti, kronologis, dan dapat dieksekusi secara seragam oleh seluruh pilot. Ini meminimalkan kesalahan manusia dan memaksimalkan keselamatan armada.</w:t>
       </w:r>
     </w:p>
     <w:p>
@@ -2293,59 +2293,7 @@
           <w:sz w:val="20"/>
           <w:szCs w:val="20"/>
         </w:rPr>
-        <w:t xml:space="preserve">Pada akhirnya, Dr. Aris menyusun Protokol Mitigasi Kota Delta yang mengikat secara hukum:</w:t>
-      </w:r>
-    </w:p>
-    <w:p>
-      <w:pPr>
-        <w:spacing w:after="100"/>
-      </w:pPr>
-      <w:r>
-        <w:rPr>
-          <w:rFonts w:ascii="Arial" w:cs="Arial" w:eastAsia="Arial" w:hAnsi="Arial"/>
-          <w:sz w:val="20"/>
-          <w:szCs w:val="20"/>
-        </w:rPr>
-        <w:t xml:space="preserve">Langkah 1: Jika BMKG merilis peringatan curah hujan &gt;150 mm/hari dan pasang laut maksimum terindikasi, maka sirine Level 1 dibunyikan.</w:t>
-      </w:r>
-    </w:p>
-    <w:p>
-      <w:pPr>
-        <w:spacing w:after="100"/>
-      </w:pPr>
-      <w:r>
-        <w:rPr>
-          <w:rFonts w:ascii="Arial" w:cs="Arial" w:eastAsia="Arial" w:hAnsi="Arial"/>
-          <w:sz w:val="20"/>
-          <w:szCs w:val="20"/>
-        </w:rPr>
-        <w:t xml:space="preserve">Langkah 2: Seluruh pabrik tekstil dan aki wajib menghentikan pembuangan limbah cair ke sungai dalam waktu 2x24 jam.</w:t>
-      </w:r>
-    </w:p>
-    <w:p>
-      <w:pPr>
-        <w:spacing w:after="100"/>
-      </w:pPr>
-      <w:r>
-        <w:rPr>
-          <w:rFonts w:ascii="Arial" w:cs="Arial" w:eastAsia="Arial" w:hAnsi="Arial"/>
-          <w:sz w:val="20"/>
-          <w:szCs w:val="20"/>
-        </w:rPr>
-        <w:t xml:space="preserve">Langkah 3: Pintu air Katulampa Utara dibuka 50% untuk memecah debit, sementara warga zona merah dievakuasi ke zona aman.</w:t>
-      </w:r>
-    </w:p>
-    <w:p>
-      <w:pPr>
-        <w:spacing w:after="100"/>
-      </w:pPr>
-      <w:r>
-        <w:rPr>
-          <w:rFonts w:ascii="Arial" w:cs="Arial" w:eastAsia="Arial" w:hAnsi="Arial"/>
-          <w:sz w:val="20"/>
-          <w:szCs w:val="20"/>
-        </w:rPr>
-        <w:t xml:space="preserve">Struktur kontrol logika pemrograman komputasional apakah yang paling mendasari "Langkah 1" pada Protokol Mitigasi tersebut?</w:t>
+        <w:t xml:space="preserve">Pada jadwal penerbangan Kapten Rina, terdapat jeda waktu antara pukul 10.00 hingga 11.00 yang khusus dialokasikan untuk pengisian ulang bahan bakar dan pemeriksaan rotor mesin di pangkalan. Jika seorang petugas mengusulkan untuk menghapus jeda waktu tersebut agar bantuan dapat dikirim tanpa henti ke desa berikutnya, risiko fatal apakah yang akan dihadapi sistem operasi logistik tersebut?</w:t>
       </w:r>
     </w:p>
     <w:p>
@@ -2369,7 +2317,7 @@
           <w:sz w:val="20"/>
           <w:szCs w:val="20"/>
         </w:rPr>
-        <w:t xml:space="preserve">Percabangan kondisional logika ganda (IF curah_hujan &gt; 150 AND pasang_rob == TRUE THEN aktifkan_sirine_level_1).</w:t>
+        <w:t xml:space="preserve">Helikopter berisiko kehabisan bahan bakar atau mengalami gangguan mesin di tengah penerbangan yang dapat menyebabkan kecelakaan mematikan.</w:t>
       </w:r>
     </w:p>
     <w:p>
@@ -2393,7 +2341,7 @@
           <w:sz w:val="20"/>
           <w:szCs w:val="20"/>
         </w:rPr>
-        <w:t xml:space="preserve">Perulangan tanpa henti (Infinite While Loop) yang membunyikan sirine sepanjang tahun tanpa memeriksa kondisi cuaca.</w:t>
+        <w:t xml:space="preserve">Warga desa penerima bantuan akan merasa bosan karena paket bantuan datang terlalu cepat dari perkiraan semula.</w:t>
       </w:r>
     </w:p>
     <w:p>
@@ -2417,7 +2365,7 @@
           <w:sz w:val="20"/>
           <w:szCs w:val="20"/>
         </w:rPr>
-        <w:t xml:space="preserve">Struktur antrean berurutan (Queue - FIFO) untuk mengevakuasi seluruh warga kota tanpa memandang zonasi merah atau hijau.</w:t>
+        <w:t xml:space="preserve">Harga bahan bakar helikopter di pasaran akan melonjak tinggi karena dibeli pada waktu siang hari.</w:t>
       </w:r>
     </w:p>
     <w:p>
@@ -2441,7 +2389,7 @@
           <w:sz w:val="20"/>
           <w:szCs w:val="20"/>
         </w:rPr>
-        <w:t xml:space="preserve">Fungsi rekursif yang secara terus menerus membuka dan menutup pintu air Katulampa setiap detik secara acak.</w:t>
+        <w:t xml:space="preserve">Pangkalan posko akan kelebihan persediaan logistik makanan karena gudang tidak sempat menampung kiriman baru.</w:t>
       </w:r>
     </w:p>
     <w:p>
@@ -2465,7 +2413,7 @@
           <w:sz w:val="20"/>
           <w:szCs w:val="20"/>
         </w:rPr>
-        <w:t xml:space="preserve">Operasi logika disjungsi tunggal (OR) yang mengabaikan salah satu faktor cuaca maupun pasang air laut.</w:t>
+        <w:t xml:space="preserve">Pilot helikopter akan kehilangan sinyal panduan arah karena satelit cuaca hanya bekerja pada pagi dan sore hari.</w:t>
       </w:r>
     </w:p>
     <w:p>
@@ -2512,7 +2460,7 @@
           <w:sz w:val="18"/>
           <w:szCs w:val="18"/>
         </w:rPr>
-        <w:t xml:space="preserve">Langkah 1 menerapkan struktur percabangan kondisional dengan konjungsi logika AND (kedua kondisi: hujan &gt;150mm DAN pasang rob wajib terpenuhi bersamaan untuk memicu sirine Level 1).</w:t>
+        <w:t xml:space="preserve">Dalam berpikir algoritma untuk sistem berdaya dukung terbatas, batasan sumber daya (bahan bakar dan ketahanan mesin) adalah syarat mutlak. Menghilangkan langkah pemeliharaan/pengisian bahan bakar demi kecepatan akan menyebabkan kegagalan sistem total yang fatal.</w:t>
       </w:r>
     </w:p>
     <w:p>
@@ -2541,20 +2489,7 @@
           <w:sz w:val="20"/>
           <w:szCs w:val="20"/>
         </w:rPr>
-        <w:t xml:space="preserve">Pada Langkah 2 Protokol Mitigasi, tertulis: "Seluruh pabrik tekstil dan aki wajib menghentikan pembuangan limbah cair ke sungai dalam waktu 2x24 jam."</w:t>
-      </w:r>
-    </w:p>
-    <w:p>
-      <w:pPr>
-        <w:spacing w:after="100"/>
-      </w:pPr>
-      <w:r>
-        <w:rPr>
-          <w:rFonts w:ascii="Arial" w:cs="Arial" w:eastAsia="Arial" w:hAnsi="Arial"/>
-          <w:sz w:val="20"/>
-          <w:szCs w:val="20"/>
-        </w:rPr>
-        <w:t xml:space="preserve">Mengapa pencantuman batasan waktu kuantitatif "2x24 jam" sangat penting dalam kaidah algoritma operasional, dibandingkan instruksi yang berbunyi "segera menghentikan pembuangan limbah"?</w:t>
+        <w:t xml:space="preserve">Pada hari kedua operasi, salah satu dari lima helikopter mengalami kebocoran oli pompa hidrolik sehingga hanya tersisa empat helikopter yang siap terbang. Dengan tetap berpegang pada prioritas keselamatan warga di Wilayah Utara sebelum kabut turun jam 14.00, bagaimanakah penyesuaian algoritma penerbangan yang paling logis dilakukan oleh Kapten Rina?</w:t>
       </w:r>
     </w:p>
     <w:p>
@@ -2578,7 +2513,7 @@
           <w:sz w:val="20"/>
           <w:szCs w:val="20"/>
         </w:rPr>
-        <w:t xml:space="preserve">Menghilangkan ambiguitas penafsiran (unambiguous) sehingga memiliki parameter batas waktu yang dapat diaudit, diukur kepatuhannya, dan ditegakkan sanksinya secara objektif.</w:t>
+        <w:t xml:space="preserve">Mengerahkan seluruh 4 helikopter yang siap ke Wilayah Utara pada pagi hari, lalu membagi masing-masing 2 helikopter untuk Wilayah Tengah dan Selatan pada sesi siang.</w:t>
       </w:r>
     </w:p>
     <w:p>
@@ -2602,7 +2537,7 @@
           <w:sz w:val="20"/>
           <w:szCs w:val="20"/>
         </w:rPr>
-        <w:t xml:space="preserve">Memberikan ruang bagi pihak industri untuk membuang seluruh sisa limbah beracun sebanyak-banyaknya sebelum tenggat waktu tiba.</w:t>
+        <w:t xml:space="preserve">Memaksakan helikopter yang bocor oli untuk tetap terbang melintasi jurang terjal demi menjaga kuota lima armada.</w:t>
       </w:r>
     </w:p>
     <w:p>
@@ -2626,7 +2561,7 @@
           <w:sz w:val="20"/>
           <w:szCs w:val="20"/>
         </w:rPr>
-        <w:t xml:space="preserve">Menyesuaikan dengan jadwal piket petugas kebersihan dinas lingkungan hidup yang bekerja dengan sistem giliran 48 jam.</w:t>
+        <w:t xml:space="preserve">Membatalkan seluruh penerbangan hari itu ke semua wilayah sampai helikopter pengganti datang dari ibu kota pekan depan.</w:t>
       </w:r>
     </w:p>
     <w:p>
@@ -2650,7 +2585,7 @@
           <w:sz w:val="20"/>
           <w:szCs w:val="20"/>
         </w:rPr>
-        <w:t xml:space="preserve">Memastikan agar sanksi denda finansial dapat dikumpulkan ke kas daerah sebelum akhir bulan penanggalan masehi.</w:t>
+        <w:t xml:space="preserve">Mengalihkan seluruh penerbangan hanya ke Wilayah Selatan karena jaraknya paling dekat dari pangkalan pendaratan.</w:t>
       </w:r>
     </w:p>
     <w:p>
@@ -2674,7 +2609,7 @@
           <w:sz w:val="20"/>
           <w:szCs w:val="20"/>
         </w:rPr>
-        <w:t xml:space="preserve">Mengikuti tradisi birokrasi pemerintahan daerah yang selalu menetapkan batas waktu kelipatan genap pada setiap surat edaran.</w:t>
+        <w:t xml:space="preserve">Meminta para pilot helikopter mengangkut kargo dengan berjalan kaki mendaki gunung menuju Wilayah Utara.</w:t>
       </w:r>
     </w:p>
     <w:p>
@@ -2721,7 +2656,7 @@
           <w:sz w:val="18"/>
           <w:szCs w:val="18"/>
         </w:rPr>
-        <w:t xml:space="preserve">Algoritma menuntut instruksi yang tidak ambigu (unambiguous). Batasan "2x24 jam" memberikan parameter terukur (deterministic bound) untuk penegakan kepatuhan, berbeda dengan frasa ambigu "segera".</w:t>
+        <w:t xml:space="preserve">Algoritma yang adaptif mampu merespons perubahan kondisi parameter (jumlah unit berkurang dari 5 menjadi 4) tanpa mengorbankan sasaran prioritas utama: Wilayah Utara tetap menjadi fokus utama di pagi hari, disusul pembagian rata armada untuk wilayah lainnya di siang hari.</w:t>
       </w:r>
     </w:p>
     <w:p>
@@ -2750,7 +2685,7 @@
           <w:sz w:val="20"/>
           <w:szCs w:val="20"/>
         </w:rPr>
-        <w:t xml:space="preserve">Perhatikan skenario kondisi ekstrem berikut: Pada suatu hari di bulan Januari, BMKG mencatat curah hujan mencapai 149 mm/hari selama 3 hari berturut-turut (hanya berselisih 1 mm di bawah batas ambang 150 mm), sementara ketinggian pasang air laut rob mencapai rekor tertinggi dalam 50 tahun terakhir.</w:t>
+        <w:t xml:space="preserve">Menjelang hari raya, sebuah keluarga berencana membersihkan seluruh rumah bertingkat mereka yang luas dalam waktu satu hari. Sang ibu membagi tugas kepada anggota keluarga: kakak bertugas membersihkan area luar (halaman dan selokan), adik membersihkan debu dan menyapu lantai dua, ayah mengecat dinding pagar depan, dan ibu mengelola dapur serta mencuci gorden.</w:t>
       </w:r>
     </w:p>
     <w:p>
@@ -2763,7 +2698,7 @@
           <w:sz w:val="20"/>
           <w:szCs w:val="20"/>
         </w:rPr>
-        <w:t xml:space="preserve">Jika sistem mitigasi otomatis Kota Delta diprogram secara kaku (hardcoded) murni menggunakan syarat logika "curah_hujan &gt; 150", kerentanan sistemik apakah yang akan terjadi (False Negative)?</w:t>
+        <w:t xml:space="preserve">Penerapan pilar berpikir komputasional apakah yang dilakukan oleh keluarga tersebut dalam mengelola pekerjaan rumah yang berat?</w:t>
       </w:r>
     </w:p>
     <w:p>
@@ -2787,7 +2722,7 @@
           <w:sz w:val="20"/>
           <w:szCs w:val="20"/>
         </w:rPr>
-        <w:t xml:space="preserve">Sirine Level 1 tidak akan berbunyi karena curah hujan 149 mm tidak memenuhi syarat &gt; 150, padahal kombinasi debit air dan pasang laut ekstrem tetap memicu bencana banjir besar.</w:t>
+        <w:t xml:space="preserve">Dekomposisi; memecah beban pekerjaan rumah yang besar menjadi beberapa bagian tugas wilayah yang lebih kecil dan terkelola sesuai kemampuan masing-masing.</w:t>
       </w:r>
     </w:p>
     <w:p>
@@ -2811,7 +2746,7 @@
           <w:sz w:val="20"/>
           <w:szCs w:val="20"/>
         </w:rPr>
-        <w:t xml:space="preserve">Seluruh pabrik tekstil dan aki akan otomatis meledak karena saluran pipa limbah tidak menerima data sinyal peringatan.</w:t>
+        <w:t xml:space="preserve">Abstraksi keliru; membiarkan ruang tamu dalam keadaan kotor karena dianggap tidak terlihat oleh tamu yang datang.</w:t>
       </w:r>
     </w:p>
     <w:p>
@@ -2835,7 +2770,7 @@
           <w:sz w:val="20"/>
           <w:szCs w:val="20"/>
         </w:rPr>
-        <w:t xml:space="preserve">Pintu air Katulampa Utara akan otomatis terbuka 100% dan menyedot air laut masuk ke dalam kawasan hulu sungai.</w:t>
+        <w:t xml:space="preserve">Pengenalan pola acak; menyapu lantai rumah secara berulang-ulang tanpa memedulikan apakah lantai sudah bersih atau belum.</w:t>
       </w:r>
     </w:p>
     <w:p>
@@ -2859,7 +2794,7 @@
           <w:sz w:val="20"/>
           <w:szCs w:val="20"/>
         </w:rPr>
-        <w:t xml:space="preserve">Komputer pemantau BMKG akan mengalami crash memori karena tidak sanggup membandingkan angka desimal di bawah 150.</w:t>
+        <w:t xml:space="preserve">Penyusunan aturan paksa; mewajibkan setiap anggota keluarga menggunakan pakaian dengan warna yang seragam saat menyapu.</w:t>
       </w:r>
     </w:p>
     <w:p>
@@ -2883,7 +2818,7 @@
           <w:sz w:val="20"/>
           <w:szCs w:val="20"/>
         </w:rPr>
-        <w:t xml:space="preserve">Warga zona merah akan secara sukarela mengungsi sendiri tanpa perlu menunggu instruksi dan bantuan dari tim satgas krisis.</w:t>
+        <w:t xml:space="preserve">Otomatisasi murni; menyerahkan seluruh pembersihan rumah kepada mesin penyedot debu tanpa bantuan tenaga manusia sama sekali.</w:t>
       </w:r>
     </w:p>
     <w:p>
@@ -2930,7 +2865,7 @@
           <w:sz w:val="18"/>
           <w:szCs w:val="18"/>
         </w:rPr>
-        <w:t xml:space="preserve">Kelemahan sistem berbasis ambang batas kaku (hardcoded boundary) tanpa margin toleransi atau fuzzy logic adalah terjadinya False Negative (gagal membunyikan alarm padahal bahaya nyata terjadi).</w:t>
+        <w:t xml:space="preserve">Membagi pekerjaan membersihkan rumah besar menjadi beberapa sub-tugas spesifik berdasarkan ruangan/wilayah kepada anggota keluarga adalah penerapan nyata pilar Dekomposisi dalam kehidupan sehari-hari di rumah.</w:t>
       </w:r>
     </w:p>
     <w:p>
@@ -2959,7 +2894,7 @@
           <w:sz w:val="20"/>
           <w:szCs w:val="20"/>
         </w:rPr>
-        <w:t xml:space="preserve">Keberhasilan Protokol Mitigasi Kota Delta menjadikannya sebagai "cetak biru" (blueprint) bagi kota-kota lain di provinsi tersebut. Dalam teori rekayasa perangkat lunak dan komputasi, konsep ini dikenal dengan prinsip Reusability (kemampuan digunakan ulang).</w:t>
+        <w:t xml:space="preserve">Saat akan mencuci pakaian keluarga yang menumpuk di akhir pekan, Budi memisahkan pakaian ke dalam tiga keranjang berbeda: keranjang pakaian putih polos, keranjang pakaian berwarna cerah yang mudah luntur, dan keranjang pakaian berbahan tebal seperti celana jin kotor berlumpur. Budi melakukan hal ini karena belajar dari pengalamannya minggu lalu saat seragam putih sekolahnya berubah warna menjadi kemerahan akibat tercampur baju merah adiknya.</w:t>
       </w:r>
     </w:p>
     <w:p>
@@ -2972,7 +2907,7 @@
           <w:sz w:val="20"/>
           <w:szCs w:val="20"/>
         </w:rPr>
-        <w:t xml:space="preserve">Karakteristik apakah yang menjadikan sebuah solusi komputasional seperti protokol Dr. Aris memiliki daya guna ulang (reusability) yang tinggi di lokasi lain?</w:t>
+        <w:t xml:space="preserve">Pilar berpikir komputasional apa yang diterapkan oleh Budi saat memilah cucian tersebut?</w:t>
       </w:r>
     </w:p>
     <w:p>
@@ -2996,7 +2931,7 @@
           <w:sz w:val="20"/>
           <w:szCs w:val="20"/>
         </w:rPr>
-        <w:t xml:space="preserve">Protokol dirumuskan sebagai model algoritmik abstrak berbasis logika data empiris yang dapat disesuaikan parameter lokalnya di daerah lain tanpa mengubah esensi kerangka kerjanya.</w:t>
+        <w:t xml:space="preserve">Pengenalan pola; mengenali kesamaan sifat bahan dan warna pakaian dari pengalaman masa lalu untuk mencegah kerusakan pakaian putih.</w:t>
       </w:r>
     </w:p>
     <w:p>
@@ -3020,7 +2955,7 @@
           <w:sz w:val="20"/>
           <w:szCs w:val="20"/>
         </w:rPr>
-        <w:t xml:space="preserve">Protokol tersebut mewajibkan daerah lain memiliki luas wilayah, jumlah penduduk, dan letak geografis yang persis identik dengan Kota Delta.</w:t>
+        <w:t xml:space="preserve">Algoritma acak; memasukkan pakaian ke mesin cuci secara sembarangan tanpa memeriksa label petunjuk perawatan pakaian.</w:t>
       </w:r>
     </w:p>
     <w:p>
@@ -3044,7 +2979,7 @@
           <w:sz w:val="20"/>
           <w:szCs w:val="20"/>
         </w:rPr>
-        <w:t xml:space="preserve">Protokol dibuat sangat rahasia sehingga hanya dapat dibeli oleh pemerintah kota yang memiliki anggaran miliaran rupiah.</w:t>
+        <w:t xml:space="preserve">Abstraksi berlebihan; membuang seluruh pakaian berwarna ke tempat sampah agar mesin cuci hanya mencuci pakaian putih.</w:t>
       </w:r>
     </w:p>
     <w:p>
@@ -3068,7 +3003,7 @@
           <w:sz w:val="20"/>
           <w:szCs w:val="20"/>
         </w:rPr>
-        <w:t xml:space="preserve">Protokol menolak integrasi dengan perangkat lunak komputer dan murni dijalankan menggunakan instruksi lisan turun-temurun.</w:t>
+        <w:t xml:space="preserve">Dekomposisi biner; menghitung jumlah kancing pada setiap kemeja sebelum merendamnya ke dalam ember air sabun.</w:t>
       </w:r>
     </w:p>
     <w:p>
@@ -3092,7 +3027,7 @@
           <w:sz w:val="20"/>
           <w:szCs w:val="20"/>
         </w:rPr>
-        <w:t xml:space="preserve">Protokol tersebut menjamin bahwa seluruh bencana banjir di muka bumi akan hilang seutuhnya tanpa perlu melakukan penanaman pohon kembali.</w:t>
+        <w:t xml:space="preserve">Perancangan perangkat keras; membongkar mesin cuci keluarga untuk mengganti tabung pemutar dengan ember kayu tradisional.</w:t>
       </w:r>
     </w:p>
     <w:p>
@@ -3139,7 +3074,7 @@
           <w:sz w:val="18"/>
           <w:szCs w:val="18"/>
         </w:rPr>
-        <w:t xml:space="preserve">Reusability terjadi karena solusi telah diabstraksi menjadi kerangka kerja algoritmik parametrik yang dapat diadaptasikan ke sistem lingkungan kota lain dengan menyesuaikan variabel ambang batas lokalnya.</w:t>
+        <w:t xml:space="preserve">Budi menggunakan Pengenalan Pola. Pengalaman masa lalu (baju luntur merusak seragam putih) dijadikan pola acuan untuk mengelompokkan pakaian berdasarkan sifat warna dan risiko kelunturan.</w:t>
       </w:r>
     </w:p>
     <w:p>
@@ -3168,7 +3103,7 @@
           <w:sz w:val="20"/>
           <w:szCs w:val="20"/>
         </w:rPr>
-        <w:t xml:space="preserve">Dalam tahapan Pengenalan Pola, seorang peneliti komputasional harus jeli memisahkan antara korelasi nyata yang bersifat sebab-akibat (kausal) dengan korelasi semu (spurious correlation) yang muncul secara kebetulan.</w:t>
+        <w:t xml:space="preserve">Rian ingin menyiapkan sarapan pagi sebelum berangkat ke sekolah. Menu sarapan terdiri dari nasi goreng, telur mata sapi, dan segelas teh manis hangat. Kompor yang dimiliki di dapur hanya memiliki dua tungku pembakaran. Rian merancang langkah kerja: menyalakan tungku 1 untuk merebus air teh, menyalakan tungku 2 untuk menggoreng telur, lalu setelah telur matang, wajan yang sama di tungku 2 digunakan menumis bumbu nasi goreng sembari menuangkan air panas ke cangkir teh.</w:t>
       </w:r>
     </w:p>
     <w:p>
@@ -3181,7 +3116,7 @@
           <w:sz w:val="20"/>
           <w:szCs w:val="20"/>
         </w:rPr>
-        <w:t xml:space="preserve">Di antara fenomena berikut di Kota Delta, manakah yang merupakan korelasi semu (spurious correlation) yang WAJIB disaring keluar melalui prinsip Abstraksi?</w:t>
+        <w:t xml:space="preserve">Mengapa perencanaan langkah yang disusun Rian merupakan contoh penerapan algoritma yang efisien dalam kehidupan sehari-hari?</w:t>
       </w:r>
     </w:p>
     <w:p>
@@ -3205,7 +3140,7 @@
           <w:sz w:val="20"/>
           <w:szCs w:val="20"/>
         </w:rPr>
-        <w:t xml:space="preserve">Kenaikan drastis jumlah penjualan jas hujan dan payung di pasar swalayan Kota Delta pada setiap minggu yang bersamaan dengan terjadinya banjir lumpur.</w:t>
+        <w:t xml:space="preserve">Menyusun urutan tindakan secara terperinci dan memperhitungkan pemanfaatan sumber daya kompor secara bersamaan sehingga seluruh makanan matang tepat waktu.</w:t>
       </w:r>
     </w:p>
     <w:p>
@@ -3229,7 +3164,7 @@
           <w:sz w:val="20"/>
           <w:szCs w:val="20"/>
         </w:rPr>
-        <w:t xml:space="preserve">Penyempitan penampang melintang sungai akibat sedimentasi lumpur yang menurunkan daya tampung volume aliran air.</w:t>
+        <w:t xml:space="preserve">Memasak seluruh bahan makanan dalam satu panci besar tanpa memedulikan rasa dan perbedaan tingkat kematangan.</w:t>
       </w:r>
     </w:p>
     <w:p>
@@ -3253,7 +3188,7 @@
           <w:sz w:val="20"/>
           <w:szCs w:val="20"/>
         </w:rPr>
-        <w:t xml:space="preserve">Kenaikan muka air pasang rob laut Jawa yang menghambat laju pembuangan gravitasi aliran sungai menuju lepas pantai.</w:t>
+        <w:t xml:space="preserve">Memastikan sarapan disiapkan hanya jika ada tamu penting yang berkunjung ke rumah di pagi hari.</w:t>
       </w:r>
     </w:p>
     <w:p>
@@ -3277,7 +3212,7 @@
           <w:sz w:val="20"/>
           <w:szCs w:val="20"/>
         </w:rPr>
-        <w:t xml:space="preserve">Peningkatan laju erosi tanah di lereng hulu sungai Ciliwung akibat pembukaan hutan lindung menjadi kawasan villa komersial.</w:t>
+        <w:t xml:space="preserve">Mengabaikan kebersihan dapur dengan membiarkan kompor menyala tanpa ditunggui sama sekali.</w:t>
       </w:r>
     </w:p>
     <w:p>
@@ -3301,7 +3236,7 @@
           <w:sz w:val="20"/>
           <w:szCs w:val="20"/>
         </w:rPr>
-        <w:t xml:space="preserve">Tingginya kadar timbal pada sedimen muara sungai yang berdekatan dengan saluran pembuangan akhir pabrik aki kendaraan.</w:t>
+        <w:t xml:space="preserve">Menghabiskan seluruh persediaan bumbu dapur keluarga hanya untuk membuat satu porsi sarapan pagi.</w:t>
       </w:r>
     </w:p>
     <w:p>
@@ -3348,7 +3283,7 @@
           <w:sz w:val="18"/>
           <w:szCs w:val="18"/>
         </w:rPr>
-        <w:t xml:space="preserve">Penjualan payung/jas hujan meningkat di musim hujan bersamaan dengan banjir, tetapi payung bukan penyebab banjir. Ini adalah korelasi semu (spurious correlation) yang wajib dieliminasi dalam abstraksi.</w:t>
+        <w:t xml:space="preserve">Algoritma yang baik mengatur urutan langkah logis serta efisiensi penggunaan sumber daya (dalam hal ini dua tungku kompor) sehingga tugas memasak selesai secara simultan dengan hasil optimal sebelum waktu berangkat sekolah.</w:t>
       </w:r>
     </w:p>
     <w:p>
@@ -3377,7 +3312,20 @@
           <w:sz w:val="20"/>
           <w:szCs w:val="20"/>
         </w:rPr>
-        <w:t xml:space="preserve">Jika Dinas Lingkungan Hidup ingin membangun sistem Internet of Things (IoT) berbasis mikrokontroler di sepanjang sungai Kota Delta untuk memicu Langkah 1 protokol mitigasi secara otomatis, komponen sensor manakah yang paling esensial dipasang di stasiun pemantau hulu dan muara?</w:t>
+        <w:t xml:space="preserve">Keluarga Pak Santoso terkejut melihat tagihan listrik rumah tangga yang melonjak drastis selama dua bulan terakhir. Doni, anak sulung Pak Santoso yang belajar Informatika, memutuskan mencatat jam operasional setiap alat elektronik selama satu pekan. Doni menemukan bahwa pendingin ruangan (AC) di kamar tidur sering dibiarkan menyala pada suhu 16 derajat Celsius sejak pukul 13.00 siang meskipun kamar dalam keadaan kosong.</w:t>
+      </w:r>
+    </w:p>
+    <w:p>
+      <w:pPr>
+        <w:spacing w:after="100"/>
+      </w:pPr>
+      <w:r>
+        <w:rPr>
+          <w:rFonts w:ascii="Arial" w:cs="Arial" w:eastAsia="Arial" w:hAnsi="Arial"/>
+          <w:sz w:val="20"/>
+          <w:szCs w:val="20"/>
+        </w:rPr>
+        <w:t xml:space="preserve">Langkah Doni menemukan sumber pemborosan listrik tersebut merupakan penerapan berpikir komputasional pada pilar:</w:t>
       </w:r>
     </w:p>
     <w:p>
@@ -3401,7 +3349,7 @@
           <w:sz w:val="20"/>
           <w:szCs w:val="20"/>
         </w:rPr>
-        <w:t xml:space="preserve">Sensor curah hujan (tipping bucket rain gauge), sensor ultrasonik ketinggian muka air pasang/surut, dan probe spektrofotometer ion logam berat B3.</w:t>
+        <w:t xml:space="preserve">Pengenalan pola; mengamati keteraturan waktu pemakaian alat listrik dan mengaitkannya dengan lonjakan biaya pada data tagihan.</w:t>
       </w:r>
     </w:p>
     <w:p>
@@ -3425,7 +3373,7 @@
           <w:sz w:val="20"/>
           <w:szCs w:val="20"/>
         </w:rPr>
-        <w:t xml:space="preserve">Kamera pengawas beresolusi tinggi yang khusus merekam pelat nomor kendaraan bermotor yang melintasi jembatan kota.</w:t>
+        <w:t xml:space="preserve">Abstraksi parsial; mematikan meteran listrik utama rumah secara permanen sehingga keluarga tidak menggunakan listrik sama sekali.</w:t>
       </w:r>
     </w:p>
     <w:p>
@@ -3449,7 +3397,7 @@
           <w:sz w:val="20"/>
           <w:szCs w:val="20"/>
         </w:rPr>
-        <w:t xml:space="preserve">Sensor pendeteksi kebisingan suara klakson kendaraan untuk mengukur tingkat kemacetan lalu lintas jalan raya.</w:t>
+        <w:t xml:space="preserve">Dekomposisi manual; membongkar mesin pendingin ruangan menjadi ratusan komponen kabel kecil di ruang tamu.</w:t>
       </w:r>
     </w:p>
     <w:p>
@@ -3473,7 +3421,7 @@
           <w:sz w:val="20"/>
           <w:szCs w:val="20"/>
         </w:rPr>
-        <w:t xml:space="preserve">Sensor pemindai sidik jari dan biometrik wajah untuk seluruh nelayan tradisional yang melaut di pesisir teluk Delta.</w:t>
+        <w:t xml:space="preserve">Algoritma semu; membayar tagihan listrik dua kali lipat setiap bulan agar petugas listrik tidak datang memeriksa ke rumah.</w:t>
       </w:r>
     </w:p>
     <w:p>
@@ -3497,7 +3445,7 @@
           <w:sz w:val="20"/>
           <w:szCs w:val="20"/>
         </w:rPr>
-        <w:t xml:space="preserve">Antena pemancar sinyal radio amatir frekuensi tinggi tanpa dilengkapi mikrokontroler penyimpan log data digital.</w:t>
+        <w:t xml:space="preserve">Pemodelan grafis; menggambar sketsa bentuk fisik pendingin ruangan pada selembar kertas karton berwarna.</w:t>
       </w:r>
     </w:p>
     <w:p>
@@ -3544,7 +3492,7 @@
           <w:sz w:val="18"/>
           <w:szCs w:val="18"/>
         </w:rPr>
-        <w:t xml:space="preserve">Sensor IoT harus merefleksikan variabel kritis hasil dekomposisi Dr. Aris: curah hujan, ketinggian muka air/pasang rob, dan sensor kualitas kimiawi logam berat.</w:t>
+        <w:t xml:space="preserve">Mencatat jam operasional alat elektronik dan menemukan kebiasaan menyalakan AC pada saat kamar kosong merupakan penerapan Pengenalan Pola untuk mencari akar penyebab masalah dalam kehidupan nyata.</w:t>
       </w:r>
     </w:p>
     <w:p>
@@ -3573,7 +3521,7 @@
           <w:sz w:val="20"/>
           <w:szCs w:val="20"/>
         </w:rPr>
-        <w:t xml:space="preserve">Pada evaluasi akhir tahun, ditemukan bahwa sebuah pabrik tekstil besar tetap membuang limbah cair kromium pada malam hari saat hujan deras karena mengira petugas pengawas sedang tidur dan tidak melakukan inspeksi lapangan.</w:t>
+        <w:t xml:space="preserve">Di rumahnya, Siti mendirikan tiga tempat sampah terpisah bertuliskan: "Sampah Makanan/Dedaunan (Organik)", "Kemasan Plastik/Kaca/Kaleng (Anorganik Daur Ulang)", dan "Baterai Bekas/Lampu Rusak (Limbah B3 Rumah Tangga)". Ketika membuang sebuah botol sampo kosong, Siti langsung memasukkannya ke wadah plastik daur ulang tanpa memedulikan gambar label stiker botol, aroma sisa sampo, maupun toko tempat ia membelinya.</w:t>
       </w:r>
     </w:p>
     <w:p>
@@ -3586,7 +3534,7 @@
           <w:sz w:val="20"/>
           <w:szCs w:val="20"/>
         </w:rPr>
-        <w:t xml:space="preserve">Strategi algoritma pengawasan komputasional apakah yang paling efektif untuk mendeteksi pelanggaran tersembunyi tersebut secara berkelanjutan?</w:t>
+        <w:t xml:space="preserve">Pilar berpikir komputasional apa yang ditunjukkan Siti ketika mengabaikan merek dan aroma botol sampo saat memilah sampah?</w:t>
       </w:r>
     </w:p>
     <w:p>
@@ -3610,7 +3558,7 @@
           <w:sz w:val="20"/>
           <w:szCs w:val="20"/>
         </w:rPr>
-        <w:t xml:space="preserve">Memasang sensor telemetri kualitas air otomatis di pipa outlet pabrik yang mengirimkan log data kadar kromium secara realtime 24 jam ke server pusat pengawas.</w:t>
+        <w:t xml:space="preserve">Abstraksi; membuang detail yang tidak relevan (aroma dan merek) serta hanya berfokus pada informasi penting yaitu jenis bahan botol (plastik daur ulang).</w:t>
       </w:r>
     </w:p>
     <w:p>
@@ -3634,7 +3582,7 @@
           <w:sz w:val="20"/>
           <w:szCs w:val="20"/>
         </w:rPr>
-        <w:t xml:space="preserve">Mengirimkan surat peringatan tertulis setiap tiga bulan sekali melalui kantor pos tanpa melakukan pengambilan sampel air.</w:t>
+        <w:t xml:space="preserve">Algoritma; mengharuskan Siti membersihkan botol sampo dengan sabun mandi sebanyak sepuluh kali sebelum dibuang.</w:t>
       </w:r>
     </w:p>
     <w:p>
@@ -3658,7 +3606,7 @@
           <w:sz w:val="20"/>
           <w:szCs w:val="20"/>
         </w:rPr>
-        <w:t xml:space="preserve">Meminta satpam pabrik untuk mengisi kuesioner kejujuran tentang volume limbah yang dibuang oleh pihak manajemen.</w:t>
+        <w:t xml:space="preserve">Dekomposisi; memotong botol plastik menjadi serpihan berukuran satu milimeter menggunakan gunting kuku.</w:t>
       </w:r>
     </w:p>
     <w:p>
@@ -3682,7 +3630,7 @@
           <w:sz w:val="20"/>
           <w:szCs w:val="20"/>
         </w:rPr>
-        <w:t xml:space="preserve">Menutup aliran listrik ke seluruh permukiman warga sekitar pabrik pada malam hari saat hujan deras turun.</w:t>
+        <w:t xml:space="preserve">Pengenalan pola keliru; menganggap seluruh benda cair di kamar mandi adalah racun berbahaya yang tidak boleh disentuh.</w:t>
       </w:r>
     </w:p>
     <w:p>
@@ -3706,7 +3654,7 @@
           <w:sz w:val="20"/>
           <w:szCs w:val="20"/>
         </w:rPr>
-        <w:t xml:space="preserve">Menghapus kromium dari daftar zat kimia berbahaya agar pabrik tidak dianggap melanggar regulasi lingkungan hidup.</w:t>
+        <w:t xml:space="preserve">Otomatisasi; membiarkan sampah menumpuk di lantai kamar mandi sampai larut sendiri ditelan air pembuangan.</w:t>
       </w:r>
     </w:p>
     <w:p>
@@ -3753,7 +3701,7 @@
           <w:sz w:val="18"/>
           <w:szCs w:val="18"/>
         </w:rPr>
-        <w:t xml:space="preserve">Otomatisasi pengawasan telemetri 24 jam menghilangkan celah kelemahan pengawasan manual manusia dan mendeteksi anomali limbah malam hari secara presisi.</w:t>
+        <w:t xml:space="preserve">Keputusan Siti memilah sampah berdasarkan karakteristik bahan pokoknya (plastik) sembari mengabaikan detail yang tidak berhubungan dengan pengelolaan daur ulang (merek, aroma, asal toko) adalah contoh konkret dari Abstraksi.</w:t>
       </w:r>
     </w:p>
     <w:p>
@@ -3782,7 +3730,7 @@
           <w:sz w:val="20"/>
           <w:szCs w:val="20"/>
         </w:rPr>
-        <w:t xml:space="preserve">Gempa bumi berkekuatan 7.2 Magnitudo melanda kawasan pegunungan Seribu Bukit. Akses jalan darat terputus total akibat longsor masif. Ribuan warga di 15 desa terisolasi tanpa makanan dan obat-obatan. Badan Nasional Penanggulangan Bencana (BNPB) harus segera mendistribusikan bantuan menggunakan 5 unit helikopter kargo yang dimiliki. Waktu sangat krusial karena kapasitas bahan bakar helikopter terbatas dan cuaca sering berubah buruk di sore hari.</w:t>
+        <w:t xml:space="preserve">Ibu memiliki puluhan pot tanaman di teras rumah yang terdiri dari anggrek, kaktus, dan tanaman cabai. Ibu membuat catatan perawatan: Kaktus hanya disiram seminggu sekali dengan sedikit air; anggrek disemprot kabut air setiap dua hari sekali di pagi hari; sedangkan tanaman cabai disiram penuh setiap sore hari dan diberi pupuk cair setiap dua minggu sekali.</w:t>
       </w:r>
     </w:p>
     <w:p>
@@ -3795,20 +3743,7 @@
           <w:sz w:val="20"/>
           <w:szCs w:val="20"/>
         </w:rPr>
-        <w:t xml:space="preserve">Komandan Logistik, Kapten Rina, menolak melihat 15 desa tersebut sebagai satu kekacauan acak. Ia mengelompokkan 15 desa ke dalam 3 Sektor Utama: Sektor Utara (kerusakan parah), Sektor Tengah (kerusakan sedang), dan Sektor Selatan (kerusakan ringan).</w:t>
-      </w:r>
-    </w:p>
-    <w:p>
-      <w:pPr>
-        <w:spacing w:after="100"/>
-      </w:pPr>
-      <w:r>
-        <w:rPr>
-          <w:rFonts w:ascii="Arial" w:cs="Arial" w:eastAsia="Arial" w:hAnsi="Arial"/>
-          <w:sz w:val="20"/>
-          <w:szCs w:val="20"/>
-        </w:rPr>
-        <w:t xml:space="preserve">Proses berpikir komputasional apakah yang diterapkan Kapten Rina melalui pengelompokan 15 desa tersebut?</w:t>
+        <w:t xml:space="preserve">Kombinasi dua pilar berpikir komputasional apakah yang paling menonjol pada cara Ibu merawat tanaman-tanaman tersebut?</w:t>
       </w:r>
     </w:p>
     <w:p>
@@ -3832,7 +3767,7 @@
           <w:sz w:val="20"/>
           <w:szCs w:val="20"/>
         </w:rPr>
-        <w:t xml:space="preserve">Dekomposisi; mereduksi kompleksitas tantangan logistik 15 lokasi terisolasi menjadi 3 kluster terkelola berbasis derajat keparahan kerusakan dan skala prioritas.</w:t>
+        <w:t xml:space="preserve">Pengenalan pola kebutuhan hidup tanaman dan penyusunan algoritma jadwal penyiraman yang teratur.</w:t>
       </w:r>
     </w:p>
     <w:p>
@@ -3856,7 +3791,7 @@
           <w:sz w:val="20"/>
           <w:szCs w:val="20"/>
         </w:rPr>
-        <w:t xml:space="preserve">Algoritma Buta; memerintahkan pilot menerbangkan helikopter ke arah mana pun sesuai arah tiupan angin pagi hari.</w:t>
+        <w:t xml:space="preserve">Penghapusan data tanaman dan pembagian pot bunga secara acak tanpa memperhatikan jenis tanamannya.</w:t>
       </w:r>
     </w:p>
     <w:p>
@@ -3880,7 +3815,7 @@
           <w:sz w:val="20"/>
           <w:szCs w:val="20"/>
         </w:rPr>
-        <w:t xml:space="preserve">Pengenalan Pola Acak; mencampuradukkan data korban bencana tanpa memperhatikan tingkat kerusakan wilayah.</w:t>
+        <w:t xml:space="preserve">Pengabaian seluruh kebutuhan air dan penyerahan pertumbuhan tanaman sepenuhnya pada air hujan alami.</w:t>
       </w:r>
     </w:p>
     <w:p>
@@ -3904,7 +3839,7 @@
           <w:sz w:val="20"/>
           <w:szCs w:val="20"/>
         </w:rPr>
-        <w:t xml:space="preserve">Abstraksi Parsial; mengabaikan seluruh desa di Sektor Utara karena kerusakannya dianggap terlalu sulit untuk dijangkau.</w:t>
+        <w:t xml:space="preserve">Pembongkaran seluruh akar tanaman setiap pagi hari untuk memastikan ada cacing tanah di dalam pot.</w:t>
       </w:r>
     </w:p>
     <w:p>
@@ -3928,7 +3863,7 @@
           <w:sz w:val="20"/>
           <w:szCs w:val="20"/>
         </w:rPr>
-        <w:t xml:space="preserve">Simulasi Fiktif; menunda pengiriman bantuan hingga seluruh jalan darat selesai diaspal kembali oleh dinas pekerjaan umum.</w:t>
+        <w:t xml:space="preserve">Pemberian pupuk kimia berdosis tinggi setiap jam agar tanaman tumbuh sepuluh kali lebih cepat dari biasanya.</w:t>
       </w:r>
     </w:p>
     <w:p>
@@ -3975,7 +3910,7 @@
           <w:sz w:val="18"/>
           <w:szCs w:val="18"/>
         </w:rPr>
-        <w:t xml:space="preserve">Mengelompokkan 15 desa menjadi 3 sektor berdasarkan tingkat keparahan adalah penerapan pilar Dekomposisi untuk memecah masalah besar menjadi sub-masalah logis yang terkelola.</w:t>
+        <w:t xml:space="preserve">Ibu mengenali pola kebutuhan biologis masing-masing tanaman (kaktus sedikit air, anggrek lembap, cabai butuh air teratur), lalu merumuskan algoritma berupa instruksi langkah dan jadwal perawatan rutin yang deterministik.</w:t>
       </w:r>
     </w:p>
     <w:p>
@@ -4004,7 +3939,7 @@
           <w:sz w:val="20"/>
           <w:szCs w:val="20"/>
         </w:rPr>
-        <w:t xml:space="preserve">Berdasarkan evaluasi arsip misi penanggulangan bencana tahun-tahun sebelumnya di kawasan perbukitan, Kapten Rina dan tim mengenali sebuah pola mikroklimat konsisten: desa-desa yang berada di lembah curam (Sektor Utara) selalu diselimuti kabut tebal pekat setelah pukul 14.00 siang, yang membuat penerbangan helikopter menjadi mustahil dan berisiko mematikan.</w:t>
+        <w:t xml:space="preserve">Kelompok belajar kelas X mendapat tugas membuat video dokumenter sejarah perjuangan lokal berdurasi 10 menit dengan batas waktu penyerahan empat pekan. Ketua kelompok membagi waktu pengerjaan menjadi tiga tahapan: Pekan 1 untuk riset naskah dan wawancara narasumber (Pra-produksi); Pekan 2 dan 3 untuk pengambilan gambar video di museum dan lokasi bersejarah (Produksi); serta Pekan 4 untuk penyuntingan video, penambahan teks, dan penyerahan tugas (Pasca-produksi).</w:t>
       </w:r>
     </w:p>
     <w:p>
@@ -4017,7 +3952,7 @@
           <w:sz w:val="20"/>
           <w:szCs w:val="20"/>
         </w:rPr>
-        <w:t xml:space="preserve">Bagaimanakah rekognisi pola cuaca tersebut memengaruhi konstruksi strategi penerbangan Kapten Rina?</w:t>
+        <w:t xml:space="preserve">Strategi ketua kelompok dalam mengelola tugas besar tersebut menerapkan pilar:</w:t>
       </w:r>
     </w:p>
     <w:p>
@@ -4041,7 +3976,7 @@
           <w:sz w:val="20"/>
           <w:szCs w:val="20"/>
         </w:rPr>
-        <w:t xml:space="preserve">Mendorong Kapten Rina mengalokasikan seluruh (5) helikopter secara maksimal ke Sektor Utara pada pagi hari (06.00 - 10.00) sebelum batas jendela cuaca berkabut tertutup.</w:t>
+        <w:t xml:space="preserve">Dekomposisi; memecah proyek besar berdurasi satu bulan ke dalam tahapan-tahapan waktu dan target kerja yang terfokus.</w:t>
       </w:r>
     </w:p>
     <w:p>
@@ -4065,7 +4000,7 @@
           <w:sz w:val="20"/>
           <w:szCs w:val="20"/>
         </w:rPr>
-        <w:t xml:space="preserve">Menyebabkan operasi penerbangan ke Sektor Utara dibatalkan sama sekali demi melindungi keselamatan helikopter dari tetesan air kabut.</w:t>
+        <w:t xml:space="preserve">Abstraksi sepihak; menolak mencantumkan nama anggota kelompok pada berkas laporan akhir tugas sekolah.</w:t>
       </w:r>
     </w:p>
     <w:p>
@@ -4089,7 +4024,7 @@
           <w:sz w:val="20"/>
           <w:szCs w:val="20"/>
         </w:rPr>
-        <w:t xml:space="preserve">Membuat Kapten Rina menginstruksikan pilot untuk menembus kabut tebal pada sore hari tanpa bantuan instrumen penerbangan.</w:t>
+        <w:t xml:space="preserve">Algoritma jalan pintas; mengunduh video dokumenter milik orang lain di internet dan mengubah judulnya menjadi tugas sendiri.</w:t>
       </w:r>
     </w:p>
     <w:p>
@@ -4113,7 +4048,7 @@
           <w:sz w:val="20"/>
           <w:szCs w:val="20"/>
         </w:rPr>
-        <w:t xml:space="preserve">Memindahkan lokasi pangkalan utama helikopter ke dasar lembah curam Sektor Utara agar lebih dekat dengan lokasi kabut.</w:t>
+        <w:t xml:space="preserve">Pengenalan pola acak; merekam gambar tanpa naskah dan berharap video akan tersusun sendiri saat diedit.</w:t>
       </w:r>
     </w:p>
     <w:p>
@@ -4137,7 +4072,7 @@
           <w:sz w:val="20"/>
           <w:szCs w:val="20"/>
         </w:rPr>
-        <w:t xml:space="preserve">Mengubah jadwal misi sehingga penerbangan hanya dilakukan pada malam hari saat matahari telah terbenam.</w:t>
+        <w:t xml:space="preserve">Otomatisasi tanpa batas; membiarkan kamera merekam ruang kelas kosong selama 24 jam tanpa ada kegiatan terarah.</w:t>
       </w:r>
     </w:p>
     <w:p>
@@ -4184,7 +4119,7 @@
           <w:sz w:val="18"/>
           <w:szCs w:val="18"/>
         </w:rPr>
-        <w:t xml:space="preserve">Pengenalan pola kabut tebal setelah jam 14.00 di lembah Sektor Utara menjadi dasar penentuan urutan jadwal (algoritma): fokuskan seluruh armada di pagi hari (06.00-10.00) ke Sektor Utara.</w:t>
+        <w:t xml:space="preserve">Memecah proyek besar (video dokumenter sejarah) menjadi sub-tahap yang memiliki target dan tenggat waktu terukur (pra-produksi, produksi, pasca-produksi) adalah penerapan nyata pilar Dekomposisi pada pembelajaran siswa di sekolah.</w:t>
       </w:r>
     </w:p>
     <w:p>
@@ -4213,7 +4148,7 @@
           <w:sz w:val="20"/>
           <w:szCs w:val="20"/>
         </w:rPr>
-        <w:t xml:space="preserve">Saat mempersiapkan pemuatan barang ke helikopter, banyak warga dan relawan donatur menitipkan barang pribadi, tumpukan pakaian bekas, buku cerita, dan mainan anak-anak. Kapten Rina dengan tegas memfilter manifes kargo. Ia menetapkan bahwa untuk 72 jam pertama, helikopter HANYA akan memuat: air bersih, terpal medis (P3K), makanan instan padat kalori, dan perangkat komunikasi darurat.</w:t>
+        <w:t xml:space="preserve">Setiap jam istirahat sekolah yang hanya berlangsung 30 menit, kantin sekolah selalu mengalami kekacauan antrean karena ratusan siswa berebut memesan makanan sekaligus di depan etalase penjual, sehingga banyak siswa terlambat masuk ke kelas. Pengurus OSIS mengusulkan alur baru: Siswa pertama-tama memilih paket menu di papan informasi luar, membayar di loket kasir khusus untuk mendapatkan nomor antrean, lalu mengambil makanan yang sudah dikemas di meja pengambilan terpisah.</w:t>
       </w:r>
     </w:p>
     <w:p>
@@ -4226,7 +4161,7 @@
           <w:sz w:val="20"/>
           <w:szCs w:val="20"/>
         </w:rPr>
-        <w:t xml:space="preserve">Proses berpikir komputasional apakah yang diterapkan Kapten Rina, dan apakah justifikasi ilmiahnya dari sudut pandang keterbatasan sistem (system constraints)?</w:t>
+        <w:t xml:space="preserve">Usulan pengurus OSIS tersebut merupakan perbaikan sistem sekolah menggunakan prinsip pilar:</w:t>
       </w:r>
     </w:p>
     <w:p>
@@ -4250,7 +4185,7 @@
           <w:sz w:val="20"/>
           <w:szCs w:val="20"/>
         </w:rPr>
-        <w:t xml:space="preserve">Abstraksi; membuang barang non-kritis dan memprioritaskan muatan penyelamat nyawa (life-saving) karena payload dan volume kargo helikopter sangat terbatas pada fase kritis 72 jam pertama.</w:t>
+        <w:t xml:space="preserve">Algoritma; merancang alur urutan proses layanan yang teratur dan searah untuk mengurai penumpukan antrean siswa.</w:t>
       </w:r>
     </w:p>
     <w:p>
@@ -4274,7 +4209,7 @@
           <w:sz w:val="20"/>
           <w:szCs w:val="20"/>
         </w:rPr>
-        <w:t xml:space="preserve">Pengenalan Pola; menyimpulkan bahwa seluruh korban bencana gempa bumi tidak membutuhkan pakaian dan obat-obatan.</w:t>
+        <w:t xml:space="preserve">Dekomposisi parsial; menutup kantin sekolah secara sepihak agar siswa membawa bekal dari rumah masing-masing.</w:t>
       </w:r>
     </w:p>
     <w:p>
@@ -4298,7 +4233,7 @@
           <w:sz w:val="20"/>
           <w:szCs w:val="20"/>
         </w:rPr>
-        <w:t xml:space="preserve">Otomatisasi Kargo; memprogram helikopter untuk menjatuhkan barang donasi di atas perairan danau tanpa parasut penerjun.</w:t>
+        <w:t xml:space="preserve">Abstraksi berlebih; menghapus daftar harga makanan sehingga siswa tidak tahu berapa uang yang harus dibayarkan.</w:t>
       </w:r>
     </w:p>
     <w:p>
@@ -4322,7 +4257,7 @@
           <w:sz w:val="20"/>
           <w:szCs w:val="20"/>
         </w:rPr>
-        <w:t xml:space="preserve">Dekomposisi; membagikan mainan anak-anak terlebih dahulu agar korban bencana tidak mengalami kesedihan berlarut-larut.</w:t>
+        <w:t xml:space="preserve">Pengenalan pola negatif; menyimpulkan bahwa antrean panjang merupakan tradisi sekolah yang tidak perlu diubah.</w:t>
       </w:r>
     </w:p>
     <w:p>
@@ -4346,7 +4281,7 @@
           <w:sz w:val="20"/>
           <w:szCs w:val="20"/>
         </w:rPr>
-        <w:t xml:space="preserve">Algoritma Buta; mengabaikan seluruh permintaan bantuan dan membiarkan helikopter terbang dalam keadaan kosong tanpa muatan.</w:t>
+        <w:t xml:space="preserve">Pemrograman manual; mewajibkan siswa menghafal kode batang setiap bungkus makanan sebelum membelinya.</w:t>
       </w:r>
     </w:p>
     <w:p>
@@ -4393,7 +4328,7 @@
           <w:sz w:val="18"/>
           <w:szCs w:val="18"/>
         </w:rPr>
-        <w:t xml:space="preserve">Abstraksi menyingkirkan detail/elemen non-kritis (baju bekas, mainan) dan fokus pada prioritas keselamatan nyawa (air, medis, makanan kalori, radio) karena kapasitas angkut helikopter sangat terbatas.</w:t>
+        <w:t xml:space="preserve">Merancang alur langkah yang terstruktur (pilih menu -&gt; bayar di kasir terpusat -&gt; ambil makanan dengan nomor antrean di meja terpisah) adalah bentuk penerapan Algoritma guna menciptakan proses transaksi yang tertib, cepat, dan bebas hambatan.</w:t>
       </w:r>
     </w:p>
     <w:p>
@@ -4422,7 +4357,7 @@
           <w:sz w:val="20"/>
           <w:szCs w:val="20"/>
         </w:rPr>
-        <w:t xml:space="preserve">Perhatikan jadwal penerbangan (Flight Plan) yang dirancang oleh Kapten Rina:</w:t>
+        <w:t xml:space="preserve">Nina mengamati hasil nilai ulangan hariannya selama satu semester. Ia menyadari sebuah pola menarik: setiap kali ia belajar pada malam hari di atas pukul 22.00 sambil mendengarkan musik keras dan sesekali membuka media sosial, nilai ulangannya cenderung di bawah 70. Sebaliknya, ketika ia tidur lebih awal pukul 21.00 dan mengulang ringkasan materi pelajaran setelah bangun subuh pada pukul 05.00 pagi, nilai ulangannya selalu di atas 85.</w:t>
       </w:r>
     </w:p>
     <w:p>
@@ -4435,59 +4370,7 @@
           <w:sz w:val="20"/>
           <w:szCs w:val="20"/>
         </w:rPr>
-        <w:t xml:space="preserve">1. Pukul 06.00 - 10.00: Seluruh (5) helikopter dikerahkan hanya untuk Sektor Utara.</w:t>
-      </w:r>
-    </w:p>
-    <w:p>
-      <w:pPr>
-        <w:spacing w:after="100"/>
-      </w:pPr>
-      <w:r>
-        <w:rPr>
-          <w:rFonts w:ascii="Arial" w:cs="Arial" w:eastAsia="Arial" w:hAnsi="Arial"/>
-          <w:sz w:val="20"/>
-          <w:szCs w:val="20"/>
-        </w:rPr>
-        <w:t xml:space="preserve">2. Pukul 10.00 - 11.00: Helikopter kembali ke pangkalan untuk isi bahan bakar ulang (refueling).</w:t>
-      </w:r>
-    </w:p>
-    <w:p>
-      <w:pPr>
-        <w:spacing w:after="100"/>
-      </w:pPr>
-      <w:r>
-        <w:rPr>
-          <w:rFonts w:ascii="Arial" w:cs="Arial" w:eastAsia="Arial" w:hAnsi="Arial"/>
-          <w:sz w:val="20"/>
-          <w:szCs w:val="20"/>
-        </w:rPr>
-        <w:t xml:space="preserve">3. Pukul 11.00 - 14.00: 3 helikopter dikerahkan ke Sektor Tengah, 2 helikopter ke Sektor Selatan.</w:t>
-      </w:r>
-    </w:p>
-    <w:p>
-      <w:pPr>
-        <w:spacing w:after="100"/>
-      </w:pPr>
-      <w:r>
-        <w:rPr>
-          <w:rFonts w:ascii="Arial" w:cs="Arial" w:eastAsia="Arial" w:hAnsi="Arial"/>
-          <w:sz w:val="20"/>
-          <w:szCs w:val="20"/>
-        </w:rPr>
-        <w:t xml:space="preserve">4. Pukul 14.00 - Selesai: Operasi penerbangan dihentikan untuk inspeksi mesin harian dan menghindari cuaca buruk sore hari.</w:t>
-      </w:r>
-    </w:p>
-    <w:p>
-      <w:pPr>
-        <w:spacing w:after="100"/>
-      </w:pPr>
-      <w:r>
-        <w:rPr>
-          <w:rFonts w:ascii="Arial" w:cs="Arial" w:eastAsia="Arial" w:hAnsi="Arial"/>
-          <w:sz w:val="20"/>
-          <w:szCs w:val="20"/>
-        </w:rPr>
-        <w:t xml:space="preserve">Apakah jadwal penerbangan tersebut sah memenuhi syarat sebagai sebuah "Algoritma"? Berikan evaluasi rasionalnya!</w:t>
+        <w:t xml:space="preserve">Bagaimana Nina sebaiknya menerapkan pemikiran komputasional berdasarkan pola yang ia temukan tersebut?</w:t>
       </w:r>
     </w:p>
     <w:p>
@@ -4511,7 +4394,7 @@
           <w:sz w:val="20"/>
           <w:szCs w:val="20"/>
         </w:rPr>
-        <w:t xml:space="preserve">Ya, memenuhi syarat penuh; jadwal berupa instruksi logis, dieksekusi secara kronologis teratur, memiliki kuantitas sumber daya spesifik per jam, dan deterministik bagi seluruh pilot.</w:t>
+        <w:t xml:space="preserve">Mengubah jadwal belajarnya menjadi rutinitas pagi hari setelah subuh dan menjauhkan gangguan ponsel pintar untuk menjaga konsentrasi optimal.</w:t>
       </w:r>
     </w:p>
     <w:p>
@@ -4535,7 +4418,7 @@
           <w:sz w:val="20"/>
           <w:szCs w:val="20"/>
         </w:rPr>
-        <w:t xml:space="preserve">Tidak memenuhi syarat; karena jadwal tersebut disusun oleh seorang perwira manusia dan tidak dieksekusi oleh bahasa pemrograman Python atau C++.</w:t>
+        <w:t xml:space="preserve">Tetap begadang hingga tengah malam karena menganggap nilai ulangan semata-mata bergantung pada keberuntungan lembar soal.</w:t>
       </w:r>
     </w:p>
     <w:p>
@@ -4559,7 +4442,7 @@
           <w:sz w:val="20"/>
           <w:szCs w:val="20"/>
         </w:rPr>
-        <w:t xml:space="preserve">Tidak memenuhi syarat; karena jadwal hanya mencakup kurun waktu dari pagi hingga sore hari dan tidak berjalan selama 24 jam nonstop.</w:t>
+        <w:t xml:space="preserve">Berhenti belajar sama sekali dan hanya mengandalkan ingatan sekilas saat guru menjelaskan materi di depan kelas.</w:t>
       </w:r>
     </w:p>
     <w:p>
@@ -4583,7 +4466,7 @@
           <w:sz w:val="20"/>
           <w:szCs w:val="20"/>
         </w:rPr>
-        <w:t xml:space="preserve">Sebagian memenuhi syarat; namun dianggap cacat logika karena membiarkan helikopter beristirahat pada pukul 10.00 - 11.00.</w:t>
+        <w:t xml:space="preserve">Menghapus catatan nilai ulangannya agar tidak merasa terbebani oleh riwayat prestasi akademiknya.</w:t>
       </w:r>
     </w:p>
     <w:p>
@@ -4607,7 +4490,7 @@
           <w:sz w:val="20"/>
           <w:szCs w:val="20"/>
         </w:rPr>
-        <w:t xml:space="preserve">Tidak memenuhi syarat; karena algoritma sejati harus berbentuk kode biner 0 dan 1 yang tertanam di dalam mesin helikopter.</w:t>
+        <w:t xml:space="preserve">Meminta guru mengubah seluruh materi ujian menjadi lagu musik pop agar sesuai dengan kebiasaan belajarnya di malam hari.</w:t>
       </w:r>
     </w:p>
     <w:p>
@@ -4654,7 +4537,7 @@
           <w:sz w:val="18"/>
           <w:szCs w:val="18"/>
         </w:rPr>
-        <w:t xml:space="preserve">Jadwal tersebut adalah algoritma valid: langkah terstruktur, spesifik dalam alokasi armada per jam dan sektor, logis, terhingga, dan siap dieksekusi oleh agen manusia (pilot).</w:t>
+        <w:t xml:space="preserve">Setelah mengenali pola korelasi antara waktu belajar, fokus mental, dan hasil nilai ujian, langkah komputasional yang logis adalah mengadaptasi algoritma jadwal belajar pribadi ke waktu yang terbukti menghasilkan performa terbaik (subuh hari tanpa distraksi).</w:t>
       </w:r>
     </w:p>
     <w:p>
@@ -4683,7 +4566,7 @@
           <w:sz w:val="20"/>
           <w:szCs w:val="20"/>
         </w:rPr>
-        <w:t xml:space="preserve">Dalam jadwal penerbangan Kapten Rina, pukul 10.00 - 11.00 ditetapkan secara ketat: "Helikopter kembali ke pangkalan untuk isi bahan bakar ulang (refueling)".</w:t>
+        <w:t xml:space="preserve">Saat membaca buku teks Biologi setebal 40 halaman tentang "Keanekaragaman Hayati", Farhan tidak menyalin seluruh kata-kata di dalam buku ke buku tulisnya. Ia hanya mencatat istilah utama (Tingkat Gen, Jenis, dan Ekosistem), menuliskan ciri pembeda masing-masing tingkat, dan memberikan dua contoh konkret dari flora fauna khas Indonesia pada selembar diagram peta konsep.</w:t>
       </w:r>
     </w:p>
     <w:p>
@@ -4696,7 +4579,7 @@
           <w:sz w:val="20"/>
           <w:szCs w:val="20"/>
         </w:rPr>
-        <w:t xml:space="preserve">Jika seorang pejabat lapangan menuntut agar tahap refueling tersebut dihilangkan demi gengsi publikasi bahwa helikopter terbang tanpa jeda, konsekuensi kegagalan sistem komputasional (system failure) apakah yang pasti terjadi?</w:t>
+        <w:t xml:space="preserve">Proses yang dilakukan Farhan dalam meringkas materi pelajaran tersebut menunjukkan penerapan pilar:</w:t>
       </w:r>
     </w:p>
     <w:p>
@@ -4720,7 +4603,7 @@
           <w:sz w:val="20"/>
           <w:szCs w:val="20"/>
         </w:rPr>
-        <w:t xml:space="preserve">Kehabisan daya sumber energi di tengah rute penerbangan sesi kedua (Resource Depletion), yang memicu insiden kecelakaan fatal dan kegagalan total seluruh misi kemanusiaan.</w:t>
+        <w:t xml:space="preserve">Abstraksi; menyaring konsep-konsep inti yang paling esensial dan mengesampingkan kalimat penjelas yang terlalu panjang lebar.</w:t>
       </w:r>
     </w:p>
     <w:p>
@@ -4744,7 +4627,7 @@
           <w:sz w:val="20"/>
           <w:szCs w:val="20"/>
         </w:rPr>
-        <w:t xml:space="preserve">Cuaca buruk di sore hari akan tertunda kemunculannya hingga pengisian bahan bakar dilakukan pada malam hari.</w:t>
+        <w:t xml:space="preserve">Algoritma sekuensial; menghafal nomor halaman buku teks tanpa memahami makna dari materi yang dibaca.</w:t>
       </w:r>
     </w:p>
     <w:p>
@@ -4768,7 +4651,7 @@
           <w:sz w:val="20"/>
           <w:szCs w:val="20"/>
         </w:rPr>
-        <w:t xml:space="preserve">Helikopter akan terbang lebih kencang karena muatan bahan bakar di dalam tangki menjadi kosong dan ringan.</w:t>
+        <w:t xml:space="preserve">Dekomposisi destruktif; merobek halaman buku teks yang dianggap tidak akan keluar dalam lembar soal ujian.</w:t>
       </w:r>
     </w:p>
     <w:p>
@@ -4792,7 +4675,7 @@
           <w:sz w:val="20"/>
           <w:szCs w:val="20"/>
         </w:rPr>
-        <w:t xml:space="preserve">Penduduk di Sektor Tengah akan menerima makanan instan dalam kondisi terlalu panas akibat panas mesin helikopter.</w:t>
+        <w:t xml:space="preserve">Pengenalan pola acak; mencoret-coret lembar buku catatan dengan gambar animasi tanpa ada teks penjelasan.</w:t>
       </w:r>
     </w:p>
     <w:p>
@@ -4816,7 +4699,7 @@
           <w:sz w:val="20"/>
           <w:szCs w:val="20"/>
         </w:rPr>
-        <w:t xml:space="preserve">Pilot helikopter akan kehilangan sinyal GPS satelit secara permanen akibat ketiadaan avtur di dalam karburator.</w:t>
+        <w:t xml:space="preserve">Otomatisasi fotokopi; memfotokopi seluruh buku tanpa membaca dan mempelajarinya secara mendalam.</w:t>
       </w:r>
     </w:p>
     <w:p>
@@ -4863,7 +4746,7 @@
           <w:sz w:val="18"/>
           <w:szCs w:val="18"/>
         </w:rPr>
-        <w:t xml:space="preserve">Dalam manajemen sistem sumber daya terbatas, proses replenishment (pengisian ulang avtur) adalah prasyarat mutlak. Menghilangkannya memicu kegagalan sistemik fatal (kehabisan bahan bakar di udara).</w:t>
+        <w:t xml:space="preserve">Membuat ringkasan peta konsep dengan hanya mengambil ide pokok dan mengabaikan narasi tambahan yang berbelit-belit adalah contoh penerapan Abstraksi dalam kegiatan akademik belajar siswa.</w:t>
       </w:r>
     </w:p>
     <w:p>
@@ -4892,7 +4775,7 @@
           <w:sz w:val="20"/>
           <w:szCs w:val="20"/>
         </w:rPr>
-        <w:t xml:space="preserve">Pada tahapan ke-4 jadwal Kapten Rina tertulis: "Pukul 14.00 - Selesai: Operasi dihentikan untuk inspeksi mesin harian dan menghindari cuaca buruk sore hari."</w:t>
+        <w:t xml:space="preserve">Sebagai ketua panitia kemah bakti OSIS, Andi membagi kepanitiaan menjadi divisi acara, divisi konsumsi, divisi perlengkapan, dan divisi keamanan medis. Selanjutnya, Andi menyusun susunan jadwal (rundown) acara secara detail menit demi menit, mulai dari upacara pembukaan pukul 08.00 hingga api unggun pukul 20.00, lengkap dengan penanggung jawab masing-masing sesi.</w:t>
       </w:r>
     </w:p>
     <w:p>
@@ -4905,7 +4788,7 @@
           <w:sz w:val="20"/>
           <w:szCs w:val="20"/>
         </w:rPr>
-        <w:t xml:space="preserve">Dari perspektif pemeliharaan sistem komputasional yang tangguh (robust &amp; sustainable system), mengapa penghentian operasi pada pukul 14.00 merupakan keputusan yang sangat cerdas, alih-alih bentuk pemalasan?</w:t>
+        <w:t xml:space="preserve">Kombinasi pilar berpikir komputasional apakah yang berhasil diintegrasikan oleh Andi dalam mempersiapkan acara sekolah tersebut?</w:t>
       </w:r>
     </w:p>
     <w:p>
@@ -4929,7 +4812,7 @@
           <w:sz w:val="20"/>
           <w:szCs w:val="20"/>
         </w:rPr>
-        <w:t xml:space="preserve">Menerapkan batas toleransi keamanan (safety threshold) untuk mencegah risiko kerugian aset total akibat cuaca buruk dan menjamin kesiapan armada untuk beroperasi kembali keesokan paginya.</w:t>
+        <w:t xml:space="preserve">Dekomposisi (pembagian divisi kepanitiaan) dan Algoritma (penyusunan urutan waktu pelaksanaan kegiatan per menit).</w:t>
       </w:r>
     </w:p>
     <w:p>
@@ -4953,7 +4836,7 @@
           <w:sz w:val="20"/>
           <w:szCs w:val="20"/>
         </w:rPr>
-        <w:t xml:space="preserve">Memberi kesempatan kepada Kapten Rina untuk meninggalkan lokasi posko bencana dan berlibur ke luar kota pegunungan.</w:t>
+        <w:t xml:space="preserve">Abstraksi semata tanpa mempertimbangkan siapa yang akan menjalankan tugas di lapangan.</w:t>
       </w:r>
     </w:p>
     <w:p>
@@ -4977,7 +4860,7 @@
           <w:sz w:val="20"/>
           <w:szCs w:val="20"/>
         </w:rPr>
-        <w:t xml:space="preserve">Karena setelah pukul 14.00 seluruh korban bencana di perbukitan sudah tidak membutuhkan pertolongan medis.</w:t>
+        <w:t xml:space="preserve">Pengenalan pola cuaca tanpa menyusun rencana tindakan konkret untuk para peserta kemah.</w:t>
       </w:r>
     </w:p>
     <w:p>
@@ -5001,7 +4884,7 @@
           <w:sz w:val="20"/>
           <w:szCs w:val="20"/>
         </w:rPr>
-        <w:t xml:space="preserve">Menghabiskan alokasi anggaran operasional harian agar sisa saldo bahan bakar avtur hangus dan diganti anggaran baru.</w:t>
+        <w:t xml:space="preserve">Percabangan acak yang membiarkan setiap peserta kemah menentukan sendiri jadwal kegiatannya tanpa koordinasi.</w:t>
       </w:r>
     </w:p>
     <w:p>
@@ -5025,7 +4908,7 @@
           <w:sz w:val="20"/>
           <w:szCs w:val="20"/>
         </w:rPr>
-        <w:t xml:space="preserve">Agar seluruh pilot helikopter dapat menghadiri konferensi pers di kantor bupati sebelum matahari terbenam.</w:t>
+        <w:t xml:space="preserve">Pengulangan tanpa henti yang mengharuskan upacara pembukaan dilakukan berulang-ulang sepanjang hari.</w:t>
       </w:r>
     </w:p>
     <w:p>
@@ -5072,7 +4955,7 @@
           <w:sz w:val="18"/>
           <w:szCs w:val="18"/>
         </w:rPr>
-        <w:t xml:space="preserve">Pilar algoritma memperhitungkan batasan keselamatan lingkungan (safety margin). Menghentikan operasi pada pukul 14.00 mencegah kecelakaan di cuaca ekstrem berkabut dan memastikan kesiapan armada jangka panjang.</w:t>
+        <w:t xml:space="preserve">Membagi kepanitiaan besar menjadi beberapa divisi kerja adalah Dekomposisi, sedangkan menyusun jadwal kegiatan dari jam ke jam dengan instruksi dan penanggung jawab yang terukur adalah Algoritma.</w:t>
       </w:r>
     </w:p>
     <w:p>
@@ -5101,7 +4984,7 @@
           <w:sz w:val="20"/>
           <w:szCs w:val="20"/>
         </w:rPr>
-        <w:t xml:space="preserve">Bandingkan tindakan Dr. Aris pada Kasus 1 (Kota Delta) dan Kapten Rina pada Kasus 2 (Garuda Rescue). Keduanya sama-sama memimpin tim penyelamat dalam situasi darurat berskala besar dengan keterbatasan sumber daya.</w:t>
+        <w:t xml:space="preserve">Bendahara kelas X mencatat arus kas mingguan kelas. Di dalam buku kas, bendahara hanya menuliskan: Tanggal Transaksi, Keterangan Penerimaan/Pengeluaran, Jumlah Uang (Rupiah), dan Saldo Akhir. Bendahara tidak mencatat warna pecahan uang kertas yang dibayarkan siswa, nomor seri uang kertas, maupun merk pulpen yang digunakan untuk menulis kuitansi.</w:t>
       </w:r>
     </w:p>
     <w:p>
@@ -5114,7 +4997,7 @@
           <w:sz w:val="20"/>
           <w:szCs w:val="20"/>
         </w:rPr>
-        <w:t xml:space="preserve">Persamaan mendasar apakah yang dapat disintesis dari cara kedua tokoh tersebut menerapkan pilar ABSTRAKSI dalam menyelesaikan krisis masing-masing?</w:t>
+        <w:t xml:space="preserve">Mengapa tindakan bendahara kelas mengabaikan detail uang tersebut merupakan wujud abstraksi yang benar?</w:t>
       </w:r>
     </w:p>
     <w:p>
@@ -5138,7 +5021,7 @@
           <w:sz w:val="20"/>
           <w:szCs w:val="20"/>
         </w:rPr>
-        <w:t xml:space="preserve">Keduanya secara disiplin menyaring dan membuang elemen non-kritis (pabrik non-B3 oleh Dr. Aris, dan barang non-medis oleh Kapten Rina) demi memusatkan kapasitas terbatas pada faktor penyelamat hidup utama.</w:t>
+        <w:t xml:space="preserve">Karena nomor seri uang dan warna kertas sama sekali tidak mempengaruhi nilai saldo kas kelas maupun keabsahan laporan keuangan.</w:t>
       </w:r>
     </w:p>
     <w:p>
@@ -5162,7 +5045,7 @@
           <w:sz w:val="20"/>
           <w:szCs w:val="20"/>
         </w:rPr>
-        <w:t xml:space="preserve">Keduanya menolak menggunakan bantuan teknologi komputer dan hanya mengandalkan firasat batin dalam memimpin operasi penyelamatan.</w:t>
+        <w:t xml:space="preserve">Karena bendahara kelas malas menuliskan rincian lengkap dari seluruh uang yang disetorkan oleh teman sekelasnya.</w:t>
       </w:r>
     </w:p>
     <w:p>
@@ -5186,7 +5069,7 @@
           <w:sz w:val="20"/>
           <w:szCs w:val="20"/>
         </w:rPr>
-        <w:t xml:space="preserve">Keduanya membagi daerah krisis menjadi sepuluh zona acak tanpa menggunakan data historis bencana masa lalu.</w:t>
+        <w:t xml:space="preserve">Karena uang kas kelas tidak boleh diperiksa oleh wali kelas maupun ketua murid selama masa jabatan berlangsung.</w:t>
       </w:r>
     </w:p>
     <w:p>
@@ -5210,7 +5093,7 @@
           <w:sz w:val="20"/>
           <w:szCs w:val="20"/>
         </w:rPr>
-        <w:t xml:space="preserve">Keduanya membatalkan operasi evakuasi warga dan membiarkan krisis diselesaikan sendiri oleh alam.</w:t>
+        <w:t xml:space="preserve">Karena nomor seri uang kertas akan hilang dengan sendirinya ketika disimpan di dalam kotak kas kelas.</w:t>
       </w:r>
     </w:p>
     <w:p>
@@ -5234,7 +5117,7 @@
           <w:sz w:val="20"/>
           <w:szCs w:val="20"/>
         </w:rPr>
-        <w:t xml:space="preserve">Keduanya memfokuskan seluruh bantuan logistik kepada masyarakat yang memiliki jabatan politik tertinggi di wilayah krisis.</w:t>
+        <w:t xml:space="preserve">Karena pencatatan nomor seri uang hanya diwajibkan untuk uang koin logam kuno keluaran abad pertengahan.</w:t>
       </w:r>
     </w:p>
     <w:p>
@@ -5281,7 +5164,7 @@
           <w:sz w:val="18"/>
           <w:szCs w:val="18"/>
         </w:rPr>
-        <w:t xml:space="preserve">Kedua tokoh mendemonstrasikan pilar Abstraksi: menyingkirkan elemen noise (pabrik non-B3 dan barang donasi sekunder) untuk memprioritaskan faktor esensial penyelamat hidup (life-saving factors).</w:t>
+        <w:t xml:space="preserve">Dalam akuntansi kas sederhana, informasi yang esensial hanyalah nominal uang, tanggal, tujuan transaksi, dan saldo akhir. Detail fisik uang (nomor seri, kelipatan lembar, warna kertas) adalah noise yang harus diabstraksi/dihilangkan agar laporan tetap ringkas dan transparan.</w:t>
       </w:r>
     </w:p>
     <w:p>
@@ -5310,7 +5193,7 @@
           <w:sz w:val="20"/>
           <w:szCs w:val="20"/>
         </w:rPr>
-        <w:t xml:space="preserve">Pada Kasus 1 (Kota Delta), Dr. Aris melakukan dekomposisi berdasarkan *aspek sains investigasi* (hidrologi, tata lahan, uji kimiawi). Sementara pada Kasus 2 (Garuda Rescue), Kapten Rina melakukan dekomposisi berdasarkan *kluster geografis dan tingkat kerusakan* (Sektor Utara, Tengah, Selatan).</w:t>
+        <w:t xml:space="preserve">Dalam materi buku ajar Informatika, dijelaskan bahwa peta jaringan transportasi umum (seperti peta kereta MRT atau rute angkutan kota) adalah bentuk abstraksi nyata. Peta tersebut hanya menyajikan garis jalur warna-warni, titik nama stasiun, dan stasiun tempat berpindah jalur (transit), sembari membuang gambar pepohonan di tepi jalan, belokan tajam rel yang sesungguhnya, maupun ruko di sekitar halte.</w:t>
       </w:r>
     </w:p>
     <w:p>
@@ -5323,7 +5206,7 @@
           <w:sz w:val="20"/>
           <w:szCs w:val="20"/>
         </w:rPr>
-        <w:t xml:space="preserve">Kesimpulan konseptual apakah yang paling valid mengenai fleksibilitas pilar Dekomposisi dalam pemecahan masalah dunia nyata?</w:t>
+        <w:t xml:space="preserve">Mengapa penumpang angkutan kota justru jauh lebih terbantu oleh peta yang telah diabstraksi tersebut dibandingkan jika diberikan foto satelit permukaan bumi yang sangat mendetail?</w:t>
       </w:r>
     </w:p>
     <w:p>
@@ -5347,7 +5230,7 @@
           <w:sz w:val="20"/>
           <w:szCs w:val="20"/>
         </w:rPr>
-        <w:t xml:space="preserve">Dekomposisi dapat diterapkan melalui berbagai dimensi pemotongan (fungsional, spasial/geografis, kronologis, atau derajat keparahan), disesuaikan dengan arsitektur masalah dan tujuan operasional.</w:t>
+        <w:t xml:space="preserve">Karena penumpang hanya membutuhkan informasi rute dan titik transit utama; terlalu banyak detail pemandangan fisik justru akan membuat bingung dan memperlambat pengambilan keputusan.</w:t>
       </w:r>
     </w:p>
     <w:p>
@@ -5371,7 +5254,7 @@
           <w:sz w:val="20"/>
           <w:szCs w:val="20"/>
         </w:rPr>
-        <w:t xml:space="preserve">Dekomposisi fungsional sains lingkungan tidak boleh digabungkan dengan dekomposisi geografis dalam satu sistem pemerintahan.</w:t>
+        <w:t xml:space="preserve">Karena foto satelit beresolusi tinggi dilarang oleh undang-undang transportasi untuk dilihat oleh masyarakat umum.</w:t>
       </w:r>
     </w:p>
     <w:p>
@@ -5395,7 +5278,7 @@
           <w:sz w:val="20"/>
           <w:szCs w:val="20"/>
         </w:rPr>
-        <w:t xml:space="preserve">Dekomposisi harus selalu menghasilkan bagian-bagian yang dikerjakan oleh robot tanpa keterlibatan tenaga manusia.</w:t>
+        <w:t xml:space="preserve">Karena garis jalur warna-warni secara otomatis memandu langkah kaki penumpang tanpa perlu membaca peta kembali.</w:t>
       </w:r>
     </w:p>
     <w:p>
@@ -5419,7 +5302,7 @@
           <w:sz w:val="20"/>
           <w:szCs w:val="20"/>
         </w:rPr>
-        <w:t xml:space="preserve">Dekomposisi hanya sah dan benar jika membagi daerah menjadi tiga sektor geografis yang berbentuk bujur sangkar sempurna.</w:t>
+        <w:t xml:space="preserve">Karena peta yang sederhana lebih murah biaya pencetakannya sehingga pengelola kereta bisa menghemat anggaran stasiun.</w:t>
       </w:r>
     </w:p>
     <w:p>
@@ -5443,7 +5326,7 @@
           <w:sz w:val="20"/>
           <w:szCs w:val="20"/>
         </w:rPr>
-        <w:t xml:space="preserve">Dekomposisi pada operasi tanggap bencana alam selalu gagal jika tidak menggunakan rumus matematika diferensial integral.</w:t>
+        <w:t xml:space="preserve">Karena kereta komuter tidak bergerak di atas rel nyata melainkan hanya meluncur di dalam ruang simulasi maya.</w:t>
       </w:r>
     </w:p>
     <w:p>
@@ -5490,7 +5373,7 @@
           <w:sz w:val="18"/>
           <w:szCs w:val="18"/>
         </w:rPr>
-        <w:t xml:space="preserve">Dekomposisi bersifat fleksibel dan adaptif: dapat dilakukan secara fungsional keilmuan maupun spasial geografis, disesuaikan dengan kebutuhan pemecahan masalah di lapangan.</w:t>
+        <w:t xml:space="preserve">Abstraksi pada peta transportasi menyaring informasi sehingga hanya menyisakan data yang dibutuhkan oleh pengguna (stasiun, jalur, titik transfer). Gambar pohon, bangunan, atau belokan riil adalah detail pengganggu (noise visual) yang justru membingungkan penumpang saat membaca rute.</w:t>
       </w:r>
     </w:p>
     <w:p>
@@ -5519,7 +5402,7 @@
           <w:sz w:val="20"/>
           <w:szCs w:val="20"/>
         </w:rPr>
-        <w:t xml:space="preserve">Pada pukul 08.00 pagi dalam misi Garuda Rescue, sebuah helikopter kargo mengalami kerusakan pompa oli darurat dan harus diistirahatkan di pangkalan, sehingga armada yang siap terbang tersisa 4 unit.</w:t>
+        <w:t xml:space="preserve">Pak Joko, seorang petani apel di kawasan Bumiaji Kota Batu, mencatat bahwa setiap kali kelembapan udara mencapai lebih dari 85 persen selama empat hari berturut-turut pada awal musim hujan, kebun apelnya selalu diserang oleh hama kutu sisik dan bercak daun. Berdasarkan pemahaman ini, sebelum serangan hama meluas, Pak Joko segera menyemprotkan cairan pelindung alami pada hari ketiga saat tanda kelembapan tinggi terdeteksi.</w:t>
       </w:r>
     </w:p>
     <w:p>
@@ -5532,7 +5415,7 @@
           <w:sz w:val="20"/>
           <w:szCs w:val="20"/>
         </w:rPr>
-        <w:t xml:space="preserve">Berdasarkan prinsip berpikir komputasional yang tangguh dan adaptif, modifikasi algoritma jadwal manakah yang paling rasional diambil oleh Kapten Rina?</w:t>
+        <w:t xml:space="preserve">Pilar berpikir komputasional apakah yang berhasil dimanfaatkan Pak Joko untuk menyelamatkan hasil panen apelnya?</w:t>
       </w:r>
     </w:p>
     <w:p>
@@ -5556,7 +5439,7 @@
           <w:sz w:val="20"/>
           <w:szCs w:val="20"/>
         </w:rPr>
-        <w:t xml:space="preserve">Menjaga prioritas penyelamatan Sektor Utara dengan mengerahkan ke-4 helikopter tersisa hingga pukul 10.00, lalu mengalokasikan masing-masing 2 helikopter untuk Sektor Tengah dan Selatan di sesi siang.</w:t>
+        <w:t xml:space="preserve">Pengenalan pola; mengaitkan hubungan berulang antara faktor kelembapan cuaca dengan siklus kemunculan hama untuk melakukan pencegahan dini.</w:t>
       </w:r>
     </w:p>
     <w:p>
@@ -5580,7 +5463,7 @@
           <w:sz w:val="20"/>
           <w:szCs w:val="20"/>
         </w:rPr>
-        <w:t xml:space="preserve">Membatalkan seluruh penerbangan hari itu dan membiarkan warga di 15 desa menunggu hingga helikopter pengganti tiba minggu depan.</w:t>
+        <w:t xml:space="preserve">Dekomposisi acak; memotong seluruh batang pohon apel yang sehat agar hama tidak memiliki tempat untuk hinggap.</w:t>
       </w:r>
     </w:p>
     <w:p>
@@ -5604,7 +5487,7 @@
           <w:sz w:val="20"/>
           <w:szCs w:val="20"/>
         </w:rPr>
-        <w:t xml:space="preserve">Memaksa helikopter yang rusak pompa oli untuk tetap terbang membawa muatan melintasi perbukitan berkabut tebal.</w:t>
+        <w:t xml:space="preserve">Abstraksi ekstrem; mengabaikan kondisi cuaca dan membiarkan kebun apel terendam air hujan tanpa pengawasan.</w:t>
       </w:r>
     </w:p>
     <w:p>
@@ -5628,7 +5511,7 @@
           <w:sz w:val="20"/>
           <w:szCs w:val="20"/>
         </w:rPr>
-        <w:t xml:space="preserve">Mengalihkan seluruh muatan kargo ke mobil ambulans darat yang sudah terbukti tidak bisa melintas karena longsor.</w:t>
+        <w:t xml:space="preserve">Algoritma tertutup; menyemprotkan pestisida kimia setiap jam sepanjang tahun tanpa memperhatikan musim.</w:t>
       </w:r>
     </w:p>
     <w:p>
@@ -5652,7 +5535,7 @@
           <w:sz w:val="20"/>
           <w:szCs w:val="20"/>
         </w:rPr>
-        <w:t xml:space="preserve">Memerintahkan pilot menerbangkan helikopter ke Sektor Selatan saja karena paling mudah dijangkau dan bebas resiko.</w:t>
+        <w:t xml:space="preserve">Penyusunan kode sandi; memberi nomor kode rahasia pada setiap buah apel yang bergelantungan di pohon.</w:t>
       </w:r>
     </w:p>
     <w:p>
@@ -5699,7 +5582,7 @@
           <w:sz w:val="18"/>
           <w:szCs w:val="18"/>
         </w:rPr>
-        <w:t xml:space="preserve">Algoritma yang adaptif melakukan penyesuaian parameter sumber daya (dari 5 unit menjadi 4 unit) tanpa mengorbankan prioritas keselamatan utama (Sektor Utara tetap prioritas pagi hari).</w:t>
+        <w:t xml:space="preserve">Petani memanfaatkan Pengenalan Pola. Mengamati korelasi berulang antara tingkat kelembapan mikro dan waktu penetasan hama memungkinkan tindakan preventif yang presisi dan menghemat biaya operasional kebun.</w:t>
       </w:r>
     </w:p>
     <w:p>
@@ -5728,7 +5611,7 @@
           <w:sz w:val="20"/>
           <w:szCs w:val="20"/>
         </w:rPr>
-        <w:t xml:space="preserve">Dalam pengenalan pola dan analisis data, manusia rentan mengalami *Confirmation Bias* (hanya mencari atau mempercayai data yang membenarkan prasangka pribadi awal, dan mengabaikan data anomali yang bertentangan).</w:t>
+        <w:t xml:space="preserve">Setiap akhir pekan panjang, jalan utama di pusat oleh-oleh Kota Batu kerap mengalami kemacetan parah akibat banyaknya bus wisata yang parkir sembarangan. Dinas Perhubungan bersama kepolisian merancang rekayasa lalu lintas: Jika panjang antrean kendaraan dari arah barat melebihi 500 meter, maka kendaraan kecil dialihkan melintasi jalan lingkar alternatif, sementara bus besar hanya diizinkan menurunkan penumpang di kantong parkir terpadu stadion.</w:t>
       </w:r>
     </w:p>
     <w:p>
@@ -5741,7 +5624,7 @@
           <w:sz w:val="20"/>
           <w:szCs w:val="20"/>
         </w:rPr>
-        <w:t xml:space="preserve">Jika dalam Kasus Kota Delta, Dr. Aris sejak awal berprasangka buruk bahwa "seluruh pencemaran kromium pasti berasal dari pabrik makanan", kesalahan fatal apakah yang akan merusak sistem penanganan krisis?</w:t>
+        <w:t xml:space="preserve">Karakteristik penting apa dari sebuah algoritma rekayasa transportasi yang tercermin dari kebijakan tersebut?</w:t>
       </w:r>
     </w:p>
     <w:p>
@@ -5765,7 +5648,7 @@
           <w:sz w:val="20"/>
           <w:szCs w:val="20"/>
         </w:rPr>
-        <w:t xml:space="preserve">Investigasi akan menyasar target yang keliru dan menutup industri makanan yang tidak bersalah, sementara pabrik tekstil dan aki pencemar sesungguhnya terus membuang limbah B3.</w:t>
+        <w:t xml:space="preserve">Memiliki aturan percabangan kondisi (kondisional) yang terukur dan memiliki tindakan aksi yang pasti ketika ambang batas kemacetan terlampaui.</w:t>
       </w:r>
     </w:p>
     <w:p>
@@ -5789,7 +5672,7 @@
           <w:sz w:val="20"/>
           <w:szCs w:val="20"/>
         </w:rPr>
-        <w:t xml:space="preserve">Lumpur sungai akan mendadak mengendap secara bersih tanpa menyisakan kandungan logam berat kromium dan timbal.</w:t>
+        <w:t xml:space="preserve">Mewajibkan seluruh kendaraan bermotor mematikan mesin dan menunggu di jalan raya sampai polisi mengizinkan jalan.</w:t>
       </w:r>
     </w:p>
     <w:p>
@@ -5813,7 +5696,7 @@
           <w:sz w:val="20"/>
           <w:szCs w:val="20"/>
         </w:rPr>
-        <w:t xml:space="preserve">Curah hujan harian Kota Delta akan otomatis turun di bawah 50 mm/hari karena pabrik makanan berhenti memproduksi uap air.</w:t>
+        <w:t xml:space="preserve">Mengharuskan pengendara mobil pribadi membayar denda uang tunai di tempat kepada petugas pengatur lalu lintas.</w:t>
       </w:r>
     </w:p>
     <w:p>
@@ -5837,7 +5720,7 @@
           <w:sz w:val="20"/>
           <w:szCs w:val="20"/>
         </w:rPr>
-        <w:t xml:space="preserve">Pintu air Katulampa Utara akan secara otomatis mengunci diri dan menolak dibuka hingga musim hujan Januari berakhir.</w:t>
+        <w:t xml:space="preserve">Menutup seluruh akses jalan menuju Kota Batu secara permanen agar jalanan kota selalu lengang dari wisatawan.</w:t>
       </w:r>
     </w:p>
     <w:p>
@@ -5861,7 +5744,7 @@
           <w:sz w:val="20"/>
           <w:szCs w:val="20"/>
         </w:rPr>
-        <w:t xml:space="preserve">Warga pengungsi di hilir sungai akan beralih mengonsumsi makanan cepat saji kalengan dari luar negeri.</w:t>
+        <w:t xml:space="preserve">Mengundi rute jalan yang boleh dilewati pengemudi menggunakan roda keberuntungan di setiap persimpangan jalan.</w:t>
       </w:r>
     </w:p>
     <w:p>
@@ -5908,7 +5791,7 @@
           <w:sz w:val="18"/>
           <w:szCs w:val="18"/>
         </w:rPr>
-        <w:t xml:space="preserve">Bias konfirmasi mendistorsi pengenalan pola ilmiah: sumber daya terbuang untuk menindak entitas yang salah (pabrik makanan), sedangkan sumber racun sesungguhnya (tekstil &amp; aki) tetap bebas mencemari sungai.</w:t>
+        <w:t xml:space="preserve">Kebijakan rekayasa jalan tersebut menerapkan algoritma percabangan (IF-THEN): JIKA antrean kendaraan &gt; 500 meter, MAKA alihkan mobil ke jalur alternatif dan batasi bus ke kantong parkir. Instruksinya jelas, deterministik, dan dapat dieksekusi petugas di lapangan.</w:t>
       </w:r>
     </w:p>
     <w:p>
@@ -5937,7 +5820,7 @@
           <w:sz w:val="20"/>
           <w:szCs w:val="20"/>
         </w:rPr>
-        <w:t xml:space="preserve">Kawasan pertanian apel di lereng Bumiaji dan Panderman Kota Batu menghadapi tantangan serius berupa anomali cuaca mikro, serangan hama kutu sisik, dan fluktuasi kelembapan tanah yang menurunkan produksi buah apel Manalagi.</w:t>
+        <w:t xml:space="preserve">Pengelola sebuah museum wahana edukasi di Kota Batu mencatat riwayat kunjungan selama lima tahun. Data menunjukkan bahwa kunjungan rombongan bus sekolah selalu melonjak lima kali lipat pada bulan Oktober dan November (musim karya wisata sekolah), sedangkan kunjungan keluarga memuncak pada libur akhir tahun di bulan Desember. Mengetahui pola ini, pengelola membuka sistem reservasi tiket daring sejak bulan Agustus dan menambah loket pintu masuk pada bulan Oktober.</w:t>
       </w:r>
     </w:p>
     <w:p>
@@ -5950,7 +5833,7 @@
           <w:sz w:val="20"/>
           <w:szCs w:val="20"/>
         </w:rPr>
-        <w:t xml:space="preserve">Siswa Kelas X SMAN 1 Batu ditugaskan merancang solusi sistem Pertanian Presisi (Smart Precision Farming) berbasis Berpikir Komputasional. Tindakan manakah yang merepresentasikan pilar PENGENALAN POLA secara tepat dalam proyek ini?</w:t>
+        <w:t xml:space="preserve">Manfaat berpikir komputasional apa yang diperoleh pengelola tempat wisata tersebut?</w:t>
       </w:r>
     </w:p>
     <w:p>
@@ -5974,7 +5857,7 @@
           <w:sz w:val="20"/>
           <w:szCs w:val="20"/>
         </w:rPr>
-        <w:t xml:space="preserve">Menganalisis korelasi data histori sensor kelembapan tanah, suhu udara, dan kecepatan angin selama 5 musim panen dengan siklus kemunculan ledakan populasi hama kutu sisik.</w:t>
+        <w:t xml:space="preserve">Mampu melakukan perencanaan alokasi sumber daya dan layanan secara matang jauh-jauh hari berlandaskan pola tren historis.</w:t>
       </w:r>
     </w:p>
     <w:p>
@@ -5998,7 +5881,7 @@
           <w:sz w:val="20"/>
           <w:szCs w:val="20"/>
         </w:rPr>
-        <w:t xml:space="preserve">Mengganti seluruh pohon apel dengan tanaman padi sawah tanpa menguji kesesuaian jenis tanah dan ketinggian lereng.</w:t>
+        <w:t xml:space="preserve">Dapat menaikkan harga tiket masuk secara mendadak hingga sepuluh kali lipat untuk meraup keuntungan pribadi.</w:t>
       </w:r>
     </w:p>
     <w:p>
@@ -6022,7 +5905,7 @@
           <w:sz w:val="20"/>
           <w:szCs w:val="20"/>
         </w:rPr>
-        <w:t xml:space="preserve">Mengecat batang pohon apel dengan warna putih agar terlihat rapi saat difoto oleh wisatawan yang berkunjung ke kebun.</w:t>
+        <w:t xml:space="preserve">Menolak kedatangan rombongan pelajar sekolah karena dianggap membuat museum menjadi terlalu berisik.</w:t>
       </w:r>
     </w:p>
     <w:p>
@@ -6046,7 +5929,7 @@
           <w:sz w:val="20"/>
           <w:szCs w:val="20"/>
         </w:rPr>
-        <w:t xml:space="preserve">Membeli pompa air berkapasitas terbesar di pasaran tanpa memeriksa debit sumber mata air alami di lereng bukit.</w:t>
+        <w:t xml:space="preserve">Menghapus catatan buku tamu agar kantor pajak tidak mengetahui jumlah wisatawan yang datang berkunjung.</w:t>
       </w:r>
     </w:p>
     <w:p>
@@ -6070,7 +5953,7 @@
           <w:sz w:val="20"/>
           <w:szCs w:val="20"/>
         </w:rPr>
-        <w:t xml:space="preserve">Menyemprotkan cairan pestisida kimia secara serentak setiap jam sepanjang hari tanpa memantau keberadaan hama.</w:t>
+        <w:t xml:space="preserve">Mengganti seluruh staf loket manusia dengan robot mekanik tanpa memperhatikan kepuasan pengunjung wisata.</w:t>
       </w:r>
     </w:p>
     <w:p>
@@ -6117,7 +6000,7 @@
           <w:sz w:val="18"/>
           <w:szCs w:val="18"/>
         </w:rPr>
-        <w:t xml:space="preserve">Pengenalan Pola pada pertanian presisi mengkorelasikan variabel iklim mikro (suhu, kelembapan) dengan waktu munculnya hama selama beberapa musim panen untuk memprediksi serangan lebih dini.</w:t>
+        <w:t xml:space="preserve">Pengenalan Pola dari data kunjungan masa lalu memberikan kemampuan prediktif (perencanaan proaktif). Pengelola dapat mempersiapkan tiket online, loket tambahan, dan staf pendukung sebelum lonjakan pengunjung terjadi.</w:t>
       </w:r>
     </w:p>
     <w:p>
@@ -6146,7 +6029,7 @@
           <w:sz w:val="20"/>
           <w:szCs w:val="20"/>
         </w:rPr>
-        <w:t xml:space="preserve">Setiap akhir pekan panjang, kemacetan parah melanda ruas jalan protokol Kota Batu menuju kawasan wisata utama (Jalan Diponegoro, Pattimura, dan Oro-Oro Ombo). Siswa SMAN 1 Batu diminta merancang purwarupa algoritma rute alternatif cerdas (Dynamic Re-routing) untuk mengurai kepadatan kendaraan.</w:t>
+        <w:t xml:space="preserve">Di dalam materi pengantar berpikir komputasional, dicontohkan rancangan pembuatan sistem perpustakaan sekolah. Sistem perpustakaan yang besar didekomposisi menjadi empat subsistem: (1) Sistem Pendataan Buku Baru, (2) Sistem Keanggotaan Siswa, (3) Sistem Peminjaman dan Pengembalian Buku, serta (4) Sistem Pengelolaan Denda Keterlambatan.</w:t>
       </w:r>
     </w:p>
     <w:p>
@@ -6159,7 +6042,7 @@
           <w:sz w:val="20"/>
           <w:szCs w:val="20"/>
         </w:rPr>
-        <w:t xml:space="preserve">Dalam proses memodelkan jaringan jalan Kota Batu ke dalam bentuk graf (Graph Modeling), tindakan ABSTRAKSI manakah yang paling esensial dilakukan?</w:t>
+        <w:t xml:space="preserve">Apa keuntungan yang dirasakan oleh pengembang sistem atau petugas perpustakaan dari penerapan dekomposisi tersebut saat terjadi kesalahan (bug) pada penghitungan denda siswa?</w:t>
       </w:r>
     </w:p>
     <w:p>
@@ -6183,7 +6066,7 @@
           <w:sz w:val="20"/>
           <w:szCs w:val="20"/>
         </w:rPr>
-        <w:t xml:space="preserve">Merepresentasikan persimpangan sebagai titik (Nodes) dan ruas jalan sebagai garis berbobot (Edges) yang memuat panjang jalan serta kecepatan rata-rata, sembari mengabaikan warna cat ruko atau jenis pohon di tepi jalan.</w:t>
+        <w:t xml:space="preserve">Petugas atau pemrogram cukup memeriksa dan memperbaiki subsistem denda tanpa perlu membongkar atau mengganggu subsistem pendataan buku dan keanggotaan siswa.</w:t>
       </w:r>
     </w:p>
     <w:p>
@@ -6207,7 +6090,7 @@
           <w:sz w:val="20"/>
           <w:szCs w:val="20"/>
         </w:rPr>
-        <w:t xml:space="preserve">Menghitung secara rinci setiap helai daun dan jenis tanaman hias di median jalan sebelum menghitung volume kendaraan yang melintas.</w:t>
+        <w:t xml:space="preserve">Petugas harus menghapus seluruh data siswa dan menginput ulang ribuan buku dari awal di perpustakaan.</w:t>
       </w:r>
     </w:p>
     <w:p>
@@ -6231,7 +6114,7 @@
           <w:sz w:val="20"/>
           <w:szCs w:val="20"/>
         </w:rPr>
-        <w:t xml:space="preserve">Mengharuskan setiap pengendara mobil wisata menyebutkan nama lengkap kakek-neneknya sebelum diizinkan melintasi jalan Diponegoro.</w:t>
+        <w:t xml:space="preserve">Perpustakaan sekolah terpaksa ditutup selama satu tahun ajaran karena sistem komputer rusak total.</w:t>
       </w:r>
     </w:p>
     <w:p>
@@ -6255,7 +6138,7 @@
           <w:sz w:val="20"/>
           <w:szCs w:val="20"/>
         </w:rPr>
-        <w:t xml:space="preserve">Menggambar kembali seluruh reklame iklan komersial di sepanjang jalan dengan tingkat kedetilan piksel 4K ke dalam peta GPS navigasi.</w:t>
+        <w:t xml:space="preserve">Siswa yang meminjam buku tidak perlu mengembalikan buku yang dipinjam karena sistem denda sedang mengalami perbaikan.</w:t>
       </w:r>
     </w:p>
     <w:p>
@@ -6279,7 +6162,7 @@
           <w:sz w:val="20"/>
           <w:szCs w:val="20"/>
         </w:rPr>
-        <w:t xml:space="preserve">Menghapus nama-nama jalan di Kota Batu dan menggantinya dengan angka acak yang diundi setiap pagi hari.</w:t>
+        <w:t xml:space="preserve">Dekomposisi mengharuskan pemrogram merakit ulang perangkat keras komputer dari komponen motherboard dasar.</w:t>
       </w:r>
     </w:p>
     <w:p>
@@ -6326,7 +6209,7 @@
           <w:sz w:val="18"/>
           <w:szCs w:val="18"/>
         </w:rPr>
-        <w:t xml:space="preserve">Dalam pemodelan graf rute lalu lintas, Abstraksi mereduksi jalan menjadi simpul (nodes) persimpangan dan ruas (edges) berbobot jarak/waktu, membuang detail visual (warna toko, pohon) yang tidak relevan bagi kalkulasi rute terpendek.</w:t>
+        <w:t xml:space="preserve">Keunggulan utama Dekomposisi adalah pemisahan modular (modularitas). Jika terjadi kesalahan pada satu modul (misal penghitungan denda), pemecahan masalah hanya terisolasi pada modul tersebut tanpa merusak modul lainnya yang sudah berjalan normal.</w:t>
       </w:r>
     </w:p>
     <w:p>
@@ -6355,7 +6238,7 @@
           <w:sz w:val="20"/>
           <w:szCs w:val="20"/>
         </w:rPr>
-        <w:t xml:space="preserve">Sebagai generasi muda yang mempelajari Informatika dan Berpikir Komputasional di SMAN 1 Batu, siswa kelak akan merancang dan mengoperasikan berbagai algoritma otomasi serta kecerdasan buatan yang memengaruhi hajat hidup masyarakat (seperti algoritma evakuasi bencana, kuota air irigasi, atau seleksi penerimaan beasiswa).</w:t>
+        <w:t xml:space="preserve">Pada materi buku ajar, prosedur keselamatan saat terjadi kebakaran di gedung bertingkat dijadikan contoh algoritma kehidupan sehari-hari: (1) Tetap tenang dan jangan panik; (2) Tinggalkan barang bawaan yang berat; (3) Berjalan cepat mengikuti petunjuk arah jalur evakuasi menuju tangga darurat terdekat; (4) Jangan pernah menggunakan lift; (5) Berkumpul di titik kumpul luar gedung yang aman.</w:t>
       </w:r>
     </w:p>
     <w:p>
@@ -6368,7 +6251,7 @@
           <w:sz w:val="20"/>
           <w:szCs w:val="20"/>
         </w:rPr>
-        <w:t xml:space="preserve">Prinsip etis dan humanis manakah yang paling fundamental dijaga oleh seorang perancang sistem komputasi yang bertanggung jawab?</w:t>
+        <w:t xml:space="preserve">Mengapa aturan nomor (4) yang melarang penggunaan lift sangat krusial dimasukkan ke dalam algoritma penyelamatan diri tersebut?</w:t>
       </w:r>
     </w:p>
     <w:p>
@@ -6392,7 +6275,7 @@
           <w:sz w:val="20"/>
           <w:szCs w:val="20"/>
         </w:rPr>
-        <w:t xml:space="preserve">Menjaga transparansi logika pengambilan keputusan (Explainability), keadilan algoritma tanpa bias diskriminatif, perlindungan privasi data warga, dan akuntabilitas moral manusia terhadap dampak keputusan sistem.</w:t>
+        <w:t xml:space="preserve">Karena saat terjadi kebakaran listrik gedung dapat terputus seketika dan cerobong lift dapat terisi asap beracun yang menjebak penumpang di dalamnya.</w:t>
       </w:r>
     </w:p>
     <w:p>
@@ -6416,7 +6299,7 @@
           <w:sz w:val="20"/>
           <w:szCs w:val="20"/>
         </w:rPr>
-        <w:t xml:space="preserve">Menghapus rekaman log jejak audit secara otomatis jika terindikasi sistem melakukan kesalahan fatal yang merugikan masyarakat luas.</w:t>
+        <w:t xml:space="preserve">Karena pintu lift hanya boleh dibuka oleh kepala sekolah dan pejabat dinas kebakaran yang berwenang.</w:t>
       </w:r>
     </w:p>
     <w:p>
@@ -6440,7 +6323,7 @@
           <w:sz w:val="20"/>
           <w:szCs w:val="20"/>
         </w:rPr>
-        <w:t xml:space="preserve">Menyerahkan seluruh keputusan etika dan moral kepada prosesor komputer tanpa menyediakan ruang banding atau pengawasan oleh manusia.</w:t>
+        <w:t xml:space="preserve">Karena tangga darurat sengaja dibuat agar siswa dapat berolahraga membakar kalori saat terjadi situasi bencana.</w:t>
       </w:r>
     </w:p>
     <w:p>
@@ -6464,7 +6347,7 @@
           <w:sz w:val="20"/>
           <w:szCs w:val="20"/>
         </w:rPr>
-        <w:t xml:space="preserve">Merancang algoritma sebagai kotak hitam (Black Box) yang tertutup rapat agar tidak ada warga masyarakat yang dapat memprotes keputusan sistem.</w:t>
+        <w:t xml:space="preserve">Karena lift gedung sekolah membutuhkan koin khusus untuk dapat beroperasi turun ke lantai dasar.</w:t>
       </w:r>
     </w:p>
     <w:p>
@@ -6488,7 +6371,7 @@
           <w:sz w:val="20"/>
           <w:szCs w:val="20"/>
         </w:rPr>
-        <w:t xml:space="preserve">Memprogram sistem agar selalu mendahulukan kepentingan kelompok elit pemilik modal terbesar dibanding keselamatan warga perkampungan kecil.</w:t>
+        <w:t xml:space="preserve">Karena kecepatan lift dianggap terlalu lambat dibandingkan jika siswa melompat langsung dari jendela lantai atas.</w:t>
       </w:r>
     </w:p>
     <w:p>
@@ -6535,7 +6418,7 @@
           <w:sz w:val="18"/>
           <w:szCs w:val="18"/>
         </w:rPr>
-        <w:t xml:space="preserve">Prinsip etika rekayasa komputasional modern menuntut transparansi (explainable algorithms), keadilan data (fairness), keselamatan warga, dan pertanggungjawaban manusia (human accountability) sebagai pemegang kendali utama.</w:t>
+        <w:t xml:space="preserve">Dalam penyusunan algoritma evakuasi, setiap batasan (aturan keselamatan) dirancang berdasarkan analisis risiko sistemik. Menggunakan lift saat kebakaran sangat berbahaya karena pasokan listrik bisa terputus mendadak dan poros lift berfungsi layaknya cerobong asap beracun yang mematikan.</w:t>
       </w:r>
     </w:p>
     <w:p>
@@ -6550,7 +6433,7 @@
           <w:sz w:val="24"/>
           <w:szCs w:val="24"/>
         </w:rPr>
-        <w:t xml:space="preserve">REKAPITULASI KUNCI JAWABAN (1 - 30)</w:t>
+        <w:t xml:space="preserve">REKAPITULASI KUNCI JAWABAN MASTER (1 - 30)</w:t>
       </w:r>
     </w:p>
     <w:tbl>
@@ -6618,7 +6501,7 @@
                 <w:sz w:val="18"/>
                 <w:szCs w:val="18"/>
               </w:rPr>
-              <w:t xml:space="preserve">Topik</w:t>
+              <w:t xml:space="preserve">Topik Bahasan</w:t>
             </w:r>
           </w:p>
         </w:tc>
@@ -6666,7 +6549,7 @@
                 <w:sz w:val="18"/>
                 <w:szCs w:val="18"/>
               </w:rPr>
-              <w:t xml:space="preserve">Topik</w:t>
+              <w:t xml:space="preserve">Topik Bahasan</w:t>
             </w:r>
           </w:p>
         </w:tc>
@@ -6712,7 +6595,7 @@
                 <w:sz w:val="16"/>
                 <w:szCs w:val="16"/>
               </w:rPr>
-              <w:t xml:space="preserve">Berpikir Komputasional</w:t>
+              <w:t xml:space="preserve">Kasus Ekologis Kota Delta (Lingkungan)</w:t>
             </w:r>
           </w:p>
         </w:tc>
@@ -6756,7 +6639,7 @@
                 <w:sz w:val="16"/>
                 <w:szCs w:val="16"/>
               </w:rPr>
-              <w:t xml:space="preserve">Berpikir Komputasional</w:t>
+              <w:t xml:space="preserve">Kehidupan Sehari-hari di Rumah (Hemat Listrik)</w:t>
             </w:r>
           </w:p>
         </w:tc>
@@ -6802,7 +6685,7 @@
                 <w:sz w:val="16"/>
                 <w:szCs w:val="16"/>
               </w:rPr>
-              <w:t xml:space="preserve">Berpikir Komputasional</w:t>
+              <w:t xml:space="preserve">Kasus Ekologis Kota Delta (Lingkungan)</w:t>
             </w:r>
           </w:p>
         </w:tc>
@@ -6846,7 +6729,7 @@
                 <w:sz w:val="16"/>
                 <w:szCs w:val="16"/>
               </w:rPr>
-              <w:t xml:space="preserve">Berpikir Komputasional</w:t>
+              <w:t xml:space="preserve">Kehidupan Sehari-hari di Rumah (Pilah Sampah)</w:t>
             </w:r>
           </w:p>
         </w:tc>
@@ -6892,7 +6775,7 @@
                 <w:sz w:val="16"/>
                 <w:szCs w:val="16"/>
               </w:rPr>
-              <w:t xml:space="preserve">Berpikir Komputasional</w:t>
+              <w:t xml:space="preserve">Kasus Ekologis Kota Delta (Lingkungan)</w:t>
             </w:r>
           </w:p>
         </w:tc>
@@ -6936,7 +6819,7 @@
                 <w:sz w:val="16"/>
                 <w:szCs w:val="16"/>
               </w:rPr>
-              <w:t xml:space="preserve">Berpikir Komputasional</w:t>
+              <w:t xml:space="preserve">Kehidupan Sehari-hari di Rumah (Tanaman)</w:t>
             </w:r>
           </w:p>
         </w:tc>
@@ -6982,7 +6865,7 @@
                 <w:sz w:val="16"/>
                 <w:szCs w:val="16"/>
               </w:rPr>
-              <w:t xml:space="preserve">Berpikir Komputasional</w:t>
+              <w:t xml:space="preserve">Kasus Ekologis Kota Delta (Lingkungan)</w:t>
             </w:r>
           </w:p>
         </w:tc>
@@ -7026,7 +6909,7 @@
                 <w:sz w:val="16"/>
                 <w:szCs w:val="16"/>
               </w:rPr>
-              <w:t xml:space="preserve">Berpikir Komputasional</w:t>
+              <w:t xml:space="preserve">Kehidupan Siswa di Sekolah (Tugas Proyek)</w:t>
             </w:r>
           </w:p>
         </w:tc>
@@ -7072,7 +6955,7 @@
                 <w:sz w:val="16"/>
                 <w:szCs w:val="16"/>
               </w:rPr>
-              <w:t xml:space="preserve">Berpikir Komputasional</w:t>
+              <w:t xml:space="preserve">Kasus Ekologis Kota Delta (Lingkungan)</w:t>
             </w:r>
           </w:p>
         </w:tc>
@@ -7116,7 +6999,7 @@
                 <w:sz w:val="16"/>
                 <w:szCs w:val="16"/>
               </w:rPr>
-              <w:t xml:space="preserve">Berpikir Komputasional</w:t>
+              <w:t xml:space="preserve">Kehidupan Siswa di Sekolah (Alur Kantin)</w:t>
             </w:r>
           </w:p>
         </w:tc>
@@ -7162,7 +7045,7 @@
                 <w:sz w:val="16"/>
                 <w:szCs w:val="16"/>
               </w:rPr>
-              <w:t xml:space="preserve">Berpikir Komputasional</w:t>
+              <w:t xml:space="preserve">Kasus Ekologis Kota Delta (Lingkungan)</w:t>
             </w:r>
           </w:p>
         </w:tc>
@@ -7206,7 +7089,7 @@
                 <w:sz w:val="16"/>
                 <w:szCs w:val="16"/>
               </w:rPr>
-              <w:t xml:space="preserve">Berpikir Komputasional</w:t>
+              <w:t xml:space="preserve">Kehidupan Siswa di Sekolah (Pola Belajar)</w:t>
             </w:r>
           </w:p>
         </w:tc>
@@ -7252,7 +7135,7 @@
                 <w:sz w:val="16"/>
                 <w:szCs w:val="16"/>
               </w:rPr>
-              <w:t xml:space="preserve">Berpikir Komputasional</w:t>
+              <w:t xml:space="preserve">Kasus Logistik Garuda Rescue (Darurat)</w:t>
             </w:r>
           </w:p>
         </w:tc>
@@ -7296,7 +7179,7 @@
                 <w:sz w:val="16"/>
                 <w:szCs w:val="16"/>
               </w:rPr>
-              <w:t xml:space="preserve">Berpikir Komputasional</w:t>
+              <w:t xml:space="preserve">Kehidupan Siswa di Sekolah (Catatan Belajar)</w:t>
             </w:r>
           </w:p>
         </w:tc>
@@ -7342,7 +7225,7 @@
                 <w:sz w:val="16"/>
                 <w:szCs w:val="16"/>
               </w:rPr>
-              <w:t xml:space="preserve">Berpikir Komputasional</w:t>
+              <w:t xml:space="preserve">Kasus Logistik Garuda Rescue (Darurat)</w:t>
             </w:r>
           </w:p>
         </w:tc>
@@ -7386,7 +7269,7 @@
                 <w:sz w:val="16"/>
                 <w:szCs w:val="16"/>
               </w:rPr>
-              <w:t xml:space="preserve">Berpikir Komputasional</w:t>
+              <w:t xml:space="preserve">Kehidupan Siswa di Sekolah (Acara OSIS)</w:t>
             </w:r>
           </w:p>
         </w:tc>
@@ -7432,7 +7315,7 @@
                 <w:sz w:val="16"/>
                 <w:szCs w:val="16"/>
               </w:rPr>
-              <w:t xml:space="preserve">Berpikir Komputasional</w:t>
+              <w:t xml:space="preserve">Kasus Logistik Garuda Rescue (Darurat)</w:t>
             </w:r>
           </w:p>
         </w:tc>
@@ -7476,7 +7359,7 @@
                 <w:sz w:val="16"/>
                 <w:szCs w:val="16"/>
               </w:rPr>
-              <w:t xml:space="preserve">Berpikir Komputasional</w:t>
+              <w:t xml:space="preserve">Kehidupan Siswa di Sekolah (Kas Kelas)</w:t>
             </w:r>
           </w:p>
         </w:tc>
@@ -7522,7 +7405,7 @@
                 <w:sz w:val="16"/>
                 <w:szCs w:val="16"/>
               </w:rPr>
-              <w:t xml:space="preserve">Berpikir Komputasional</w:t>
+              <w:t xml:space="preserve">Kasus Logistik Garuda Rescue (Darurat)</w:t>
             </w:r>
           </w:p>
         </w:tc>
@@ -7566,7 +7449,7 @@
                 <w:sz w:val="16"/>
                 <w:szCs w:val="16"/>
               </w:rPr>
-              <w:t xml:space="preserve">Berpikir Komputasional</w:t>
+              <w:t xml:space="preserve">Layanan Publik &amp; Komunitas (Peta Transportasi)</w:t>
             </w:r>
           </w:p>
         </w:tc>
@@ -7612,7 +7495,7 @@
                 <w:sz w:val="16"/>
                 <w:szCs w:val="16"/>
               </w:rPr>
-              <w:t xml:space="preserve">Berpikir Komputasional</w:t>
+              <w:t xml:space="preserve">Kasus Logistik Garuda Rescue (Darurat)</w:t>
             </w:r>
           </w:p>
         </w:tc>
@@ -7656,7 +7539,7 @@
                 <w:sz w:val="16"/>
                 <w:szCs w:val="16"/>
               </w:rPr>
-              <w:t xml:space="preserve">Berpikir Komputasional</w:t>
+              <w:t xml:space="preserve">Layanan Publik &amp; Pertanian Kota Batu (Kebun Apel)</w:t>
             </w:r>
           </w:p>
         </w:tc>
@@ -7702,7 +7585,7 @@
                 <w:sz w:val="16"/>
                 <w:szCs w:val="16"/>
               </w:rPr>
-              <w:t xml:space="preserve">Berpikir Komputasional</w:t>
+              <w:t xml:space="preserve">Kasus Logistik Garuda Rescue (Darurat)</w:t>
             </w:r>
           </w:p>
         </w:tc>
@@ -7746,7 +7629,7 @@
                 <w:sz w:val="16"/>
                 <w:szCs w:val="16"/>
               </w:rPr>
-              <w:t xml:space="preserve">Berpikir Komputasional</w:t>
+              <w:t xml:space="preserve">Layanan Publik &amp; Transportasi Kota Batu (Lalu Lintas)</w:t>
             </w:r>
           </w:p>
         </w:tc>
@@ -7792,7 +7675,7 @@
                 <w:sz w:val="16"/>
                 <w:szCs w:val="16"/>
               </w:rPr>
-              <w:t xml:space="preserve">Berpikir Komputasional</w:t>
+              <w:t xml:space="preserve">Kehidupan Sehari-hari di Rumah (Keluarga)</w:t>
             </w:r>
           </w:p>
         </w:tc>
@@ -7836,7 +7719,7 @@
                 <w:sz w:val="16"/>
                 <w:szCs w:val="16"/>
               </w:rPr>
-              <w:t xml:space="preserve">Berpikir Komputasional</w:t>
+              <w:t xml:space="preserve">Layanan Publik &amp; Pariwisata Kota Batu (Museum)</w:t>
             </w:r>
           </w:p>
         </w:tc>
@@ -7882,7 +7765,7 @@
                 <w:sz w:val="16"/>
                 <w:szCs w:val="16"/>
               </w:rPr>
-              <w:t xml:space="preserve">Berpikir Komputasional</w:t>
+              <w:t xml:space="preserve">Kehidupan Sehari-hari di Rumah (Mencuci)</w:t>
             </w:r>
           </w:p>
         </w:tc>
@@ -7926,7 +7809,7 @@
                 <w:sz w:val="16"/>
                 <w:szCs w:val="16"/>
               </w:rPr>
-              <w:t xml:space="preserve">Berpikir Komputasional</w:t>
+              <w:t xml:space="preserve">Layanan Publik Sekolah (Sistem Perpustakaan)</w:t>
             </w:r>
           </w:p>
         </w:tc>
@@ -7972,7 +7855,7 @@
                 <w:sz w:val="16"/>
                 <w:szCs w:val="16"/>
               </w:rPr>
-              <w:t xml:space="preserve">Berpikir Komputasional</w:t>
+              <w:t xml:space="preserve">Kehidupan Sehari-hari di Rumah (Memasak)</w:t>
             </w:r>
           </w:p>
         </w:tc>
@@ -8016,7 +7899,7 @@
                 <w:sz w:val="16"/>
                 <w:szCs w:val="16"/>
               </w:rPr>
-              <w:t xml:space="preserve">Berpikir Komputasional</w:t>
+              <w:t xml:space="preserve">Prosedur Tanggap Darurat Gedung (Keselamatan Diri)</w:t>
             </w:r>
           </w:p>
         </w:tc>

</xml_diff>

<commit_message>
feat(exam): buat panjang opsi jawaban A-E seragam dan seimbang agar kunci jawaban tidak mencolok sebagai opsi paling panjang
</commit_message>
<xml_diff>
--- a/Bank_Soal_30_CT_Informatika_SMAN_1_Batu.docx
+++ b/Bank_Soal_30_CT_Informatika_SMAN_1_Batu.docx
@@ -240,7 +240,7 @@
           <w:sz w:val="20"/>
           <w:szCs w:val="20"/>
         </w:rPr>
-        <w:t xml:space="preserve">Membuat masalah besar yang rumit menjadi bagian-bagian kecil yang terkelola sehingga setiap tim ahli dapat fokus bekerja secara mendalam dan terarah.</w:t>
+        <w:t xml:space="preserve">Mengurai persoalan rumit menjadi bagian terkelola agar setiap tim ahli dapat fokus bekerja secara mendalam dan terarah.</w:t>
       </w:r>
     </w:p>
     <w:p>
@@ -264,7 +264,7 @@
           <w:sz w:val="20"/>
           <w:szCs w:val="20"/>
         </w:rPr>
-        <w:t xml:space="preserve">Memperpanjang durasi penyelidikan agar pemerintah daerah memiliki alasan untuk menambah alokasi anggaran proyek penanganan bencana.</w:t>
+        <w:t xml:space="preserve">Menunda pengambilan tindakan penyelamatan agar pemerintah daerah memiliki waktu cukup untuk menambah anggaran penanggulangan.</w:t>
       </w:r>
     </w:p>
     <w:p>
@@ -288,7 +288,7 @@
           <w:sz w:val="20"/>
           <w:szCs w:val="20"/>
         </w:rPr>
-        <w:t xml:space="preserve">Menghindari tanggung jawab langsung atas kegagalan penanganan banjir dengan menyerahkan keputusan sepenuhnya kepada kelompok kerja.</w:t>
+        <w:t xml:space="preserve">Menghindari beban tanggung jawab langsung dengan menyerahkan keputusan penanganan sepenuhnya kepada masing-masing tim kerja.</w:t>
       </w:r>
     </w:p>
     <w:p>
@@ -312,7 +312,7 @@
           <w:sz w:val="20"/>
           <w:szCs w:val="20"/>
         </w:rPr>
-        <w:t xml:space="preserve">Mengalihkan perhatian warga dari bahaya limbah beracun dengan menyibukkan relawan pada pencatatan ketinggian air sungai.</w:t>
+        <w:t xml:space="preserve">Mengalihkan perhatian warga dari bahaya limbah beracun dengan menyibukkan relawan pada pencatatan ketinggian muka air sungai.</w:t>
       </w:r>
     </w:p>
     <w:p>
@@ -336,7 +336,7 @@
           <w:sz w:val="20"/>
           <w:szCs w:val="20"/>
         </w:rPr>
-        <w:t xml:space="preserve">Memastikan seluruh warga di sepanjang bantaran sungai terlibat langsung sebagai peneliti lapangan tanpa memandang keahlian mereka.</w:t>
+        <w:t xml:space="preserve">Melibatkan seluruh masyarakat di sepanjang bantaran sungai sebagai tenaga peneliti lapangan tanpa memandang keahlian khusus.</w:t>
       </w:r>
     </w:p>
     <w:p>
@@ -449,7 +449,7 @@
           <w:sz w:val="20"/>
           <w:szCs w:val="20"/>
         </w:rPr>
-        <w:t xml:space="preserve">Pengenalan pola; membantu tim menemukan keteraturan hubungan sebab-akibat masa lalu untuk memprediksi saat bahaya akan datang di masa depan.</w:t>
+        <w:t xml:space="preserve">Pengenalan pola; memanfaatkan keteraturan masa lalu guna memprediksi dan mengantisipasi datangnya bahaya di masa depan.</w:t>
       </w:r>
     </w:p>
     <w:p>
@@ -473,7 +473,7 @@
           <w:sz w:val="20"/>
           <w:szCs w:val="20"/>
         </w:rPr>
-        <w:t xml:space="preserve">Dekomposisi; memilah data cuaca menjadi dokumen digital yang tersimpan rapi di dalam arsip kantor dinas kebersihan.</w:t>
+        <w:t xml:space="preserve">Dekomposisi; memilah tumpukan berkas data cuaca menjadi dokumen digital yang tersimpan rapi pada lemari arsip dinas kota.</w:t>
       </w:r>
     </w:p>
     <w:p>
@@ -497,7 +497,7 @@
           <w:sz w:val="20"/>
           <w:szCs w:val="20"/>
         </w:rPr>
-        <w:t xml:space="preserve">Abstraksi; menghapus seluruh catatan curah hujan masa lalu agar komputer tidak mengalami kelambatan memori saat bekerja.</w:t>
+        <w:t xml:space="preserve">Abstraksi; menghapus seluruh rekaman curah hujan masa lampau agar perangkat komputer tidak mengalami kelebihan beban memori.</w:t>
       </w:r>
     </w:p>
     <w:p>
@@ -521,7 +521,7 @@
           <w:sz w:val="20"/>
           <w:szCs w:val="20"/>
         </w:rPr>
-        <w:t xml:space="preserve">Pemrograman mekanis; memaksa sensor cuaca untuk otomatis menurunkan curah hujan ketika angka 150 milimeter tercapai.</w:t>
+        <w:t xml:space="preserve">Otomatisasi; memasang pintu bendungan otomatis yang sanggup menurunkan intensitas awan hujan secara langsung di angkasa.</w:t>
       </w:r>
     </w:p>
     <w:p>
@@ -545,7 +545,7 @@
           <w:sz w:val="20"/>
           <w:szCs w:val="20"/>
         </w:rPr>
-        <w:t xml:space="preserve">Penyusunan aturan hukum; melarang awan mendung berkumpul di atas kawasan hulu selama musim hujan berlangsung.</w:t>
+        <w:t xml:space="preserve">Berpikir algoritma; membuat aturan hukum tertulis yang melarang berkumpulnya gumpalan awan mendung di atas kawasan hulu.</w:t>
       </w:r>
     </w:p>
     <w:p>
@@ -658,7 +658,7 @@
           <w:sz w:val="20"/>
           <w:szCs w:val="20"/>
         </w:rPr>
-        <w:t xml:space="preserve">Karena menyaring dan membuang informasi yang tidak berkaitan dengan sumber zat beracun, sehingga tenaga dan waktu penyelidikan terpusat pada sasaran yang tepat.</w:t>
+        <w:t xml:space="preserve">Menyaring dan menyingkirkan data yang tidak relevan agar fokus penyelidikan terpusat pada industri pembuang racun utama.</w:t>
       </w:r>
     </w:p>
     <w:p>
@@ -682,7 +682,7 @@
           <w:sz w:val="20"/>
           <w:szCs w:val="20"/>
         </w:rPr>
-        <w:t xml:space="preserve">Karena pabrik makanan dan toko kelontong telah membayar pajak perlindungan kepada pemerintah kota sehingga tidak boleh diperiksa.</w:t>
+        <w:t xml:space="preserve">Melindungi tempat usaha makanan dan toko kecil warga karena pemiliknya telah membayar uang retribusi resmi kepada dinas kota.</w:t>
       </w:r>
     </w:p>
     <w:p>
@@ -706,7 +706,7 @@
           <w:sz w:val="20"/>
           <w:szCs w:val="20"/>
         </w:rPr>
-        <w:t xml:space="preserve">Karena tim tidak memiliki peralatan yang memadai untuk menguji sampel dari pabrik kayu dan bangunan ruko warga.</w:t>
+        <w:t xml:space="preserve">Menutupi keterbatasan sarana laboratorium penyelidik yang tidak memiliki peralatan memadai untuk memeriksa bangunan industri.</w:t>
       </w:r>
     </w:p>
     <w:p>
@@ -730,7 +730,7 @@
           <w:sz w:val="20"/>
           <w:szCs w:val="20"/>
         </w:rPr>
-        <w:t xml:space="preserve">Karena Dr. Aris ingin mempercepat penutupan kasus tanpa perlu membuktikan keterkaitan kimiawi dari limbah yang dibuang.</w:t>
+        <w:t xml:space="preserve">Mempercepat penutupan proses penyelidikan tanpa perlu membuktikan hubungan sebab-akibat pencemaran limbah secara ilmiah.</w:t>
       </w:r>
     </w:p>
     <w:p>
@@ -754,7 +754,7 @@
           <w:sz w:val="20"/>
           <w:szCs w:val="20"/>
         </w:rPr>
-        <w:t xml:space="preserve">Karena pilar abstraksi menuntut agar hanya pabrik berukuran paling besar yang berhak mendapatkan pemeriksaan lingkungan.</w:t>
+        <w:t xml:space="preserve">Membatasi jangkauan pengawasan hanya pada pabrik berukuran paling luas sesuai ketentuan peraturan birokrasi pemerintahan.</w:t>
       </w:r>
     </w:p>
     <w:p>
@@ -867,7 +867,7 @@
           <w:sz w:val="20"/>
           <w:szCs w:val="20"/>
         </w:rPr>
-        <w:t xml:space="preserve">Langkah-langkahnya tersusun runtut, memiliki batasan syarat yang pasti dan tegas, serta dapat dijalankan secara konsisten oleh seluruh petugas.</w:t>
+        <w:t xml:space="preserve">Langkah tersusun runtut, syarat kondisi bernilai pasti, dan dapat dieksekusi seragam oleh setiap petugas di lapangan.</w:t>
       </w:r>
     </w:p>
     <w:p>
@@ -891,7 +891,7 @@
           <w:sz w:val="20"/>
           <w:szCs w:val="20"/>
         </w:rPr>
-        <w:t xml:space="preserve">Petunjuk tersebut ditulis menggunakan bahasa pemrograman komputer tingkat tinggi yang hanya dimengerti oleh mesin pemindai.</w:t>
+        <w:t xml:space="preserve">Perintah dirumuskan menggunakan bahasa kode mesin komputer tingkat tinggi yang hanya dimengerti oleh perangkat lunak server.</w:t>
       </w:r>
     </w:p>
     <w:p>
@@ -915,7 +915,7 @@
           <w:sz w:val="20"/>
           <w:szCs w:val="20"/>
         </w:rPr>
-        <w:t xml:space="preserve">Instruksi di dalamnya bersifat lentur dan bebas ditafsirkan berbeda-beda oleh masing-masing penjaga pintu air di lapangan.</w:t>
+        <w:t xml:space="preserve">Instruksi bersifat lentur dan diserahkan pada tafsiran pribadi masing-masing penjaga pintu air tanpa acuan baku tertulis.</w:t>
       </w:r>
     </w:p>
     <w:p>
@@ -939,7 +939,7 @@
           <w:sz w:val="20"/>
           <w:szCs w:val="20"/>
         </w:rPr>
-        <w:t xml:space="preserve">Rangkaian tindakan tersebut disusun tanpa mempertimbangkan kondisi keselamatan warga dan ketersediaan petugas tanggap darurat.</w:t>
+        <w:t xml:space="preserve">Rangkaian tindakan disusun tanpa memperhitungkan ketersediaan personel pengawas serta keselamatan warga di permukiman hilir.</w:t>
       </w:r>
     </w:p>
     <w:p>
@@ -963,7 +963,7 @@
           <w:sz w:val="20"/>
           <w:szCs w:val="20"/>
         </w:rPr>
-        <w:t xml:space="preserve">Aturan tersebut hanya berlaku satu kali saja dan tidak dapat digunakan kembali jika bencana banjir datang pada tahun berikutnya.</w:t>
+        <w:t xml:space="preserve">Aturan penyelamatan dirancang hanya untuk sekali pakai dan tidak boleh diterapkan lagi pada musim penghujan tahun berikutnya.</w:t>
       </w:r>
     </w:p>
     <w:p>
@@ -1076,7 +1076,7 @@
           <w:sz w:val="20"/>
           <w:szCs w:val="20"/>
         </w:rPr>
-        <w:t xml:space="preserve">Tim penyelidik akan kehabisan waktu dan tenaga karena tenggelam dalam lautan data yang tidak penting, sehingga sumber racun utama gagal dihentikan tepat waktu.</w:t>
+        <w:t xml:space="preserve">Waktu dan energi penyelidik terkuras oleh data yang tidak penting, sehingga sumber pencemaran utama terlambat dihentikan.</w:t>
       </w:r>
     </w:p>
     <w:p>
@@ -1100,7 +1100,7 @@
           <w:sz w:val="20"/>
           <w:szCs w:val="20"/>
         </w:rPr>
-        <w:t xml:space="preserve">Sungai Kota Delta akan secara otomatis kembali jernih karena seluruh warga merasa diawasi oleh petugas pemeriksa.</w:t>
+        <w:t xml:space="preserve">Kawasan aliran sungai akan kembali bersih dengan sendirinya karena seluruh pengelola pabrik merasa diawasi secara mendalam.</w:t>
       </w:r>
     </w:p>
     <w:p>
@@ -1124,7 +1124,7 @@
           <w:sz w:val="20"/>
           <w:szCs w:val="20"/>
         </w:rPr>
-        <w:t xml:space="preserve">Pabrik tekstil dan aki pembuang limbah berbahaya akan secara sukarela menyerahkan diri tanpa perlu diuji sampel limbahnya.</w:t>
+        <w:t xml:space="preserve">Seluruh pengelola pabrik pencemar bahan berbahaya akan menyerahkan diri secara sukarela tanpa perlu proses pembuktian kimia.</w:t>
       </w:r>
     </w:p>
     <w:p>
@@ -1148,7 +1148,7 @@
           <w:sz w:val="20"/>
           <w:szCs w:val="20"/>
         </w:rPr>
-        <w:t xml:space="preserve">Waktu eksekusi penanganan menjadi jauh lebih singkat karena semakin banyak informasi yang dikumpulkan maka komputer semakin cepat mengolahnya.</w:t>
+        <w:t xml:space="preserve">Waktu penyelesaian masalah menjadi semakin cepat karena semakin lengkap data yang dihimpun maka kesimpulan kian mudah diambil.</w:t>
       </w:r>
     </w:p>
     <w:p>
@@ -1172,7 +1172,7 @@
           <w:sz w:val="20"/>
           <w:szCs w:val="20"/>
         </w:rPr>
-        <w:t xml:space="preserve">Curah hujan ekstrem akan berhenti secara mendadak karena proses pendataan administratif berlangsung sangat terperinci.</w:t>
+        <w:t xml:space="preserve">Intensitas curah hujan tinggi di wilayah hulu sungai akan mereda secara mendadak akibat keteraturan pencatatan administrasi.</w:t>
       </w:r>
     </w:p>
     <w:p>
@@ -1285,7 +1285,7 @@
           <w:sz w:val="20"/>
           <w:szCs w:val="20"/>
         </w:rPr>
-        <w:t xml:space="preserve">Pemanfaatan kembali solusi umum dengan menyesuaikan parameter yang sesuai dengan kondisi lingkungan setempat.</w:t>
+        <w:t xml:space="preserve">Menggunakan kembali model penyelesaian masalah dengan menyesuaikan variabel sesuai kondisi lingkungan wilayah setempat.</w:t>
       </w:r>
     </w:p>
     <w:p>
@@ -1309,7 +1309,7 @@
           <w:sz w:val="20"/>
           <w:szCs w:val="20"/>
         </w:rPr>
-        <w:t xml:space="preserve">Penyalinan tanpa modifikasi yang membuktikan bahwa seluruh bencana alam di dunia memiliki karakter yang persis sama.</w:t>
+        <w:t xml:space="preserve">Menyalin seluruh rancangan penanganan secara mentah karena seluruh bentuk bencana alam memiliki sifat bahaya yang persis sama.</w:t>
       </w:r>
     </w:p>
     <w:p>
@@ -1333,7 +1333,7 @@
           <w:sz w:val="20"/>
           <w:szCs w:val="20"/>
         </w:rPr>
-        <w:t xml:space="preserve">Penolakan terhadap pilar algoritma karena pedoman dari daerah lain tidak boleh diterapkan di wilayah berbeda.</w:t>
+        <w:t xml:space="preserve">Mengabaikan kaidah logika algoritma karena pedoman mitigasi bencana dari satu daerah pantang digunakan di wilayah perbukitan.</w:t>
       </w:r>
     </w:p>
     <w:p>
@@ -1357,7 +1357,7 @@
           <w:sz w:val="20"/>
           <w:szCs w:val="20"/>
         </w:rPr>
-        <w:t xml:space="preserve">Penerapan coba-coba tanpa dasar perhitungan nalar yang jelas untuk melihat apakah bencana tanah longsor bisa dicegah.</w:t>
+        <w:t xml:space="preserve">Menjalankan strategi coba-coba tanpa perencanaan terukur untuk menguji apakah ancaman bahaya tanah longsor dapat dicegah tepat.</w:t>
       </w:r>
     </w:p>
     <w:p>
@@ -1381,7 +1381,7 @@
           <w:sz w:val="20"/>
           <w:szCs w:val="20"/>
         </w:rPr>
-        <w:t xml:space="preserve">Penghapusan seluruh data lingkungan karena penanganan tanah longsor sama sekali tidak memerlukan data masa lalu.</w:t>
+        <w:t xml:space="preserve">Meniadakan pengumpulan data geologis sebab upaya penanganan lereng longsor sama sekali tidak membutuhkan catatan histori masa lalu.</w:t>
       </w:r>
     </w:p>
     <w:p>
@@ -1494,7 +1494,7 @@
           <w:sz w:val="20"/>
           <w:szCs w:val="20"/>
         </w:rPr>
-        <w:t xml:space="preserve">Dekomposisi; mengurai wilayah operasi yang luas dan rumit menjadi satuan-satuan area yang lebih teratur berdasarkan skala prioritas.</w:t>
+        <w:t xml:space="preserve">Dekomposisi; membagi wilayah tugas yang luas menjadi bagian teratur agar alokasi bantuan dapat disalurkan tepat prioritas.</w:t>
       </w:r>
     </w:p>
     <w:p>
@@ -1518,7 +1518,7 @@
           <w:sz w:val="20"/>
           <w:szCs w:val="20"/>
         </w:rPr>
-        <w:t xml:space="preserve">Abstraksi semu; meniadakan desa-desa di Wilayah Selatan agar tim tidak perlu mengirimkan bantuan ke sana.</w:t>
+        <w:t xml:space="preserve">Abstraksi keliru; menghapus keberadaan desa pada Wilayah Selatan agar tim penyelamat tidak terbebani kewajiban mengirim paket bantuan.</w:t>
       </w:r>
     </w:p>
     <w:p>
@@ -1542,7 +1542,7 @@
           <w:sz w:val="20"/>
           <w:szCs w:val="20"/>
         </w:rPr>
-        <w:t xml:space="preserve">Algoritma acak; memilih rute penerbangan secara mendadak tergantung pada arah hembusan angin di pagi hari.</w:t>
+        <w:t xml:space="preserve">Pemilihan acak; menentukan jalur terbang helikopter secara mendadak mengikuti arah hembusan angin perbukitan pada pagi hari.</w:t>
       </w:r>
     </w:p>
     <w:p>
@@ -1566,7 +1566,7 @@
           <w:sz w:val="20"/>
           <w:szCs w:val="20"/>
         </w:rPr>
-        <w:t xml:space="preserve">Otomatisasi mesin; memprogram komputer helikopter agar terbang sendiri tanpa memerlukan pilot manusia.</w:t>
+        <w:t xml:space="preserve">Otomatisasi mesin; mengaktifkan kendali jarak jauh pada komputer armada agar helikopter dapat terbang tanpa pengawasan manusia.</w:t>
       </w:r>
     </w:p>
     <w:p>
@@ -1590,7 +1590,7 @@
           <w:sz w:val="20"/>
           <w:szCs w:val="20"/>
         </w:rPr>
-        <w:t xml:space="preserve">Pengenalan pola cuaca; membuktikan bahwa gempa bumi selalu terjadi bersamaan dengan kabut tebal di pegunungan.</w:t>
+        <w:t xml:space="preserve">Pengenalan pola cuaca; membuktikan bahwa bencana gempa bumi selalu diikuti oleh kabut tebal pada kawasan lembah perbukitan terjal.</w:t>
       </w:r>
     </w:p>
     <w:p>
@@ -1703,7 +1703,7 @@
           <w:sz w:val="20"/>
           <w:szCs w:val="20"/>
         </w:rPr>
-        <w:t xml:space="preserve">Mengerahkan seluruh kekuatan armada helikopter ke Wilayah Utara sejak pagi hari sebelum jendela waktu penerbangan tertutup oleh kabut tebal.</w:t>
+        <w:t xml:space="preserve">Mengerahkan seluruh armada ke Wilayah Utara sejak pagi hari sebelum jalur penerbangan tertutup rapat oleh kabut berbahaya.</w:t>
       </w:r>
     </w:p>
     <w:p>
@@ -1727,7 +1727,7 @@
           <w:sz w:val="20"/>
           <w:szCs w:val="20"/>
         </w:rPr>
-        <w:t xml:space="preserve">Membatalkan seluruh misi penerbangan ke Wilayah Utara dan membiarkan warga di sana menunggu hingga musim kemarau tiba.</w:t>
+        <w:t xml:space="preserve">Menghentikan seluruh pengiriman bantuan ke Wilayah Utara dan membiarkan para korban menunggu hingga datangnya musim kemarau panjang.</w:t>
       </w:r>
     </w:p>
     <w:p>
@@ -1751,7 +1751,7 @@
           <w:sz w:val="20"/>
           <w:szCs w:val="20"/>
         </w:rPr>
-        <w:t xml:space="preserve">Memerintahkan para pilot untuk tetap nekat menerobos kabut tebal pada sore hari demi menunjukkan keberanian tim penyelamat.</w:t>
+        <w:t xml:space="preserve">Menginstruksikan para penerbang menerobos kabut tebal pada sore hari demi menunjukkan ketangguhan mental pasukan penyelamat udara.</w:t>
       </w:r>
     </w:p>
     <w:p>
@@ -1775,7 +1775,7 @@
           <w:sz w:val="20"/>
           <w:szCs w:val="20"/>
         </w:rPr>
-        <w:t xml:space="preserve">Mengalihkan seluruh helikopter ke Wilayah Selatan di pagi hari karena wilayah tersebut tidak pernah berkabut.</w:t>
+        <w:t xml:space="preserve">Mengalihkan seluruh helikopter menuju Wilayah Selatan pada pagi hari karena kawasan tersebut memiliki jarak tempuh yang lebih dekat.</w:t>
       </w:r>
     </w:p>
     <w:p>
@@ -1799,7 +1799,7 @@
           <w:sz w:val="20"/>
           <w:szCs w:val="20"/>
         </w:rPr>
-        <w:t xml:space="preserve">Menghapus catatan kabut masa lalu dari papan rencana operasi karena dianggap hanya perkiraan cuaca yang belum tentu terulang.</w:t>
+        <w:t xml:space="preserve">Menghapus catatan cuaca masa lalu dari papan posko pemantau karena dianggap hanya perkiraan yang belum tentu terjadi berulang kembali.</w:t>
       </w:r>
     </w:p>
     <w:p>
@@ -1912,7 +1912,7 @@
           <w:sz w:val="20"/>
           <w:szCs w:val="20"/>
         </w:rPr>
-        <w:t xml:space="preserve">Mengabaikan barang-barang yang bukan kebutuhan penyelamat jiwa demi memaksimalkan muatan kebutuhan pokok yang menentukan kelangsungan hidup korban.</w:t>
+        <w:t xml:space="preserve">Menyisihkan muatan non-darurat demi memaksimalkan kapasitas angkut terbatas pada barang penopang keselamatan nyawa korban.</w:t>
       </w:r>
     </w:p>
     <w:p>
@@ -1936,7 +1936,7 @@
           <w:sz w:val="20"/>
           <w:szCs w:val="20"/>
         </w:rPr>
-        <w:t xml:space="preserve">Menolak barang sumbangan warga karena helikopter hanya diperbolehkan membawa barang yang dibeli oleh dinas pemerintah.</w:t>
+        <w:t xml:space="preserve">Menolak barang kiriman warga karena helikopter kargo militer hanya diizinkan memuat perbekalan yang dibeli lewat anggaran dinas.</w:t>
       </w:r>
     </w:p>
     <w:p>
@@ -1960,7 +1960,7 @@
           <w:sz w:val="20"/>
           <w:szCs w:val="20"/>
         </w:rPr>
-        <w:t xml:space="preserve">Mengurangi beban kerja petugas gudang agar mereka memiliki waktu istirahat yang lebih lama di pangkalan posko.</w:t>
+        <w:t xml:space="preserve">Mengurangi beban kerja relawan gudang pangkalan udara agar mereka memiliki waktu istirahat lebih banyak di dalam tenda penampungan.</w:t>
       </w:r>
     </w:p>
     <w:p>
@@ -1984,7 +1984,7 @@
           <w:sz w:val="20"/>
           <w:szCs w:val="20"/>
         </w:rPr>
-        <w:t xml:space="preserve">Menyenangkan hati para penyumbang makanan dengan mendahulukan produk makanan pabrik tertentu.</w:t>
+        <w:t xml:space="preserve">Memprioritaskan produk makanan pabrikan tertentu guna menjaga kerja sama kemitraan logistik antara pihak posko dan badan penyumbang.</w:t>
       </w:r>
     </w:p>
     <w:p>
@@ -2008,7 +2008,7 @@
           <w:sz w:val="20"/>
           <w:szCs w:val="20"/>
         </w:rPr>
-        <w:t xml:space="preserve">Menunjukkan wewenang mutlak seorang pimpinan operasi logistik tanpa perlu menjelaskan alasannya kepada sukarelawan.</w:t>
+        <w:t xml:space="preserve">Memperlihatkan wewenang mutlak seorang pemimpin misi penyelamatan tanpa berkewajiban memberi penjelasan rasional kepada sukarelawan.</w:t>
       </w:r>
     </w:p>
     <w:p>
@@ -2121,7 +2121,7 @@
           <w:sz w:val="20"/>
           <w:szCs w:val="20"/>
         </w:rPr>
-        <w:t xml:space="preserve">Menyediakan panduan langkah kerja yang runtut waktu, terukur alokasi sumber dayanya, dan mencegah kebingungan para pilot di lapangan.</w:t>
+        <w:t xml:space="preserve">Menyajikan panduan kerja berurutan waktu dan terukur pemanfaatan sumber dayanya sehingga mencegah kebingungan para penerbang.</w:t>
       </w:r>
     </w:p>
     <w:p>
@@ -2145,7 +2145,7 @@
           <w:sz w:val="20"/>
           <w:szCs w:val="20"/>
         </w:rPr>
-        <w:t xml:space="preserve">Membuat helikopter dapat terbang lebih cepat melampaui batas kecepatan maksimal yang ditentukan pabrik pembuatnya.</w:t>
+        <w:t xml:space="preserve">Memungkinkan helikopter melesat lebih cepat melampaui batas kecepatan tertinggi yang sudah ditetapkan oleh pabrik pembuat mesin.</w:t>
       </w:r>
     </w:p>
     <w:p>
@@ -2169,7 +2169,7 @@
           <w:sz w:val="20"/>
           <w:szCs w:val="20"/>
         </w:rPr>
-        <w:t xml:space="preserve">Menjamin bahwa seluruh warga di 15 desa akan mendapatkan jumlah pasokan beras yang sama persis tanpa selisih satu butir pun.</w:t>
+        <w:t xml:space="preserve">Menjamin seluruh warga di lima belas desa menerima jatah logistik dalam takaran yang sama rata tanpa selisih berat sedikit pun.</w:t>
       </w:r>
     </w:p>
     <w:p>
@@ -2193,7 +2193,7 @@
           <w:sz w:val="20"/>
           <w:szCs w:val="20"/>
         </w:rPr>
-        <w:t xml:space="preserve">Menghilangkan kebutuhan pilot manusia karena helikopter dapat terbang secara mandiri mengikuti tulisan di papan tulis posko.</w:t>
+        <w:t xml:space="preserve">Menggantikan peran penerbang manusia karena armada kargo dapat mengudara sendiri secara otomatis berbekal jadwal di papan posko.</w:t>
       </w:r>
     </w:p>
     <w:p>
@@ -2217,7 +2217,7 @@
           <w:sz w:val="20"/>
           <w:szCs w:val="20"/>
         </w:rPr>
-        <w:t xml:space="preserve">Memastikan seluruh anggaran operasional bahan bakar avtur habis digunakan dalam satu hari pelaksanaan misi.</w:t>
+        <w:t xml:space="preserve">Memastikan seluruh jatah cadangan bahan bakar avtur pangkalan habis terpakai dalam satu hari pelaksanaan rangkaian misi darurat.</w:t>
       </w:r>
     </w:p>
     <w:p>
@@ -2317,7 +2317,7 @@
           <w:sz w:val="20"/>
           <w:szCs w:val="20"/>
         </w:rPr>
-        <w:t xml:space="preserve">Helikopter berisiko kehabisan bahan bakar atau mengalami gangguan mesin di tengah penerbangan yang dapat menyebabkan kecelakaan mematikan.</w:t>
+        <w:t xml:space="preserve">Helikopter berisiko kehabisan bahan bakar atau mengalami gangguan mesin di udara yang memicu kecelakaan penerbangan fatal.</w:t>
       </w:r>
     </w:p>
     <w:p>
@@ -2341,7 +2341,7 @@
           <w:sz w:val="20"/>
           <w:szCs w:val="20"/>
         </w:rPr>
-        <w:t xml:space="preserve">Warga desa penerima bantuan akan merasa bosan karena paket bantuan datang terlalu cepat dari perkiraan semula.</w:t>
+        <w:t xml:space="preserve">Warga desa terdampak akan merasa jenuh karena paket bantuan kemanusiaan tiba di lokasi penampungan lebih cepat dari jadwal semula.</w:t>
       </w:r>
     </w:p>
     <w:p>
@@ -2365,7 +2365,7 @@
           <w:sz w:val="20"/>
           <w:szCs w:val="20"/>
         </w:rPr>
-        <w:t xml:space="preserve">Harga bahan bakar helikopter di pasaran akan melonjak tinggi karena dibeli pada waktu siang hari.</w:t>
+        <w:t xml:space="preserve">Biaya pembelian bahan bakar avtur akan melonjak tinggi karena stasiun pengisian pangkalan menaikkan harga pada siang hari terik.</w:t>
       </w:r>
     </w:p>
     <w:p>
@@ -2389,7 +2389,7 @@
           <w:sz w:val="20"/>
           <w:szCs w:val="20"/>
         </w:rPr>
-        <w:t xml:space="preserve">Pangkalan posko akan kelebihan persediaan logistik makanan karena gudang tidak sempat menampung kiriman baru.</w:t>
+        <w:t xml:space="preserve">Gudang penampungan posko akan kelebihan muatan barang sebab petugas logistik tidak sanggup memilah kiriman donasi yang baru masuk.</w:t>
       </w:r>
     </w:p>
     <w:p>
@@ -2413,7 +2413,7 @@
           <w:sz w:val="20"/>
           <w:szCs w:val="20"/>
         </w:rPr>
-        <w:t xml:space="preserve">Pilot helikopter akan kehilangan sinyal panduan arah karena satelit cuaca hanya bekerja pada pagi dan sore hari.</w:t>
+        <w:t xml:space="preserve">Perangkat navigasi satelit akan kehilangan arah sebab pemancar sinyal di angkasa hanya dapat berfungsi pada pagi dan sore hari.</w:t>
       </w:r>
     </w:p>
     <w:p>
@@ -2513,7 +2513,7 @@
           <w:sz w:val="20"/>
           <w:szCs w:val="20"/>
         </w:rPr>
-        <w:t xml:space="preserve">Mengerahkan seluruh 4 helikopter yang siap ke Wilayah Utara pada pagi hari, lalu membagi masing-masing 2 helikopter untuk Wilayah Tengah dan Selatan pada sesi siang.</w:t>
+        <w:t xml:space="preserve">Mengerahkan seluruh 4 helikopter ke Wilayah Utara pada pagi hari, lalu membagi masing-masing 2 helikopter ke wilayah lain saat siang.</w:t>
       </w:r>
     </w:p>
     <w:p>
@@ -2537,7 +2537,7 @@
           <w:sz w:val="20"/>
           <w:szCs w:val="20"/>
         </w:rPr>
-        <w:t xml:space="preserve">Memaksakan helikopter yang bocor oli untuk tetap terbang melintasi jurang terjal demi menjaga kuota lima armada.</w:t>
+        <w:t xml:space="preserve">Memaksakan helikopter yang rusak oli tetap terbang melintasi jurang terjal demi menjaga target jumlah lima armada di udara perbukitan.</w:t>
       </w:r>
     </w:p>
     <w:p>
@@ -2561,7 +2561,7 @@
           <w:sz w:val="20"/>
           <w:szCs w:val="20"/>
         </w:rPr>
-        <w:t xml:space="preserve">Membatalkan seluruh penerbangan hari itu ke semua wilayah sampai helikopter pengganti datang dari ibu kota pekan depan.</w:t>
+        <w:t xml:space="preserve">Membatalkan seluruh operasi bantuan hari itu ke semua kawasan hingga unit helikopter pengganti tiba dari ibu kota pada minggu depan.</w:t>
       </w:r>
     </w:p>
     <w:p>
@@ -2585,7 +2585,7 @@
           <w:sz w:val="20"/>
           <w:szCs w:val="20"/>
         </w:rPr>
-        <w:t xml:space="preserve">Mengalihkan seluruh penerbangan hanya ke Wilayah Selatan karena jaraknya paling dekat dari pangkalan pendaratan.</w:t>
+        <w:t xml:space="preserve">Memindahkan seluruh fokus penerbangan ke Wilayah Selatan karena memiliki medan paling landai dan jarak terdekat dari pangkalan utama.</w:t>
       </w:r>
     </w:p>
     <w:p>
@@ -2609,7 +2609,7 @@
           <w:sz w:val="20"/>
           <w:szCs w:val="20"/>
         </w:rPr>
-        <w:t xml:space="preserve">Meminta para pilot helikopter mengangkut kargo dengan berjalan kaki mendaki gunung menuju Wilayah Utara.</w:t>
+        <w:t xml:space="preserve">Memerintahkan kru penerbang memikul barang kargo dengan berjalan kaki menyusuri lereng terjal menuju desa terpencil di Wilayah Utara.</w:t>
       </w:r>
     </w:p>
     <w:p>
@@ -2722,7 +2722,7 @@
           <w:sz w:val="20"/>
           <w:szCs w:val="20"/>
         </w:rPr>
-        <w:t xml:space="preserve">Dekomposisi; memecah beban pekerjaan rumah yang besar menjadi beberapa bagian tugas wilayah yang lebih kecil dan terkelola sesuai kemampuan masing-masing.</w:t>
+        <w:t xml:space="preserve">Dekomposisi; memecah pekerjaan rumah tangga yang berat ke dalam bidang tugas yang lebih teratur sesuai kemampuan masing-masing.</w:t>
       </w:r>
     </w:p>
     <w:p>
@@ -2746,7 +2746,7 @@
           <w:sz w:val="20"/>
           <w:szCs w:val="20"/>
         </w:rPr>
-        <w:t xml:space="preserve">Abstraksi keliru; membiarkan ruang tamu dalam keadaan kotor karena dianggap tidak terlihat oleh tamu yang datang.</w:t>
+        <w:t xml:space="preserve">Abstraksi keliru; membiarkan tumpukan sampah di ruang tamu karena menganggap area tersebut tidak akan diperhatikan oleh para tamu.</w:t>
       </w:r>
     </w:p>
     <w:p>
@@ -2770,7 +2770,7 @@
           <w:sz w:val="20"/>
           <w:szCs w:val="20"/>
         </w:rPr>
-        <w:t xml:space="preserve">Pengenalan pola acak; menyapu lantai rumah secara berulang-ulang tanpa memedulikan apakah lantai sudah bersih atau belum.</w:t>
+        <w:t xml:space="preserve">Pengenalan pola acak; membersihkan lantai berulang kali tanpa memeriksa apakah permukaan keramik sudah bersih dari kotoran debu.</w:t>
       </w:r>
     </w:p>
     <w:p>
@@ -2794,7 +2794,7 @@
           <w:sz w:val="20"/>
           <w:szCs w:val="20"/>
         </w:rPr>
-        <w:t xml:space="preserve">Penyusunan aturan paksa; mewajibkan setiap anggota keluarga menggunakan pakaian dengan warna yang seragam saat menyapu.</w:t>
+        <w:t xml:space="preserve">Aturan baku sepihak; mewajibkan setiap anggota keluarga mengenakan pakaian dengan warna serasi saat membersihkan perabot di rumah.</w:t>
       </w:r>
     </w:p>
     <w:p>
@@ -2818,7 +2818,7 @@
           <w:sz w:val="20"/>
           <w:szCs w:val="20"/>
         </w:rPr>
-        <w:t xml:space="preserve">Otomatisasi murni; menyerahkan seluruh pembersihan rumah kepada mesin penyedot debu tanpa bantuan tenaga manusia sama sekali.</w:t>
+        <w:t xml:space="preserve">Otomatisasi total; membebankan seluruh tugas pembersihan lantai kepada robot penyedot debu tanpa bantuan tenaga manusia sama sekali.</w:t>
       </w:r>
     </w:p>
     <w:p>
@@ -2931,7 +2931,7 @@
           <w:sz w:val="20"/>
           <w:szCs w:val="20"/>
         </w:rPr>
-        <w:t xml:space="preserve">Pengenalan pola; mengenali kesamaan sifat bahan dan warna pakaian dari pengalaman masa lalu untuk mencegah kerusakan pakaian putih.</w:t>
+        <w:t xml:space="preserve">Pengenalan pola; mengelompokkan cucian berdasarkan sifat warna dan risiko luntur dari pengalaman mencuci sebelumnya.</w:t>
       </w:r>
     </w:p>
     <w:p>
@@ -2955,7 +2955,7 @@
           <w:sz w:val="20"/>
           <w:szCs w:val="20"/>
         </w:rPr>
-        <w:t xml:space="preserve">Algoritma acak; memasukkan pakaian ke mesin cuci secara sembarangan tanpa memeriksa label petunjuk perawatan pakaian.</w:t>
+        <w:t xml:space="preserve">Algoritma acak; mencampur seluruh pakaian kotor ke tabung mesin cuci tanpa membaca instruksi perawatan pada label pakaian.</w:t>
       </w:r>
     </w:p>
     <w:p>
@@ -2979,7 +2979,7 @@
           <w:sz w:val="20"/>
           <w:szCs w:val="20"/>
         </w:rPr>
-        <w:t xml:space="preserve">Abstraksi berlebihan; membuang seluruh pakaian berwarna ke tempat sampah agar mesin cuci hanya mencuci pakaian putih.</w:t>
+        <w:t xml:space="preserve">Abstraksi berlebihan; membuang seluruh celana berwarna ke tempat sampah agar mesin cuci hanya membersihkan seragam putih sekolah.</w:t>
       </w:r>
     </w:p>
     <w:p>
@@ -3003,7 +3003,7 @@
           <w:sz w:val="20"/>
           <w:szCs w:val="20"/>
         </w:rPr>
-        <w:t xml:space="preserve">Dekomposisi biner; menghitung jumlah kancing pada setiap kemeja sebelum merendamnya ke dalam ember air sabun.</w:t>
+        <w:t xml:space="preserve">Dekomposisi mekanis; menghitung jumlah kancing pada setiap baju sebelum merendamnya ke dalam larutan air detergen di ember cuci.</w:t>
       </w:r>
     </w:p>
     <w:p>
@@ -3027,7 +3027,7 @@
           <w:sz w:val="20"/>
           <w:szCs w:val="20"/>
         </w:rPr>
-        <w:t xml:space="preserve">Perancangan perangkat keras; membongkar mesin cuci keluarga untuk mengganti tabung pemutar dengan ember kayu tradisional.</w:t>
+        <w:t xml:space="preserve">Rekayasa perangkat; membongkar tabung mesin cuci untuk mengganti motor penggerak listrik dengan tuas pemutar kayu tradisional.</w:t>
       </w:r>
     </w:p>
     <w:p>
@@ -3140,7 +3140,7 @@
           <w:sz w:val="20"/>
           <w:szCs w:val="20"/>
         </w:rPr>
-        <w:t xml:space="preserve">Menyusun urutan tindakan secara terperinci dan memperhitungkan pemanfaatan sumber daya kompor secara bersamaan sehingga seluruh makanan matang tepat waktu.</w:t>
+        <w:t xml:space="preserve">Merancang urutan kerja dan memanfaatkan dua tungku secara terkoordinasi agar semua hidangan matang bersamaan sebelum berangkat.</w:t>
       </w:r>
     </w:p>
     <w:p>
@@ -3164,7 +3164,7 @@
           <w:sz w:val="20"/>
           <w:szCs w:val="20"/>
         </w:rPr>
-        <w:t xml:space="preserve">Memasak seluruh bahan makanan dalam satu panci besar tanpa memedulikan rasa dan perbedaan tingkat kematangan.</w:t>
+        <w:t xml:space="preserve">Memasukkan semua bahan makanan ke dalam satu wadah wajan yang sama tanpa memedulikan cita rasa dan tingkat kematangan masakan.</w:t>
       </w:r>
     </w:p>
     <w:p>
@@ -3188,7 +3188,7 @@
           <w:sz w:val="20"/>
           <w:szCs w:val="20"/>
         </w:rPr>
-        <w:t xml:space="preserve">Memastikan sarapan disiapkan hanya jika ada tamu penting yang berkunjung ke rumah di pagi hari.</w:t>
+        <w:t xml:space="preserve">Menyiapkan menu hidangan sarapan hanya apabila ada sanak keluarga penting yang datang berkunjung ke rumah pada waktu pagi hari.</w:t>
       </w:r>
     </w:p>
     <w:p>
@@ -3212,7 +3212,7 @@
           <w:sz w:val="20"/>
           <w:szCs w:val="20"/>
         </w:rPr>
-        <w:t xml:space="preserve">Mengabaikan kebersihan dapur dengan membiarkan kompor menyala tanpa ditunggui sama sekali.</w:t>
+        <w:t xml:space="preserve">Mengabaikan keselamatan dapur dengan menyalakan api kompor berkekuatan besar tanpa ditunggui selama proses penggorengan makanan.</w:t>
       </w:r>
     </w:p>
     <w:p>
@@ -3236,7 +3236,7 @@
           <w:sz w:val="20"/>
           <w:szCs w:val="20"/>
         </w:rPr>
-        <w:t xml:space="preserve">Menghabiskan seluruh persediaan bumbu dapur keluarga hanya untuk membuat satu porsi sarapan pagi.</w:t>
+        <w:t xml:space="preserve">Menghabiskan seluruh persediaan minyak goreng keluarga di lemari dapur hanya demi memasak sebutir telur mata sapi di wajan panas.</w:t>
       </w:r>
     </w:p>
     <w:p>
@@ -3349,7 +3349,7 @@
           <w:sz w:val="20"/>
           <w:szCs w:val="20"/>
         </w:rPr>
-        <w:t xml:space="preserve">Pengenalan pola; mengamati keteraturan waktu pemakaian alat listrik dan mengaitkannya dengan lonjakan biaya pada data tagihan.</w:t>
+        <w:t xml:space="preserve">Pengenalan pola; meneliti keteraturan waktu pemakaian alat listrik dan mengaitkannya dengan lonjakan biaya tagihan bulanan.</w:t>
       </w:r>
     </w:p>
     <w:p>
@@ -3373,7 +3373,7 @@
           <w:sz w:val="20"/>
           <w:szCs w:val="20"/>
         </w:rPr>
-        <w:t xml:space="preserve">Abstraksi parsial; mematikan meteran listrik utama rumah secara permanen sehingga keluarga tidak menggunakan listrik sama sekali.</w:t>
+        <w:t xml:space="preserve">Abstraksi parsial; mematikan sakelar listrik utama rumah tangga sehingga seluruh penghuni tidak lagi memanfaatkan energi listrik.</w:t>
       </w:r>
     </w:p>
     <w:p>
@@ -3397,7 +3397,7 @@
           <w:sz w:val="20"/>
           <w:szCs w:val="20"/>
         </w:rPr>
-        <w:t xml:space="preserve">Dekomposisi manual; membongkar mesin pendingin ruangan menjadi ratusan komponen kabel kecil di ruang tamu.</w:t>
+        <w:t xml:space="preserve">Dekomposisi mekanik; melepas seluruh baut pendingin ruangan menjadi ratusan kabel kecil yang berserakan di atas lantai kamar tidur.</w:t>
       </w:r>
     </w:p>
     <w:p>
@@ -3421,7 +3421,7 @@
           <w:sz w:val="20"/>
           <w:szCs w:val="20"/>
         </w:rPr>
-        <w:t xml:space="preserve">Algoritma semu; membayar tagihan listrik dua kali lipat setiap bulan agar petugas listrik tidak datang memeriksa ke rumah.</w:t>
+        <w:t xml:space="preserve">Kebiasaan boros; membayar tagihan listrik berlipat ganda setiap bulan agar petugas pencatat meteran tidak perlu datang memeriksa.</w:t>
       </w:r>
     </w:p>
     <w:p>
@@ -3445,7 +3445,7 @@
           <w:sz w:val="20"/>
           <w:szCs w:val="20"/>
         </w:rPr>
-        <w:t xml:space="preserve">Pemodelan grafis; menggambar sketsa bentuk fisik pendingin ruangan pada selembar kertas karton berwarna.</w:t>
+        <w:t xml:space="preserve">Pemodelan visual; menggambar ulang bentuk fisik pendingin ruangan pada selembar kertas karton untuk dipajang di dinding ruang tamu.</w:t>
       </w:r>
     </w:p>
     <w:p>
@@ -3558,7 +3558,7 @@
           <w:sz w:val="20"/>
           <w:szCs w:val="20"/>
         </w:rPr>
-        <w:t xml:space="preserve">Abstraksi; membuang detail yang tidak relevan (aroma dan merek) serta hanya berfokus pada informasi penting yaitu jenis bahan botol (plastik daur ulang).</w:t>
+        <w:t xml:space="preserve">Abstraksi; mengabaikan detail aroma dan merek kemasan serta hanya berfokus pada informasi penting yaitu jenis bahan plastik.</w:t>
       </w:r>
     </w:p>
     <w:p>
@@ -3582,7 +3582,7 @@
           <w:sz w:val="20"/>
           <w:szCs w:val="20"/>
         </w:rPr>
-        <w:t xml:space="preserve">Algoritma; mengharuskan Siti membersihkan botol sampo dengan sabun mandi sebanyak sepuluh kali sebelum dibuang.</w:t>
+        <w:t xml:space="preserve">Algoritma kaku; mewajibkan pencucian botol plastik menggunakan sabun pembersih sebanyak sepuluh kali sebelum dimasukkan ke tong sampah.</w:t>
       </w:r>
     </w:p>
     <w:p>
@@ -3606,7 +3606,7 @@
           <w:sz w:val="20"/>
           <w:szCs w:val="20"/>
         </w:rPr>
-        <w:t xml:space="preserve">Dekomposisi; memotong botol plastik menjadi serpihan berukuran satu milimeter menggunakan gunting kuku.</w:t>
+        <w:t xml:space="preserve">Dekomposisi ekstrem; memotong kemasan botol plastik menjadi serpihan berukuran sangat kecil menggunakan gunting pemotong kuku tangan.</w:t>
       </w:r>
     </w:p>
     <w:p>
@@ -3630,7 +3630,7 @@
           <w:sz w:val="20"/>
           <w:szCs w:val="20"/>
         </w:rPr>
-        <w:t xml:space="preserve">Pengenalan pola keliru; menganggap seluruh benda cair di kamar mandi adalah racun berbahaya yang tidak boleh disentuh.</w:t>
+        <w:t xml:space="preserve">Penilaian keliru; menganggap seluruh sisa cairan pembersih di kamar mandi sebagai racun berbahaya yang dilarang untuk disentuh tangan.</w:t>
       </w:r>
     </w:p>
     <w:p>
@@ -3654,7 +3654,7 @@
           <w:sz w:val="20"/>
           <w:szCs w:val="20"/>
         </w:rPr>
-        <w:t xml:space="preserve">Otomatisasi; membiarkan sampah menumpuk di lantai kamar mandi sampai larut sendiri ditelan air pembuangan.</w:t>
+        <w:t xml:space="preserve">Sikap pasif; membiarkan kemasan bekas menumpuk di sudut lantai kamar mandi hingga larut dengan sendirinya terbawa arus air pembuangan.</w:t>
       </w:r>
     </w:p>
     <w:p>
@@ -3767,7 +3767,7 @@
           <w:sz w:val="20"/>
           <w:szCs w:val="20"/>
         </w:rPr>
-        <w:t xml:space="preserve">Pengenalan pola kebutuhan hidup tanaman dan penyusunan algoritma jadwal penyiraman yang teratur.</w:t>
+        <w:t xml:space="preserve">Pengenalan pola kebutuhan hayati setiap tanaman dan perancangan algoritma jadwal perawatan berkala yang teratur.</w:t>
       </w:r>
     </w:p>
     <w:p>
@@ -3791,7 +3791,7 @@
           <w:sz w:val="20"/>
           <w:szCs w:val="20"/>
         </w:rPr>
-        <w:t xml:space="preserve">Penghapusan data tanaman dan pembagian pot bunga secara acak tanpa memperhatikan jenis tanamannya.</w:t>
+        <w:t xml:space="preserve">Penyeragaman takaran air siraman tanpa membedakan daya tahan akar kaktus gurun dengan tanaman anggrek gantung.</w:t>
       </w:r>
     </w:p>
     <w:p>
@@ -3815,7 +3815,7 @@
           <w:sz w:val="20"/>
           <w:szCs w:val="20"/>
         </w:rPr>
-        <w:t xml:space="preserve">Pengabaian seluruh kebutuhan air dan penyerahan pertumbuhan tanaman sepenuhnya pada air hujan alami.</w:t>
+        <w:t xml:space="preserve">Pengabaian seluruh kebutuhan pupuk dan membiarkan pertumbuhan pot tanaman pekarangan bergantung pada air hujan.</w:t>
       </w:r>
     </w:p>
     <w:p>
@@ -3839,7 +3839,7 @@
           <w:sz w:val="20"/>
           <w:szCs w:val="20"/>
         </w:rPr>
-        <w:t xml:space="preserve">Pembongkaran seluruh akar tanaman setiap pagi hari untuk memastikan ada cacing tanah di dalam pot.</w:t>
+        <w:t xml:space="preserve">Pemeriksaan fisik berlebihan dengan membongkar tanah pot tanaman setiap pagi untuk menghitung jumlah cacing tanah.</w:t>
       </w:r>
     </w:p>
     <w:p>
@@ -3863,7 +3863,7 @@
           <w:sz w:val="20"/>
           <w:szCs w:val="20"/>
         </w:rPr>
-        <w:t xml:space="preserve">Pemberian pupuk kimia berdosis tinggi setiap jam agar tanaman tumbuh sepuluh kali lebih cepat dari biasanya.</w:t>
+        <w:t xml:space="preserve">Pemberian cairan pupuk berkonsentrasi tinggi setiap beberapa jam agar bunga tanaman mekar sepuluh kali lebih cepat.</w:t>
       </w:r>
     </w:p>
     <w:p>
@@ -3976,7 +3976,7 @@
           <w:sz w:val="20"/>
           <w:szCs w:val="20"/>
         </w:rPr>
-        <w:t xml:space="preserve">Dekomposisi; memecah proyek besar berdurasi satu bulan ke dalam tahapan-tahapan waktu dan target kerja yang terfokus.</w:t>
+        <w:t xml:space="preserve">Dekomposisi; mengurai proyek berdurasi satu bulan ke dalam tahapan waktu dan target kerja berkala yang lebih terfokus.</w:t>
       </w:r>
     </w:p>
     <w:p>
@@ -4000,7 +4000,7 @@
           <w:sz w:val="20"/>
           <w:szCs w:val="20"/>
         </w:rPr>
-        <w:t xml:space="preserve">Abstraksi sepihak; menolak mencantumkan nama anggota kelompok pada berkas laporan akhir tugas sekolah.</w:t>
+        <w:t xml:space="preserve">Abstraksi sepihak; menghapus nama rekan satu kelompok pada laporan lembar penyerahan tugas agar nilai terkumpul mandiri.</w:t>
       </w:r>
     </w:p>
     <w:p>
@@ -4024,7 +4024,7 @@
           <w:sz w:val="20"/>
           <w:szCs w:val="20"/>
         </w:rPr>
-        <w:t xml:space="preserve">Algoritma jalan pintas; mengunduh video dokumenter milik orang lain di internet dan mengubah judulnya menjadi tugas sendiri.</w:t>
+        <w:t xml:space="preserve">Langkah curang; menyalin rekaman video milik orang lain di internet kemudian mengubah judulnya menjadi karya kelompok tugas.</w:t>
       </w:r>
     </w:p>
     <w:p>
@@ -4048,7 +4048,7 @@
           <w:sz w:val="20"/>
           <w:szCs w:val="20"/>
         </w:rPr>
-        <w:t xml:space="preserve">Pengenalan pola acak; merekam gambar tanpa naskah dan berharap video akan tersusun sendiri saat diedit.</w:t>
+        <w:t xml:space="preserve">Pemilihan acak; merekam pemandangan jalan tanpa acuan naskah cerita dan berharap rekaman tersusun padu saat tahap pengeditan.</w:t>
       </w:r>
     </w:p>
     <w:p>
@@ -4072,7 +4072,7 @@
           <w:sz w:val="20"/>
           <w:szCs w:val="20"/>
         </w:rPr>
-        <w:t xml:space="preserve">Otomatisasi tanpa batas; membiarkan kamera merekam ruang kelas kosong selama 24 jam tanpa ada kegiatan terarah.</w:t>
+        <w:t xml:space="preserve">Pengawasan hampa; membiarkan kamera merekam ruangan kelas kosong selama seharian penuh tanpa ada arahan kegiatan yang jelas.</w:t>
       </w:r>
     </w:p>
     <w:p>
@@ -4185,7 +4185,7 @@
           <w:sz w:val="20"/>
           <w:szCs w:val="20"/>
         </w:rPr>
-        <w:t xml:space="preserve">Algoritma; merancang alur urutan proses layanan yang teratur dan searah untuk mengurai penumpukan antrean siswa.</w:t>
+        <w:t xml:space="preserve">Algoritma; merancang urutan langkah alur transaksi yang searah untuk mencegah penumpukan antrean siswa di kantin.</w:t>
       </w:r>
     </w:p>
     <w:p>
@@ -4209,7 +4209,7 @@
           <w:sz w:val="20"/>
           <w:szCs w:val="20"/>
         </w:rPr>
-        <w:t xml:space="preserve">Dekomposisi parsial; menutup kantin sekolah secara sepihak agar siswa membawa bekal dari rumah masing-masing.</w:t>
+        <w:t xml:space="preserve">Penutupan sepihak; melarang seluruh kantin beroperasi agar siswa membawa kotak bekal makanan sendiri dari rumah mereka.</w:t>
       </w:r>
     </w:p>
     <w:p>
@@ -4233,7 +4233,7 @@
           <w:sz w:val="20"/>
           <w:szCs w:val="20"/>
         </w:rPr>
-        <w:t xml:space="preserve">Abstraksi berlebih; menghapus daftar harga makanan sehingga siswa tidak tahu berapa uang yang harus dibayarkan.</w:t>
+        <w:t xml:space="preserve">Peniadaan informasi; mencopot daftar harga makanan sehingga para pembeli tidak mengetahui nominal uang yang disiapkan.</w:t>
       </w:r>
     </w:p>
     <w:p>
@@ -4257,7 +4257,7 @@
           <w:sz w:val="20"/>
           <w:szCs w:val="20"/>
         </w:rPr>
-        <w:t xml:space="preserve">Pengenalan pola negatif; menyimpulkan bahwa antrean panjang merupakan tradisi sekolah yang tidak perlu diubah.</w:t>
+        <w:t xml:space="preserve">Pembiaran kebiasaan; menganggap kerumunan antrean padat sebagai tradisi sekolah yang wajar dan tidak perlu diperbaiki.</w:t>
       </w:r>
     </w:p>
     <w:p>
@@ -4281,7 +4281,7 @@
           <w:sz w:val="20"/>
           <w:szCs w:val="20"/>
         </w:rPr>
-        <w:t xml:space="preserve">Pemrograman manual; mewajibkan siswa menghafal kode batang setiap bungkus makanan sebelum membelinya.</w:t>
+        <w:t xml:space="preserve">Pengujian berbelit; mengharuskan setiap siswa menghafal kode batang bungkus makanan sebelum diizinkan membeli di loket.</w:t>
       </w:r>
     </w:p>
     <w:p>
@@ -4394,7 +4394,7 @@
           <w:sz w:val="20"/>
           <w:szCs w:val="20"/>
         </w:rPr>
-        <w:t xml:space="preserve">Mengubah jadwal belajarnya menjadi rutinitas pagi hari setelah subuh dan menjauhkan gangguan ponsel pintar untuk menjaga konsentrasi optimal.</w:t>
+        <w:t xml:space="preserve">Mengubah jadwal belajar pribadi ke waktu subuh hari dan menjauhkan gangguan ponsel pintar demi konsentrasi yang optimal.</w:t>
       </w:r>
     </w:p>
     <w:p>
@@ -4418,7 +4418,7 @@
           <w:sz w:val="20"/>
           <w:szCs w:val="20"/>
         </w:rPr>
-        <w:t xml:space="preserve">Tetap begadang hingga tengah malam karena menganggap nilai ulangan semata-mata bergantung pada keberuntungan lembar soal.</w:t>
+        <w:t xml:space="preserve">Mempertahankan kebiasaan belajar larut malam karena menganggap hasil perolehan nilai semata-mata ditentukan oleh faktor nasib.</w:t>
       </w:r>
     </w:p>
     <w:p>
@@ -4442,7 +4442,7 @@
           <w:sz w:val="20"/>
           <w:szCs w:val="20"/>
         </w:rPr>
-        <w:t xml:space="preserve">Berhenti belajar sama sekali dan hanya mengandalkan ingatan sekilas saat guru menjelaskan materi di depan kelas.</w:t>
+        <w:t xml:space="preserve">Menghentikan kegiatan belajar mandiri dan hanya mengandalkan penjelasan sekilas yang disampaikan oleh bapak ibu guru di kelas.</w:t>
       </w:r>
     </w:p>
     <w:p>
@@ -4466,7 +4466,7 @@
           <w:sz w:val="20"/>
           <w:szCs w:val="20"/>
         </w:rPr>
-        <w:t xml:space="preserve">Menghapus catatan nilai ulangannya agar tidak merasa terbebani oleh riwayat prestasi akademiknya.</w:t>
+        <w:t xml:space="preserve">Membuang buku rapor berkala agar pikiran tidak terbebani oleh catatan capaian nilai ulangan yang pernah diperoleh sebelumnya.</w:t>
       </w:r>
     </w:p>
     <w:p>
@@ -4490,7 +4490,7 @@
           <w:sz w:val="20"/>
           <w:szCs w:val="20"/>
         </w:rPr>
-        <w:t xml:space="preserve">Meminta guru mengubah seluruh materi ujian menjadi lagu musik pop agar sesuai dengan kebiasaan belajarnya di malam hari.</w:t>
+        <w:t xml:space="preserve">Mengajukan permohonan agar seluruh naskah ulangan sekolah diubah menjadi lantunan lagu pop sesuai kebiasaan mendengarkan musik.</w:t>
       </w:r>
     </w:p>
     <w:p>
@@ -4603,7 +4603,7 @@
           <w:sz w:val="20"/>
           <w:szCs w:val="20"/>
         </w:rPr>
-        <w:t xml:space="preserve">Abstraksi; menyaring konsep-konsep inti yang paling esensial dan mengesampingkan kalimat penjelas yang terlalu panjang lebar.</w:t>
+        <w:t xml:space="preserve">Abstraksi; menyaring konsep-konsep inti yang penting dan mengesampingkan uraian kalimat penjelas yang berbelit-belit.</w:t>
       </w:r>
     </w:p>
     <w:p>
@@ -4627,7 +4627,7 @@
           <w:sz w:val="20"/>
           <w:szCs w:val="20"/>
         </w:rPr>
-        <w:t xml:space="preserve">Algoritma sekuensial; menghafal nomor halaman buku teks tanpa memahami makna dari materi yang dibaca.</w:t>
+        <w:t xml:space="preserve">Algoritma sekuensial; menghafalkan urutan nomor halaman buku cetak tanpa mendalami hubungan konsep materi yang sedang dibaca.</w:t>
       </w:r>
     </w:p>
     <w:p>
@@ -4651,7 +4651,7 @@
           <w:sz w:val="20"/>
           <w:szCs w:val="20"/>
         </w:rPr>
-        <w:t xml:space="preserve">Dekomposisi destruktif; merobek halaman buku teks yang dianggap tidak akan keluar dalam lembar soal ujian.</w:t>
+        <w:t xml:space="preserve">Dekomposisi ekstrem; menyobek lembaran buku pelajaran yang diperkirakan tidak akan diujikan pada naskah soal penilaian akhir.</w:t>
       </w:r>
     </w:p>
     <w:p>
@@ -4675,7 +4675,7 @@
           <w:sz w:val="20"/>
           <w:szCs w:val="20"/>
         </w:rPr>
-        <w:t xml:space="preserve">Pengenalan pola acak; mencoret-coret lembar buku catatan dengan gambar animasi tanpa ada teks penjelasan.</w:t>
+        <w:t xml:space="preserve">Pengenalan pola acak; menghiasi buku catatan dengan aneka gambar ilustrasi kartun tanpa mencantumkan rangkuman materi biologi.</w:t>
       </w:r>
     </w:p>
     <w:p>
@@ -4699,7 +4699,7 @@
           <w:sz w:val="20"/>
           <w:szCs w:val="20"/>
         </w:rPr>
-        <w:t xml:space="preserve">Otomatisasi fotokopi; memfotokopi seluruh buku tanpa membaca dan mempelajarinya secara mendalam.</w:t>
+        <w:t xml:space="preserve">Penggandaan berkas; mencetak salinan seluruh isi buku pelajaran di tempat fotokopi tanpa mempelajari konsep yang tertulis.</w:t>
       </w:r>
     </w:p>
     <w:p>
@@ -4812,7 +4812,7 @@
           <w:sz w:val="20"/>
           <w:szCs w:val="20"/>
         </w:rPr>
-        <w:t xml:space="preserve">Dekomposisi (pembagian divisi kepanitiaan) dan Algoritma (penyusunan urutan waktu pelaksanaan kegiatan per menit).</w:t>
+        <w:t xml:space="preserve">Dekomposisi (pembagian kelompok divisi kepanitiaan) dan Algoritma (perancangan susunan jadwal acara menit demi menit).</w:t>
       </w:r>
     </w:p>
     <w:p>
@@ -4836,7 +4836,7 @@
           <w:sz w:val="20"/>
           <w:szCs w:val="20"/>
         </w:rPr>
-        <w:t xml:space="preserve">Abstraksi semata tanpa mempertimbangkan siapa yang akan menjalankan tugas di lapangan.</w:t>
+        <w:t xml:space="preserve">Abstraksi parsial semata tanpa merumuskan siapa petugas yang bertanggung jawab menjalankan perlengkapan di lapangan perkemahan.</w:t>
       </w:r>
     </w:p>
     <w:p>
@@ -4860,7 +4860,7 @@
           <w:sz w:val="20"/>
           <w:szCs w:val="20"/>
         </w:rPr>
-        <w:t xml:space="preserve">Pengenalan pola cuaca tanpa menyusun rencana tindakan konkret untuk para peserta kemah.</w:t>
+        <w:t xml:space="preserve">Pengenalan pola ramalan cuaca tanpa diimbangi oleh penyusunan langkah tindakan darurat yang nyata bagi seluruh anggota perkemahan.</w:t>
       </w:r>
     </w:p>
     <w:p>
@@ -4884,7 +4884,7 @@
           <w:sz w:val="20"/>
           <w:szCs w:val="20"/>
         </w:rPr>
-        <w:t xml:space="preserve">Percabangan acak yang membiarkan setiap peserta kemah menentukan sendiri jadwal kegiatannya tanpa koordinasi.</w:t>
+        <w:t xml:space="preserve">Penjadwalan acak yang membiarkan seluruh peserta kemah menentukan waktu kegiatan upacara pembukaan sesuai keinginan masing-masing.</w:t>
       </w:r>
     </w:p>
     <w:p>
@@ -4908,7 +4908,7 @@
           <w:sz w:val="20"/>
           <w:szCs w:val="20"/>
         </w:rPr>
-        <w:t xml:space="preserve">Pengulangan tanpa henti yang mengharuskan upacara pembukaan dilakukan berulang-ulang sepanjang hari.</w:t>
+        <w:t xml:space="preserve">Pengulangan tanpa henti yang mewajibkan seluruh rangkaian acara pembukaan perkemahan diulang berkali-kali sepanjang hari pelaksanaan.</w:t>
       </w:r>
     </w:p>
     <w:p>
@@ -5021,7 +5021,7 @@
           <w:sz w:val="20"/>
           <w:szCs w:val="20"/>
         </w:rPr>
-        <w:t xml:space="preserve">Karena nomor seri uang dan warna kertas sama sekali tidak mempengaruhi nilai saldo kas kelas maupun keabsahan laporan keuangan.</w:t>
+        <w:t xml:space="preserve">Nomor seri dan warna uang kertas tidak mempengaruhi kebenaran nilai saldo kas maupun keterbukaan laporan keuangan.</w:t>
       </w:r>
     </w:p>
     <w:p>
@@ -5045,7 +5045,7 @@
           <w:sz w:val="20"/>
           <w:szCs w:val="20"/>
         </w:rPr>
-        <w:t xml:space="preserve">Karena bendahara kelas malas menuliskan rincian lengkap dari seluruh uang yang disetorkan oleh teman sekelasnya.</w:t>
+        <w:t xml:space="preserve">Pengurus bendahara kelas merasa jenuh untuk mencatat data perincian uang yang disetorkan oleh setiap teman sekelas di sekolah.</w:t>
       </w:r>
     </w:p>
     <w:p>
@@ -5069,7 +5069,7 @@
           <w:sz w:val="20"/>
           <w:szCs w:val="20"/>
         </w:rPr>
-        <w:t xml:space="preserve">Karena uang kas kelas tidak boleh diperiksa oleh wali kelas maupun ketua murid selama masa jabatan berlangsung.</w:t>
+        <w:t xml:space="preserve">Uang kas simpanan murid dilarang untuk diperiksa oleh wali kelas maupun ketua kelas selama masa kepengurusan organisasi berjalan.</w:t>
       </w:r>
     </w:p>
     <w:p>
@@ -5093,7 +5093,7 @@
           <w:sz w:val="20"/>
           <w:szCs w:val="20"/>
         </w:rPr>
-        <w:t xml:space="preserve">Karena nomor seri uang kertas akan hilang dengan sendirinya ketika disimpan di dalam kotak kas kelas.</w:t>
+        <w:t xml:space="preserve">Catatan angka pada nomor seri uang kertas dipercaya akan terhapus dengan sendirinya sewaktu tersimpan lama di dalam kotak brankas.</w:t>
       </w:r>
     </w:p>
     <w:p>
@@ -5117,7 +5117,7 @@
           <w:sz w:val="20"/>
           <w:szCs w:val="20"/>
         </w:rPr>
-        <w:t xml:space="preserve">Karena pencatatan nomor seri uang hanya diwajibkan untuk uang koin logam kuno keluaran abad pertengahan.</w:t>
+        <w:t xml:space="preserve">Pendataan nomor seri uang hanya diwajibkan oleh pihak bank untuk transaksi keping koin logam zaman kuno bernilai sejarah tinggi.</w:t>
       </w:r>
     </w:p>
     <w:p>
@@ -5230,7 +5230,7 @@
           <w:sz w:val="20"/>
           <w:szCs w:val="20"/>
         </w:rPr>
-        <w:t xml:space="preserve">Karena penumpang hanya membutuhkan informasi rute dan titik transit utama; terlalu banyak detail pemandangan fisik justru akan membuat bingung dan memperlambat pengambilan keputusan.</w:t>
+        <w:t xml:space="preserve">Penumpang hanya membutuhkan info jalur dan stasiun transit; terlalu banyak gambar pemandangan fisik justru membingungkan pembaca rute.</w:t>
       </w:r>
     </w:p>
     <w:p>
@@ -5254,7 +5254,7 @@
           <w:sz w:val="20"/>
           <w:szCs w:val="20"/>
         </w:rPr>
-        <w:t xml:space="preserve">Karena foto satelit beresolusi tinggi dilarang oleh undang-undang transportasi untuk dilihat oleh masyarakat umum.</w:t>
+        <w:t xml:space="preserve">Foto citra satelit beresolusi tajam dilarang keras oleh dinas perhubungan untuk diperlihatkan kepada seluruh warga masyarakat umum.</w:t>
       </w:r>
     </w:p>
     <w:p>
@@ -5278,7 +5278,7 @@
           <w:sz w:val="20"/>
           <w:szCs w:val="20"/>
         </w:rPr>
-        <w:t xml:space="preserve">Karena garis jalur warna-warni secara otomatis memandu langkah kaki penumpang tanpa perlu membaca peta kembali.</w:t>
+        <w:t xml:space="preserve">Garis jalur rel warna-warni pada lembar kertas sanggup memandu langkah kaki penumpang secara ajaib tanpa perlu menatap papan halte.</w:t>
       </w:r>
     </w:p>
     <w:p>
@@ -5302,7 +5302,7 @@
           <w:sz w:val="20"/>
           <w:szCs w:val="20"/>
         </w:rPr>
-        <w:t xml:space="preserve">Karena peta yang sederhana lebih murah biaya pencetakannya sehingga pengelola kereta bisa menghemat anggaran stasiun.</w:t>
+        <w:t xml:space="preserve">Peta sederhana membutuhkan biaya pencetakan yang jauh lebih hemat sehingga pengelola stasiun dapat menyimpan kelebihan anggaran dana.</w:t>
       </w:r>
     </w:p>
     <w:p>
@@ -5326,7 +5326,7 @@
           <w:sz w:val="20"/>
           <w:szCs w:val="20"/>
         </w:rPr>
-        <w:t xml:space="preserve">Karena kereta komuter tidak bergerak di atas rel nyata melainkan hanya meluncur di dalam ruang simulasi maya.</w:t>
+        <w:t xml:space="preserve">Gerbong kereta komuter hanya meluncur di dalam ruang simulasi maya sehingga jalur rel tidak memiliki wujud nyata di permukaan bumi.</w:t>
       </w:r>
     </w:p>
     <w:p>
@@ -5439,7 +5439,7 @@
           <w:sz w:val="20"/>
           <w:szCs w:val="20"/>
         </w:rPr>
-        <w:t xml:space="preserve">Pengenalan pola; mengaitkan hubungan berulang antara faktor kelembapan cuaca dengan siklus kemunculan hama untuk melakukan pencegahan dini.</w:t>
+        <w:t xml:space="preserve">Pengenalan pola; mengaitkan hubungan berulang antara kelembapan udara dan kemunculan hama untuk langkah pencegahan dini.</w:t>
       </w:r>
     </w:p>
     <w:p>
@@ -5463,7 +5463,7 @@
           <w:sz w:val="20"/>
           <w:szCs w:val="20"/>
         </w:rPr>
-        <w:t xml:space="preserve">Dekomposisi acak; memotong seluruh batang pohon apel yang sehat agar hama tidak memiliki tempat untuk hinggap.</w:t>
+        <w:t xml:space="preserve">Dekomposisi perusakan; memangkas seluruh dahan pohon apel yang sehat agar hama pemakan daun tidak memiliki tempat untuk hinggap.</w:t>
       </w:r>
     </w:p>
     <w:p>
@@ -5487,7 +5487,7 @@
           <w:sz w:val="20"/>
           <w:szCs w:val="20"/>
         </w:rPr>
-        <w:t xml:space="preserve">Abstraksi ekstrem; mengabaikan kondisi cuaca dan membiarkan kebun apel terendam air hujan tanpa pengawasan.</w:t>
+        <w:t xml:space="preserve">Abstraksi pasrah; mengesampingkan pengamatan cuaca dan membiarkan areal perkebunan apel diguyur hujan tanpa pemantauan berkala.</w:t>
       </w:r>
     </w:p>
     <w:p>
@@ -5511,7 +5511,7 @@
           <w:sz w:val="20"/>
           <w:szCs w:val="20"/>
         </w:rPr>
-        <w:t xml:space="preserve">Algoritma tertutup; menyemprotkan pestisida kimia setiap jam sepanjang tahun tanpa memperhatikan musim.</w:t>
+        <w:t xml:space="preserve">Algoritma serampangan; menyemprotkan cairan pestisida kimia setiap beberapa jam sepanjang tahun tanpa memeriksa kondisi tanaman.</w:t>
       </w:r>
     </w:p>
     <w:p>
@@ -5535,7 +5535,7 @@
           <w:sz w:val="20"/>
           <w:szCs w:val="20"/>
         </w:rPr>
-        <w:t xml:space="preserve">Penyusunan kode sandi; memberi nomor kode rahasia pada setiap buah apel yang bergelantungan di pohon.</w:t>
+        <w:t xml:space="preserve">Pembuatan kode rahasia; membubuhkan tanda angka sandi pada setiap permukaan kulit buah apel yang masih bergelantungan di dahan.</w:t>
       </w:r>
     </w:p>
     <w:p>
@@ -5648,7 +5648,7 @@
           <w:sz w:val="20"/>
           <w:szCs w:val="20"/>
         </w:rPr>
-        <w:t xml:space="preserve">Memiliki aturan percabangan kondisi (kondisional) yang terukur dan memiliki tindakan aksi yang pasti ketika ambang batas kemacetan terlampaui.</w:t>
+        <w:t xml:space="preserve">Memiliki percabangan kondisi terukur dan panduan tindakan yang pasti saat ambang batas panjang antrean kendaraan terlampaui.</w:t>
       </w:r>
     </w:p>
     <w:p>
@@ -5672,7 +5672,7 @@
           <w:sz w:val="20"/>
           <w:szCs w:val="20"/>
         </w:rPr>
-        <w:t xml:space="preserve">Mewajibkan seluruh kendaraan bermotor mematikan mesin dan menunggu di jalan raya sampai polisi mengizinkan jalan.</w:t>
+        <w:t xml:space="preserve">Mewajibkan seluruh pengemudi mematikan mesin kendaraan di tengah jalan raya sampai petugas kepolisian meniup peluit tanda aman.</w:t>
       </w:r>
     </w:p>
     <w:p>
@@ -5696,7 +5696,7 @@
           <w:sz w:val="20"/>
           <w:szCs w:val="20"/>
         </w:rPr>
-        <w:t xml:space="preserve">Mengharuskan pengendara mobil pribadi membayar denda uang tunai di tempat kepada petugas pengatur lalu lintas.</w:t>
+        <w:t xml:space="preserve">Memberi wewenang kepada petugas pengatur jalur untuk memungut uang denda tunai langsung kepada setiap pengemudi mobil di lapangan.</w:t>
       </w:r>
     </w:p>
     <w:p>
@@ -5720,7 +5720,7 @@
           <w:sz w:val="20"/>
           <w:szCs w:val="20"/>
         </w:rPr>
-        <w:t xml:space="preserve">Menutup seluruh akses jalan menuju Kota Batu secara permanen agar jalanan kota selalu lengang dari wisatawan.</w:t>
+        <w:t xml:space="preserve">Memblokir seluruh akses jalan penghubung menuju Kota Batu secara permanen agar jalanan dalam kota selalu terbebas dari kepadatan.</w:t>
       </w:r>
     </w:p>
     <w:p>
@@ -5744,7 +5744,7 @@
           <w:sz w:val="20"/>
           <w:szCs w:val="20"/>
         </w:rPr>
-        <w:t xml:space="preserve">Mengundi rute jalan yang boleh dilewati pengemudi menggunakan roda keberuntungan di setiap persimpangan jalan.</w:t>
+        <w:t xml:space="preserve">Menentukan arah rute perjalanan pengemudi menggunakan undian kartu keberuntungan di setiap persimpangan lampu lalu lintas jalan.</w:t>
       </w:r>
     </w:p>
     <w:p>
@@ -5857,7 +5857,7 @@
           <w:sz w:val="20"/>
           <w:szCs w:val="20"/>
         </w:rPr>
-        <w:t xml:space="preserve">Mampu melakukan perencanaan alokasi sumber daya dan layanan secara matang jauh-jauh hari berlandaskan pola tren historis.</w:t>
+        <w:t xml:space="preserve">Mampu menyiapkan alokasi sarana dan tenaga petugas secara matang jauh hari berlandaskan pola kecenderungan masa lalu.</w:t>
       </w:r>
     </w:p>
     <w:p>
@@ -5881,7 +5881,7 @@
           <w:sz w:val="20"/>
           <w:szCs w:val="20"/>
         </w:rPr>
-        <w:t xml:space="preserve">Dapat menaikkan harga tiket masuk secara mendadak hingga sepuluh kali lipat untuk meraup keuntungan pribadi.</w:t>
+        <w:t xml:space="preserve">Memiliki alasan untuk menaikkan tarif tiket masuk secara sepihak hingga berkali-kali lipat demi melipatgandakan perolehan laba.</w:t>
       </w:r>
     </w:p>
     <w:p>
@@ -5905,7 +5905,7 @@
           <w:sz w:val="20"/>
           <w:szCs w:val="20"/>
         </w:rPr>
-        <w:t xml:space="preserve">Menolak kedatangan rombongan pelajar sekolah karena dianggap membuat museum menjadi terlalu berisik.</w:t>
+        <w:t xml:space="preserve">Menolak kedatangan rombongan bus karya wisata pelajar sebab suara keramaian anak sekolah dianggap merusak ketenangan museum.</w:t>
       </w:r>
     </w:p>
     <w:p>
@@ -5929,7 +5929,7 @@
           <w:sz w:val="20"/>
           <w:szCs w:val="20"/>
         </w:rPr>
-        <w:t xml:space="preserve">Menghapus catatan buku tamu agar kantor pajak tidak mengetahui jumlah wisatawan yang datang berkunjung.</w:t>
+        <w:t xml:space="preserve">Menghapus arsip buku kunjungan agar instansi dinas pajak pariwisata tidak mengetahui jumlah pemasukan pengunjung yang sebenarnya.</w:t>
       </w:r>
     </w:p>
     <w:p>
@@ -5953,7 +5953,7 @@
           <w:sz w:val="20"/>
           <w:szCs w:val="20"/>
         </w:rPr>
-        <w:t xml:space="preserve">Mengganti seluruh staf loket manusia dengan robot mekanik tanpa memperhatikan kepuasan pengunjung wisata.</w:t>
+        <w:t xml:space="preserve">Menggantikan seluruh peran pemandu wisata manusia dengan robot pajangan mekanis tanpa memedulikan kepuasan pelayanan pengunjung.</w:t>
       </w:r>
     </w:p>
     <w:p>
@@ -6066,7 +6066,7 @@
           <w:sz w:val="20"/>
           <w:szCs w:val="20"/>
         </w:rPr>
-        <w:t xml:space="preserve">Petugas atau pemrogram cukup memeriksa dan memperbaiki subsistem denda tanpa perlu membongkar atau mengganggu subsistem pendataan buku dan keanggotaan siswa.</w:t>
+        <w:t xml:space="preserve">Pemrogram cukup memeriksa dan membenahi modul denda tanpa perlu mengganggu modul pendataan buku atau data keanggotaan siswa.</w:t>
       </w:r>
     </w:p>
     <w:p>
@@ -6090,7 +6090,7 @@
           <w:sz w:val="20"/>
           <w:szCs w:val="20"/>
         </w:rPr>
-        <w:t xml:space="preserve">Petugas harus menghapus seluruh data siswa dan menginput ulang ribuan buku dari awal di perpustakaan.</w:t>
+        <w:t xml:space="preserve">Petugas perpustakaan harus mengosongkan seluruh basis data sekolah dan mengetik ulang judul ribuan buku dari lembar awal kembali.</w:t>
       </w:r>
     </w:p>
     <w:p>
@@ -6114,7 +6114,7 @@
           <w:sz w:val="20"/>
           <w:szCs w:val="20"/>
         </w:rPr>
-        <w:t xml:space="preserve">Perpustakaan sekolah terpaksa ditutup selama satu tahun ajaran karena sistem komputer rusak total.</w:t>
+        <w:t xml:space="preserve">Pelayanan perpustakaan sekolah terpaksa dinonaktifkan sepanjang tahun ajaran karena kerusakan pada satu komponen modul aplikasi.</w:t>
       </w:r>
     </w:p>
     <w:p>
@@ -6138,7 +6138,7 @@
           <w:sz w:val="20"/>
           <w:szCs w:val="20"/>
         </w:rPr>
-        <w:t xml:space="preserve">Siswa yang meminjam buku tidak perlu mengembalikan buku yang dipinjam karena sistem denda sedang mengalami perbaikan.</w:t>
+        <w:t xml:space="preserve">Siswa peminjam dibebaskan dari kewajiban mengembalikan buku bacaan karena sistem penghitungan sanksi sedang dalam masa perbaikan.</w:t>
       </w:r>
     </w:p>
     <w:p>
@@ -6162,7 +6162,7 @@
           <w:sz w:val="20"/>
           <w:szCs w:val="20"/>
         </w:rPr>
-        <w:t xml:space="preserve">Dekomposisi mengharuskan pemrogram merakit ulang perangkat keras komputer dari komponen motherboard dasar.</w:t>
+        <w:t xml:space="preserve">Pemrogram diwajibkan membongkar susunan kabel perangkat keras komputer server dari papan induk rangkaian elektronik utama.</w:t>
       </w:r>
     </w:p>
     <w:p>
@@ -6275,7 +6275,7 @@
           <w:sz w:val="20"/>
           <w:szCs w:val="20"/>
         </w:rPr>
-        <w:t xml:space="preserve">Karena saat terjadi kebakaran listrik gedung dapat terputus seketika dan cerobong lift dapat terisi asap beracun yang menjebak penumpang di dalamnya.</w:t>
+        <w:t xml:space="preserve">Aliran listrik dapat terputus seketika dan lubang poros lift dapat terisi asap beracun yang menjebak penumpang di dalamnya.</w:t>
       </w:r>
     </w:p>
     <w:p>
@@ -6299,7 +6299,7 @@
           <w:sz w:val="20"/>
           <w:szCs w:val="20"/>
         </w:rPr>
-        <w:t xml:space="preserve">Karena pintu lift hanya boleh dibuka oleh kepala sekolah dan pejabat dinas kebakaran yang berwenang.</w:t>
+        <w:t xml:space="preserve">Pintu akses elevator bertingkat hanya boleh dioperasikan oleh pejabat dinas pemadam kebakaran yang memiliki kunci master khusus.</w:t>
       </w:r>
     </w:p>
     <w:p>
@@ -6323,7 +6323,7 @@
           <w:sz w:val="20"/>
           <w:szCs w:val="20"/>
         </w:rPr>
-        <w:t xml:space="preserve">Karena tangga darurat sengaja dibuat agar siswa dapat berolahraga membakar kalori saat terjadi situasi bencana.</w:t>
+        <w:t xml:space="preserve">Tangga darurat sengaja disediakan agar setiap warga sekolah dapat melatih ketahanan fisik saat menghadapi situasi gawat darurat.</w:t>
       </w:r>
     </w:p>
     <w:p>
@@ -6347,7 +6347,7 @@
           <w:sz w:val="20"/>
           <w:szCs w:val="20"/>
         </w:rPr>
-        <w:t xml:space="preserve">Karena lift gedung sekolah membutuhkan koin khusus untuk dapat beroperasi turun ke lantai dasar.</w:t>
+        <w:t xml:space="preserve">Pengoperasian kabin elevator gedung bertingkat membutuhkan koin khusus yang tersimpan di dalam laci ruang kepala sekolah dasar.</w:t>
       </w:r>
     </w:p>
     <w:p>
@@ -6371,7 +6371,7 @@
           <w:sz w:val="20"/>
           <w:szCs w:val="20"/>
         </w:rPr>
-        <w:t xml:space="preserve">Karena kecepatan lift dianggap terlalu lambat dibandingkan jika siswa melompat langsung dari jendela lantai atas.</w:t>
+        <w:t xml:space="preserve">Laju penurunan kabin lift dinilai terlalu lambat dibandingkan jika para penghuni melompat langsung melalui jendela lantai atas.</w:t>
       </w:r>
     </w:p>
     <w:p>

</xml_diff>